<commit_message>
Replaced LCY Label with the new LCY Label
</commit_message>
<xml_diff>
--- a/src/Layers/W1/BaseApp/Sales/Reports/SalespersonCommissionBody.docx
+++ b/src/Layers/W1/BaseApp/Sales/Reports/SalespersonCommissionBody.docx
@@ -54,13 +54,12 @@
         </w:trPr>
         <w:sdt>
           <w:sdtPr>
-            <w:alias w:val="All_amounts_are_in_LCYCaption"/>
-            <w:tag w:val="#BC:InsertDataItem,DataItems/Salesperson_Purchaser/All_amounts_are_in_LCYCaption"/>
-            <w:id w:val="1521658723"/>
+            <w:alias w:val="AllAmountsAreInLCYLabel"/>
+            <w:tag w:val="#BC:InsertDataItem,Labels/AllAmountsAreInLCYLabel"/>
+            <w:id w:val="1797175241"/>
             <w:placeholder>
               <w:docPart w:val="DefaultPlaceholder_-1854013440"/>
             </w:placeholder>
-            <w:dataBinding w:prefixMappings="xmlns:ns0='urn:microsoft-dynamics-nav/reports/Salesperson_Commission/115/'" w:xpath="/ns0:NavWordReportXmlPart[1]/ns0:Salesperson_Purchaser[1]/ns0:All_amounts_are_in_LCYCaption[1]" w:storeItemID="{79D6D75F-D29A-40D3-A819-B215617F17D6}"/>
             <w15:color w:val="808080"/>
             <w:text/>
           </w:sdtPr>
@@ -73,9 +72,11 @@
                 <w:pPr>
                   <w:pStyle w:val="NoSpacing"/>
                 </w:pPr>
+                <w:proofErr w:type="spellStart"/>
                 <w:r>
-                  <w:t>All_amounts_are_in_LCYCaption</w:t>
+                  <w:t>AllAmountsAreInLCYLabel</w:t>
                 </w:r>
+                <w:proofErr w:type="spellEnd"/>
               </w:p>
             </w:tc>
           </w:sdtContent>
@@ -457,7 +458,6 @@
           <w15:dataBinding w:prefixMappings="xmlns:ns0='urn:microsoft-dynamics-nav/reports/Salesperson_Commission/115/' " w:xpath="/ns0:NavWordReportXmlPart[1]/ns0:Salesperson_Purchaser" w:storeItemID="{79D6D75F-D29A-40D3-A819-B215617F17D6}"/>
           <w15:repeatingSection/>
         </w:sdtPr>
-        <w:sdtEndPr/>
         <w:sdtContent>
           <w:sdt>
             <w:sdtPr>
@@ -470,7 +470,6 @@
               </w:placeholder>
               <w15:repeatingSectionItem/>
             </w:sdtPr>
-            <w:sdtEndPr/>
             <w:sdtContent>
               <w:tr>
                 <w:trPr>
@@ -2945,6 +2944,7 @@
     <w:rsid w:val="00115A94"/>
     <w:rsid w:val="001557A7"/>
     <w:rsid w:val="00193CFB"/>
+    <w:rsid w:val="002217FC"/>
     <w:rsid w:val="002409E2"/>
     <w:rsid w:val="00280142"/>
     <w:rsid w:val="002B3616"/>
@@ -2986,6 +2986,7 @@
     <w:rsid w:val="00753B56"/>
     <w:rsid w:val="007A0F74"/>
     <w:rsid w:val="007A75D3"/>
+    <w:rsid w:val="007D6844"/>
     <w:rsid w:val="00843CE7"/>
     <w:rsid w:val="0086264C"/>
     <w:rsid w:val="008858E8"/>
@@ -2995,6 +2996,7 @@
     <w:rsid w:val="009051A9"/>
     <w:rsid w:val="0091315A"/>
     <w:rsid w:val="00933416"/>
+    <w:rsid w:val="00951E4E"/>
     <w:rsid w:val="009B3459"/>
     <w:rsid w:val="009D3079"/>
     <w:rsid w:val="009E275F"/>
@@ -3553,13 +3555,6 @@
       <w:lang w:val="da-DK" w:eastAsia="da-DK"/>
     </w:rPr>
   </w:style>
-  <w:style w:type="paragraph" w:customStyle="1" w:styleId="FE268EC6B73C45C69982695EA660ACAC">
-    <w:name w:val="FE268EC6B73C45C69982695EA660ACAC"/>
-    <w:rsid w:val="00115A94"/>
-    <w:rPr>
-      <w:lang w:val="en-US" w:eastAsia="en-US"/>
-    </w:rPr>
-  </w:style>
   <w:style w:type="paragraph" w:customStyle="1" w:styleId="07B3927F190F42D19E177B7F12BBAA0D">
     <w:name w:val="07B3927F190F42D19E177B7F12BBAA0D"/>
     <w:rsid w:val="00115A94"/>
@@ -3591,34 +3586,6 @@
   <w:style w:type="paragraph" w:customStyle="1" w:styleId="C41C9EC9AFA54E0BB32956D2C6A0BE8D">
     <w:name w:val="C41C9EC9AFA54E0BB32956D2C6A0BE8D"/>
     <w:rsid w:val="00115A94"/>
-    <w:rPr>
-      <w:lang w:val="en-US" w:eastAsia="en-US"/>
-    </w:rPr>
-  </w:style>
-  <w:style w:type="paragraph" w:customStyle="1" w:styleId="C794FD860E444D3AB10D10EA8F2F89B6">
-    <w:name w:val="C794FD860E444D3AB10D10EA8F2F89B6"/>
-    <w:rsid w:val="00475EE0"/>
-    <w:rPr>
-      <w:lang w:val="en-US" w:eastAsia="en-US"/>
-    </w:rPr>
-  </w:style>
-  <w:style w:type="paragraph" w:customStyle="1" w:styleId="260CCBCB6F184F98939C6790AD527268">
-    <w:name w:val="260CCBCB6F184F98939C6790AD527268"/>
-    <w:rsid w:val="00475EE0"/>
-    <w:rPr>
-      <w:lang w:val="en-US" w:eastAsia="en-US"/>
-    </w:rPr>
-  </w:style>
-  <w:style w:type="paragraph" w:customStyle="1" w:styleId="1972C88321944DA7BCF7DD61D956D2F1">
-    <w:name w:val="1972C88321944DA7BCF7DD61D956D2F1"/>
-    <w:rsid w:val="00475EE0"/>
-    <w:rPr>
-      <w:lang w:val="en-US" w:eastAsia="en-US"/>
-    </w:rPr>
-  </w:style>
-  <w:style w:type="paragraph" w:customStyle="1" w:styleId="B25EB7399EAE40469875C4F3B1FA4AD6">
-    <w:name w:val="B25EB7399EAE40469875C4F3B1FA4AD6"/>
-    <w:rsid w:val="00475EE0"/>
     <w:rPr>
       <w:lang w:val="en-US" w:eastAsia="en-US"/>
     </w:rPr>
@@ -3956,6 +3923,9 @@
   <wetp:taskpane dockstate="right" visibility="0" width="350" row="2">
     <wetp:webextensionref xmlns:r="http://schemas.openxmlformats.org/officeDocument/2006/relationships" r:id="rId2"/>
   </wetp:taskpane>
+  <wetp:taskpane dockstate="right" visibility="0" width="350" row="3">
+    <wetp:webextensionref xmlns:r="http://schemas.openxmlformats.org/officeDocument/2006/relationships" r:id="rId3"/>
+  </wetp:taskpane>
 </wetp:taskpanes>
 </file>
 
@@ -3985,7 +3955,19 @@
 </we:webextension>
 </file>
 
-<file path=customXml/item1.xml>��< ? x m l   v e r s i o n = " 1 . 0 "   e n c o d i n g = " u t f - 1 6 " ? > < N a v W o r d R e p o r t X m l P a r t   x m l n s = " u r n : m i c r o s o f t - d y n a m i c s - b u s i n e s s c e n t r a l / i n t e r n a l / e x t e n d e d / r e p o r t s / S a l e s p e r s o n _ C o m m i s s i o n / 1 1 5 / " > +<file path=word/webextensions/webextension3.xml><?xml version="1.0" encoding="utf-8"?>
+<we:webextension xmlns:we="http://schemas.microsoft.com/office/webextensions/webextension/2010/11" id="{BE860300-A89B-410C-A34C-3BA7FAA2B841}">
+  <we:reference id="WA200009156" version="2.0.3.0" store="Omex" storeType="OMEX"/>
+  <we:alternateReferences>
+    <we:reference id="WA200009156" version="2.0.3.0" store="WA200009156" storeType="OMEX"/>
+  </we:alternateReferences>
+  <we:properties/>
+  <we:bindings/>
+  <we:snapshot xmlns:r="http://schemas.openxmlformats.org/officeDocument/2006/relationships"/>
+</we:webextension>
+</file>
+
+<file path=customXml/item1.xml>��< ? x m l   v e r s i o n = " 1 . 0 "   e n c o d i n g = " u t f - 1 6 " ? > < N a v W o r d R e p o r t X m l P a r t   x m l n s = " u r n : m i c r o s o f t - d y n a m i c s - n a v / r e p o r t s / S a l e s p e r s o n _ C o m m i s s i o n / 1 1 5 / " >   
      < B C R e p o r t I n f o r m a t i o n >   
@@ -4133,262 +4115,192 @@
  
      < L a b e l s >   
-         < A b o u t T h e R e p o r t L a b e l   E l e m e n t T y p e = " P a r a m e t e r "   E l e m e n t I d = " 1 6 7 7 9 2 0 0 1 "   D a t a T y p e = " S t r i n g " > A b o u t T h e R e p o r t L a b e l < / A b o u t T h e R e p o r t L a b e l > - 
-         < A d j u s t e d P r o f i t C o m m i s s i o n L a b e l   E l e m e n t T y p e = " P a r a m e t e r "   E l e m e n t I d = " 9 1 5 5 5 7 0 2 0 "   D a t a T y p e = " S t r i n g " > A d j u s t e d P r o f i t C o m m i s s i o n L a b e l < / A d j u s t e d P r o f i t C o m m i s s i o n L a b e l > - 
-         < A d j u s t e d P r o f i t L a b e l   E l e m e n t T y p e = " P a r a m e t e r "   E l e m e n t I d = " 1 6 1 5 2 8 3 0 4 7 "   D a t a T y p e = " S t r i n g " > A d j u s t e d P r o f i t L a b e l < / A d j u s t e d P r o f i t L a b e l > - 
-         < A l l A m o u n t s A r e I n L C Y L a b e l   E l e m e n t T y p e = " P a r a m e t e r "   E l e m e n t I d = " 5 6 3 5 1 4 3 1 8 "   D a t a T y p e = " S t r i n g " > A l l A m o u n t s A r e I n L C Y L a b e l < / A l l A m o u n t s A r e I n L C Y L a b e l > - 
-         < C o m m i s s i o n P e r c e n t L a b e l   E l e m e n t T y p e = " P a r a m e t e r "   E l e m e n t I d = " 8 3 9 2 6 3 7 6 5 "   D a t a T y p e = " S t r i n g " > C o m m i s s i o n P e r c e n t L a b e l < / C o m m i s s i o n P e r c e n t L a b e l > - 
-         < C o m p a n y L a b e l   E l e m e n t T y p e = " P a r a m e t e r "   E l e m e n t I d = " 3 4 6 7 6 0 3 4 8 "   D a t a T y p e = " S t r i n g " > C o m p a n y L a b e l < / C o m p a n y L a b e l > - 
-         < C u s t o m e r N a m e L a b e l   E l e m e n t T y p e = " P a r a m e t e r "   E l e m e n t I d = " 1 1 1 8 7 9 0 8 8 "   D a t a T y p e = " S t r i n g " > C u s t o m e r N a m e L a b e l < / C u s t o m e r N a m e L a b e l > - 
-         < C u s t o m e r N o L a b e l   E l e m e n t T y p e = " P a r a m e t e r "   E l e m e n t I d = " 3 8 7 4 7 8 0 3 4 "   D a t a T y p e = " S t r i n g " > C u s t o m e r N o L a b e l < / C u s t o m e r N o L a b e l > - 
-         < D a t a R e t r i e v e d   E l e m e n t T y p e = " P a r a m e t e r "   E l e m e n t I d = " 2 9 1 9 1 1 8 0 7 "   D a t a T y p e = " S t r i n g " > D a t a R e t r i e v e d < / D a t a R e t r i e v e d > - 
-         < D o c u m e n t a t i o n L a b e l   E l e m e n t T y p e = " P a r a m e t e r "   E l e m e n t I d = " 1 7 3 8 9 2 4 8 1 5 "   D a t a T y p e = " S t r i n g " > D o c u m e n t a t i o n L a b e l < / D o c u m e n t a t i o n L a b e l > - 
-         < D o c u m e n t N o L a b e l   E l e m e n t T y p e = " P a r a m e t e r "   E l e m e n t I d = " 1 1 4 6 4 3 5 8 0 3 "   D a t a T y p e = " S t r i n g " > D o c u m e n t N o L a b e l < / D o c u m e n t N o L a b e l > - 
-         < E n v i r o n m e n t L a b e l   E l e m e n t T y p e = " P a r a m e t e r "   E l e m e n t I d = " 8 1 8 8 1 6 5 9 0 "   D a t a T y p e = " S t r i n g " > E n v i r o n m e n t L a b e l < / E n v i r o n m e n t L a b e l > - 
-         < P e r i o d C a p t i o n   E l e m e n t T y p e = " P a r a m e t e r "   E l e m e n t I d = " 1 4 7 8 2 5 3 4 2 2 "   D a t a T y p e = " S t r i n g " > P e r i o d C a p t i o n < / P e r i o d C a p t i o n > - 
-         < P o s t i n g D a t e L a b e l   E l e m e n t T y p e = " P a r a m e t e r "   E l e m e n t I d = " 1 7 7 5 7 9 4 2 4 9 "   D a t a T y p e = " S t r i n g " > P o s t i n g D a t e L a b e l < / P o s t i n g D a t e L a b e l > - 
-         < P r o f i t C o m m i s s i o n L a b e l   E l e m e n t T y p e = " P a r a m e t e r "   E l e m e n t I d = " 8 3 2 7 0 6 3 9 2 "   D a t a T y p e = " S t r i n g " > P r o f i t C o m m i s s i o n L a b e l < / P r o f i t C o m m i s s i o n L a b e l > - 
-         < P r o f i t L a b e l   E l e m e n t T y p e = " P a r a m e t e r "   E l e m e n t I d = " 2 5 4 6 3 3 6 4 5 "   D a t a T y p e = " S t r i n g " > P r o f i t L a b e l < / P r o f i t L a b e l > - 
-         < R e p o r t N a m e L a b e l   E l e m e n t T y p e = " P a r a m e t e r "   E l e m e n t I d = " 1 0 2 2 2 9 2 9 8 2 "   D a t a T y p e = " S t r i n g " > R e p o r t N a m e L a b e l < / R e p o r t N a m e L a b e l > - 
-         < R u n O n L a b e l   E l e m e n t T y p e = " P a r a m e t e r "   E l e m e n t I d = " 1 1 1 9 0 3 7 5 9 5 "   D a t a T y p e = " S t r i n g " > R u n O n L a b e l < / R u n O n L a b e l > - 
-         < S a l e s C o m m i s s i o n L a b e l   E l e m e n t T y p e = " P a r a m e t e r "   E l e m e n t I d = " 1 0 1 8 2 6 8 7 7 0 "   D a t a T y p e = " S t r i n g " > S a l e s C o m m i s s i o n L a b e l < / S a l e s C o m m i s s i o n L a b e l > - 
-         < S a l e s L a b e l   E l e m e n t T y p e = " P a r a m e t e r "   E l e m e n t I d = " 1 7 9 5 4 4 8 0 0 5 "   D a t a T y p e = " S t r i n g " > S a l e s L a b e l < / S a l e s L a b e l > - 
-         < S a l e s p e r s o n _ P u r c h a s e r _ _ N a m e C a p t i o n   E l e m e n t T y p e = " P a r a m e t e r "   E l e m e n t I d = " 1 1 9 5 8 7 9 8 7 3 "   D a t a T y p e = " S t r i n g " > S a l e s p e r s o n _ P u r c h a s e r _ _ N a m e C a p t i o n < / S a l e s p e r s o n _ P u r c h a s e r _ _ N a m e C a p t i o n > - 
-         < S a l e s p e r s o n C o m m i s s i o n A n a l y s i s   E l e m e n t T y p e = " P a r a m e t e r "   E l e m e n t I d = " 7 1 5 8 7 1 2 4 7 "   D a t a T y p e = " S t r i n g " > S a l e s p e r s o n C o m m i s s i o n A n a l y s i s < / S a l e s p e r s o n C o m m i s s i o n A n a l y s i s > - 
-         < S a l e s p e r s o n C o m m i s s i o n L a b e l   E l e m e n t T y p e = " P a r a m e t e r "   E l e m e n t I d = " 3 0 0 0 9 6 0 5 1 "   D a t a T y p e = " S t r i n g " > S a l e s p e r s o n C o m m i s s i o n L a b e l < / S a l e s p e r s o n C o m m i s s i o n L a b e l > - 
-         < S a l e s p e r s o n C o m m i s s i o n P r i n t   E l e m e n t T y p e = " P a r a m e t e r "   E l e m e n t I d = " 1 3 1 6 0 2 8 6 0 "   D a t a T y p e = " S t r i n g " > S a l e s p e r s o n C o m m i s s i o n P r i n t < / S a l e s p e r s o n C o m m i s s i o n P r i n t > - 
-         < S a l e s p e r s o n P u r c h a s e r _ C o d e C a p t i o n   E l e m e n t T y p e = " P a r a m e t e r "   E l e m e n t I d = " 1 2 2 1 2 1 9 2 4 5 "   D a t a T y p e = " S t r i n g " > S a l e s p e r s o n P u r c h a s e r _ C o d e C a p t i o n < / S a l e s p e r s o n P u r c h a s e r _ C o d e C a p t i o n > - 
-         < T o t a l s C a p t i o n   E l e m e n t T y p e = " P a r a m e t e r "   E l e m e n t I d = " 2 3 5 4 5 9 0 6 "   D a t a T y p e = " S t r i n g " > T o t a l s C a p t i o n < / T o t a l s C a p t i o n > - 
-         < U s e r L a b e l   E l e m e n t T y p e = " P a r a m e t e r "   E l e m e n t I d = " 8 4 8 8 1 6 7 9 4 "   D a t a T y p e = " S t r i n g " > U s e r L a b e l < / U s e r L a b e l > +         < A b o u t T h e R e p o r t L a b e l > A b o u t T h e R e p o r t L a b e l < / A b o u t T h e R e p o r t L a b e l > + 
+         < A d j u s t e d P r o f i t C o m m i s s i o n L a b e l > A d j u s t e d P r o f i t C o m m i s s i o n L a b e l < / A d j u s t e d P r o f i t C o m m i s s i o n L a b e l > + 
+         < A d j u s t e d P r o f i t L a b e l > A d j u s t e d P r o f i t L a b e l < / A d j u s t e d P r o f i t L a b e l > + 
+         < A l l A m o u n t s A r e I n L C Y L a b e l > A l l A m o u n t s A r e I n L C Y L a b e l < / A l l A m o u n t s A r e I n L C Y L a b e l > + 
+         < C o m m i s s i o n P e r c e n t L a b e l > C o m m i s s i o n P e r c e n t L a b e l < / C o m m i s s i o n P e r c e n t L a b e l > + 
+         < C o m p a n y L a b e l > C o m p a n y L a b e l < / C o m p a n y L a b e l > + 
+         < C u s t o m e r N a m e L a b e l > C u s t o m e r N a m e L a b e l < / C u s t o m e r N a m e L a b e l > + 
+         < C u s t o m e r N o L a b e l > C u s t o m e r N o L a b e l < / C u s t o m e r N o L a b e l > + 
+         < D a t a R e t r i e v e d > D a t a R e t r i e v e d < / D a t a R e t r i e v e d > + 
+         < D o c u m e n t a t i o n L a b e l > D o c u m e n t a t i o n L a b e l < / D o c u m e n t a t i o n L a b e l > + 
+         < D o c u m e n t N o L a b e l > D o c u m e n t N o L a b e l < / D o c u m e n t N o L a b e l > + 
+         < E n v i r o n m e n t L a b e l > E n v i r o n m e n t L a b e l < / E n v i r o n m e n t L a b e l > + 
+         < P e r i o d C a p t i o n > P e r i o d C a p t i o n < / P e r i o d C a p t i o n > + 
+         < P o s t i n g D a t e L a b e l > P o s t i n g D a t e L a b e l < / P o s t i n g D a t e L a b e l > + 
+         < P r o f i t C o m m i s s i o n L a b e l > P r o f i t C o m m i s s i o n L a b e l < / P r o f i t C o m m i s s i o n L a b e l > + 
+         < P r o f i t L a b e l > P r o f i t L a b e l < / P r o f i t L a b e l > + 
+         < R e p o r t N a m e L a b e l > R e p o r t N a m e L a b e l < / R e p o r t N a m e L a b e l > + 
+         < R u n O n L a b e l > R u n O n L a b e l < / R u n O n L a b e l > + 
+         < S a l e s C o m m i s s i o n L a b e l > S a l e s C o m m i s s i o n L a b e l < / S a l e s C o m m i s s i o n L a b e l > + 
+         < S a l e s L a b e l > S a l e s L a b e l < / S a l e s L a b e l > + 
+         < S a l e s p e r s o n _ P u r c h a s e r _ _ N a m e C a p t i o n > S a l e s p e r s o n _ P u r c h a s e r _ _ N a m e C a p t i o n < / S a l e s p e r s o n _ P u r c h a s e r _ _ N a m e C a p t i o n > + 
+         < S a l e s p e r s o n C o m m i s s i o n A n a l y s i s > S a l e s p e r s o n C o m m i s s i o n A n a l y s i s < / S a l e s p e r s o n C o m m i s s i o n A n a l y s i s > + 
+         < S a l e s p e r s o n C o m m i s s i o n L a b e l > S a l e s p e r s o n C o m m i s s i o n L a b e l < / S a l e s p e r s o n C o m m i s s i o n L a b e l > + 
+         < S a l e s p e r s o n C o m m i s s i o n P r i n t > S a l e s p e r s o n C o m m i s s i o n P r i n t < / S a l e s p e r s o n C o m m i s s i o n P r i n t > + 
+         < S a l e s p e r s o n P u r c h a s e r _ C o d e C a p t i o n > S a l e s p e r s o n P u r c h a s e r _ C o d e C a p t i o n < / S a l e s p e r s o n P u r c h a s e r _ C o d e C a p t i o n > + 
+         < T o t a l s C a p t i o n > T o t a l s C a p t i o n < / T o t a l s C a p t i o n > + 
+         < U s e r L a b e l > U s e r L a b e l < / U s e r L a b e l >   
      < / L a b e l s >   
-     < T o o l t i p s > - 
-         < T o o l t i p   c o l u m n = " S a l e s p e r s o n _ P u r c h a s e r _ C o d e "   E l e m e n t I d = " 1 3 8 8 0 3 1 6 5 2 " > - 
-             < T o o l t i p T e x t   l a n g = " e n - U S " > S p e c i f i e s   a   c o d e   f o r   t h e   s a l e s p e r s o n   o r   p u r c h a s e r . < / T o o l t i p T e x t > - 
-         < / T o o l t i p > - 
-         < T o o l t i p   c o l u m n = " S a l e s p e r s o n _ P u r c h a s e r _ N a m e "   E l e m e n t I d = " 1 3 4 8 2 2 8 4 6 2 " > - 
-             < T o o l t i p T e x t   l a n g = " e n - U S " > S p e c i f i e s   t h e   n a m e   o f   t h e   s a l e s p e r s o n   o r   p u r c h a s e r . < / T o o l t i p T e x t > - 
-         < / T o o l t i p > - 
-         < T o o l t i p   c o l u m n = " S a l e s p e r s o n _ P u r c h a s e r _ _ C o m m i s s i o n _ _ _ "   E l e m e n t I d = " 1 5 9 0 6 8 9 0 0 4 " > - 
-             < T o o l t i p T e x t   l a n g = " e n - U S " > S p e c i f i e s   t h e   p e r c e n t a g e   t o   u s e   t o   c a l c u l a t e   t h e   s a l e s p e r s o n ' s   c o m m i s s i o n . < / T o o l t i p T e x t > - 
-         < / T o o l t i p > - 
-         < T o o l t i p   c o l u m n = " C u s t _ _ L e d g e r _ E n t r y _ _ _ S a l e s _ _ L C Y _ _ "   E l e m e n t I d = " 3 4 8 7 9 4 9 4 9 " > - 
-             < T o o l t i p T e x t   l a n g = " e n - U S " > S p e c i f i e s   t h e   t o t a l   s a l e s   a m o u n t   e x c l .   V A T   t o   t h e   c u s t o m e r   i n   L C Y . < / T o o l t i p T e x t > - 
-         < / T o o l t i p > - 
-         < T o o l t i p   c o l u m n = " C u s t _ _ L e d g e r _ E n t r y _ _ D o c u m e n t _ N o _ _ "   E l e m e n t I d = " 8 5 2 6 1 1 1 8 1 " > - 
-             < T o o l t i p T e x t   l a n g = " e n - U S " > S p e c i f i e s   t h e   e n t r y ' s   d o c u m e n t   n u m b e r . < / T o o l t i p T e x t > - 
-         < / T o o l t i p > - 
-         < T o o l t i p   c o l u m n = " C u s t _ _ L e d g e r _ E n t r y _ _ C u s t o m e r _ N o _ _ "   E l e m e n t I d = " 1 0 0 9 0 1 6 8 0 8 " > - 
-             < T o o l t i p T e x t   l a n g = " e n - U S " > S p e c i f i e s   t h e   c u s t o m e r   a c c o u n t   n u m b e r   t h a t   t h e   e n t r y   i s   l i n k e d   t o . < / T o o l t i p T e x t > - 
-         < / T o o l t i p > - 
-         < T o o l t i p   c o l u m n = " C u s t _ _ L e d g e r _ E n t r y _ _ S a l e s _ _ L C Y _ _ "   E l e m e n t I d = " 8 1 9 5 1 7 4 8 " > - 
-             < T o o l t i p T e x t   l a n g = " e n - U S " > S p e c i f i e s   t h e   t o t a l   s a l e s   a m o u n t   e x c l .   V A T   t o   t h e   c u s t o m e r   i n   L C Y . < / T o o l t i p T e x t > - 
-         < / T o o l t i p > - 
-         < T o o l t i p   c o l u m n = " C u s t L e d g e r E n t r y _ C u s t o m e r N a m e "   E l e m e n t I d = " 2 0 9 1 8 9 3 2 7 9 " > - 
-             < T o o l t i p T e x t   l a n g = " e n - U S " > S p e c i f i e s   t h e   c u s t o m e r   n a m e   t h a t   t h e   e n t r y   i s   l i n k e d   t o . < / T o o l t i p T e x t > - 
-         < / T o o l t i p > - 
-         < T o o l t i p   c o l u m n = " S a l e s p e r s o n P u r c h a s e r _ C o d e "   E l e m e n t I d = " 1 2 2 1 2 1 9 2 4 5 " > - 
-             < T o o l t i p T e x t   l a n g = " e n - U S " > S p e c i f i e s   a   c o d e   f o r   t h e   s a l e s p e r s o n   o r   p u r c h a s e r . < / T o o l t i p T e x t > - 
-         < / T o o l t i p > - 
-         < T o o l t i p   c o l u m n = " S a l e s p e r s o n _ P u r c h a s e r _ _ N a m e "   E l e m e n t I d = " 1 1 9 5 8 7 9 8 7 3 " > - 
-             < T o o l t i p T e x t   l a n g = " e n - U S " > S p e c i f i e s   t h e   n a m e   o f   t h e   s a l e s p e r s o n   o r   p u r c h a s e r . < / T o o l t i p T e x t > - 
-         < / T o o l t i p > - 
-         < T o o l t i p   c o l u m n = " S u b t o t a l s _ S a l e s p e r s o n _ C o d e "   E l e m e n t I d = " 1 1 9 8 5 9 4 2 7 2 " > - 
-             < T o o l t i p T e x t   l a n g = " e n - U S " > S p e c i f i e s   a   c o d e   f o r   t h e   s a l e s p e r s o n   o r   p u r c h a s e r . < / T o o l t i p T e x t > - 
-         < / T o o l t i p > - 
-     < / T o o l t i p s > - 
-     < S a l e s p e r s o n _ P u r c h a s e r   E l e m e n t T y p e = " D a t a I t e m "   E l e m e n t I d = " 7 1 5 0 0 7 1 9 8 " > - 
-         < A d j P r o f i t   E l e m e n t T y p e = " C o l u m n "   E l e m e n t I d = " 6 6 6 3 9 3 8 5 2 "   D a t a T y p e = " D e c i m a l "   O b s o l e t e S t a t e = " P e n d i n g " > A d j P r o f i t < / A d j P r o f i t > - 
-         < A d j P r o f i t C o m m i s s i o n A m t   E l e m e n t T y p e = " C o l u m n "   E l e m e n t I d = " 1 5 8 1 4 8 8 5 9 9 "   D a t a T y p e = " D e c i m a l "   O b s o l e t e S t a t e = " P e n d i n g " > A d j P r o f i t C o m m i s s i o n A m t < / A d j P r o f i t C o m m i s s i o n A m t > - 
-         < A d j P r o f i t C o m m i s s i o n A m t _ C o n t r o l 4 5 C a p t i o n   E l e m e n t T y p e = " C o l u m n "   E l e m e n t I d = " 6 2 1 2 7 7 8 5 4 "   D a t a T y p e = " L a b e l "   O b s o l e t e S t a t e = " P e n d i n g " > A d j P r o f i t C o m m i s s i o n A m t _ C o n t r o l 4 5 C a p t i o n < / A d j P r o f i t C o m m i s s i o n A m t _ C o n t r o l 4 5 C a p t i o n > - 
-         < A d j P r o f i t _ C o n t r o l 3 9 C a p t i o n   E l e m e n t T y p e = " C o l u m n "   E l e m e n t I d = " 2 1 3 3 9 8 4 3 2 "   D a t a T y p e = " L a b e l "   O b s o l e t e S t a t e = " P e n d i n g " > A d j P r o f i t _ C o n t r o l 3 9 C a p t i o n < / A d j P r o f i t _ C o n t r o l 3 9 C a p t i o n > - 
-         < A l l _ a m o u n t s _ a r e _ i n _ L C Y C a p t i o n   E l e m e n t T y p e = " C o l u m n "   E l e m e n t I d = " 6 9 7 4 8 4 8 0 2 "   D a t a T y p e = " L a b e l "   O b s o l e t e S t a t e = " P e n d i n g " > A l l _ a m o u n t s _ a r e _ i n _ L C Y C a p t i o n < / A l l _ a m o u n t s _ a r e _ i n _ L C Y C a p t i o n > - 
-         < C O M P A N Y N A M E   E l e m e n t T y p e = " C o l u m n "   E l e m e n t I d = " 1 7 5 3 0 1 5 1 5 5 "   D a t a T y p e = " S t r i n g "   O b s o l e t e S t a t e = " P e n d i n g " > C O M P A N Y N A M E < / C O M P A N Y N A M E > - 
-         < C u r r R e p o r t _ P A G E N O C a p t i o n   E l e m e n t T y p e = " C o l u m n "   E l e m e n t I d = " 1 8 4 6 2 6 2 1 5 8 "   D a t a T y p e = " L a b e l "   O b s o l e t e S t a t e = " P e n d i n g " > C u r r R e p o r t _ P A G E N O C a p t i o n < / C u r r R e p o r t _ P A G E N O C a p t i o n > - 
-         < C u s t L e d g E n t r y F i l t e r   E l e m e n t T y p e = " C o l u m n "   E l e m e n t I d = " 1 1 7 3 5 3 2 6 6 6 "   D a t a T y p e = " T e x t "   O b s o l e t e S t a t e = " P e n d i n g " > C u s t L e d g E n t r y F i l t e r < / C u s t L e d g E n t r y F i l t e r > - 
-         < C u s t _ _ L e d g e r _ E n t r y _ _ C u s t o m e r _ N o _ _ C a p t i o n   E l e m e n t T y p e = " C o l u m n "   E l e m e n t I d = " 1 2 2 3 8 5 6 2 7 8 "   D a t a T y p e = " S t r i n g "   O b s o l e t e S t a t e = " P e n d i n g " > C u s t _ _ L e d g e r _ E n t r y _ _ C u s t o m e r _ N o _ _ C a p t i o n < / C u s t _ _ L e d g e r _ E n t r y _ _ C u s t o m e r _ N o _ _ C a p t i o n > - 
-         < C u s t _ _ L e d g e r _ E n t r y _ _ D o c u m e n t _ N o _ _ C a p t i o n   E l e m e n t T y p e = " C o l u m n "   E l e m e n t I d = " 4 8 8 8 0 6 5 1 7 "   D a t a T y p e = " S t r i n g "   O b s o l e t e S t a t e = " P e n d i n g " > C u s t _ _ L e d g e r _ E n t r y _ _ D o c u m e n t _ N o _ _ C a p t i o n < / C u s t _ _ L e d g e r _ E n t r y _ _ D o c u m e n t _ N o _ _ C a p t i o n > - 
-         < C u s t _ _ L e d g e r _ E n t r y _ _ P o s t i n g _ D a t e _ C a p t i o n   E l e m e n t T y p e = " C o l u m n "   E l e m e n t I d = " 2 0 7 9 4 3 8 7 1 2 "   D a t a T y p e = " L a b e l "   O b s o l e t e S t a t e = " P e n d i n g " > C u s t _ _ L e d g e r _ E n t r y _ _ P o s t i n g _ D a t e _ C a p t i o n < / C u s t _ _ L e d g e r _ E n t r y _ _ P o s t i n g _ D a t e _ C a p t i o n > - 
-         < C u s t _ _ L e d g e r _ E n t r y _ _ P r o f i t _ _ L C Y _ _ C a p t i o n   E l e m e n t T y p e = " C o l u m n "   E l e m e n t I d = " 1 9 9 4 3 8 8 4 7 6 "   D a t a T y p e = " S t r i n g "   O b s o l e t e S t a t e = " P e n d i n g " > C u s t _ _ L e d g e r _ E n t r y _ _ P r o f i t _ _ L C Y _ _ C a p t i o n < / C u s t _ _ L e d g e r _ E n t r y _ _ P r o f i t _ _ L C Y _ _ C a p t i o n > - 
-         < C u s t _ _ L e d g e r _ E n t r y _ _ S a l e s _ _ L C Y _ _ C a p t i o n   E l e m e n t T y p e = " C o l u m n "   E l e m e n t I d = " 1 0 5 6 9 2 6 5 4 6 "   D a t a T y p e = " S t r i n g "   O b s o l e t e S t a t e = " P e n d i n g " > C u s t _ _ L e d g e r _ E n t r y _ _ S a l e s _ _ L C Y _ _ C a p t i o n < / C u s t _ _ L e d g e r _ E n t r y _ _ S a l e s _ _ L C Y _ _ C a p t i o n > - 
-         < C u s t _ _ L e d g e r _ E n t r y _ _ T A B L E C A P T I O N _ _ _ _ _ _ _ _ _ _ C u s t L e d g E n t r y F i l t e r   E l e m e n t T y p e = " C o l u m n "   E l e m e n t I d = " 7 1 0 6 3 3 9 1 7 "   D a t a T y p e = " T e x t " > C u s t _ _ L e d g e r _ E n t r y _ _ T A B L E C A P T I O N _ _ _ _ _ _ _ _ _ _ C u s t L e d g E n t r y F i l t e r < / C u s t _ _ L e d g e r _ E n t r y _ _ T A B L E C A P T I O N _ _ _ _ _ _ _ _ _ _ C u s t L e d g E n t r y F i l t e r > - 
-         < C u s t _ _ L e d g e r _ E n t r y _ _ _ P r o f i t _ _ L C Y _ _   E l e m e n t T y p e = " C o l u m n "   E l e m e n t I d = " 1 6 1 5 1 3 7 4 4 3 "   D a t a T y p e = " D e c i m a l "   O b s o l e t e S t a t e = " P e n d i n g " > C u s t _ _ L e d g e r _ E n t r y _ _ _ P r o f i t _ _ L C Y _ _ < / C u s t _ _ L e d g e r _ E n t r y _ _ _ P r o f i t _ _ L C Y _ _ > - 
-         < C u s t _ _ L e d g e r _ E n t r y _ _ _ S a l e s _ _ L C Y _ _   E l e m e n t T y p e = " C o l u m n "   E l e m e n t I d = " 3 4 8 7 9 4 9 4 9 "   D a t a T y p e = " D e c i m a l "   O b s o l e t e S t a t e = " P e n d i n g " > C u s t _ _ L e d g e r _ E n t r y _ _ _ S a l e s _ _ L C Y _ _ < / C u s t _ _ L e d g e r _ E n t r y _ _ _ S a l e s _ _ L C Y _ _ > - 
-         < P a g e G r o u p N o   E l e m e n t T y p e = " C o l u m n "   E l e m e n t I d = " 6 4 9 1 8 0 1 4 4 "   D a t a T y p e = " I n t e g e r "   O b s o l e t e S t a t e = " P e n d i n g " > P a g e G r o u p N o < / P a g e G r o u p N o > - 
-         < P r o f i t C o m m i s s i o n A m t   E l e m e n t T y p e = " C o l u m n "   E l e m e n t I d = " 4 1 6 2 2 4 2 0 6 "   D a t a T y p e = " D e c i m a l "   O b s o l e t e S t a t e = " P e n d i n g " > P r o f i t C o m m i s s i o n A m t < / P r o f i t C o m m i s s i o n A m t > - 
-         < P r o f i t C o m m i s s i o n A m t _ C o n t r o l 3 3 C a p t i o n   E l e m e n t T y p e = " C o l u m n "   E l e m e n t I d = " 4 6 5 8 1 2 5 3 6 "   D a t a T y p e = " L a b e l "   O b s o l e t e S t a t e = " P e n d i n g " > P r o f i t C o m m i s s i o n A m t _ C o n t r o l 3 3 C a p t i o n < / P r o f i t C o m m i s s i o n A m t _ C o n t r o l 3 3 C a p t i o n > - 
-         < S a l e s C o m m i s s i o n A m t   E l e m e n t T y p e = " C o l u m n "   E l e m e n t I d = " 1 6 5 6 6 7 5 0 1 6 "   D a t a T y p e = " D e c i m a l "   O b s o l e t e S t a t e = " P e n d i n g " > S a l e s C o m m i s s i o n A m t < / S a l e s C o m m i s s i o n A m t > - 
-         < S a l e s C o m m i s s i o n A m t _ C o n t r o l 3 2 C a p t i o n   E l e m e n t T y p e = " C o l u m n "   E l e m e n t I d = " 1 2 7 2 6 4 2 0 6 5 "   D a t a T y p e = " L a b e l "   O b s o l e t e S t a t e = " P e n d i n g " > S a l e s C o m m i s s i o n A m t _ C o n t r o l 3 2 C a p t i o n < / S a l e s C o m m i s s i o n A m t _ C o n t r o l 3 2 C a p t i o n > - 
-         < S a l e s p e r s o n F i l t e r   E l e m e n t T y p e = " C o l u m n "   E l e m e n t I d = " 1 2 4 2 2 8 3 2 5 6 "   D a t a T y p e = " T e x t "   O b s o l e t e S t a t e = " P e n d i n g " > S a l e s p e r s o n F i l t e r < / S a l e s p e r s o n F i l t e r > - 
-         < S a l e s p e r s o n _ P u r c h a s e r _ C o d e   E l e m e n t T y p e = " C o l u m n "   E l e m e n t I d = " 1 3 8 8 0 3 1 6 5 2 "   D a t a T y p e = " C o d e " > S a l e s p e r s o n _ P u r c h a s e r _ C o d e < / S a l e s p e r s o n _ P u r c h a s e r _ C o d e > - 
-         < S a l e s p e r s o n _ P u r c h a s e r _ N a m e   E l e m e n t T y p e = " C o l u m n "   E l e m e n t I d = " 1 3 4 8 2 2 8 4 6 2 "   D a t a T y p e = " T e x t " > S a l e s p e r s o n _ P u r c h a s e r _ N a m e < / S a l e s p e r s o n _ P u r c h a s e r _ N a m e > - 
-         < S a l e s p e r s o n _ P u r c h a s e r _ _ C o m m i s s i o n _ _ _   E l e m e n t T y p e = " C o l u m n "   E l e m e n t I d = " 1 5 9 0 6 8 9 0 0 4 "   D a t a T y p e = " D e c i m a l " > S a l e s p e r s o n _ P u r c h a s e r _ _ C o m m i s s i o n _ _ _ < / S a l e s p e r s o n _ P u r c h a s e r _ _ C o m m i s s i o n _ _ _ > - 
-         < S a l e s p e r s o n _ P u r c h a s e r _ _ C o m m i s s i o n _ _ _ C a p t i o n   E l e m e n t T y p e = " C o l u m n "   E l e m e n t I d = " 4 9 9 4 6 3 1 7 0 "   D a t a T y p e = " S t r i n g "   O b s o l e t e S t a t e = " P e n d i n g " > S a l e s p e r s o n _ P u r c h a s e r _ _ C o m m i s s i o n _ _ _ C a p t i o n < / S a l e s p e r s o n _ P u r c h a s e r _ _ C o m m i s s i o n _ _ _ C a p t i o n > - 
-         < S a l e s p e r s o n _ P u r c h a s e r _ _ T A B L E C A P T I O N _ _ _ _ _ _ _ _ _ _ S a l e s p e r s o n F i l t e r   E l e m e n t T y p e = " C o l u m n "   E l e m e n t I d = " 1 0 1 6 0 4 1 6 9 9 "   D a t a T y p e = " T e x t " > S a l e s p e r s o n _ P u r c h a s e r _ _ T A B L E C A P T I O N _ _ _ _ _ _ _ _ _ _ S a l e s p e r s o n F i l t e r < / S a l e s p e r s o n _ P u r c h a s e r _ _ T A B L E C A P T I O N _ _ _ _ _ _ _ _ _ _ S a l e s p e r s o n F i l t e r > - 
-         < S a l e s p e r s o n _ _ _ C o m m i s s i o n C a p t i o n   E l e m e n t T y p e = " C o l u m n "   E l e m e n t I d = " 1 7 6 9 4 7 1 9 4 8 "   D a t a T y p e = " L a b e l "   O b s o l e t e S t a t e = " P e n d i n g " > S a l e s p e r s o n _ _ _ C o m m i s s i o n C a p t i o n < / S a l e s p e r s o n _ _ _ C o m m i s s i o n C a p t i o n > - 
-         < S T R S U B S T N O _ T e x t 0 0 0 _ P e r i o d T e x t _   E l e m e n t T y p e = " C o l u m n "   E l e m e n t I d = " 7 2 2 9 9 1 7 0 4 "   D a t a T y p e = " S t r i n g " > S T R S U B S T N O _ T e x t 0 0 0 _ P e r i o d T e x t _ < / S T R S U B S T N O _ T e x t 0 0 0 _ P e r i o d T e x t _ > - 
-         < T o t a l C a p t i o n   E l e m e n t T y p e = " C o l u m n "   E l e m e n t I d = " 7 0 7 1 0 2 6 9 5 "   D a t a T y p e = " L a b e l "   O b s o l e t e S t a t e = " P e n d i n g " > T o t a l C a p t i o n < / T o t a l C a p t i o n > - 
-         < C u s t _ L e d g e r _ E n t r y   E l e m e n t T y p e = " D a t a I t e m "   E l e m e n t I d = " 1 6 3 9 1 4 6 4 4 5 " > - 
-             < A d j P r o f i t C o m m i s s i o n A m t _ C o n t r o l 4 5   E l e m e n t T y p e = " C o l u m n "   E l e m e n t I d = " 8 0 5 8 9 6 4 0 0 "   D a t a T y p e = " D e c i m a l " > A d j P r o f i t C o m m i s s i o n A m t _ C o n t r o l 4 5 < / A d j P r o f i t C o m m i s s i o n A m t _ C o n t r o l 4 5 > - 
-             < A d j P r o f i t _ C o n t r o l 3 9   E l e m e n t T y p e = " C o l u m n "   E l e m e n t I d = " 2 0 2 4 1 9 6 5 4 2 "   D a t a T y p e = " D e c i m a l " > A d j P r o f i t _ C o n t r o l 3 9 < / A d j P r o f i t _ C o n t r o l 3 9 > - 
-             < C u s t L e d g e r E n t r y _ C u s t o m e r N a m e   E l e m e n t T y p e = " C o l u m n "   E l e m e n t I d = " 2 0 9 1 8 9 3 2 7 9 "   D a t a T y p e = " T e x t " > C u s t L e d g e r E n t r y _ C u s t o m e r N a m e < / C u s t L e d g e r E n t r y _ C u s t o m e r N a m e > - 
-             < C u s t _ _ L e d g e r _ E n t r y _ _ C u s t o m e r _ N o _ _   E l e m e n t T y p e = " C o l u m n "   E l e m e n t I d = " 1 0 0 9 0 1 6 8 0 8 "   D a t a T y p e = " C o d e " > C u s t _ _ L e d g e r _ E n t r y _ _ C u s t o m e r _ N o _ _ < / C u s t _ _ L e d g e r _ E n t r y _ _ C u s t o m e r _ N o _ _ > - 
-             < C u s t _ _ L e d g e r _ E n t r y _ _ D o c u m e n t _ N o _ _   E l e m e n t T y p e = " C o l u m n "   E l e m e n t I d = " 8 5 2 6 1 1 1 8 1 "   D a t a T y p e = " C o d e " > C u s t _ _ L e d g e r _ E n t r y _ _ D o c u m e n t _ N o _ _ < / C u s t _ _ L e d g e r _ E n t r y _ _ D o c u m e n t _ N o _ _ > - 
-             < C u s t _ _ L e d g e r _ E n t r y _ _ P o s t i n g _ D a t e _   E l e m e n t T y p e = " C o l u m n "   E l e m e n t I d = " 2 1 4 2 6 5 7 1 6 2 "   D a t a T y p e = " S t r i n g " > C u s t _ _ L e d g e r _ E n t r y _ _ P o s t i n g _ D a t e _ < / C u s t _ _ L e d g e r _ E n t r y _ _ P o s t i n g _ D a t e _ > - 
-             < C u s t _ _ L e d g e r _ E n t r y _ _ P r o f i t _ _ L C Y _ _   E l e m e n t T y p e = " C o l u m n "   E l e m e n t I d = " 5 1 9 3 4 1 8 2 6 "   D a t a T y p e = " D e c i m a l " > C u s t _ _ L e d g e r _ E n t r y _ _ P r o f i t _ _ L C Y _ _ < / C u s t _ _ L e d g e r _ E n t r y _ _ P r o f i t _ _ L C Y _ _ > - 
-             < C u s t _ _ L e d g e r _ E n t r y _ _ S a l e s _ _ L C Y _ _   E l e m e n t T y p e = " C o l u m n "   E l e m e n t I d = " 8 1 9 5 1 7 4 8 "   D a t a T y p e = " D e c i m a l " > C u s t _ _ L e d g e r _ E n t r y _ _ S a l e s _ _ L C Y _ _ < / C u s t _ _ L e d g e r _ E n t r y _ _ S a l e s _ _ L C Y _ _ > - 
-             < P r o f i t C o m m i s s i o n A m t _ C o n t r o l 3 3   E l e m e n t T y p e = " C o l u m n "   E l e m e n t I d = " 3 1 2 1 8 6 8 2 6 "   D a t a T y p e = " D e c i m a l " > P r o f i t C o m m i s s i o n A m t _ C o n t r o l 3 3 < / P r o f i t C o m m i s s i o n A m t _ C o n t r o l 3 3 > - 
-             < S a l e s C o m m i s s i o n A m t _ C o n t r o l 3 2   E l e m e n t T y p e = " C o l u m n "   E l e m e n t I d = " 1 4 6 2 3 9 0 1 5 3 "   D a t a T y p e = " D e c i m a l " > S a l e s C o m m i s s i o n A m t _ C o n t r o l 3 2 < / S a l e s C o m m i s s i o n A m t _ C o n t r o l 3 2 > - 
-             < S a l e s p e r s o n P u r c h a s e r _ C o d e   E l e m e n t T y p e = " C o l u m n "   E l e m e n t I d = " 1 2 2 1 2 1 9 2 4 5 "   D a t a T y p e = " C o d e " > S a l e s p e r s o n P u r c h a s e r _ C o d e < / S a l e s p e r s o n P u r c h a s e r _ C o d e > - 
-             < S a l e s p e r s o n _ P u r c h a s e r _ _ N a m e   E l e m e n t T y p e = " C o l u m n "   E l e m e n t I d = " 1 1 9 5 8 7 9 8 7 3 "   D a t a T y p e = " T e x t " > S a l e s p e r s o n _ P u r c h a s e r _ _ N a m e < / S a l e s p e r s o n _ P u r c h a s e r _ _ N a m e > +     < S a l e s p e r s o n _ P u r c h a s e r > + 
+         < A d j P r o f i t > A d j P r o f i t < / A d j P r o f i t > + 
+         < A d j P r o f i t C o m m i s s i o n A m t > A d j P r o f i t C o m m i s s i o n A m t < / A d j P r o f i t C o m m i s s i o n A m t > + 
+         < A d j P r o f i t C o m m i s s i o n A m t _ C o n t r o l 4 5 C a p t i o n > A d j P r o f i t C o m m i s s i o n A m t _ C o n t r o l 4 5 C a p t i o n < / A d j P r o f i t C o m m i s s i o n A m t _ C o n t r o l 4 5 C a p t i o n > + 
+         < A d j P r o f i t _ C o n t r o l 3 9 C a p t i o n > A d j P r o f i t _ C o n t r o l 3 9 C a p t i o n < / A d j P r o f i t _ C o n t r o l 3 9 C a p t i o n > + 
+         < A l l _ a m o u n t s _ a r e _ i n _ L C Y C a p t i o n > A l l _ a m o u n t s _ a r e _ i n _ L C Y C a p t i o n < / A l l _ a m o u n t s _ a r e _ i n _ L C Y C a p t i o n > + 
+         < C O M P A N Y N A M E > C O M P A N Y N A M E < / C O M P A N Y N A M E > + 
+         < C u r r R e p o r t _ P A G E N O C a p t i o n > C u r r R e p o r t _ P A G E N O C a p t i o n < / C u r r R e p o r t _ P A G E N O C a p t i o n > + 
+         < C u s t L e d g E n t r y F i l t e r > C u s t L e d g E n t r y F i l t e r < / C u s t L e d g E n t r y F i l t e r > + 
+         < C u s t _ _ L e d g e r _ E n t r y _ _ C u s t o m e r _ N o _ _ C a p t i o n > C u s t _ _ L e d g e r _ E n t r y _ _ C u s t o m e r _ N o _ _ C a p t i o n < / C u s t _ _ L e d g e r _ E n t r y _ _ C u s t o m e r _ N o _ _ C a p t i o n > + 
+         < C u s t _ _ L e d g e r _ E n t r y _ _ D o c u m e n t _ N o _ _ C a p t i o n > C u s t _ _ L e d g e r _ E n t r y _ _ D o c u m e n t _ N o _ _ C a p t i o n < / C u s t _ _ L e d g e r _ E n t r y _ _ D o c u m e n t _ N o _ _ C a p t i o n > + 
+         < C u s t _ _ L e d g e r _ E n t r y _ _ P o s t i n g _ D a t e _ C a p t i o n > C u s t _ _ L e d g e r _ E n t r y _ _ P o s t i n g _ D a t e _ C a p t i o n < / C u s t _ _ L e d g e r _ E n t r y _ _ P o s t i n g _ D a t e _ C a p t i o n > + 
+         < C u s t _ _ L e d g e r _ E n t r y _ _ P r o f i t _ _ L C Y _ _ C a p t i o n > C u s t _ _ L e d g e r _ E n t r y _ _ P r o f i t _ _ L C Y _ _ C a p t i o n < / C u s t _ _ L e d g e r _ E n t r y _ _ P r o f i t _ _ L C Y _ _ C a p t i o n > + 
+         < C u s t _ _ L e d g e r _ E n t r y _ _ S a l e s _ _ L C Y _ _ C a p t i o n > C u s t _ _ L e d g e r _ E n t r y _ _ S a l e s _ _ L C Y _ _ C a p t i o n < / C u s t _ _ L e d g e r _ E n t r y _ _ S a l e s _ _ L C Y _ _ C a p t i o n > + 
+         < C u s t _ _ L e d g e r _ E n t r y _ _ T A B L E C A P T I O N _ _ _ _ _ _ _ _ _ _ C u s t L e d g E n t r y F i l t e r > C u s t _ _ L e d g e r _ E n t r y _ _ T A B L E C A P T I O N _ _ _ _ _ _ _ _ _ _ C u s t L e d g E n t r y F i l t e r < / C u s t _ _ L e d g e r _ E n t r y _ _ T A B L E C A P T I O N _ _ _ _ _ _ _ _ _ _ C u s t L e d g E n t r y F i l t e r > + 
+         < C u s t _ _ L e d g e r _ E n t r y _ _ _ P r o f i t _ _ L C Y _ _ > C u s t _ _ L e d g e r _ E n t r y _ _ _ P r o f i t _ _ L C Y _ _ < / C u s t _ _ L e d g e r _ E n t r y _ _ _ P r o f i t _ _ L C Y _ _ > + 
+         < C u s t _ _ L e d g e r _ E n t r y _ _ _ S a l e s _ _ L C Y _ _ > C u s t _ _ L e d g e r _ E n t r y _ _ _ S a l e s _ _ L C Y _ _ < / C u s t _ _ L e d g e r _ E n t r y _ _ _ S a l e s _ _ L C Y _ _ > + 
+         < P a g e G r o u p N o > P a g e G r o u p N o < / P a g e G r o u p N o > + 
+         < P r o f i t C o m m i s s i o n A m t > P r o f i t C o m m i s s i o n A m t < / P r o f i t C o m m i s s i o n A m t > + 
+         < P r o f i t C o m m i s s i o n A m t _ C o n t r o l 3 3 C a p t i o n > P r o f i t C o m m i s s i o n A m t _ C o n t r o l 3 3 C a p t i o n < / P r o f i t C o m m i s s i o n A m t _ C o n t r o l 3 3 C a p t i o n > + 
+         < S a l e s C o m m i s s i o n A m t > S a l e s C o m m i s s i o n A m t < / S a l e s C o m m i s s i o n A m t > + 
+         < S a l e s C o m m i s s i o n A m t _ C o n t r o l 3 2 C a p t i o n > S a l e s C o m m i s s i o n A m t _ C o n t r o l 3 2 C a p t i o n < / S a l e s C o m m i s s i o n A m t _ C o n t r o l 3 2 C a p t i o n > + 
+         < S a l e s p e r s o n F i l t e r > S a l e s p e r s o n F i l t e r < / S a l e s p e r s o n F i l t e r > + 
+         < S a l e s p e r s o n _ P u r c h a s e r _ C o d e > S a l e s p e r s o n _ P u r c h a s e r _ C o d e < / S a l e s p e r s o n _ P u r c h a s e r _ C o d e > + 
+         < S a l e s p e r s o n _ P u r c h a s e r _ N a m e > S a l e s p e r s o n _ P u r c h a s e r _ N a m e < / S a l e s p e r s o n _ P u r c h a s e r _ N a m e > + 
+         < S a l e s p e r s o n _ P u r c h a s e r _ _ C o m m i s s i o n _ _ _ > S a l e s p e r s o n _ P u r c h a s e r _ _ C o m m i s s i o n _ _ _ < / S a l e s p e r s o n _ P u r c h a s e r _ _ C o m m i s s i o n _ _ _ > + 
+         < S a l e s p e r s o n _ P u r c h a s e r _ _ C o m m i s s i o n _ _ _ C a p t i o n > S a l e s p e r s o n _ P u r c h a s e r _ _ C o m m i s s i o n _ _ _ C a p t i o n < / S a l e s p e r s o n _ P u r c h a s e r _ _ C o m m i s s i o n _ _ _ C a p t i o n > + 
+         < S a l e s p e r s o n _ P u r c h a s e r _ _ T A B L E C A P T I O N _ _ _ _ _ _ _ _ _ _ S a l e s p e r s o n F i l t e r > S a l e s p e r s o n _ P u r c h a s e r _ _ T A B L E C A P T I O N _ _ _ _ _ _ _ _ _ _ S a l e s p e r s o n F i l t e r < / S a l e s p e r s o n _ P u r c h a s e r _ _ T A B L E C A P T I O N _ _ _ _ _ _ _ _ _ _ S a l e s p e r s o n F i l t e r > + 
+         < S a l e s p e r s o n _ _ _ C o m m i s s i o n C a p t i o n > S a l e s p e r s o n _ _ _ C o m m i s s i o n C a p t i o n < / S a l e s p e r s o n _ _ _ C o m m i s s i o n C a p t i o n > + 
+         < S T R S U B S T N O _ T e x t 0 0 0 _ P e r i o d T e x t _ > S T R S U B S T N O _ T e x t 0 0 0 _ P e r i o d T e x t _ < / S T R S U B S T N O _ T e x t 0 0 0 _ P e r i o d T e x t _ > + 
+         < T o t a l C a p t i o n > T o t a l C a p t i o n < / T o t a l C a p t i o n > + 
+         < C u s t _ L e d g e r _ E n t r y > + 
+             < A d j P r o f i t C o m m i s s i o n A m t _ C o n t r o l 4 5 > A d j P r o f i t C o m m i s s i o n A m t _ C o n t r o l 4 5 < / A d j P r o f i t C o m m i s s i o n A m t _ C o n t r o l 4 5 > + 
+             < A d j P r o f i t _ C o n t r o l 3 9 > A d j P r o f i t _ C o n t r o l 3 9 < / A d j P r o f i t _ C o n t r o l 3 9 > + 
+             < C u s t L e d g e r E n t r y _ C u s t o m e r N a m e > C u s t L e d g e r E n t r y _ C u s t o m e r N a m e < / C u s t L e d g e r E n t r y _ C u s t o m e r N a m e > + 
+             < C u s t _ _ L e d g e r _ E n t r y _ _ C u s t o m e r _ N o _ _ > C u s t _ _ L e d g e r _ E n t r y _ _ C u s t o m e r _ N o _ _ < / C u s t _ _ L e d g e r _ E n t r y _ _ C u s t o m e r _ N o _ _ > + 
+             < C u s t _ _ L e d g e r _ E n t r y _ _ D o c u m e n t _ N o _ _ > C u s t _ _ L e d g e r _ E n t r y _ _ D o c u m e n t _ N o _ _ < / C u s t _ _ L e d g e r _ E n t r y _ _ D o c u m e n t _ N o _ _ > + 
+             < C u s t _ _ L e d g e r _ E n t r y _ _ P o s t i n g _ D a t e _ > C u s t _ _ L e d g e r _ E n t r y _ _ P o s t i n g _ D a t e _ < / C u s t _ _ L e d g e r _ E n t r y _ _ P o s t i n g _ D a t e _ > + 
+             < C u s t _ _ L e d g e r _ E n t r y _ _ P r o f i t _ _ L C Y _ _ > C u s t _ _ L e d g e r _ E n t r y _ _ P r o f i t _ _ L C Y _ _ < / C u s t _ _ L e d g e r _ E n t r y _ _ P r o f i t _ _ L C Y _ _ > + 
+             < C u s t _ _ L e d g e r _ E n t r y _ _ S a l e s _ _ L C Y _ _ > C u s t _ _ L e d g e r _ E n t r y _ _ S a l e s _ _ L C Y _ _ < / C u s t _ _ L e d g e r _ E n t r y _ _ S a l e s _ _ L C Y _ _ > + 
+             < P r o f i t C o m m i s s i o n A m t _ C o n t r o l 3 3 > P r o f i t C o m m i s s i o n A m t _ C o n t r o l 3 3 < / P r o f i t C o m m i s s i o n A m t _ C o n t r o l 3 3 > + 
+             < S a l e s C o m m i s s i o n A m t _ C o n t r o l 3 2 > S a l e s C o m m i s s i o n A m t _ C o n t r o l 3 2 < / S a l e s C o m m i s s i o n A m t _ C o n t r o l 3 2 > + 
+             < S a l e s p e r s o n P u r c h a s e r _ C o d e > S a l e s p e r s o n P u r c h a s e r _ C o d e < / S a l e s p e r s o n P u r c h a s e r _ C o d e > + 
+             < S a l e s p e r s o n _ P u r c h a s e r _ _ N a m e > S a l e s p e r s o n _ P u r c h a s e r _ _ N a m e < / S a l e s p e r s o n _ P u r c h a s e r _ _ N a m e >   
          < / C u s t _ L e d g e r _ E n t r y >   
-         < S u b t o t a l s   E l e m e n t T y p e = " D a t a I t e m "   E l e m e n t I d = " 8 3 8 6 9 3 5 6 0 " > - 
-             < S u b t o t a l s _ A d j P r o f i t   E l e m e n t T y p e = " C o l u m n "   E l e m e n t I d = " 5 6 1 3 6 6 8 2 2 "   D a t a T y p e = " D e c i m a l " > S u b t o t a l s _ A d j P r o f i t < / S u b t o t a l s _ A d j P r o f i t > - 
-             < S u b t o t a l s _ A d j P r o f i t C o m m i s s i o n   E l e m e n t T y p e = " C o l u m n "   E l e m e n t I d = " 1 4 1 8 9 7 1 8 3 5 "   D a t a T y p e = " D e c i m a l " > S u b t o t a l s _ A d j P r o f i t C o m m i s s i o n < / S u b t o t a l s _ A d j P r o f i t C o m m i s s i o n > - 
-             < S u b t o t a l s _ P r o f i t   E l e m e n t T y p e = " C o l u m n "   E l e m e n t I d = " 2 4 1 5 0 0 6 9 7 "   D a t a T y p e = " D e c i m a l " > S u b t o t a l s _ P r o f i t < / S u b t o t a l s _ P r o f i t > - 
-             < S u b t o t a l s _ P r o f i t C o m m i s s i o n   E l e m e n t T y p e = " C o l u m n "   E l e m e n t I d = " 1 4 9 6 3 3 2 1 7 2 "   D a t a T y p e = " D e c i m a l " > S u b t o t a l s _ P r o f i t C o m m i s s i o n < / S u b t o t a l s _ P r o f i t C o m m i s s i o n > - 
-             < S u b t o t a l s _ S a l e s   E l e m e n t T y p e = " C o l u m n "   E l e m e n t I d = " 1 9 7 8 7 7 5 0 3 "   D a t a T y p e = " D e c i m a l " > S u b t o t a l s _ S a l e s < / S u b t o t a l s _ S a l e s > - 
-             < S u b t o t a l s _ S a l e s C o m m i s s i o n   E l e m e n t T y p e = " C o l u m n "   E l e m e n t I d = " 1 4 7 6 0 7 2 5 9 0 "   D a t a T y p e = " D e c i m a l " > S u b t o t a l s _ S a l e s C o m m i s s i o n < / S u b t o t a l s _ S a l e s C o m m i s s i o n > - 
-             < S u b t o t a l s _ S a l e s p e r s o n _ C o d e   E l e m e n t T y p e = " C o l u m n "   E l e m e n t I d = " 1 1 9 8 5 9 4 2 7 2 "   D a t a T y p e = " C o d e " > S u b t o t a l s _ S a l e s p e r s o n _ C o d e < / S u b t o t a l s _ S a l e s p e r s o n _ C o d e > +         < S u b t o t a l s > + 
+             < S u b t o t a l s _ A d j P r o f i t > S u b t o t a l s _ A d j P r o f i t < / S u b t o t a l s _ A d j P r o f i t > + 
+             < S u b t o t a l s _ A d j P r o f i t C o m m i s s i o n > S u b t o t a l s _ A d j P r o f i t C o m m i s s i o n < / S u b t o t a l s _ A d j P r o f i t C o m m i s s i o n > + 
+             < S u b t o t a l s _ P r o f i t > S u b t o t a l s _ P r o f i t < / S u b t o t a l s _ P r o f i t > + 
+             < S u b t o t a l s _ P r o f i t C o m m i s s i o n > S u b t o t a l s _ P r o f i t C o m m i s s i o n < / S u b t o t a l s _ P r o f i t C o m m i s s i o n > + 
+             < S u b t o t a l s _ S a l e s > S u b t o t a l s _ S a l e s < / S u b t o t a l s _ S a l e s > + 
+             < S u b t o t a l s _ S a l e s C o m m i s s i o n > S u b t o t a l s _ S a l e s C o m m i s s i o n < / S u b t o t a l s _ S a l e s C o m m i s s i o n > + 
+             < S u b t o t a l s _ S a l e s p e r s o n _ C o d e > S u b t o t a l s _ S a l e s p e r s o n _ C o d e < / S u b t o t a l s _ S a l e s p e r s o n _ C o d e >   
          < / S u b t o t a l s >   
      < / S a l e s p e r s o n _ P u r c h a s e r >   
-     < T o t a l s   E l e m e n t T y p e = " D a t a I t e m "   E l e m e n t I d = " 1 8 2 3 9 5 0 0 4 4 " > - 
-         < T o t a l s _ A d j P r o f i t   E l e m e n t T y p e = " C o l u m n "   E l e m e n t I d = " 1 9 0 9 5 0 1 3 6 2 "   D a t a T y p e = " D e c i m a l " > T o t a l s _ A d j P r o f i t < / T o t a l s _ A d j P r o f i t > - 
-         < T o t a l s _ A d j P r o f i t C o m m i s s i o n   E l e m e n t T y p e = " C o l u m n "   E l e m e n t I d = " 9 4 6 1 0 3 7 5 9 "   D a t a T y p e = " D e c i m a l " > T o t a l s _ A d j P r o f i t C o m m i s s i o n < / T o t a l s _ A d j P r o f i t C o m m i s s i o n > - 
-         < T o t a l s _ P r o f i t   E l e m e n t T y p e = " C o l u m n "   E l e m e n t I d = " 6 4 6 2 9 5 2 1 9 "   D a t a T y p e = " D e c i m a l " > T o t a l s _ P r o f i t < / T o t a l s _ P r o f i t > - 
-         < T o t a l s _ P r o f i t C o m m i s s i o n   E l e m e n t T y p e = " C o l u m n "   E l e m e n t I d = " 3 6 7 7 9 1 3 9 2 "   D a t a T y p e = " D e c i m a l " > T o t a l s _ P r o f i t C o m m i s s i o n < / T o t a l s _ P r o f i t C o m m i s s i o n > - 
-         < T o t a l s _ S a l e s   E l e m e n t T y p e = " C o l u m n "   E l e m e n t I d = " 1 3 9 9 9 8 5 1 0 9 "   D a t a T y p e = " D e c i m a l " > T o t a l s _ S a l e s < / T o t a l s _ S a l e s > - 
-         < T o t a l s _ S a l e s C o m m i s s i o n   E l e m e n t T y p e = " C o l u m n "   E l e m e n t I d = " 4 6 4 8 2 3 3 9 8 "   D a t a T y p e = " D e c i m a l " > T o t a l s _ S a l e s C o m m i s s i o n < / T o t a l s _ S a l e s C o m m i s s i o n > +     < T o t a l s > + 
+         < T o t a l s _ A d j P r o f i t > T o t a l s _ A d j P r o f i t < / T o t a l s _ A d j P r o f i t > + 
+         < T o t a l s _ A d j P r o f i t C o m m i s s i o n > T o t a l s _ A d j P r o f i t C o m m i s s i o n < / T o t a l s _ A d j P r o f i t C o m m i s s i o n > + 
+         < T o t a l s _ P r o f i t > T o t a l s _ P r o f i t < / T o t a l s _ P r o f i t > + 
+         < T o t a l s _ P r o f i t C o m m i s s i o n > T o t a l s _ P r o f i t C o m m i s s i o n < / T o t a l s _ P r o f i t C o m m i s s i o n > + 
+         < T o t a l s _ S a l e s > T o t a l s _ S a l e s < / T o t a l s _ S a l e s > + 
+         < T o t a l s _ S a l e s C o m m i s s i o n > T o t a l s _ S a l e s C o m m i s s i o n < / T o t a l s _ S a l e s C o m m i s s i o n >   
      < / T o t a l s >   
  < / N a v W o r d R e p o r t X m l P a r t > 
 </file>
 
-<file path=customXml/item2.xml>��< ? x m l   v e r s i o n = " 1 . 0 "   e n c o d i n g = " u t f - 1 6 " ? > < N a v W o r d R e p o r t X m l P a r t   x m l n s = " u r n : m i c r o s o f t - d y n a m i c s - n a v / r e p o r t s / S a l e s p e r s o n _ C o m m i s s i o n / 1 1 5 / " > +<file path=customXml/item2.xml>��< ? x m l   v e r s i o n = " 1 . 0 "   e n c o d i n g = " u t f - 1 6 " ? > < N a v W o r d R e p o r t X m l P a r t   x m l n s = " u r n : m i c r o s o f t - d y n a m i c s - b u s i n e s s c e n t r a l / i n t e r n a l / e x t e n d e d / r e p o r t s / S a l e s p e r s o n _ C o m m i s s i o n / 1 1 5 / " >   
      < B C R e p o r t I n f o r m a t i o n >   
@@ -4536,185 +4448,255 @@
  
      < L a b e l s >   
-         < A b o u t T h e R e p o r t L a b e l > A b o u t T h e R e p o r t L a b e l < / A b o u t T h e R e p o r t L a b e l > - 
-         < A d j u s t e d P r o f i t C o m m i s s i o n L a b e l > A d j u s t e d P r o f i t C o m m i s s i o n L a b e l < / A d j u s t e d P r o f i t C o m m i s s i o n L a b e l > - 
-         < A d j u s t e d P r o f i t L a b e l > A d j u s t e d P r o f i t L a b e l < / A d j u s t e d P r o f i t L a b e l > - 
-         < A l l A m o u n t s A r e I n L C Y L a b e l > A l l A m o u n t s A r e I n L C Y L a b e l < / A l l A m o u n t s A r e I n L C Y L a b e l > - 
-         < C o m m i s s i o n P e r c e n t L a b e l > C o m m i s s i o n P e r c e n t L a b e l < / C o m m i s s i o n P e r c e n t L a b e l > - 
-         < C o m p a n y L a b e l > C o m p a n y L a b e l < / C o m p a n y L a b e l > - 
-         < C u s t o m e r N a m e L a b e l > C u s t o m e r N a m e L a b e l < / C u s t o m e r N a m e L a b e l > - 
-         < C u s t o m e r N o L a b e l > C u s t o m e r N o L a b e l < / C u s t o m e r N o L a b e l > - 
-         < D a t a R e t r i e v e d > D a t a R e t r i e v e d < / D a t a R e t r i e v e d > - 
-         < D o c u m e n t a t i o n L a b e l > D o c u m e n t a t i o n L a b e l < / D o c u m e n t a t i o n L a b e l > - 
-         < D o c u m e n t N o L a b e l > D o c u m e n t N o L a b e l < / D o c u m e n t N o L a b e l > - 
-         < E n v i r o n m e n t L a b e l > E n v i r o n m e n t L a b e l < / E n v i r o n m e n t L a b e l > - 
-         < P e r i o d C a p t i o n > P e r i o d C a p t i o n < / P e r i o d C a p t i o n > - 
-         < P o s t i n g D a t e L a b e l > P o s t i n g D a t e L a b e l < / P o s t i n g D a t e L a b e l > - 
-         < P r o f i t C o m m i s s i o n L a b e l > P r o f i t C o m m i s s i o n L a b e l < / P r o f i t C o m m i s s i o n L a b e l > - 
-         < P r o f i t L a b e l > P r o f i t L a b e l < / P r o f i t L a b e l > - 
-         < R e p o r t N a m e L a b e l > R e p o r t N a m e L a b e l < / R e p o r t N a m e L a b e l > - 
-         < R u n O n L a b e l > R u n O n L a b e l < / R u n O n L a b e l > - 
-         < S a l e s C o m m i s s i o n L a b e l > S a l e s C o m m i s s i o n L a b e l < / S a l e s C o m m i s s i o n L a b e l > - 
-         < S a l e s L a b e l > S a l e s L a b e l < / S a l e s L a b e l > - 
-         < S a l e s p e r s o n _ P u r c h a s e r _ _ N a m e C a p t i o n > S a l e s p e r s o n _ P u r c h a s e r _ _ N a m e C a p t i o n < / S a l e s p e r s o n _ P u r c h a s e r _ _ N a m e C a p t i o n > - 
-         < S a l e s p e r s o n C o m m i s s i o n A n a l y s i s > S a l e s p e r s o n C o m m i s s i o n A n a l y s i s < / S a l e s p e r s o n C o m m i s s i o n A n a l y s i s > - 
-         < S a l e s p e r s o n C o m m i s s i o n L a b e l > S a l e s p e r s o n C o m m i s s i o n L a b e l < / S a l e s p e r s o n C o m m i s s i o n L a b e l > - 
-         < S a l e s p e r s o n C o m m i s s i o n P r i n t > S a l e s p e r s o n C o m m i s s i o n P r i n t < / S a l e s p e r s o n C o m m i s s i o n P r i n t > - 
-         < S a l e s p e r s o n P u r c h a s e r _ C o d e C a p t i o n > S a l e s p e r s o n P u r c h a s e r _ C o d e C a p t i o n < / S a l e s p e r s o n P u r c h a s e r _ C o d e C a p t i o n > - 
-         < T o t a l s C a p t i o n > T o t a l s C a p t i o n < / T o t a l s C a p t i o n > - 
-         < U s e r L a b e l > U s e r L a b e l < / U s e r L a b e l > +         < A b o u t T h e R e p o r t L a b e l   E l e m e n t T y p e = " P a r a m e t e r "   E l e m e n t I d = " 1 6 7 7 9 2 0 0 1 "   D a t a T y p e = " S t r i n g " > A b o u t T h e R e p o r t L a b e l < / A b o u t T h e R e p o r t L a b e l > + 
+         < A d j u s t e d P r o f i t C o m m i s s i o n L a b e l   E l e m e n t T y p e = " P a r a m e t e r "   E l e m e n t I d = " 9 1 5 5 5 7 0 2 0 "   D a t a T y p e = " S t r i n g " > A d j u s t e d P r o f i t C o m m i s s i o n L a b e l < / A d j u s t e d P r o f i t C o m m i s s i o n L a b e l > + 
+         < A d j u s t e d P r o f i t L a b e l   E l e m e n t T y p e = " P a r a m e t e r "   E l e m e n t I d = " 1 6 1 5 2 8 3 0 4 7 "   D a t a T y p e = " S t r i n g " > A d j u s t e d P r o f i t L a b e l < / A d j u s t e d P r o f i t L a b e l > + 
+         < A l l A m o u n t s A r e I n L C Y L a b e l   E l e m e n t T y p e = " P a r a m e t e r "   E l e m e n t I d = " 5 6 3 5 1 4 3 1 8 "   D a t a T y p e = " S t r i n g " > A l l A m o u n t s A r e I n L C Y L a b e l < / A l l A m o u n t s A r e I n L C Y L a b e l > + 
+         < C o m m i s s i o n P e r c e n t L a b e l   E l e m e n t T y p e = " P a r a m e t e r "   E l e m e n t I d = " 8 3 9 2 6 3 7 6 5 "   D a t a T y p e = " S t r i n g " > C o m m i s s i o n P e r c e n t L a b e l < / C o m m i s s i o n P e r c e n t L a b e l > + 
+         < C o m p a n y L a b e l   E l e m e n t T y p e = " P a r a m e t e r "   E l e m e n t I d = " 3 4 6 7 6 0 3 4 8 "   D a t a T y p e = " S t r i n g " > C o m p a n y L a b e l < / C o m p a n y L a b e l > + 
+         < C u s t o m e r N a m e L a b e l   E l e m e n t T y p e = " P a r a m e t e r "   E l e m e n t I d = " 1 1 1 8 7 9 0 8 8 "   D a t a T y p e = " S t r i n g " > C u s t o m e r N a m e L a b e l < / C u s t o m e r N a m e L a b e l > + 
+         < C u s t o m e r N o L a b e l   E l e m e n t T y p e = " P a r a m e t e r "   E l e m e n t I d = " 3 8 7 4 7 8 0 3 4 "   D a t a T y p e = " S t r i n g " > C u s t o m e r N o L a b e l < / C u s t o m e r N o L a b e l > + 
+         < D a t a R e t r i e v e d   E l e m e n t T y p e = " P a r a m e t e r "   E l e m e n t I d = " 2 9 1 9 1 1 8 0 7 "   D a t a T y p e = " S t r i n g " > D a t a R e t r i e v e d < / D a t a R e t r i e v e d > + 
+         < D o c u m e n t a t i o n L a b e l   E l e m e n t T y p e = " P a r a m e t e r "   E l e m e n t I d = " 1 7 3 8 9 2 4 8 1 5 "   D a t a T y p e = " S t r i n g " > D o c u m e n t a t i o n L a b e l < / D o c u m e n t a t i o n L a b e l > + 
+         < D o c u m e n t N o L a b e l   E l e m e n t T y p e = " P a r a m e t e r "   E l e m e n t I d = " 1 1 4 6 4 3 5 8 0 3 "   D a t a T y p e = " S t r i n g " > D o c u m e n t N o L a b e l < / D o c u m e n t N o L a b e l > + 
+         < E n v i r o n m e n t L a b e l   E l e m e n t T y p e = " P a r a m e t e r "   E l e m e n t I d = " 8 1 8 8 1 6 5 9 0 "   D a t a T y p e = " S t r i n g " > E n v i r o n m e n t L a b e l < / E n v i r o n m e n t L a b e l > + 
+         < P e r i o d C a p t i o n   E l e m e n t T y p e = " P a r a m e t e r "   E l e m e n t I d = " 1 4 7 8 2 5 3 4 2 2 "   D a t a T y p e = " S t r i n g " > P e r i o d C a p t i o n < / P e r i o d C a p t i o n > + 
+         < P o s t i n g D a t e L a b e l   E l e m e n t T y p e = " P a r a m e t e r "   E l e m e n t I d = " 1 7 7 5 7 9 4 2 4 9 "   D a t a T y p e = " S t r i n g " > P o s t i n g D a t e L a b e l < / P o s t i n g D a t e L a b e l > + 
+         < P r o f i t C o m m i s s i o n L a b e l   E l e m e n t T y p e = " P a r a m e t e r "   E l e m e n t I d = " 8 3 2 7 0 6 3 9 2 "   D a t a T y p e = " S t r i n g " > P r o f i t C o m m i s s i o n L a b e l < / P r o f i t C o m m i s s i o n L a b e l > + 
+         < P r o f i t L a b e l   E l e m e n t T y p e = " P a r a m e t e r "   E l e m e n t I d = " 2 5 4 6 3 3 6 4 5 "   D a t a T y p e = " S t r i n g " > P r o f i t L a b e l < / P r o f i t L a b e l > + 
+         < R e p o r t N a m e L a b e l   E l e m e n t T y p e = " P a r a m e t e r "   E l e m e n t I d = " 1 0 2 2 2 9 2 9 8 2 "   D a t a T y p e = " S t r i n g " > R e p o r t N a m e L a b e l < / R e p o r t N a m e L a b e l > + 
+         < R u n O n L a b e l   E l e m e n t T y p e = " P a r a m e t e r "   E l e m e n t I d = " 1 1 1 9 0 3 7 5 9 5 "   D a t a T y p e = " S t r i n g " > R u n O n L a b e l < / R u n O n L a b e l > + 
+         < S a l e s C o m m i s s i o n L a b e l   E l e m e n t T y p e = " P a r a m e t e r "   E l e m e n t I d = " 1 0 1 8 2 6 8 7 7 0 "   D a t a T y p e = " S t r i n g " > S a l e s C o m m i s s i o n L a b e l < / S a l e s C o m m i s s i o n L a b e l > + 
+         < S a l e s L a b e l   E l e m e n t T y p e = " P a r a m e t e r "   E l e m e n t I d = " 1 7 9 5 4 4 8 0 0 5 "   D a t a T y p e = " S t r i n g " > S a l e s L a b e l < / S a l e s L a b e l > + 
+         < S a l e s p e r s o n _ P u r c h a s e r _ _ N a m e C a p t i o n   E l e m e n t T y p e = " P a r a m e t e r "   E l e m e n t I d = " 1 1 9 5 8 7 9 8 7 3 "   D a t a T y p e = " S t r i n g " > S a l e s p e r s o n _ P u r c h a s e r _ _ N a m e C a p t i o n < / S a l e s p e r s o n _ P u r c h a s e r _ _ N a m e C a p t i o n > + 
+         < S a l e s p e r s o n C o m m i s s i o n A n a l y s i s   E l e m e n t T y p e = " P a r a m e t e r "   E l e m e n t I d = " 7 1 5 8 7 1 2 4 7 "   D a t a T y p e = " S t r i n g " > S a l e s p e r s o n C o m m i s s i o n A n a l y s i s < / S a l e s p e r s o n C o m m i s s i o n A n a l y s i s > + 
+         < S a l e s p e r s o n C o m m i s s i o n L a b e l   E l e m e n t T y p e = " P a r a m e t e r "   E l e m e n t I d = " 3 0 0 0 9 6 0 5 1 "   D a t a T y p e = " S t r i n g " > S a l e s p e r s o n C o m m i s s i o n L a b e l < / S a l e s p e r s o n C o m m i s s i o n L a b e l > + 
+         < S a l e s p e r s o n C o m m i s s i o n P r i n t   E l e m e n t T y p e = " P a r a m e t e r "   E l e m e n t I d = " 1 3 1 6 0 2 8 6 0 "   D a t a T y p e = " S t r i n g " > S a l e s p e r s o n C o m m i s s i o n P r i n t < / S a l e s p e r s o n C o m m i s s i o n P r i n t > + 
+         < S a l e s p e r s o n P u r c h a s e r _ C o d e C a p t i o n   E l e m e n t T y p e = " P a r a m e t e r "   E l e m e n t I d = " 1 2 2 1 2 1 9 2 4 5 "   D a t a T y p e = " S t r i n g " > S a l e s p e r s o n P u r c h a s e r _ C o d e C a p t i o n < / S a l e s p e r s o n P u r c h a s e r _ C o d e C a p t i o n > + 
+         < T o t a l s C a p t i o n   E l e m e n t T y p e = " P a r a m e t e r "   E l e m e n t I d = " 2 3 5 4 5 9 0 6 "   D a t a T y p e = " S t r i n g " > T o t a l s C a p t i o n < / T o t a l s C a p t i o n > + 
+         < U s e r L a b e l   E l e m e n t T y p e = " P a r a m e t e r "   E l e m e n t I d = " 8 4 8 8 1 6 7 9 4 "   D a t a T y p e = " S t r i n g " > U s e r L a b e l < / U s e r L a b e l >   
      < / L a b e l s >   
-     < S a l e s p e r s o n _ P u r c h a s e r > - 
-         < A d j P r o f i t > A d j P r o f i t < / A d j P r o f i t > - 
-         < A d j P r o f i t C o m m i s s i o n A m t > A d j P r o f i t C o m m i s s i o n A m t < / A d j P r o f i t C o m m i s s i o n A m t > - 
-         < A d j P r o f i t C o m m i s s i o n A m t _ C o n t r o l 4 5 C a p t i o n > A d j P r o f i t C o m m i s s i o n A m t _ C o n t r o l 4 5 C a p t i o n < / A d j P r o f i t C o m m i s s i o n A m t _ C o n t r o l 4 5 C a p t i o n > - 
-         < A d j P r o f i t _ C o n t r o l 3 9 C a p t i o n > A d j P r o f i t _ C o n t r o l 3 9 C a p t i o n < / A d j P r o f i t _ C o n t r o l 3 9 C a p t i o n > - 
-         < A l l _ a m o u n t s _ a r e _ i n _ L C Y C a p t i o n > A l l _ a m o u n t s _ a r e _ i n _ L C Y C a p t i o n < / A l l _ a m o u n t s _ a r e _ i n _ L C Y C a p t i o n > - 
-         < C O M P A N Y N A M E > C O M P A N Y N A M E < / C O M P A N Y N A M E > - 
-         < C u r r R e p o r t _ P A G E N O C a p t i o n > C u r r R e p o r t _ P A G E N O C a p t i o n < / C u r r R e p o r t _ P A G E N O C a p t i o n > - 
-         < C u s t L e d g E n t r y F i l t e r > C u s t L e d g E n t r y F i l t e r < / C u s t L e d g E n t r y F i l t e r > - 
-         < C u s t _ _ L e d g e r _ E n t r y _ _ C u s t o m e r _ N o _ _ C a p t i o n > C u s t _ _ L e d g e r _ E n t r y _ _ C u s t o m e r _ N o _ _ C a p t i o n < / C u s t _ _ L e d g e r _ E n t r y _ _ C u s t o m e r _ N o _ _ C a p t i o n > - 
-         < C u s t _ _ L e d g e r _ E n t r y _ _ D o c u m e n t _ N o _ _ C a p t i o n > C u s t _ _ L e d g e r _ E n t r y _ _ D o c u m e n t _ N o _ _ C a p t i o n < / C u s t _ _ L e d g e r _ E n t r y _ _ D o c u m e n t _ N o _ _ C a p t i o n > - 
-         < C u s t _ _ L e d g e r _ E n t r y _ _ P o s t i n g _ D a t e _ C a p t i o n > C u s t _ _ L e d g e r _ E n t r y _ _ P o s t i n g _ D a t e _ C a p t i o n < / C u s t _ _ L e d g e r _ E n t r y _ _ P o s t i n g _ D a t e _ C a p t i o n > - 
-         < C u s t _ _ L e d g e r _ E n t r y _ _ P r o f i t _ _ L C Y _ _ C a p t i o n > C u s t _ _ L e d g e r _ E n t r y _ _ P r o f i t _ _ L C Y _ _ C a p t i o n < / C u s t _ _ L e d g e r _ E n t r y _ _ P r o f i t _ _ L C Y _ _ C a p t i o n > - 
-         < C u s t _ _ L e d g e r _ E n t r y _ _ S a l e s _ _ L C Y _ _ C a p t i o n > C u s t _ _ L e d g e r _ E n t r y _ _ S a l e s _ _ L C Y _ _ C a p t i o n < / C u s t _ _ L e d g e r _ E n t r y _ _ S a l e s _ _ L C Y _ _ C a p t i o n > - 
-         < C u s t _ _ L e d g e r _ E n t r y _ _ T A B L E C A P T I O N _ _ _ _ _ _ _ _ _ _ C u s t L e d g E n t r y F i l t e r > C u s t _ _ L e d g e r _ E n t r y _ _ T A B L E C A P T I O N _ _ _ _ _ _ _ _ _ _ C u s t L e d g E n t r y F i l t e r < / C u s t _ _ L e d g e r _ E n t r y _ _ T A B L E C A P T I O N _ _ _ _ _ _ _ _ _ _ C u s t L e d g E n t r y F i l t e r > - 
-         < C u s t _ _ L e d g e r _ E n t r y _ _ _ P r o f i t _ _ L C Y _ _ > C u s t _ _ L e d g e r _ E n t r y _ _ _ P r o f i t _ _ L C Y _ _ < / C u s t _ _ L e d g e r _ E n t r y _ _ _ P r o f i t _ _ L C Y _ _ > - 
-         < C u s t _ _ L e d g e r _ E n t r y _ _ _ S a l e s _ _ L C Y _ _ > C u s t _ _ L e d g e r _ E n t r y _ _ _ S a l e s _ _ L C Y _ _ < / C u s t _ _ L e d g e r _ E n t r y _ _ _ S a l e s _ _ L C Y _ _ > - 
-         < P a g e G r o u p N o > P a g e G r o u p N o < / P a g e G r o u p N o > - 
-         < P r o f i t C o m m i s s i o n A m t > P r o f i t C o m m i s s i o n A m t < / P r o f i t C o m m i s s i o n A m t > - 
-         < P r o f i t C o m m i s s i o n A m t _ C o n t r o l 3 3 C a p t i o n > P r o f i t C o m m i s s i o n A m t _ C o n t r o l 3 3 C a p t i o n < / P r o f i t C o m m i s s i o n A m t _ C o n t r o l 3 3 C a p t i o n > - 
-         < S a l e s C o m m i s s i o n A m t > S a l e s C o m m i s s i o n A m t < / S a l e s C o m m i s s i o n A m t > - 
-         < S a l e s C o m m i s s i o n A m t _ C o n t r o l 3 2 C a p t i o n > S a l e s C o m m i s s i o n A m t _ C o n t r o l 3 2 C a p t i o n < / S a l e s C o m m i s s i o n A m t _ C o n t r o l 3 2 C a p t i o n > - 
-         < S a l e s p e r s o n F i l t e r > S a l e s p e r s o n F i l t e r < / S a l e s p e r s o n F i l t e r > - 
-         < S a l e s p e r s o n _ P u r c h a s e r _ C o d e > S a l e s p e r s o n _ P u r c h a s e r _ C o d e < / S a l e s p e r s o n _ P u r c h a s e r _ C o d e > - 
-         < S a l e s p e r s o n _ P u r c h a s e r _ N a m e > S a l e s p e r s o n _ P u r c h a s e r _ N a m e < / S a l e s p e r s o n _ P u r c h a s e r _ N a m e > - 
-         < S a l e s p e r s o n _ P u r c h a s e r _ _ C o m m i s s i o n _ _ _ > S a l e s p e r s o n _ P u r c h a s e r _ _ C o m m i s s i o n _ _ _ < / S a l e s p e r s o n _ P u r c h a s e r _ _ C o m m i s s i o n _ _ _ > - 
-         < S a l e s p e r s o n _ P u r c h a s e r _ _ C o m m i s s i o n _ _ _ C a p t i o n > S a l e s p e r s o n _ P u r c h a s e r _ _ C o m m i s s i o n _ _ _ C a p t i o n < / S a l e s p e r s o n _ P u r c h a s e r _ _ C o m m i s s i o n _ _ _ C a p t i o n > - 
-         < S a l e s p e r s o n _ P u r c h a s e r _ _ T A B L E C A P T I O N _ _ _ _ _ _ _ _ _ _ S a l e s p e r s o n F i l t e r > S a l e s p e r s o n _ P u r c h a s e r _ _ T A B L E C A P T I O N _ _ _ _ _ _ _ _ _ _ S a l e s p e r s o n F i l t e r < / S a l e s p e r s o n _ P u r c h a s e r _ _ T A B L E C A P T I O N _ _ _ _ _ _ _ _ _ _ S a l e s p e r s o n F i l t e r > - 
-         < S a l e s p e r s o n _ _ _ C o m m i s s i o n C a p t i o n > S a l e s p e r s o n _ _ _ C o m m i s s i o n C a p t i o n < / S a l e s p e r s o n _ _ _ C o m m i s s i o n C a p t i o n > - 
-         < S T R S U B S T N O _ T e x t 0 0 0 _ P e r i o d T e x t _ > S T R S U B S T N O _ T e x t 0 0 0 _ P e r i o d T e x t _ < / S T R S U B S T N O _ T e x t 0 0 0 _ P e r i o d T e x t _ > - 
-         < T o t a l C a p t i o n > T o t a l C a p t i o n < / T o t a l C a p t i o n > - 
-         < C u s t _ L e d g e r _ E n t r y > - 
-             < A d j P r o f i t C o m m i s s i o n A m t _ C o n t r o l 4 5 > A d j P r o f i t C o m m i s s i o n A m t _ C o n t r o l 4 5 < / A d j P r o f i t C o m m i s s i o n A m t _ C o n t r o l 4 5 > - 
-             < A d j P r o f i t _ C o n t r o l 3 9 > A d j P r o f i t _ C o n t r o l 3 9 < / A d j P r o f i t _ C o n t r o l 3 9 > - 
-             < C u s t L e d g e r E n t r y _ C u s t o m e r N a m e > C u s t L e d g e r E n t r y _ C u s t o m e r N a m e < / C u s t L e d g e r E n t r y _ C u s t o m e r N a m e > - 
-             < C u s t _ _ L e d g e r _ E n t r y _ _ C u s t o m e r _ N o _ _ > C u s t _ _ L e d g e r _ E n t r y _ _ C u s t o m e r _ N o _ _ < / C u s t _ _ L e d g e r _ E n t r y _ _ C u s t o m e r _ N o _ _ > - 
-             < C u s t _ _ L e d g e r _ E n t r y _ _ D o c u m e n t _ N o _ _ > C u s t _ _ L e d g e r _ E n t r y _ _ D o c u m e n t _ N o _ _ < / C u s t _ _ L e d g e r _ E n t r y _ _ D o c u m e n t _ N o _ _ > - 
-             < C u s t _ _ L e d g e r _ E n t r y _ _ P o s t i n g _ D a t e _ > C u s t _ _ L e d g e r _ E n t r y _ _ P o s t i n g _ D a t e _ < / C u s t _ _ L e d g e r _ E n t r y _ _ P o s t i n g _ D a t e _ > - 
-             < C u s t _ _ L e d g e r _ E n t r y _ _ P r o f i t _ _ L C Y _ _ > C u s t _ _ L e d g e r _ E n t r y _ _ P r o f i t _ _ L C Y _ _ < / C u s t _ _ L e d g e r _ E n t r y _ _ P r o f i t _ _ L C Y _ _ > - 
-             < C u s t _ _ L e d g e r _ E n t r y _ _ S a l e s _ _ L C Y _ _ > C u s t _ _ L e d g e r _ E n t r y _ _ S a l e s _ _ L C Y _ _ < / C u s t _ _ L e d g e r _ E n t r y _ _ S a l e s _ _ L C Y _ _ > - 
-             < P r o f i t C o m m i s s i o n A m t _ C o n t r o l 3 3 > P r o f i t C o m m i s s i o n A m t _ C o n t r o l 3 3 < / P r o f i t C o m m i s s i o n A m t _ C o n t r o l 3 3 > - 
-             < S a l e s C o m m i s s i o n A m t _ C o n t r o l 3 2 > S a l e s C o m m i s s i o n A m t _ C o n t r o l 3 2 < / S a l e s C o m m i s s i o n A m t _ C o n t r o l 3 2 > - 
-             < S a l e s p e r s o n P u r c h a s e r _ C o d e > S a l e s p e r s o n P u r c h a s e r _ C o d e < / S a l e s p e r s o n P u r c h a s e r _ C o d e > - 
-             < S a l e s p e r s o n _ P u r c h a s e r _ _ N a m e > S a l e s p e r s o n _ P u r c h a s e r _ _ N a m e < / S a l e s p e r s o n _ P u r c h a s e r _ _ N a m e > +     < T o o l t i p s > + 
+         < T o o l t i p   c o l u m n = " S a l e s p e r s o n _ P u r c h a s e r _ C o d e "   E l e m e n t I d = " 1 3 8 8 0 3 1 6 5 2 " > + 
+             < T o o l t i p T e x t   l a n g = " e n - U S " > S p e c i f i e s   a   c o d e   f o r   t h e   s a l e s p e r s o n   o r   p u r c h a s e r . < / T o o l t i p T e x t > + 
+         < / T o o l t i p > + 
+         < T o o l t i p   c o l u m n = " S a l e s p e r s o n _ P u r c h a s e r _ N a m e "   E l e m e n t I d = " 1 3 4 8 2 2 8 4 6 2 " > + 
+             < T o o l t i p T e x t   l a n g = " e n - U S " > S p e c i f i e s   t h e   n a m e   o f   t h e   s a l e s p e r s o n   o r   p u r c h a s e r . < / T o o l t i p T e x t > + 
+         < / T o o l t i p > + 
+         < T o o l t i p   c o l u m n = " S a l e s p e r s o n _ P u r c h a s e r _ _ C o m m i s s i o n _ _ _ "   E l e m e n t I d = " 1 5 9 0 6 8 9 0 0 4 " > + 
+             < T o o l t i p T e x t   l a n g = " e n - U S " > S p e c i f i e s   t h e   p e r c e n t a g e   t o   u s e   t o   c a l c u l a t e   t h e   s a l e s p e r s o n ' s   c o m m i s s i o n . < / T o o l t i p T e x t > + 
+         < / T o o l t i p > + 
+         < T o o l t i p   c o l u m n = " C u s t _ _ L e d g e r _ E n t r y _ _ _ S a l e s _ _ L C Y _ _ "   E l e m e n t I d = " 3 4 8 7 9 4 9 4 9 " > + 
+             < T o o l t i p T e x t   l a n g = " e n - U S " > S p e c i f i e s   t h e   t o t a l   s a l e s   a m o u n t   e x c l .   V A T   t o   t h e   c u s t o m e r   i n   L C Y . < / T o o l t i p T e x t > + 
+         < / T o o l t i p > + 
+         < T o o l t i p   c o l u m n = " C u s t _ _ L e d g e r _ E n t r y _ _ D o c u m e n t _ N o _ _ "   E l e m e n t I d = " 8 5 2 6 1 1 1 8 1 " > + 
+             < T o o l t i p T e x t   l a n g = " e n - U S " > S p e c i f i e s   t h e   e n t r y ' s   d o c u m e n t   n u m b e r . < / T o o l t i p T e x t > + 
+         < / T o o l t i p > + 
+         < T o o l t i p   c o l u m n = " C u s t _ _ L e d g e r _ E n t r y _ _ C u s t o m e r _ N o _ _ "   E l e m e n t I d = " 1 0 0 9 0 1 6 8 0 8 " > + 
+             < T o o l t i p T e x t   l a n g = " e n - U S " > S p e c i f i e s   t h e   c u s t o m e r   a c c o u n t   n u m b e r   t h a t   t h e   e n t r y   i s   l i n k e d   t o . < / T o o l t i p T e x t > + 
+         < / T o o l t i p > + 
+         < T o o l t i p   c o l u m n = " C u s t _ _ L e d g e r _ E n t r y _ _ S a l e s _ _ L C Y _ _ "   E l e m e n t I d = " 8 1 9 5 1 7 4 8 " > + 
+             < T o o l t i p T e x t   l a n g = " e n - U S " > S p e c i f i e s   t h e   t o t a l   s a l e s   a m o u n t   e x c l .   V A T   t o   t h e   c u s t o m e r   i n   L C Y . < / T o o l t i p T e x t > + 
+         < / T o o l t i p > + 
+         < T o o l t i p   c o l u m n = " C u s t L e d g e r E n t r y _ C u s t o m e r N a m e "   E l e m e n t I d = " 2 0 9 1 8 9 3 2 7 9 " > + 
+             < T o o l t i p T e x t   l a n g = " e n - U S " > S p e c i f i e s   t h e   c u s t o m e r   n a m e   t h a t   t h e   e n t r y   i s   l i n k e d   t o . < / T o o l t i p T e x t > + 
+         < / T o o l t i p > + 
+         < T o o l t i p   c o l u m n = " S a l e s p e r s o n P u r c h a s e r _ C o d e "   E l e m e n t I d = " 1 2 2 1 2 1 9 2 4 5 " > + 
+             < T o o l t i p T e x t   l a n g = " e n - U S " > S p e c i f i e s   a   c o d e   f o r   t h e   s a l e s p e r s o n   o r   p u r c h a s e r . < / T o o l t i p T e x t > + 
+         < / T o o l t i p > + 
+         < T o o l t i p   c o l u m n = " S a l e s p e r s o n _ P u r c h a s e r _ _ N a m e "   E l e m e n t I d = " 1 1 9 5 8 7 9 8 7 3 " > + 
+             < T o o l t i p T e x t   l a n g = " e n - U S " > S p e c i f i e s   t h e   n a m e   o f   t h e   s a l e s p e r s o n   o r   p u r c h a s e r . < / T o o l t i p T e x t > + 
+         < / T o o l t i p > + 
+         < T o o l t i p   c o l u m n = " S u b t o t a l s _ S a l e s p e r s o n _ C o d e "   E l e m e n t I d = " 1 1 9 8 5 9 4 2 7 2 " > + 
+             < T o o l t i p T e x t   l a n g = " e n - U S " > S p e c i f i e s   a   c o d e   f o r   t h e   s a l e s p e r s o n   o r   p u r c h a s e r . < / T o o l t i p T e x t > + 
+         < / T o o l t i p > + 
+     < / T o o l t i p s > + 
+     < S a l e s p e r s o n _ P u r c h a s e r   E l e m e n t T y p e = " D a t a I t e m "   E l e m e n t I d = " 7 1 5 0 0 7 1 9 8 " > + 
+         < A d j P r o f i t   E l e m e n t T y p e = " C o l u m n "   E l e m e n t I d = " 6 6 6 3 9 3 8 5 2 "   D a t a T y p e = " D e c i m a l "   O b s o l e t e S t a t e = " P e n d i n g " > A d j P r o f i t < / A d j P r o f i t > + 
+         < A d j P r o f i t C o m m i s s i o n A m t   E l e m e n t T y p e = " C o l u m n "   E l e m e n t I d = " 1 5 8 1 4 8 8 5 9 9 "   D a t a T y p e = " D e c i m a l "   O b s o l e t e S t a t e = " P e n d i n g " > A d j P r o f i t C o m m i s s i o n A m t < / A d j P r o f i t C o m m i s s i o n A m t > + 
+         < A d j P r o f i t C o m m i s s i o n A m t _ C o n t r o l 4 5 C a p t i o n   E l e m e n t T y p e = " C o l u m n "   E l e m e n t I d = " 6 2 1 2 7 7 8 5 4 "   D a t a T y p e = " L a b e l "   O b s o l e t e S t a t e = " P e n d i n g " > A d j P r o f i t C o m m i s s i o n A m t _ C o n t r o l 4 5 C a p t i o n < / A d j P r o f i t C o m m i s s i o n A m t _ C o n t r o l 4 5 C a p t i o n > + 
+         < A d j P r o f i t _ C o n t r o l 3 9 C a p t i o n   E l e m e n t T y p e = " C o l u m n "   E l e m e n t I d = " 2 1 3 3 9 8 4 3 2 "   D a t a T y p e = " L a b e l "   O b s o l e t e S t a t e = " P e n d i n g " > A d j P r o f i t _ C o n t r o l 3 9 C a p t i o n < / A d j P r o f i t _ C o n t r o l 3 9 C a p t i o n > + 
+         < A l l _ a m o u n t s _ a r e _ i n _ L C Y C a p t i o n   E l e m e n t T y p e = " C o l u m n "   E l e m e n t I d = " 6 9 7 4 8 4 8 0 2 "   D a t a T y p e = " L a b e l "   O b s o l e t e S t a t e = " P e n d i n g " > A l l _ a m o u n t s _ a r e _ i n _ L C Y C a p t i o n < / A l l _ a m o u n t s _ a r e _ i n _ L C Y C a p t i o n > + 
+         < C O M P A N Y N A M E   E l e m e n t T y p e = " C o l u m n "   E l e m e n t I d = " 1 7 5 3 0 1 5 1 5 5 "   D a t a T y p e = " S t r i n g "   O b s o l e t e S t a t e = " P e n d i n g " > C O M P A N Y N A M E < / C O M P A N Y N A M E > + 
+         < C u r r R e p o r t _ P A G E N O C a p t i o n   E l e m e n t T y p e = " C o l u m n "   E l e m e n t I d = " 1 8 4 6 2 6 2 1 5 8 "   D a t a T y p e = " L a b e l "   O b s o l e t e S t a t e = " P e n d i n g " > C u r r R e p o r t _ P A G E N O C a p t i o n < / C u r r R e p o r t _ P A G E N O C a p t i o n > + 
+         < C u s t L e d g E n t r y F i l t e r   E l e m e n t T y p e = " C o l u m n "   E l e m e n t I d = " 1 1 7 3 5 3 2 6 6 6 "   D a t a T y p e = " T e x t "   O b s o l e t e S t a t e = " P e n d i n g " > C u s t L e d g E n t r y F i l t e r < / C u s t L e d g E n t r y F i l t e r > + 
+         < C u s t _ _ L e d g e r _ E n t r y _ _ C u s t o m e r _ N o _ _ C a p t i o n   E l e m e n t T y p e = " C o l u m n "   E l e m e n t I d = " 1 2 2 3 8 5 6 2 7 8 "   D a t a T y p e = " S t r i n g "   O b s o l e t e S t a t e = " P e n d i n g " > C u s t _ _ L e d g e r _ E n t r y _ _ C u s t o m e r _ N o _ _ C a p t i o n < / C u s t _ _ L e d g e r _ E n t r y _ _ C u s t o m e r _ N o _ _ C a p t i o n > + 
+         < C u s t _ _ L e d g e r _ E n t r y _ _ D o c u m e n t _ N o _ _ C a p t i o n   E l e m e n t T y p e = " C o l u m n "   E l e m e n t I d = " 4 8 8 8 0 6 5 1 7 "   D a t a T y p e = " S t r i n g "   O b s o l e t e S t a t e = " P e n d i n g " > C u s t _ _ L e d g e r _ E n t r y _ _ D o c u m e n t _ N o _ _ C a p t i o n < / C u s t _ _ L e d g e r _ E n t r y _ _ D o c u m e n t _ N o _ _ C a p t i o n > + 
+         < C u s t _ _ L e d g e r _ E n t r y _ _ P o s t i n g _ D a t e _ C a p t i o n   E l e m e n t T y p e = " C o l u m n "   E l e m e n t I d = " 2 0 7 9 4 3 8 7 1 2 "   D a t a T y p e = " L a b e l "   O b s o l e t e S t a t e = " P e n d i n g " > C u s t _ _ L e d g e r _ E n t r y _ _ P o s t i n g _ D a t e _ C a p t i o n < / C u s t _ _ L e d g e r _ E n t r y _ _ P o s t i n g _ D a t e _ C a p t i o n > + 
+         < C u s t _ _ L e d g e r _ E n t r y _ _ P r o f i t _ _ L C Y _ _ C a p t i o n   E l e m e n t T y p e = " C o l u m n "   E l e m e n t I d = " 1 9 9 4 3 8 8 4 7 6 "   D a t a T y p e = " S t r i n g "   O b s o l e t e S t a t e = " P e n d i n g " > C u s t _ _ L e d g e r _ E n t r y _ _ P r o f i t _ _ L C Y _ _ C a p t i o n < / C u s t _ _ L e d g e r _ E n t r y _ _ P r o f i t _ _ L C Y _ _ C a p t i o n > + 
+         < C u s t _ _ L e d g e r _ E n t r y _ _ S a l e s _ _ L C Y _ _ C a p t i o n   E l e m e n t T y p e = " C o l u m n "   E l e m e n t I d = " 1 0 5 6 9 2 6 5 4 6 "   D a t a T y p e = " S t r i n g "   O b s o l e t e S t a t e = " P e n d i n g " > C u s t _ _ L e d g e r _ E n t r y _ _ S a l e s _ _ L C Y _ _ C a p t i o n < / C u s t _ _ L e d g e r _ E n t r y _ _ S a l e s _ _ L C Y _ _ C a p t i o n > + 
+         < C u s t _ _ L e d g e r _ E n t r y _ _ T A B L E C A P T I O N _ _ _ _ _ _ _ _ _ _ C u s t L e d g E n t r y F i l t e r   E l e m e n t T y p e = " C o l u m n "   E l e m e n t I d = " 7 1 0 6 3 3 9 1 7 "   D a t a T y p e = " T e x t " > C u s t _ _ L e d g e r _ E n t r y _ _ T A B L E C A P T I O N _ _ _ _ _ _ _ _ _ _ C u s t L e d g E n t r y F i l t e r < / C u s t _ _ L e d g e r _ E n t r y _ _ T A B L E C A P T I O N _ _ _ _ _ _ _ _ _ _ C u s t L e d g E n t r y F i l t e r > + 
+         < C u s t _ _ L e d g e r _ E n t r y _ _ _ P r o f i t _ _ L C Y _ _   E l e m e n t T y p e = " C o l u m n "   E l e m e n t I d = " 1 6 1 5 1 3 7 4 4 3 "   D a t a T y p e = " D e c i m a l "   O b s o l e t e S t a t e = " P e n d i n g " > C u s t _ _ L e d g e r _ E n t r y _ _ _ P r o f i t _ _ L C Y _ _ < / C u s t _ _ L e d g e r _ E n t r y _ _ _ P r o f i t _ _ L C Y _ _ > + 
+         < C u s t _ _ L e d g e r _ E n t r y _ _ _ S a l e s _ _ L C Y _ _   E l e m e n t T y p e = " C o l u m n "   E l e m e n t I d = " 3 4 8 7 9 4 9 4 9 "   D a t a T y p e = " D e c i m a l "   O b s o l e t e S t a t e = " P e n d i n g " > C u s t _ _ L e d g e r _ E n t r y _ _ _ S a l e s _ _ L C Y _ _ < / C u s t _ _ L e d g e r _ E n t r y _ _ _ S a l e s _ _ L C Y _ _ > + 
+         < P a g e G r o u p N o   E l e m e n t T y p e = " C o l u m n "   E l e m e n t I d = " 6 4 9 1 8 0 1 4 4 "   D a t a T y p e = " I n t e g e r "   O b s o l e t e S t a t e = " P e n d i n g " > P a g e G r o u p N o < / P a g e G r o u p N o > + 
+         < P r o f i t C o m m i s s i o n A m t   E l e m e n t T y p e = " C o l u m n "   E l e m e n t I d = " 4 1 6 2 2 4 2 0 6 "   D a t a T y p e = " D e c i m a l "   O b s o l e t e S t a t e = " P e n d i n g " > P r o f i t C o m m i s s i o n A m t < / P r o f i t C o m m i s s i o n A m t > + 
+         < P r o f i t C o m m i s s i o n A m t _ C o n t r o l 3 3 C a p t i o n   E l e m e n t T y p e = " C o l u m n "   E l e m e n t I d = " 4 6 5 8 1 2 5 3 6 "   D a t a T y p e = " L a b e l "   O b s o l e t e S t a t e = " P e n d i n g " > P r o f i t C o m m i s s i o n A m t _ C o n t r o l 3 3 C a p t i o n < / P r o f i t C o m m i s s i o n A m t _ C o n t r o l 3 3 C a p t i o n > + 
+         < S a l e s C o m m i s s i o n A m t   E l e m e n t T y p e = " C o l u m n "   E l e m e n t I d = " 1 6 5 6 6 7 5 0 1 6 "   D a t a T y p e = " D e c i m a l "   O b s o l e t e S t a t e = " P e n d i n g " > S a l e s C o m m i s s i o n A m t < / S a l e s C o m m i s s i o n A m t > + 
+         < S a l e s C o m m i s s i o n A m t _ C o n t r o l 3 2 C a p t i o n   E l e m e n t T y p e = " C o l u m n "   E l e m e n t I d = " 1 2 7 2 6 4 2 0 6 5 "   D a t a T y p e = " L a b e l "   O b s o l e t e S t a t e = " P e n d i n g " > S a l e s C o m m i s s i o n A m t _ C o n t r o l 3 2 C a p t i o n < / S a l e s C o m m i s s i o n A m t _ C o n t r o l 3 2 C a p t i o n > + 
+         < S a l e s p e r s o n F i l t e r   E l e m e n t T y p e = " C o l u m n "   E l e m e n t I d = " 1 2 4 2 2 8 3 2 5 6 "   D a t a T y p e = " T e x t "   O b s o l e t e S t a t e = " P e n d i n g " > S a l e s p e r s o n F i l t e r < / S a l e s p e r s o n F i l t e r > + 
+         < S a l e s p e r s o n _ P u r c h a s e r _ C o d e   E l e m e n t T y p e = " C o l u m n "   E l e m e n t I d = " 1 3 8 8 0 3 1 6 5 2 "   D a t a T y p e = " C o d e " > S a l e s p e r s o n _ P u r c h a s e r _ C o d e < / S a l e s p e r s o n _ P u r c h a s e r _ C o d e > + 
+         < S a l e s p e r s o n _ P u r c h a s e r _ N a m e   E l e m e n t T y p e = " C o l u m n "   E l e m e n t I d = " 1 3 4 8 2 2 8 4 6 2 "   D a t a T y p e = " T e x t " > S a l e s p e r s o n _ P u r c h a s e r _ N a m e < / S a l e s p e r s o n _ P u r c h a s e r _ N a m e > + 
+         < S a l e s p e r s o n _ P u r c h a s e r _ _ C o m m i s s i o n _ _ _   E l e m e n t T y p e = " C o l u m n "   E l e m e n t I d = " 1 5 9 0 6 8 9 0 0 4 "   D a t a T y p e = " D e c i m a l " > S a l e s p e r s o n _ P u r c h a s e r _ _ C o m m i s s i o n _ _ _ < / S a l e s p e r s o n _ P u r c h a s e r _ _ C o m m i s s i o n _ _ _ > + 
+         < S a l e s p e r s o n _ P u r c h a s e r _ _ C o m m i s s i o n _ _ _ C a p t i o n   E l e m e n t T y p e = " C o l u m n "   E l e m e n t I d = " 4 9 9 4 6 3 1 7 0 "   D a t a T y p e = " S t r i n g "   O b s o l e t e S t a t e = " P e n d i n g " > S a l e s p e r s o n _ P u r c h a s e r _ _ C o m m i s s i o n _ _ _ C a p t i o n < / S a l e s p e r s o n _ P u r c h a s e r _ _ C o m m i s s i o n _ _ _ C a p t i o n > + 
+         < S a l e s p e r s o n _ P u r c h a s e r _ _ T A B L E C A P T I O N _ _ _ _ _ _ _ _ _ _ S a l e s p e r s o n F i l t e r   E l e m e n t T y p e = " C o l u m n "   E l e m e n t I d = " 1 0 1 6 0 4 1 6 9 9 "   D a t a T y p e = " T e x t " > S a l e s p e r s o n _ P u r c h a s e r _ _ T A B L E C A P T I O N _ _ _ _ _ _ _ _ _ _ S a l e s p e r s o n F i l t e r < / S a l e s p e r s o n _ P u r c h a s e r _ _ T A B L E C A P T I O N _ _ _ _ _ _ _ _ _ _ S a l e s p e r s o n F i l t e r > + 
+         < S a l e s p e r s o n _ _ _ C o m m i s s i o n C a p t i o n   E l e m e n t T y p e = " C o l u m n "   E l e m e n t I d = " 1 7 6 9 4 7 1 9 4 8 "   D a t a T y p e = " L a b e l "   O b s o l e t e S t a t e = " P e n d i n g " > S a l e s p e r s o n _ _ _ C o m m i s s i o n C a p t i o n < / S a l e s p e r s o n _ _ _ C o m m i s s i o n C a p t i o n > + 
+         < S T R S U B S T N O _ T e x t 0 0 0 _ P e r i o d T e x t _   E l e m e n t T y p e = " C o l u m n "   E l e m e n t I d = " 7 2 2 9 9 1 7 0 4 "   D a t a T y p e = " S t r i n g " > S T R S U B S T N O _ T e x t 0 0 0 _ P e r i o d T e x t _ < / S T R S U B S T N O _ T e x t 0 0 0 _ P e r i o d T e x t _ > + 
+         < T o t a l C a p t i o n   E l e m e n t T y p e = " C o l u m n "   E l e m e n t I d = " 7 0 7 1 0 2 6 9 5 "   D a t a T y p e = " L a b e l "   O b s o l e t e S t a t e = " P e n d i n g " > T o t a l C a p t i o n < / T o t a l C a p t i o n > + 
+         < C u s t _ L e d g e r _ E n t r y   E l e m e n t T y p e = " D a t a I t e m "   E l e m e n t I d = " 1 6 3 9 1 4 6 4 4 5 " > + 
+             < A d j P r o f i t C o m m i s s i o n A m t _ C o n t r o l 4 5   E l e m e n t T y p e = " C o l u m n "   E l e m e n t I d = " 8 0 5 8 9 6 4 0 0 "   D a t a T y p e = " D e c i m a l " > A d j P r o f i t C o m m i s s i o n A m t _ C o n t r o l 4 5 < / A d j P r o f i t C o m m i s s i o n A m t _ C o n t r o l 4 5 > + 
+             < A d j P r o f i t _ C o n t r o l 3 9   E l e m e n t T y p e = " C o l u m n "   E l e m e n t I d = " 2 0 2 4 1 9 6 5 4 2 "   D a t a T y p e = " D e c i m a l " > A d j P r o f i t _ C o n t r o l 3 9 < / A d j P r o f i t _ C o n t r o l 3 9 > + 
+             < C u s t L e d g e r E n t r y _ C u s t o m e r N a m e   E l e m e n t T y p e = " C o l u m n "   E l e m e n t I d = " 2 0 9 1 8 9 3 2 7 9 "   D a t a T y p e = " T e x t " > C u s t L e d g e r E n t r y _ C u s t o m e r N a m e < / C u s t L e d g e r E n t r y _ C u s t o m e r N a m e > + 
+             < C u s t _ _ L e d g e r _ E n t r y _ _ C u s t o m e r _ N o _ _   E l e m e n t T y p e = " C o l u m n "   E l e m e n t I d = " 1 0 0 9 0 1 6 8 0 8 "   D a t a T y p e = " C o d e " > C u s t _ _ L e d g e r _ E n t r y _ _ C u s t o m e r _ N o _ _ < / C u s t _ _ L e d g e r _ E n t r y _ _ C u s t o m e r _ N o _ _ > + 
+             < C u s t _ _ L e d g e r _ E n t r y _ _ D o c u m e n t _ N o _ _   E l e m e n t T y p e = " C o l u m n "   E l e m e n t I d = " 8 5 2 6 1 1 1 8 1 "   D a t a T y p e = " C o d e " > C u s t _ _ L e d g e r _ E n t r y _ _ D o c u m e n t _ N o _ _ < / C u s t _ _ L e d g e r _ E n t r y _ _ D o c u m e n t _ N o _ _ > + 
+             < C u s t _ _ L e d g e r _ E n t r y _ _ P o s t i n g _ D a t e _   E l e m e n t T y p e = " C o l u m n "   E l e m e n t I d = " 2 1 4 2 6 5 7 1 6 2 "   D a t a T y p e = " S t r i n g " > C u s t _ _ L e d g e r _ E n t r y _ _ P o s t i n g _ D a t e _ < / C u s t _ _ L e d g e r _ E n t r y _ _ P o s t i n g _ D a t e _ > + 
+             < C u s t _ _ L e d g e r _ E n t r y _ _ P r o f i t _ _ L C Y _ _   E l e m e n t T y p e = " C o l u m n "   E l e m e n t I d = " 5 1 9 3 4 1 8 2 6 "   D a t a T y p e = " D e c i m a l " > C u s t _ _ L e d g e r _ E n t r y _ _ P r o f i t _ _ L C Y _ _ < / C u s t _ _ L e d g e r _ E n t r y _ _ P r o f i t _ _ L C Y _ _ > + 
+             < C u s t _ _ L e d g e r _ E n t r y _ _ S a l e s _ _ L C Y _ _   E l e m e n t T y p e = " C o l u m n "   E l e m e n t I d = " 8 1 9 5 1 7 4 8 "   D a t a T y p e = " D e c i m a l " > C u s t _ _ L e d g e r _ E n t r y _ _ S a l e s _ _ L C Y _ _ < / C u s t _ _ L e d g e r _ E n t r y _ _ S a l e s _ _ L C Y _ _ > + 
+             < P r o f i t C o m m i s s i o n A m t _ C o n t r o l 3 3   E l e m e n t T y p e = " C o l u m n "   E l e m e n t I d = " 3 1 2 1 8 6 8 2 6 "   D a t a T y p e = " D e c i m a l " > P r o f i t C o m m i s s i o n A m t _ C o n t r o l 3 3 < / P r o f i t C o m m i s s i o n A m t _ C o n t r o l 3 3 > + 
+             < S a l e s C o m m i s s i o n A m t _ C o n t r o l 3 2   E l e m e n t T y p e = " C o l u m n "   E l e m e n t I d = " 1 4 6 2 3 9 0 1 5 3 "   D a t a T y p e = " D e c i m a l " > S a l e s C o m m i s s i o n A m t _ C o n t r o l 3 2 < / S a l e s C o m m i s s i o n A m t _ C o n t r o l 3 2 > + 
+             < S a l e s p e r s o n P u r c h a s e r _ C o d e   E l e m e n t T y p e = " C o l u m n "   E l e m e n t I d = " 1 2 2 1 2 1 9 2 4 5 "   D a t a T y p e = " C o d e " > S a l e s p e r s o n P u r c h a s e r _ C o d e < / S a l e s p e r s o n P u r c h a s e r _ C o d e > + 
+             < S a l e s p e r s o n _ P u r c h a s e r _ _ N a m e   E l e m e n t T y p e = " C o l u m n "   E l e m e n t I d = " 1 1 9 5 8 7 9 8 7 3 "   D a t a T y p e = " T e x t " > S a l e s p e r s o n _ P u r c h a s e r _ _ N a m e < / S a l e s p e r s o n _ P u r c h a s e r _ _ N a m e >   
          < / C u s t _ L e d g e r _ E n t r y >   
-         < S u b t o t a l s > - 
-             < S u b t o t a l s _ A d j P r o f i t > S u b t o t a l s _ A d j P r o f i t < / S u b t o t a l s _ A d j P r o f i t > - 
-             < S u b t o t a l s _ A d j P r o f i t C o m m i s s i o n > S u b t o t a l s _ A d j P r o f i t C o m m i s s i o n < / S u b t o t a l s _ A d j P r o f i t C o m m i s s i o n > - 
-             < S u b t o t a l s _ P r o f i t > S u b t o t a l s _ P r o f i t < / S u b t o t a l s _ P r o f i t > - 
-             < S u b t o t a l s _ P r o f i t C o m m i s s i o n > S u b t o t a l s _ P r o f i t C o m m i s s i o n < / S u b t o t a l s _ P r o f i t C o m m i s s i o n > - 
-             < S u b t o t a l s _ S a l e s > S u b t o t a l s _ S a l e s < / S u b t o t a l s _ S a l e s > - 
-             < S u b t o t a l s _ S a l e s C o m m i s s i o n > S u b t o t a l s _ S a l e s C o m m i s s i o n < / S u b t o t a l s _ S a l e s C o m m i s s i o n > - 
-             < S u b t o t a l s _ S a l e s p e r s o n _ C o d e > S u b t o t a l s _ S a l e s p e r s o n _ C o d e < / S u b t o t a l s _ S a l e s p e r s o n _ C o d e > +         < S u b t o t a l s   E l e m e n t T y p e = " D a t a I t e m "   E l e m e n t I d = " 8 3 8 6 9 3 5 6 0 " > + 
+             < S u b t o t a l s _ A d j P r o f i t   E l e m e n t T y p e = " C o l u m n "   E l e m e n t I d = " 5 6 1 3 6 6 8 2 2 "   D a t a T y p e = " D e c i m a l " > S u b t o t a l s _ A d j P r o f i t < / S u b t o t a l s _ A d j P r o f i t > + 
+             < S u b t o t a l s _ A d j P r o f i t C o m m i s s i o n   E l e m e n t T y p e = " C o l u m n "   E l e m e n t I d = " 1 4 1 8 9 7 1 8 3 5 "   D a t a T y p e = " D e c i m a l " > S u b t o t a l s _ A d j P r o f i t C o m m i s s i o n < / S u b t o t a l s _ A d j P r o f i t C o m m i s s i o n > + 
+             < S u b t o t a l s _ P r o f i t   E l e m e n t T y p e = " C o l u m n "   E l e m e n t I d = " 2 4 1 5 0 0 6 9 7 "   D a t a T y p e = " D e c i m a l " > S u b t o t a l s _ P r o f i t < / S u b t o t a l s _ P r o f i t > + 
+             < S u b t o t a l s _ P r o f i t C o m m i s s i o n   E l e m e n t T y p e = " C o l u m n "   E l e m e n t I d = " 1 4 9 6 3 3 2 1 7 2 "   D a t a T y p e = " D e c i m a l " > S u b t o t a l s _ P r o f i t C o m m i s s i o n < / S u b t o t a l s _ P r o f i t C o m m i s s i o n > + 
+             < S u b t o t a l s _ S a l e s   E l e m e n t T y p e = " C o l u m n "   E l e m e n t I d = " 1 9 7 8 7 7 5 0 3 "   D a t a T y p e = " D e c i m a l " > S u b t o t a l s _ S a l e s < / S u b t o t a l s _ S a l e s > + 
+             < S u b t o t a l s _ S a l e s C o m m i s s i o n   E l e m e n t T y p e = " C o l u m n "   E l e m e n t I d = " 1 4 7 6 0 7 2 5 9 0 "   D a t a T y p e = " D e c i m a l " > S u b t o t a l s _ S a l e s C o m m i s s i o n < / S u b t o t a l s _ S a l e s C o m m i s s i o n > + 
+             < S u b t o t a l s _ S a l e s p e r s o n _ C o d e   E l e m e n t T y p e = " C o l u m n "   E l e m e n t I d = " 1 1 9 8 5 9 4 2 7 2 "   D a t a T y p e = " C o d e " > S u b t o t a l s _ S a l e s p e r s o n _ C o d e < / S u b t o t a l s _ S a l e s p e r s o n _ C o d e >   
          < / S u b t o t a l s >   
      < / S a l e s p e r s o n _ P u r c h a s e r >   
-     < T o t a l s > - 
-         < T o t a l s _ A d j P r o f i t > T o t a l s _ A d j P r o f i t < / T o t a l s _ A d j P r o f i t > - 
-         < T o t a l s _ A d j P r o f i t C o m m i s s i o n > T o t a l s _ A d j P r o f i t C o m m i s s i o n < / T o t a l s _ A d j P r o f i t C o m m i s s i o n > - 
-         < T o t a l s _ P r o f i t > T o t a l s _ P r o f i t < / T o t a l s _ P r o f i t > - 
-         < T o t a l s _ P r o f i t C o m m i s s i o n > T o t a l s _ P r o f i t C o m m i s s i o n < / T o t a l s _ P r o f i t C o m m i s s i o n > - 
-         < T o t a l s _ S a l e s > T o t a l s _ S a l e s < / T o t a l s _ S a l e s > - 
-         < T o t a l s _ S a l e s C o m m i s s i o n > T o t a l s _ S a l e s C o m m i s s i o n < / T o t a l s _ S a l e s C o m m i s s i o n > +     < T o t a l s   E l e m e n t T y p e = " D a t a I t e m "   E l e m e n t I d = " 1 8 2 3 9 5 0 0 4 4 " > + 
+         < T o t a l s _ A d j P r o f i t   E l e m e n t T y p e = " C o l u m n "   E l e m e n t I d = " 1 9 0 9 5 0 1 3 6 2 "   D a t a T y p e = " D e c i m a l " > T o t a l s _ A d j P r o f i t < / T o t a l s _ A d j P r o f i t > + 
+         < T o t a l s _ A d j P r o f i t C o m m i s s i o n   E l e m e n t T y p e = " C o l u m n "   E l e m e n t I d = " 9 4 6 1 0 3 7 5 9 "   D a t a T y p e = " D e c i m a l " > T o t a l s _ A d j P r o f i t C o m m i s s i o n < / T o t a l s _ A d j P r o f i t C o m m i s s i o n > + 
+         < T o t a l s _ P r o f i t   E l e m e n t T y p e = " C o l u m n "   E l e m e n t I d = " 6 4 6 2 9 5 2 1 9 "   D a t a T y p e = " D e c i m a l " > T o t a l s _ P r o f i t < / T o t a l s _ P r o f i t > + 
+         < T o t a l s _ P r o f i t C o m m i s s i o n   E l e m e n t T y p e = " C o l u m n "   E l e m e n t I d = " 3 6 7 7 9 1 3 9 2 "   D a t a T y p e = " D e c i m a l " > T o t a l s _ P r o f i t C o m m i s s i o n < / T o t a l s _ P r o f i t C o m m i s s i o n > + 
+         < T o t a l s _ S a l e s   E l e m e n t T y p e = " C o l u m n "   E l e m e n t I d = " 1 3 9 9 9 8 5 1 0 9 "   D a t a T y p e = " D e c i m a l " > T o t a l s _ S a l e s < / T o t a l s _ S a l e s > + 
+         < T o t a l s _ S a l e s C o m m i s s i o n   E l e m e n t T y p e = " C o l u m n "   E l e m e n t I d = " 4 6 4 8 2 3 3 9 8 "   D a t a T y p e = " D e c i m a l " > T o t a l s _ S a l e s C o m m i s s i o n < / T o t a l s _ S a l e s C o m m i s s i o n >   
      < / T o t a l s >   
@@ -4722,17 +4704,17 @@
 </file>
 
 <file path=customXml/itemProps1.xml><?xml version="1.0" encoding="utf-8"?>
-<ds:datastoreItem xmlns:ds="http://schemas.openxmlformats.org/officeDocument/2006/customXml" ds:itemID="{A0CC7945-5283-4905-A71D-472246249B67}">
+<ds:datastoreItem xmlns:ds="http://schemas.openxmlformats.org/officeDocument/2006/customXml" ds:itemID="{79D6D75F-D29A-40D3-A819-B215617F17D6}">
   <ds:schemaRefs>
-    <ds:schemaRef ds:uri="urn:microsoft-dynamics-businesscentral/internal/extended/reports/Salesperson_Commission/115/"/>
+    <ds:schemaRef ds:uri="urn:microsoft-dynamics-nav/reports/Salesperson_Commission/115/"/>
   </ds:schemaRefs>
 </ds:datastoreItem>
 </file>
 
 <file path=customXml/itemProps2.xml><?xml version="1.0" encoding="utf-8"?>
-<ds:datastoreItem xmlns:ds="http://schemas.openxmlformats.org/officeDocument/2006/customXml" ds:itemID="{79D6D75F-D29A-40D3-A819-B215617F17D6}">
+<ds:datastoreItem xmlns:ds="http://schemas.openxmlformats.org/officeDocument/2006/customXml" ds:itemID="{A0CC7945-5283-4905-A71D-472246249B67}">
   <ds:schemaRefs>
-    <ds:schemaRef ds:uri="urn:microsoft-dynamics-nav/reports/Salesperson_Commission/115/"/>
+    <ds:schemaRef ds:uri="urn:microsoft-dynamics-businesscentral/internal/extended/reports/Salesperson_Commission/115/"/>
   </ds:schemaRefs>
 </ds:datastoreItem>
 </file>

</xml_diff>

<commit_message>
[29.0] Bring in the corrected Salesperson Commission body template
Backports the LCY-notice binding fix from source PR #10495: the
template now binds Labels/AllAmountsAreInLCYLabel instead of the
CLEAN27-excluded Salesperson_Purchaser/All_amounts_are_in_LCYCaption
dataset column.

Blob now matches the source branch's 634b3f819.
</commit_message>
<xml_diff>
--- a/src/Layers/W1/BaseApp/Sales/Reports/SalespersonCommissionBody.docx
+++ b/src/Layers/W1/BaseApp/Sales/Reports/SalespersonCommissionBody.docx
@@ -54,13 +54,12 @@
         </w:trPr>
         <w:sdt>
           <w:sdtPr>
-            <w:alias w:val="All_amounts_are_in_LCYCaption"/>
-            <w:tag w:val="#BC:InsertDataItem,DataItems/Salesperson_Purchaser/All_amounts_are_in_LCYCaption"/>
-            <w:id w:val="1521658723"/>
+            <w:alias w:val="AllAmountsAreInLCYLabel"/>
+            <w:tag w:val="#BC:InsertDataItem,Labels/AllAmountsAreInLCYLabel"/>
+            <w:id w:val="1797175241"/>
             <w:placeholder>
               <w:docPart w:val="DefaultPlaceholder_-1854013440"/>
             </w:placeholder>
-            <w:dataBinding w:prefixMappings="xmlns:ns0='urn:microsoft-dynamics-nav/reports/Salesperson_Commission/115/'" w:xpath="/ns0:NavWordReportXmlPart[1]/ns0:Salesperson_Purchaser[1]/ns0:All_amounts_are_in_LCYCaption[1]" w:storeItemID="{79D6D75F-D29A-40D3-A819-B215617F17D6}"/>
             <w15:color w:val="808080"/>
             <w:text/>
           </w:sdtPr>
@@ -73,9 +72,11 @@
                 <w:pPr>
                   <w:pStyle w:val="NoSpacing"/>
                 </w:pPr>
+                <w:proofErr w:type="spellStart"/>
                 <w:r>
-                  <w:t>All_amounts_are_in_LCYCaption</w:t>
+                  <w:t>AllAmountsAreInLCYLabel</w:t>
                 </w:r>
+                <w:proofErr w:type="spellEnd"/>
               </w:p>
             </w:tc>
           </w:sdtContent>
@@ -457,7 +458,6 @@
           <w15:dataBinding w:prefixMappings="xmlns:ns0='urn:microsoft-dynamics-nav/reports/Salesperson_Commission/115/' " w:xpath="/ns0:NavWordReportXmlPart[1]/ns0:Salesperson_Purchaser" w:storeItemID="{79D6D75F-D29A-40D3-A819-B215617F17D6}"/>
           <w15:repeatingSection/>
         </w:sdtPr>
-        <w:sdtEndPr/>
         <w:sdtContent>
           <w:sdt>
             <w:sdtPr>
@@ -470,7 +470,6 @@
               </w:placeholder>
               <w15:repeatingSectionItem/>
             </w:sdtPr>
-            <w:sdtEndPr/>
             <w:sdtContent>
               <w:tr>
                 <w:trPr>
@@ -2945,6 +2944,7 @@
     <w:rsid w:val="00115A94"/>
     <w:rsid w:val="001557A7"/>
     <w:rsid w:val="00193CFB"/>
+    <w:rsid w:val="002217FC"/>
     <w:rsid w:val="002409E2"/>
     <w:rsid w:val="00280142"/>
     <w:rsid w:val="002B3616"/>
@@ -2986,6 +2986,7 @@
     <w:rsid w:val="00753B56"/>
     <w:rsid w:val="007A0F74"/>
     <w:rsid w:val="007A75D3"/>
+    <w:rsid w:val="007D6844"/>
     <w:rsid w:val="00843CE7"/>
     <w:rsid w:val="0086264C"/>
     <w:rsid w:val="008858E8"/>
@@ -2995,6 +2996,7 @@
     <w:rsid w:val="009051A9"/>
     <w:rsid w:val="0091315A"/>
     <w:rsid w:val="00933416"/>
+    <w:rsid w:val="00951E4E"/>
     <w:rsid w:val="009B3459"/>
     <w:rsid w:val="009D3079"/>
     <w:rsid w:val="009E275F"/>
@@ -3553,13 +3555,6 @@
       <w:lang w:val="da-DK" w:eastAsia="da-DK"/>
     </w:rPr>
   </w:style>
-  <w:style w:type="paragraph" w:customStyle="1" w:styleId="FE268EC6B73C45C69982695EA660ACAC">
-    <w:name w:val="FE268EC6B73C45C69982695EA660ACAC"/>
-    <w:rsid w:val="00115A94"/>
-    <w:rPr>
-      <w:lang w:val="en-US" w:eastAsia="en-US"/>
-    </w:rPr>
-  </w:style>
   <w:style w:type="paragraph" w:customStyle="1" w:styleId="07B3927F190F42D19E177B7F12BBAA0D">
     <w:name w:val="07B3927F190F42D19E177B7F12BBAA0D"/>
     <w:rsid w:val="00115A94"/>
@@ -3591,34 +3586,6 @@
   <w:style w:type="paragraph" w:customStyle="1" w:styleId="C41C9EC9AFA54E0BB32956D2C6A0BE8D">
     <w:name w:val="C41C9EC9AFA54E0BB32956D2C6A0BE8D"/>
     <w:rsid w:val="00115A94"/>
-    <w:rPr>
-      <w:lang w:val="en-US" w:eastAsia="en-US"/>
-    </w:rPr>
-  </w:style>
-  <w:style w:type="paragraph" w:customStyle="1" w:styleId="C794FD860E444D3AB10D10EA8F2F89B6">
-    <w:name w:val="C794FD860E444D3AB10D10EA8F2F89B6"/>
-    <w:rsid w:val="00475EE0"/>
-    <w:rPr>
-      <w:lang w:val="en-US" w:eastAsia="en-US"/>
-    </w:rPr>
-  </w:style>
-  <w:style w:type="paragraph" w:customStyle="1" w:styleId="260CCBCB6F184F98939C6790AD527268">
-    <w:name w:val="260CCBCB6F184F98939C6790AD527268"/>
-    <w:rsid w:val="00475EE0"/>
-    <w:rPr>
-      <w:lang w:val="en-US" w:eastAsia="en-US"/>
-    </w:rPr>
-  </w:style>
-  <w:style w:type="paragraph" w:customStyle="1" w:styleId="1972C88321944DA7BCF7DD61D956D2F1">
-    <w:name w:val="1972C88321944DA7BCF7DD61D956D2F1"/>
-    <w:rsid w:val="00475EE0"/>
-    <w:rPr>
-      <w:lang w:val="en-US" w:eastAsia="en-US"/>
-    </w:rPr>
-  </w:style>
-  <w:style w:type="paragraph" w:customStyle="1" w:styleId="B25EB7399EAE40469875C4F3B1FA4AD6">
-    <w:name w:val="B25EB7399EAE40469875C4F3B1FA4AD6"/>
-    <w:rsid w:val="00475EE0"/>
     <w:rPr>
       <w:lang w:val="en-US" w:eastAsia="en-US"/>
     </w:rPr>
@@ -3956,6 +3923,9 @@
   <wetp:taskpane dockstate="right" visibility="0" width="350" row="2">
     <wetp:webextensionref xmlns:r="http://schemas.openxmlformats.org/officeDocument/2006/relationships" r:id="rId2"/>
   </wetp:taskpane>
+  <wetp:taskpane dockstate="right" visibility="0" width="350" row="3">
+    <wetp:webextensionref xmlns:r="http://schemas.openxmlformats.org/officeDocument/2006/relationships" r:id="rId3"/>
+  </wetp:taskpane>
 </wetp:taskpanes>
 </file>
 
@@ -3985,7 +3955,19 @@
 </we:webextension>
 </file>
 
-<file path=customXml/item1.xml>��< ? x m l   v e r s i o n = " 1 . 0 "   e n c o d i n g = " u t f - 1 6 " ? > < N a v W o r d R e p o r t X m l P a r t   x m l n s = " u r n : m i c r o s o f t - d y n a m i c s - b u s i n e s s c e n t r a l / i n t e r n a l / e x t e n d e d / r e p o r t s / S a l e s p e r s o n _ C o m m i s s i o n / 1 1 5 / " > +<file path=word/webextensions/webextension3.xml><?xml version="1.0" encoding="utf-8"?>
+<we:webextension xmlns:we="http://schemas.microsoft.com/office/webextensions/webextension/2010/11" id="{BE860300-A89B-410C-A34C-3BA7FAA2B841}">
+  <we:reference id="WA200009156" version="2.0.3.0" store="Omex" storeType="OMEX"/>
+  <we:alternateReferences>
+    <we:reference id="WA200009156" version="2.0.3.0" store="WA200009156" storeType="OMEX"/>
+  </we:alternateReferences>
+  <we:properties/>
+  <we:bindings/>
+  <we:snapshot xmlns:r="http://schemas.openxmlformats.org/officeDocument/2006/relationships"/>
+</we:webextension>
+</file>
+
+<file path=customXml/item1.xml>��< ? x m l   v e r s i o n = " 1 . 0 "   e n c o d i n g = " u t f - 1 6 " ? > < N a v W o r d R e p o r t X m l P a r t   x m l n s = " u r n : m i c r o s o f t - d y n a m i c s - n a v / r e p o r t s / S a l e s p e r s o n _ C o m m i s s i o n / 1 1 5 / " >   
      < B C R e p o r t I n f o r m a t i o n >   
@@ -4133,262 +4115,192 @@
  
      < L a b e l s >   
-         < A b o u t T h e R e p o r t L a b e l   E l e m e n t T y p e = " P a r a m e t e r "   E l e m e n t I d = " 1 6 7 7 9 2 0 0 1 "   D a t a T y p e = " S t r i n g " > A b o u t T h e R e p o r t L a b e l < / A b o u t T h e R e p o r t L a b e l > - 
-         < A d j u s t e d P r o f i t C o m m i s s i o n L a b e l   E l e m e n t T y p e = " P a r a m e t e r "   E l e m e n t I d = " 9 1 5 5 5 7 0 2 0 "   D a t a T y p e = " S t r i n g " > A d j u s t e d P r o f i t C o m m i s s i o n L a b e l < / A d j u s t e d P r o f i t C o m m i s s i o n L a b e l > - 
-         < A d j u s t e d P r o f i t L a b e l   E l e m e n t T y p e = " P a r a m e t e r "   E l e m e n t I d = " 1 6 1 5 2 8 3 0 4 7 "   D a t a T y p e = " S t r i n g " > A d j u s t e d P r o f i t L a b e l < / A d j u s t e d P r o f i t L a b e l > - 
-         < A l l A m o u n t s A r e I n L C Y L a b e l   E l e m e n t T y p e = " P a r a m e t e r "   E l e m e n t I d = " 5 6 3 5 1 4 3 1 8 "   D a t a T y p e = " S t r i n g " > A l l A m o u n t s A r e I n L C Y L a b e l < / A l l A m o u n t s A r e I n L C Y L a b e l > - 
-         < C o m m i s s i o n P e r c e n t L a b e l   E l e m e n t T y p e = " P a r a m e t e r "   E l e m e n t I d = " 8 3 9 2 6 3 7 6 5 "   D a t a T y p e = " S t r i n g " > C o m m i s s i o n P e r c e n t L a b e l < / C o m m i s s i o n P e r c e n t L a b e l > - 
-         < C o m p a n y L a b e l   E l e m e n t T y p e = " P a r a m e t e r "   E l e m e n t I d = " 3 4 6 7 6 0 3 4 8 "   D a t a T y p e = " S t r i n g " > C o m p a n y L a b e l < / C o m p a n y L a b e l > - 
-         < C u s t o m e r N a m e L a b e l   E l e m e n t T y p e = " P a r a m e t e r "   E l e m e n t I d = " 1 1 1 8 7 9 0 8 8 "   D a t a T y p e = " S t r i n g " > C u s t o m e r N a m e L a b e l < / C u s t o m e r N a m e L a b e l > - 
-         < C u s t o m e r N o L a b e l   E l e m e n t T y p e = " P a r a m e t e r "   E l e m e n t I d = " 3 8 7 4 7 8 0 3 4 "   D a t a T y p e = " S t r i n g " > C u s t o m e r N o L a b e l < / C u s t o m e r N o L a b e l > - 
-         < D a t a R e t r i e v e d   E l e m e n t T y p e = " P a r a m e t e r "   E l e m e n t I d = " 2 9 1 9 1 1 8 0 7 "   D a t a T y p e = " S t r i n g " > D a t a R e t r i e v e d < / D a t a R e t r i e v e d > - 
-         < D o c u m e n t a t i o n L a b e l   E l e m e n t T y p e = " P a r a m e t e r "   E l e m e n t I d = " 1 7 3 8 9 2 4 8 1 5 "   D a t a T y p e = " S t r i n g " > D o c u m e n t a t i o n L a b e l < / D o c u m e n t a t i o n L a b e l > - 
-         < D o c u m e n t N o L a b e l   E l e m e n t T y p e = " P a r a m e t e r "   E l e m e n t I d = " 1 1 4 6 4 3 5 8 0 3 "   D a t a T y p e = " S t r i n g " > D o c u m e n t N o L a b e l < / D o c u m e n t N o L a b e l > - 
-         < E n v i r o n m e n t L a b e l   E l e m e n t T y p e = " P a r a m e t e r "   E l e m e n t I d = " 8 1 8 8 1 6 5 9 0 "   D a t a T y p e = " S t r i n g " > E n v i r o n m e n t L a b e l < / E n v i r o n m e n t L a b e l > - 
-         < P e r i o d C a p t i o n   E l e m e n t T y p e = " P a r a m e t e r "   E l e m e n t I d = " 1 4 7 8 2 5 3 4 2 2 "   D a t a T y p e = " S t r i n g " > P e r i o d C a p t i o n < / P e r i o d C a p t i o n > - 
-         < P o s t i n g D a t e L a b e l   E l e m e n t T y p e = " P a r a m e t e r "   E l e m e n t I d = " 1 7 7 5 7 9 4 2 4 9 "   D a t a T y p e = " S t r i n g " > P o s t i n g D a t e L a b e l < / P o s t i n g D a t e L a b e l > - 
-         < P r o f i t C o m m i s s i o n L a b e l   E l e m e n t T y p e = " P a r a m e t e r "   E l e m e n t I d = " 8 3 2 7 0 6 3 9 2 "   D a t a T y p e = " S t r i n g " > P r o f i t C o m m i s s i o n L a b e l < / P r o f i t C o m m i s s i o n L a b e l > - 
-         < P r o f i t L a b e l   E l e m e n t T y p e = " P a r a m e t e r "   E l e m e n t I d = " 2 5 4 6 3 3 6 4 5 "   D a t a T y p e = " S t r i n g " > P r o f i t L a b e l < / P r o f i t L a b e l > - 
-         < R e p o r t N a m e L a b e l   E l e m e n t T y p e = " P a r a m e t e r "   E l e m e n t I d = " 1 0 2 2 2 9 2 9 8 2 "   D a t a T y p e = " S t r i n g " > R e p o r t N a m e L a b e l < / R e p o r t N a m e L a b e l > - 
-         < R u n O n L a b e l   E l e m e n t T y p e = " P a r a m e t e r "   E l e m e n t I d = " 1 1 1 9 0 3 7 5 9 5 "   D a t a T y p e = " S t r i n g " > R u n O n L a b e l < / R u n O n L a b e l > - 
-         < S a l e s C o m m i s s i o n L a b e l   E l e m e n t T y p e = " P a r a m e t e r "   E l e m e n t I d = " 1 0 1 8 2 6 8 7 7 0 "   D a t a T y p e = " S t r i n g " > S a l e s C o m m i s s i o n L a b e l < / S a l e s C o m m i s s i o n L a b e l > - 
-         < S a l e s L a b e l   E l e m e n t T y p e = " P a r a m e t e r "   E l e m e n t I d = " 1 7 9 5 4 4 8 0 0 5 "   D a t a T y p e = " S t r i n g " > S a l e s L a b e l < / S a l e s L a b e l > - 
-         < S a l e s p e r s o n _ P u r c h a s e r _ _ N a m e C a p t i o n   E l e m e n t T y p e = " P a r a m e t e r "   E l e m e n t I d = " 1 1 9 5 8 7 9 8 7 3 "   D a t a T y p e = " S t r i n g " > S a l e s p e r s o n _ P u r c h a s e r _ _ N a m e C a p t i o n < / S a l e s p e r s o n _ P u r c h a s e r _ _ N a m e C a p t i o n > - 
-         < S a l e s p e r s o n C o m m i s s i o n A n a l y s i s   E l e m e n t T y p e = " P a r a m e t e r "   E l e m e n t I d = " 7 1 5 8 7 1 2 4 7 "   D a t a T y p e = " S t r i n g " > S a l e s p e r s o n C o m m i s s i o n A n a l y s i s < / S a l e s p e r s o n C o m m i s s i o n A n a l y s i s > - 
-         < S a l e s p e r s o n C o m m i s s i o n L a b e l   E l e m e n t T y p e = " P a r a m e t e r "   E l e m e n t I d = " 3 0 0 0 9 6 0 5 1 "   D a t a T y p e = " S t r i n g " > S a l e s p e r s o n C o m m i s s i o n L a b e l < / S a l e s p e r s o n C o m m i s s i o n L a b e l > - 
-         < S a l e s p e r s o n C o m m i s s i o n P r i n t   E l e m e n t T y p e = " P a r a m e t e r "   E l e m e n t I d = " 1 3 1 6 0 2 8 6 0 "   D a t a T y p e = " S t r i n g " > S a l e s p e r s o n C o m m i s s i o n P r i n t < / S a l e s p e r s o n C o m m i s s i o n P r i n t > - 
-         < S a l e s p e r s o n P u r c h a s e r _ C o d e C a p t i o n   E l e m e n t T y p e = " P a r a m e t e r "   E l e m e n t I d = " 1 2 2 1 2 1 9 2 4 5 "   D a t a T y p e = " S t r i n g " > S a l e s p e r s o n P u r c h a s e r _ C o d e C a p t i o n < / S a l e s p e r s o n P u r c h a s e r _ C o d e C a p t i o n > - 
-         < T o t a l s C a p t i o n   E l e m e n t T y p e = " P a r a m e t e r "   E l e m e n t I d = " 2 3 5 4 5 9 0 6 "   D a t a T y p e = " S t r i n g " > T o t a l s C a p t i o n < / T o t a l s C a p t i o n > - 
-         < U s e r L a b e l   E l e m e n t T y p e = " P a r a m e t e r "   E l e m e n t I d = " 8 4 8 8 1 6 7 9 4 "   D a t a T y p e = " S t r i n g " > U s e r L a b e l < / U s e r L a b e l > +         < A b o u t T h e R e p o r t L a b e l > A b o u t T h e R e p o r t L a b e l < / A b o u t T h e R e p o r t L a b e l > + 
+         < A d j u s t e d P r o f i t C o m m i s s i o n L a b e l > A d j u s t e d P r o f i t C o m m i s s i o n L a b e l < / A d j u s t e d P r o f i t C o m m i s s i o n L a b e l > + 
+         < A d j u s t e d P r o f i t L a b e l > A d j u s t e d P r o f i t L a b e l < / A d j u s t e d P r o f i t L a b e l > + 
+         < A l l A m o u n t s A r e I n L C Y L a b e l > A l l A m o u n t s A r e I n L C Y L a b e l < / A l l A m o u n t s A r e I n L C Y L a b e l > + 
+         < C o m m i s s i o n P e r c e n t L a b e l > C o m m i s s i o n P e r c e n t L a b e l < / C o m m i s s i o n P e r c e n t L a b e l > + 
+         < C o m p a n y L a b e l > C o m p a n y L a b e l < / C o m p a n y L a b e l > + 
+         < C u s t o m e r N a m e L a b e l > C u s t o m e r N a m e L a b e l < / C u s t o m e r N a m e L a b e l > + 
+         < C u s t o m e r N o L a b e l > C u s t o m e r N o L a b e l < / C u s t o m e r N o L a b e l > + 
+         < D a t a R e t r i e v e d > D a t a R e t r i e v e d < / D a t a R e t r i e v e d > + 
+         < D o c u m e n t a t i o n L a b e l > D o c u m e n t a t i o n L a b e l < / D o c u m e n t a t i o n L a b e l > + 
+         < D o c u m e n t N o L a b e l > D o c u m e n t N o L a b e l < / D o c u m e n t N o L a b e l > + 
+         < E n v i r o n m e n t L a b e l > E n v i r o n m e n t L a b e l < / E n v i r o n m e n t L a b e l > + 
+         < P e r i o d C a p t i o n > P e r i o d C a p t i o n < / P e r i o d C a p t i o n > + 
+         < P o s t i n g D a t e L a b e l > P o s t i n g D a t e L a b e l < / P o s t i n g D a t e L a b e l > + 
+         < P r o f i t C o m m i s s i o n L a b e l > P r o f i t C o m m i s s i o n L a b e l < / P r o f i t C o m m i s s i o n L a b e l > + 
+         < P r o f i t L a b e l > P r o f i t L a b e l < / P r o f i t L a b e l > + 
+         < R e p o r t N a m e L a b e l > R e p o r t N a m e L a b e l < / R e p o r t N a m e L a b e l > + 
+         < R u n O n L a b e l > R u n O n L a b e l < / R u n O n L a b e l > + 
+         < S a l e s C o m m i s s i o n L a b e l > S a l e s C o m m i s s i o n L a b e l < / S a l e s C o m m i s s i o n L a b e l > + 
+         < S a l e s L a b e l > S a l e s L a b e l < / S a l e s L a b e l > + 
+         < S a l e s p e r s o n _ P u r c h a s e r _ _ N a m e C a p t i o n > S a l e s p e r s o n _ P u r c h a s e r _ _ N a m e C a p t i o n < / S a l e s p e r s o n _ P u r c h a s e r _ _ N a m e C a p t i o n > + 
+         < S a l e s p e r s o n C o m m i s s i o n A n a l y s i s > S a l e s p e r s o n C o m m i s s i o n A n a l y s i s < / S a l e s p e r s o n C o m m i s s i o n A n a l y s i s > + 
+         < S a l e s p e r s o n C o m m i s s i o n L a b e l > S a l e s p e r s o n C o m m i s s i o n L a b e l < / S a l e s p e r s o n C o m m i s s i o n L a b e l > + 
+         < S a l e s p e r s o n C o m m i s s i o n P r i n t > S a l e s p e r s o n C o m m i s s i o n P r i n t < / S a l e s p e r s o n C o m m i s s i o n P r i n t > + 
+         < S a l e s p e r s o n P u r c h a s e r _ C o d e C a p t i o n > S a l e s p e r s o n P u r c h a s e r _ C o d e C a p t i o n < / S a l e s p e r s o n P u r c h a s e r _ C o d e C a p t i o n > + 
+         < T o t a l s C a p t i o n > T o t a l s C a p t i o n < / T o t a l s C a p t i o n > + 
+         < U s e r L a b e l > U s e r L a b e l < / U s e r L a b e l >   
      < / L a b e l s >   
-     < T o o l t i p s > - 
-         < T o o l t i p   c o l u m n = " S a l e s p e r s o n _ P u r c h a s e r _ C o d e "   E l e m e n t I d = " 1 3 8 8 0 3 1 6 5 2 " > - 
-             < T o o l t i p T e x t   l a n g = " e n - U S " > S p e c i f i e s   a   c o d e   f o r   t h e   s a l e s p e r s o n   o r   p u r c h a s e r . < / T o o l t i p T e x t > - 
-         < / T o o l t i p > - 
-         < T o o l t i p   c o l u m n = " S a l e s p e r s o n _ P u r c h a s e r _ N a m e "   E l e m e n t I d = " 1 3 4 8 2 2 8 4 6 2 " > - 
-             < T o o l t i p T e x t   l a n g = " e n - U S " > S p e c i f i e s   t h e   n a m e   o f   t h e   s a l e s p e r s o n   o r   p u r c h a s e r . < / T o o l t i p T e x t > - 
-         < / T o o l t i p > - 
-         < T o o l t i p   c o l u m n = " S a l e s p e r s o n _ P u r c h a s e r _ _ C o m m i s s i o n _ _ _ "   E l e m e n t I d = " 1 5 9 0 6 8 9 0 0 4 " > - 
-             < T o o l t i p T e x t   l a n g = " e n - U S " > S p e c i f i e s   t h e   p e r c e n t a g e   t o   u s e   t o   c a l c u l a t e   t h e   s a l e s p e r s o n ' s   c o m m i s s i o n . < / T o o l t i p T e x t > - 
-         < / T o o l t i p > - 
-         < T o o l t i p   c o l u m n = " C u s t _ _ L e d g e r _ E n t r y _ _ _ S a l e s _ _ L C Y _ _ "   E l e m e n t I d = " 3 4 8 7 9 4 9 4 9 " > - 
-             < T o o l t i p T e x t   l a n g = " e n - U S " > S p e c i f i e s   t h e   t o t a l   s a l e s   a m o u n t   e x c l .   V A T   t o   t h e   c u s t o m e r   i n   L C Y . < / T o o l t i p T e x t > - 
-         < / T o o l t i p > - 
-         < T o o l t i p   c o l u m n = " C u s t _ _ L e d g e r _ E n t r y _ _ D o c u m e n t _ N o _ _ "   E l e m e n t I d = " 8 5 2 6 1 1 1 8 1 " > - 
-             < T o o l t i p T e x t   l a n g = " e n - U S " > S p e c i f i e s   t h e   e n t r y ' s   d o c u m e n t   n u m b e r . < / T o o l t i p T e x t > - 
-         < / T o o l t i p > - 
-         < T o o l t i p   c o l u m n = " C u s t _ _ L e d g e r _ E n t r y _ _ C u s t o m e r _ N o _ _ "   E l e m e n t I d = " 1 0 0 9 0 1 6 8 0 8 " > - 
-             < T o o l t i p T e x t   l a n g = " e n - U S " > S p e c i f i e s   t h e   c u s t o m e r   a c c o u n t   n u m b e r   t h a t   t h e   e n t r y   i s   l i n k e d   t o . < / T o o l t i p T e x t > - 
-         < / T o o l t i p > - 
-         < T o o l t i p   c o l u m n = " C u s t _ _ L e d g e r _ E n t r y _ _ S a l e s _ _ L C Y _ _ "   E l e m e n t I d = " 8 1 9 5 1 7 4 8 " > - 
-             < T o o l t i p T e x t   l a n g = " e n - U S " > S p e c i f i e s   t h e   t o t a l   s a l e s   a m o u n t   e x c l .   V A T   t o   t h e   c u s t o m e r   i n   L C Y . < / T o o l t i p T e x t > - 
-         < / T o o l t i p > - 
-         < T o o l t i p   c o l u m n = " C u s t L e d g e r E n t r y _ C u s t o m e r N a m e "   E l e m e n t I d = " 2 0 9 1 8 9 3 2 7 9 " > - 
-             < T o o l t i p T e x t   l a n g = " e n - U S " > S p e c i f i e s   t h e   c u s t o m e r   n a m e   t h a t   t h e   e n t r y   i s   l i n k e d   t o . < / T o o l t i p T e x t > - 
-         < / T o o l t i p > - 
-         < T o o l t i p   c o l u m n = " S a l e s p e r s o n P u r c h a s e r _ C o d e "   E l e m e n t I d = " 1 2 2 1 2 1 9 2 4 5 " > - 
-             < T o o l t i p T e x t   l a n g = " e n - U S " > S p e c i f i e s   a   c o d e   f o r   t h e   s a l e s p e r s o n   o r   p u r c h a s e r . < / T o o l t i p T e x t > - 
-         < / T o o l t i p > - 
-         < T o o l t i p   c o l u m n = " S a l e s p e r s o n _ P u r c h a s e r _ _ N a m e "   E l e m e n t I d = " 1 1 9 5 8 7 9 8 7 3 " > - 
-             < T o o l t i p T e x t   l a n g = " e n - U S " > S p e c i f i e s   t h e   n a m e   o f   t h e   s a l e s p e r s o n   o r   p u r c h a s e r . < / T o o l t i p T e x t > - 
-         < / T o o l t i p > - 
-         < T o o l t i p   c o l u m n = " S u b t o t a l s _ S a l e s p e r s o n _ C o d e "   E l e m e n t I d = " 1 1 9 8 5 9 4 2 7 2 " > - 
-             < T o o l t i p T e x t   l a n g = " e n - U S " > S p e c i f i e s   a   c o d e   f o r   t h e   s a l e s p e r s o n   o r   p u r c h a s e r . < / T o o l t i p T e x t > - 
-         < / T o o l t i p > - 
-     < / T o o l t i p s > - 
-     < S a l e s p e r s o n _ P u r c h a s e r   E l e m e n t T y p e = " D a t a I t e m "   E l e m e n t I d = " 7 1 5 0 0 7 1 9 8 " > - 
-         < A d j P r o f i t   E l e m e n t T y p e = " C o l u m n "   E l e m e n t I d = " 6 6 6 3 9 3 8 5 2 "   D a t a T y p e = " D e c i m a l "   O b s o l e t e S t a t e = " P e n d i n g " > A d j P r o f i t < / A d j P r o f i t > - 
-         < A d j P r o f i t C o m m i s s i o n A m t   E l e m e n t T y p e = " C o l u m n "   E l e m e n t I d = " 1 5 8 1 4 8 8 5 9 9 "   D a t a T y p e = " D e c i m a l "   O b s o l e t e S t a t e = " P e n d i n g " > A d j P r o f i t C o m m i s s i o n A m t < / A d j P r o f i t C o m m i s s i o n A m t > - 
-         < A d j P r o f i t C o m m i s s i o n A m t _ C o n t r o l 4 5 C a p t i o n   E l e m e n t T y p e = " C o l u m n "   E l e m e n t I d = " 6 2 1 2 7 7 8 5 4 "   D a t a T y p e = " L a b e l "   O b s o l e t e S t a t e = " P e n d i n g " > A d j P r o f i t C o m m i s s i o n A m t _ C o n t r o l 4 5 C a p t i o n < / A d j P r o f i t C o m m i s s i o n A m t _ C o n t r o l 4 5 C a p t i o n > - 
-         < A d j P r o f i t _ C o n t r o l 3 9 C a p t i o n   E l e m e n t T y p e = " C o l u m n "   E l e m e n t I d = " 2 1 3 3 9 8 4 3 2 "   D a t a T y p e = " L a b e l "   O b s o l e t e S t a t e = " P e n d i n g " > A d j P r o f i t _ C o n t r o l 3 9 C a p t i o n < / A d j P r o f i t _ C o n t r o l 3 9 C a p t i o n > - 
-         < A l l _ a m o u n t s _ a r e _ i n _ L C Y C a p t i o n   E l e m e n t T y p e = " C o l u m n "   E l e m e n t I d = " 6 9 7 4 8 4 8 0 2 "   D a t a T y p e = " L a b e l "   O b s o l e t e S t a t e = " P e n d i n g " > A l l _ a m o u n t s _ a r e _ i n _ L C Y C a p t i o n < / A l l _ a m o u n t s _ a r e _ i n _ L C Y C a p t i o n > - 
-         < C O M P A N Y N A M E   E l e m e n t T y p e = " C o l u m n "   E l e m e n t I d = " 1 7 5 3 0 1 5 1 5 5 "   D a t a T y p e = " S t r i n g "   O b s o l e t e S t a t e = " P e n d i n g " > C O M P A N Y N A M E < / C O M P A N Y N A M E > - 
-         < C u r r R e p o r t _ P A G E N O C a p t i o n   E l e m e n t T y p e = " C o l u m n "   E l e m e n t I d = " 1 8 4 6 2 6 2 1 5 8 "   D a t a T y p e = " L a b e l "   O b s o l e t e S t a t e = " P e n d i n g " > C u r r R e p o r t _ P A G E N O C a p t i o n < / C u r r R e p o r t _ P A G E N O C a p t i o n > - 
-         < C u s t L e d g E n t r y F i l t e r   E l e m e n t T y p e = " C o l u m n "   E l e m e n t I d = " 1 1 7 3 5 3 2 6 6 6 "   D a t a T y p e = " T e x t "   O b s o l e t e S t a t e = " P e n d i n g " > C u s t L e d g E n t r y F i l t e r < / C u s t L e d g E n t r y F i l t e r > - 
-         < C u s t _ _ L e d g e r _ E n t r y _ _ C u s t o m e r _ N o _ _ C a p t i o n   E l e m e n t T y p e = " C o l u m n "   E l e m e n t I d = " 1 2 2 3 8 5 6 2 7 8 "   D a t a T y p e = " S t r i n g "   O b s o l e t e S t a t e = " P e n d i n g " > C u s t _ _ L e d g e r _ E n t r y _ _ C u s t o m e r _ N o _ _ C a p t i o n < / C u s t _ _ L e d g e r _ E n t r y _ _ C u s t o m e r _ N o _ _ C a p t i o n > - 
-         < C u s t _ _ L e d g e r _ E n t r y _ _ D o c u m e n t _ N o _ _ C a p t i o n   E l e m e n t T y p e = " C o l u m n "   E l e m e n t I d = " 4 8 8 8 0 6 5 1 7 "   D a t a T y p e = " S t r i n g "   O b s o l e t e S t a t e = " P e n d i n g " > C u s t _ _ L e d g e r _ E n t r y _ _ D o c u m e n t _ N o _ _ C a p t i o n < / C u s t _ _ L e d g e r _ E n t r y _ _ D o c u m e n t _ N o _ _ C a p t i o n > - 
-         < C u s t _ _ L e d g e r _ E n t r y _ _ P o s t i n g _ D a t e _ C a p t i o n   E l e m e n t T y p e = " C o l u m n "   E l e m e n t I d = " 2 0 7 9 4 3 8 7 1 2 "   D a t a T y p e = " L a b e l "   O b s o l e t e S t a t e = " P e n d i n g " > C u s t _ _ L e d g e r _ E n t r y _ _ P o s t i n g _ D a t e _ C a p t i o n < / C u s t _ _ L e d g e r _ E n t r y _ _ P o s t i n g _ D a t e _ C a p t i o n > - 
-         < C u s t _ _ L e d g e r _ E n t r y _ _ P r o f i t _ _ L C Y _ _ C a p t i o n   E l e m e n t T y p e = " C o l u m n "   E l e m e n t I d = " 1 9 9 4 3 8 8 4 7 6 "   D a t a T y p e = " S t r i n g "   O b s o l e t e S t a t e = " P e n d i n g " > C u s t _ _ L e d g e r _ E n t r y _ _ P r o f i t _ _ L C Y _ _ C a p t i o n < / C u s t _ _ L e d g e r _ E n t r y _ _ P r o f i t _ _ L C Y _ _ C a p t i o n > - 
-         < C u s t _ _ L e d g e r _ E n t r y _ _ S a l e s _ _ L C Y _ _ C a p t i o n   E l e m e n t T y p e = " C o l u m n "   E l e m e n t I d = " 1 0 5 6 9 2 6 5 4 6 "   D a t a T y p e = " S t r i n g "   O b s o l e t e S t a t e = " P e n d i n g " > C u s t _ _ L e d g e r _ E n t r y _ _ S a l e s _ _ L C Y _ _ C a p t i o n < / C u s t _ _ L e d g e r _ E n t r y _ _ S a l e s _ _ L C Y _ _ C a p t i o n > - 
-         < C u s t _ _ L e d g e r _ E n t r y _ _ T A B L E C A P T I O N _ _ _ _ _ _ _ _ _ _ C u s t L e d g E n t r y F i l t e r   E l e m e n t T y p e = " C o l u m n "   E l e m e n t I d = " 7 1 0 6 3 3 9 1 7 "   D a t a T y p e = " T e x t " > C u s t _ _ L e d g e r _ E n t r y _ _ T A B L E C A P T I O N _ _ _ _ _ _ _ _ _ _ C u s t L e d g E n t r y F i l t e r < / C u s t _ _ L e d g e r _ E n t r y _ _ T A B L E C A P T I O N _ _ _ _ _ _ _ _ _ _ C u s t L e d g E n t r y F i l t e r > - 
-         < C u s t _ _ L e d g e r _ E n t r y _ _ _ P r o f i t _ _ L C Y _ _   E l e m e n t T y p e = " C o l u m n "   E l e m e n t I d = " 1 6 1 5 1 3 7 4 4 3 "   D a t a T y p e = " D e c i m a l "   O b s o l e t e S t a t e = " P e n d i n g " > C u s t _ _ L e d g e r _ E n t r y _ _ _ P r o f i t _ _ L C Y _ _ < / C u s t _ _ L e d g e r _ E n t r y _ _ _ P r o f i t _ _ L C Y _ _ > - 
-         < C u s t _ _ L e d g e r _ E n t r y _ _ _ S a l e s _ _ L C Y _ _   E l e m e n t T y p e = " C o l u m n "   E l e m e n t I d = " 3 4 8 7 9 4 9 4 9 "   D a t a T y p e = " D e c i m a l "   O b s o l e t e S t a t e = " P e n d i n g " > C u s t _ _ L e d g e r _ E n t r y _ _ _ S a l e s _ _ L C Y _ _ < / C u s t _ _ L e d g e r _ E n t r y _ _ _ S a l e s _ _ L C Y _ _ > - 
-         < P a g e G r o u p N o   E l e m e n t T y p e = " C o l u m n "   E l e m e n t I d = " 6 4 9 1 8 0 1 4 4 "   D a t a T y p e = " I n t e g e r "   O b s o l e t e S t a t e = " P e n d i n g " > P a g e G r o u p N o < / P a g e G r o u p N o > - 
-         < P r o f i t C o m m i s s i o n A m t   E l e m e n t T y p e = " C o l u m n "   E l e m e n t I d = " 4 1 6 2 2 4 2 0 6 "   D a t a T y p e = " D e c i m a l "   O b s o l e t e S t a t e = " P e n d i n g " > P r o f i t C o m m i s s i o n A m t < / P r o f i t C o m m i s s i o n A m t > - 
-         < P r o f i t C o m m i s s i o n A m t _ C o n t r o l 3 3 C a p t i o n   E l e m e n t T y p e = " C o l u m n "   E l e m e n t I d = " 4 6 5 8 1 2 5 3 6 "   D a t a T y p e = " L a b e l "   O b s o l e t e S t a t e = " P e n d i n g " > P r o f i t C o m m i s s i o n A m t _ C o n t r o l 3 3 C a p t i o n < / P r o f i t C o m m i s s i o n A m t _ C o n t r o l 3 3 C a p t i o n > - 
-         < S a l e s C o m m i s s i o n A m t   E l e m e n t T y p e = " C o l u m n "   E l e m e n t I d = " 1 6 5 6 6 7 5 0 1 6 "   D a t a T y p e = " D e c i m a l "   O b s o l e t e S t a t e = " P e n d i n g " > S a l e s C o m m i s s i o n A m t < / S a l e s C o m m i s s i o n A m t > - 
-         < S a l e s C o m m i s s i o n A m t _ C o n t r o l 3 2 C a p t i o n   E l e m e n t T y p e = " C o l u m n "   E l e m e n t I d = " 1 2 7 2 6 4 2 0 6 5 "   D a t a T y p e = " L a b e l "   O b s o l e t e S t a t e = " P e n d i n g " > S a l e s C o m m i s s i o n A m t _ C o n t r o l 3 2 C a p t i o n < / S a l e s C o m m i s s i o n A m t _ C o n t r o l 3 2 C a p t i o n > - 
-         < S a l e s p e r s o n F i l t e r   E l e m e n t T y p e = " C o l u m n "   E l e m e n t I d = " 1 2 4 2 2 8 3 2 5 6 "   D a t a T y p e = " T e x t "   O b s o l e t e S t a t e = " P e n d i n g " > S a l e s p e r s o n F i l t e r < / S a l e s p e r s o n F i l t e r > - 
-         < S a l e s p e r s o n _ P u r c h a s e r _ C o d e   E l e m e n t T y p e = " C o l u m n "   E l e m e n t I d = " 1 3 8 8 0 3 1 6 5 2 "   D a t a T y p e = " C o d e " > S a l e s p e r s o n _ P u r c h a s e r _ C o d e < / S a l e s p e r s o n _ P u r c h a s e r _ C o d e > - 
-         < S a l e s p e r s o n _ P u r c h a s e r _ N a m e   E l e m e n t T y p e = " C o l u m n "   E l e m e n t I d = " 1 3 4 8 2 2 8 4 6 2 "   D a t a T y p e = " T e x t " > S a l e s p e r s o n _ P u r c h a s e r _ N a m e < / S a l e s p e r s o n _ P u r c h a s e r _ N a m e > - 
-         < S a l e s p e r s o n _ P u r c h a s e r _ _ C o m m i s s i o n _ _ _   E l e m e n t T y p e = " C o l u m n "   E l e m e n t I d = " 1 5 9 0 6 8 9 0 0 4 "   D a t a T y p e = " D e c i m a l " > S a l e s p e r s o n _ P u r c h a s e r _ _ C o m m i s s i o n _ _ _ < / S a l e s p e r s o n _ P u r c h a s e r _ _ C o m m i s s i o n _ _ _ > - 
-         < S a l e s p e r s o n _ P u r c h a s e r _ _ C o m m i s s i o n _ _ _ C a p t i o n   E l e m e n t T y p e = " C o l u m n "   E l e m e n t I d = " 4 9 9 4 6 3 1 7 0 "   D a t a T y p e = " S t r i n g "   O b s o l e t e S t a t e = " P e n d i n g " > S a l e s p e r s o n _ P u r c h a s e r _ _ C o m m i s s i o n _ _ _ C a p t i o n < / S a l e s p e r s o n _ P u r c h a s e r _ _ C o m m i s s i o n _ _ _ C a p t i o n > - 
-         < S a l e s p e r s o n _ P u r c h a s e r _ _ T A B L E C A P T I O N _ _ _ _ _ _ _ _ _ _ S a l e s p e r s o n F i l t e r   E l e m e n t T y p e = " C o l u m n "   E l e m e n t I d = " 1 0 1 6 0 4 1 6 9 9 "   D a t a T y p e = " T e x t " > S a l e s p e r s o n _ P u r c h a s e r _ _ T A B L E C A P T I O N _ _ _ _ _ _ _ _ _ _ S a l e s p e r s o n F i l t e r < / S a l e s p e r s o n _ P u r c h a s e r _ _ T A B L E C A P T I O N _ _ _ _ _ _ _ _ _ _ S a l e s p e r s o n F i l t e r > - 
-         < S a l e s p e r s o n _ _ _ C o m m i s s i o n C a p t i o n   E l e m e n t T y p e = " C o l u m n "   E l e m e n t I d = " 1 7 6 9 4 7 1 9 4 8 "   D a t a T y p e = " L a b e l "   O b s o l e t e S t a t e = " P e n d i n g " > S a l e s p e r s o n _ _ _ C o m m i s s i o n C a p t i o n < / S a l e s p e r s o n _ _ _ C o m m i s s i o n C a p t i o n > - 
-         < S T R S U B S T N O _ T e x t 0 0 0 _ P e r i o d T e x t _   E l e m e n t T y p e = " C o l u m n "   E l e m e n t I d = " 7 2 2 9 9 1 7 0 4 "   D a t a T y p e = " S t r i n g " > S T R S U B S T N O _ T e x t 0 0 0 _ P e r i o d T e x t _ < / S T R S U B S T N O _ T e x t 0 0 0 _ P e r i o d T e x t _ > - 
-         < T o t a l C a p t i o n   E l e m e n t T y p e = " C o l u m n "   E l e m e n t I d = " 7 0 7 1 0 2 6 9 5 "   D a t a T y p e = " L a b e l "   O b s o l e t e S t a t e = " P e n d i n g " > T o t a l C a p t i o n < / T o t a l C a p t i o n > - 
-         < C u s t _ L e d g e r _ E n t r y   E l e m e n t T y p e = " D a t a I t e m "   E l e m e n t I d = " 1 6 3 9 1 4 6 4 4 5 " > - 
-             < A d j P r o f i t C o m m i s s i o n A m t _ C o n t r o l 4 5   E l e m e n t T y p e = " C o l u m n "   E l e m e n t I d = " 8 0 5 8 9 6 4 0 0 "   D a t a T y p e = " D e c i m a l " > A d j P r o f i t C o m m i s s i o n A m t _ C o n t r o l 4 5 < / A d j P r o f i t C o m m i s s i o n A m t _ C o n t r o l 4 5 > - 
-             < A d j P r o f i t _ C o n t r o l 3 9   E l e m e n t T y p e = " C o l u m n "   E l e m e n t I d = " 2 0 2 4 1 9 6 5 4 2 "   D a t a T y p e = " D e c i m a l " > A d j P r o f i t _ C o n t r o l 3 9 < / A d j P r o f i t _ C o n t r o l 3 9 > - 
-             < C u s t L e d g e r E n t r y _ C u s t o m e r N a m e   E l e m e n t T y p e = " C o l u m n "   E l e m e n t I d = " 2 0 9 1 8 9 3 2 7 9 "   D a t a T y p e = " T e x t " > C u s t L e d g e r E n t r y _ C u s t o m e r N a m e < / C u s t L e d g e r E n t r y _ C u s t o m e r N a m e > - 
-             < C u s t _ _ L e d g e r _ E n t r y _ _ C u s t o m e r _ N o _ _   E l e m e n t T y p e = " C o l u m n "   E l e m e n t I d = " 1 0 0 9 0 1 6 8 0 8 "   D a t a T y p e = " C o d e " > C u s t _ _ L e d g e r _ E n t r y _ _ C u s t o m e r _ N o _ _ < / C u s t _ _ L e d g e r _ E n t r y _ _ C u s t o m e r _ N o _ _ > - 
-             < C u s t _ _ L e d g e r _ E n t r y _ _ D o c u m e n t _ N o _ _   E l e m e n t T y p e = " C o l u m n "   E l e m e n t I d = " 8 5 2 6 1 1 1 8 1 "   D a t a T y p e = " C o d e " > C u s t _ _ L e d g e r _ E n t r y _ _ D o c u m e n t _ N o _ _ < / C u s t _ _ L e d g e r _ E n t r y _ _ D o c u m e n t _ N o _ _ > - 
-             < C u s t _ _ L e d g e r _ E n t r y _ _ P o s t i n g _ D a t e _   E l e m e n t T y p e = " C o l u m n "   E l e m e n t I d = " 2 1 4 2 6 5 7 1 6 2 "   D a t a T y p e = " S t r i n g " > C u s t _ _ L e d g e r _ E n t r y _ _ P o s t i n g _ D a t e _ < / C u s t _ _ L e d g e r _ E n t r y _ _ P o s t i n g _ D a t e _ > - 
-             < C u s t _ _ L e d g e r _ E n t r y _ _ P r o f i t _ _ L C Y _ _   E l e m e n t T y p e = " C o l u m n "   E l e m e n t I d = " 5 1 9 3 4 1 8 2 6 "   D a t a T y p e = " D e c i m a l " > C u s t _ _ L e d g e r _ E n t r y _ _ P r o f i t _ _ L C Y _ _ < / C u s t _ _ L e d g e r _ E n t r y _ _ P r o f i t _ _ L C Y _ _ > - 
-             < C u s t _ _ L e d g e r _ E n t r y _ _ S a l e s _ _ L C Y _ _   E l e m e n t T y p e = " C o l u m n "   E l e m e n t I d = " 8 1 9 5 1 7 4 8 "   D a t a T y p e = " D e c i m a l " > C u s t _ _ L e d g e r _ E n t r y _ _ S a l e s _ _ L C Y _ _ < / C u s t _ _ L e d g e r _ E n t r y _ _ S a l e s _ _ L C Y _ _ > - 
-             < P r o f i t C o m m i s s i o n A m t _ C o n t r o l 3 3   E l e m e n t T y p e = " C o l u m n "   E l e m e n t I d = " 3 1 2 1 8 6 8 2 6 "   D a t a T y p e = " D e c i m a l " > P r o f i t C o m m i s s i o n A m t _ C o n t r o l 3 3 < / P r o f i t C o m m i s s i o n A m t _ C o n t r o l 3 3 > - 
-             < S a l e s C o m m i s s i o n A m t _ C o n t r o l 3 2   E l e m e n t T y p e = " C o l u m n "   E l e m e n t I d = " 1 4 6 2 3 9 0 1 5 3 "   D a t a T y p e = " D e c i m a l " > S a l e s C o m m i s s i o n A m t _ C o n t r o l 3 2 < / S a l e s C o m m i s s i o n A m t _ C o n t r o l 3 2 > - 
-             < S a l e s p e r s o n P u r c h a s e r _ C o d e   E l e m e n t T y p e = " C o l u m n "   E l e m e n t I d = " 1 2 2 1 2 1 9 2 4 5 "   D a t a T y p e = " C o d e " > S a l e s p e r s o n P u r c h a s e r _ C o d e < / S a l e s p e r s o n P u r c h a s e r _ C o d e > - 
-             < S a l e s p e r s o n _ P u r c h a s e r _ _ N a m e   E l e m e n t T y p e = " C o l u m n "   E l e m e n t I d = " 1 1 9 5 8 7 9 8 7 3 "   D a t a T y p e = " T e x t " > S a l e s p e r s o n _ P u r c h a s e r _ _ N a m e < / S a l e s p e r s o n _ P u r c h a s e r _ _ N a m e > +     < S a l e s p e r s o n _ P u r c h a s e r > + 
+         < A d j P r o f i t > A d j P r o f i t < / A d j P r o f i t > + 
+         < A d j P r o f i t C o m m i s s i o n A m t > A d j P r o f i t C o m m i s s i o n A m t < / A d j P r o f i t C o m m i s s i o n A m t > + 
+         < A d j P r o f i t C o m m i s s i o n A m t _ C o n t r o l 4 5 C a p t i o n > A d j P r o f i t C o m m i s s i o n A m t _ C o n t r o l 4 5 C a p t i o n < / A d j P r o f i t C o m m i s s i o n A m t _ C o n t r o l 4 5 C a p t i o n > + 
+         < A d j P r o f i t _ C o n t r o l 3 9 C a p t i o n > A d j P r o f i t _ C o n t r o l 3 9 C a p t i o n < / A d j P r o f i t _ C o n t r o l 3 9 C a p t i o n > + 
+         < A l l _ a m o u n t s _ a r e _ i n _ L C Y C a p t i o n > A l l _ a m o u n t s _ a r e _ i n _ L C Y C a p t i o n < / A l l _ a m o u n t s _ a r e _ i n _ L C Y C a p t i o n > + 
+         < C O M P A N Y N A M E > C O M P A N Y N A M E < / C O M P A N Y N A M E > + 
+         < C u r r R e p o r t _ P A G E N O C a p t i o n > C u r r R e p o r t _ P A G E N O C a p t i o n < / C u r r R e p o r t _ P A G E N O C a p t i o n > + 
+         < C u s t L e d g E n t r y F i l t e r > C u s t L e d g E n t r y F i l t e r < / C u s t L e d g E n t r y F i l t e r > + 
+         < C u s t _ _ L e d g e r _ E n t r y _ _ C u s t o m e r _ N o _ _ C a p t i o n > C u s t _ _ L e d g e r _ E n t r y _ _ C u s t o m e r _ N o _ _ C a p t i o n < / C u s t _ _ L e d g e r _ E n t r y _ _ C u s t o m e r _ N o _ _ C a p t i o n > + 
+         < C u s t _ _ L e d g e r _ E n t r y _ _ D o c u m e n t _ N o _ _ C a p t i o n > C u s t _ _ L e d g e r _ E n t r y _ _ D o c u m e n t _ N o _ _ C a p t i o n < / C u s t _ _ L e d g e r _ E n t r y _ _ D o c u m e n t _ N o _ _ C a p t i o n > + 
+         < C u s t _ _ L e d g e r _ E n t r y _ _ P o s t i n g _ D a t e _ C a p t i o n > C u s t _ _ L e d g e r _ E n t r y _ _ P o s t i n g _ D a t e _ C a p t i o n < / C u s t _ _ L e d g e r _ E n t r y _ _ P o s t i n g _ D a t e _ C a p t i o n > + 
+         < C u s t _ _ L e d g e r _ E n t r y _ _ P r o f i t _ _ L C Y _ _ C a p t i o n > C u s t _ _ L e d g e r _ E n t r y _ _ P r o f i t _ _ L C Y _ _ C a p t i o n < / C u s t _ _ L e d g e r _ E n t r y _ _ P r o f i t _ _ L C Y _ _ C a p t i o n > + 
+         < C u s t _ _ L e d g e r _ E n t r y _ _ S a l e s _ _ L C Y _ _ C a p t i o n > C u s t _ _ L e d g e r _ E n t r y _ _ S a l e s _ _ L C Y _ _ C a p t i o n < / C u s t _ _ L e d g e r _ E n t r y _ _ S a l e s _ _ L C Y _ _ C a p t i o n > + 
+         < C u s t _ _ L e d g e r _ E n t r y _ _ T A B L E C A P T I O N _ _ _ _ _ _ _ _ _ _ C u s t L e d g E n t r y F i l t e r > C u s t _ _ L e d g e r _ E n t r y _ _ T A B L E C A P T I O N _ _ _ _ _ _ _ _ _ _ C u s t L e d g E n t r y F i l t e r < / C u s t _ _ L e d g e r _ E n t r y _ _ T A B L E C A P T I O N _ _ _ _ _ _ _ _ _ _ C u s t L e d g E n t r y F i l t e r > + 
+         < C u s t _ _ L e d g e r _ E n t r y _ _ _ P r o f i t _ _ L C Y _ _ > C u s t _ _ L e d g e r _ E n t r y _ _ _ P r o f i t _ _ L C Y _ _ < / C u s t _ _ L e d g e r _ E n t r y _ _ _ P r o f i t _ _ L C Y _ _ > + 
+         < C u s t _ _ L e d g e r _ E n t r y _ _ _ S a l e s _ _ L C Y _ _ > C u s t _ _ L e d g e r _ E n t r y _ _ _ S a l e s _ _ L C Y _ _ < / C u s t _ _ L e d g e r _ E n t r y _ _ _ S a l e s _ _ L C Y _ _ > + 
+         < P a g e G r o u p N o > P a g e G r o u p N o < / P a g e G r o u p N o > + 
+         < P r o f i t C o m m i s s i o n A m t > P r o f i t C o m m i s s i o n A m t < / P r o f i t C o m m i s s i o n A m t > + 
+         < P r o f i t C o m m i s s i o n A m t _ C o n t r o l 3 3 C a p t i o n > P r o f i t C o m m i s s i o n A m t _ C o n t r o l 3 3 C a p t i o n < / P r o f i t C o m m i s s i o n A m t _ C o n t r o l 3 3 C a p t i o n > + 
+         < S a l e s C o m m i s s i o n A m t > S a l e s C o m m i s s i o n A m t < / S a l e s C o m m i s s i o n A m t > + 
+         < S a l e s C o m m i s s i o n A m t _ C o n t r o l 3 2 C a p t i o n > S a l e s C o m m i s s i o n A m t _ C o n t r o l 3 2 C a p t i o n < / S a l e s C o m m i s s i o n A m t _ C o n t r o l 3 2 C a p t i o n > + 
+         < S a l e s p e r s o n F i l t e r > S a l e s p e r s o n F i l t e r < / S a l e s p e r s o n F i l t e r > + 
+         < S a l e s p e r s o n _ P u r c h a s e r _ C o d e > S a l e s p e r s o n _ P u r c h a s e r _ C o d e < / S a l e s p e r s o n _ P u r c h a s e r _ C o d e > + 
+         < S a l e s p e r s o n _ P u r c h a s e r _ N a m e > S a l e s p e r s o n _ P u r c h a s e r _ N a m e < / S a l e s p e r s o n _ P u r c h a s e r _ N a m e > + 
+         < S a l e s p e r s o n _ P u r c h a s e r _ _ C o m m i s s i o n _ _ _ > S a l e s p e r s o n _ P u r c h a s e r _ _ C o m m i s s i o n _ _ _ < / S a l e s p e r s o n _ P u r c h a s e r _ _ C o m m i s s i o n _ _ _ > + 
+         < S a l e s p e r s o n _ P u r c h a s e r _ _ C o m m i s s i o n _ _ _ C a p t i o n > S a l e s p e r s o n _ P u r c h a s e r _ _ C o m m i s s i o n _ _ _ C a p t i o n < / S a l e s p e r s o n _ P u r c h a s e r _ _ C o m m i s s i o n _ _ _ C a p t i o n > + 
+         < S a l e s p e r s o n _ P u r c h a s e r _ _ T A B L E C A P T I O N _ _ _ _ _ _ _ _ _ _ S a l e s p e r s o n F i l t e r > S a l e s p e r s o n _ P u r c h a s e r _ _ T A B L E C A P T I O N _ _ _ _ _ _ _ _ _ _ S a l e s p e r s o n F i l t e r < / S a l e s p e r s o n _ P u r c h a s e r _ _ T A B L E C A P T I O N _ _ _ _ _ _ _ _ _ _ S a l e s p e r s o n F i l t e r > + 
+         < S a l e s p e r s o n _ _ _ C o m m i s s i o n C a p t i o n > S a l e s p e r s o n _ _ _ C o m m i s s i o n C a p t i o n < / S a l e s p e r s o n _ _ _ C o m m i s s i o n C a p t i o n > + 
+         < S T R S U B S T N O _ T e x t 0 0 0 _ P e r i o d T e x t _ > S T R S U B S T N O _ T e x t 0 0 0 _ P e r i o d T e x t _ < / S T R S U B S T N O _ T e x t 0 0 0 _ P e r i o d T e x t _ > + 
+         < T o t a l C a p t i o n > T o t a l C a p t i o n < / T o t a l C a p t i o n > + 
+         < C u s t _ L e d g e r _ E n t r y > + 
+             < A d j P r o f i t C o m m i s s i o n A m t _ C o n t r o l 4 5 > A d j P r o f i t C o m m i s s i o n A m t _ C o n t r o l 4 5 < / A d j P r o f i t C o m m i s s i o n A m t _ C o n t r o l 4 5 > + 
+             < A d j P r o f i t _ C o n t r o l 3 9 > A d j P r o f i t _ C o n t r o l 3 9 < / A d j P r o f i t _ C o n t r o l 3 9 > + 
+             < C u s t L e d g e r E n t r y _ C u s t o m e r N a m e > C u s t L e d g e r E n t r y _ C u s t o m e r N a m e < / C u s t L e d g e r E n t r y _ C u s t o m e r N a m e > + 
+             < C u s t _ _ L e d g e r _ E n t r y _ _ C u s t o m e r _ N o _ _ > C u s t _ _ L e d g e r _ E n t r y _ _ C u s t o m e r _ N o _ _ < / C u s t _ _ L e d g e r _ E n t r y _ _ C u s t o m e r _ N o _ _ > + 
+             < C u s t _ _ L e d g e r _ E n t r y _ _ D o c u m e n t _ N o _ _ > C u s t _ _ L e d g e r _ E n t r y _ _ D o c u m e n t _ N o _ _ < / C u s t _ _ L e d g e r _ E n t r y _ _ D o c u m e n t _ N o _ _ > + 
+             < C u s t _ _ L e d g e r _ E n t r y _ _ P o s t i n g _ D a t e _ > C u s t _ _ L e d g e r _ E n t r y _ _ P o s t i n g _ D a t e _ < / C u s t _ _ L e d g e r _ E n t r y _ _ P o s t i n g _ D a t e _ > + 
+             < C u s t _ _ L e d g e r _ E n t r y _ _ P r o f i t _ _ L C Y _ _ > C u s t _ _ L e d g e r _ E n t r y _ _ P r o f i t _ _ L C Y _ _ < / C u s t _ _ L e d g e r _ E n t r y _ _ P r o f i t _ _ L C Y _ _ > + 
+             < C u s t _ _ L e d g e r _ E n t r y _ _ S a l e s _ _ L C Y _ _ > C u s t _ _ L e d g e r _ E n t r y _ _ S a l e s _ _ L C Y _ _ < / C u s t _ _ L e d g e r _ E n t r y _ _ S a l e s _ _ L C Y _ _ > + 
+             < P r o f i t C o m m i s s i o n A m t _ C o n t r o l 3 3 > P r o f i t C o m m i s s i o n A m t _ C o n t r o l 3 3 < / P r o f i t C o m m i s s i o n A m t _ C o n t r o l 3 3 > + 
+             < S a l e s C o m m i s s i o n A m t _ C o n t r o l 3 2 > S a l e s C o m m i s s i o n A m t _ C o n t r o l 3 2 < / S a l e s C o m m i s s i o n A m t _ C o n t r o l 3 2 > + 
+             < S a l e s p e r s o n P u r c h a s e r _ C o d e > S a l e s p e r s o n P u r c h a s e r _ C o d e < / S a l e s p e r s o n P u r c h a s e r _ C o d e > + 
+             < S a l e s p e r s o n _ P u r c h a s e r _ _ N a m e > S a l e s p e r s o n _ P u r c h a s e r _ _ N a m e < / S a l e s p e r s o n _ P u r c h a s e r _ _ N a m e >   
          < / C u s t _ L e d g e r _ E n t r y >   
-         < S u b t o t a l s   E l e m e n t T y p e = " D a t a I t e m "   E l e m e n t I d = " 8 3 8 6 9 3 5 6 0 " > - 
-             < S u b t o t a l s _ A d j P r o f i t   E l e m e n t T y p e = " C o l u m n "   E l e m e n t I d = " 5 6 1 3 6 6 8 2 2 "   D a t a T y p e = " D e c i m a l " > S u b t o t a l s _ A d j P r o f i t < / S u b t o t a l s _ A d j P r o f i t > - 
-             < S u b t o t a l s _ A d j P r o f i t C o m m i s s i o n   E l e m e n t T y p e = " C o l u m n "   E l e m e n t I d = " 1 4 1 8 9 7 1 8 3 5 "   D a t a T y p e = " D e c i m a l " > S u b t o t a l s _ A d j P r o f i t C o m m i s s i o n < / S u b t o t a l s _ A d j P r o f i t C o m m i s s i o n > - 
-             < S u b t o t a l s _ P r o f i t   E l e m e n t T y p e = " C o l u m n "   E l e m e n t I d = " 2 4 1 5 0 0 6 9 7 "   D a t a T y p e = " D e c i m a l " > S u b t o t a l s _ P r o f i t < / S u b t o t a l s _ P r o f i t > - 
-             < S u b t o t a l s _ P r o f i t C o m m i s s i o n   E l e m e n t T y p e = " C o l u m n "   E l e m e n t I d = " 1 4 9 6 3 3 2 1 7 2 "   D a t a T y p e = " D e c i m a l " > S u b t o t a l s _ P r o f i t C o m m i s s i o n < / S u b t o t a l s _ P r o f i t C o m m i s s i o n > - 
-             < S u b t o t a l s _ S a l e s   E l e m e n t T y p e = " C o l u m n "   E l e m e n t I d = " 1 9 7 8 7 7 5 0 3 "   D a t a T y p e = " D e c i m a l " > S u b t o t a l s _ S a l e s < / S u b t o t a l s _ S a l e s > - 
-             < S u b t o t a l s _ S a l e s C o m m i s s i o n   E l e m e n t T y p e = " C o l u m n "   E l e m e n t I d = " 1 4 7 6 0 7 2 5 9 0 "   D a t a T y p e = " D e c i m a l " > S u b t o t a l s _ S a l e s C o m m i s s i o n < / S u b t o t a l s _ S a l e s C o m m i s s i o n > - 
-             < S u b t o t a l s _ S a l e s p e r s o n _ C o d e   E l e m e n t T y p e = " C o l u m n "   E l e m e n t I d = " 1 1 9 8 5 9 4 2 7 2 "   D a t a T y p e = " C o d e " > S u b t o t a l s _ S a l e s p e r s o n _ C o d e < / S u b t o t a l s _ S a l e s p e r s o n _ C o d e > +         < S u b t o t a l s > + 
+             < S u b t o t a l s _ A d j P r o f i t > S u b t o t a l s _ A d j P r o f i t < / S u b t o t a l s _ A d j P r o f i t > + 
+             < S u b t o t a l s _ A d j P r o f i t C o m m i s s i o n > S u b t o t a l s _ A d j P r o f i t C o m m i s s i o n < / S u b t o t a l s _ A d j P r o f i t C o m m i s s i o n > + 
+             < S u b t o t a l s _ P r o f i t > S u b t o t a l s _ P r o f i t < / S u b t o t a l s _ P r o f i t > + 
+             < S u b t o t a l s _ P r o f i t C o m m i s s i o n > S u b t o t a l s _ P r o f i t C o m m i s s i o n < / S u b t o t a l s _ P r o f i t C o m m i s s i o n > + 
+             < S u b t o t a l s _ S a l e s > S u b t o t a l s _ S a l e s < / S u b t o t a l s _ S a l e s > + 
+             < S u b t o t a l s _ S a l e s C o m m i s s i o n > S u b t o t a l s _ S a l e s C o m m i s s i o n < / S u b t o t a l s _ S a l e s C o m m i s s i o n > + 
+             < S u b t o t a l s _ S a l e s p e r s o n _ C o d e > S u b t o t a l s _ S a l e s p e r s o n _ C o d e < / S u b t o t a l s _ S a l e s p e r s o n _ C o d e >   
          < / S u b t o t a l s >   
      < / S a l e s p e r s o n _ P u r c h a s e r >   
-     < T o t a l s   E l e m e n t T y p e = " D a t a I t e m "   E l e m e n t I d = " 1 8 2 3 9 5 0 0 4 4 " > - 
-         < T o t a l s _ A d j P r o f i t   E l e m e n t T y p e = " C o l u m n "   E l e m e n t I d = " 1 9 0 9 5 0 1 3 6 2 "   D a t a T y p e = " D e c i m a l " > T o t a l s _ A d j P r o f i t < / T o t a l s _ A d j P r o f i t > - 
-         < T o t a l s _ A d j P r o f i t C o m m i s s i o n   E l e m e n t T y p e = " C o l u m n "   E l e m e n t I d = " 9 4 6 1 0 3 7 5 9 "   D a t a T y p e = " D e c i m a l " > T o t a l s _ A d j P r o f i t C o m m i s s i o n < / T o t a l s _ A d j P r o f i t C o m m i s s i o n > - 
-         < T o t a l s _ P r o f i t   E l e m e n t T y p e = " C o l u m n "   E l e m e n t I d = " 6 4 6 2 9 5 2 1 9 "   D a t a T y p e = " D e c i m a l " > T o t a l s _ P r o f i t < / T o t a l s _ P r o f i t > - 
-         < T o t a l s _ P r o f i t C o m m i s s i o n   E l e m e n t T y p e = " C o l u m n "   E l e m e n t I d = " 3 6 7 7 9 1 3 9 2 "   D a t a T y p e = " D e c i m a l " > T o t a l s _ P r o f i t C o m m i s s i o n < / T o t a l s _ P r o f i t C o m m i s s i o n > - 
-         < T o t a l s _ S a l e s   E l e m e n t T y p e = " C o l u m n "   E l e m e n t I d = " 1 3 9 9 9 8 5 1 0 9 "   D a t a T y p e = " D e c i m a l " > T o t a l s _ S a l e s < / T o t a l s _ S a l e s > - 
-         < T o t a l s _ S a l e s C o m m i s s i o n   E l e m e n t T y p e = " C o l u m n "   E l e m e n t I d = " 4 6 4 8 2 3 3 9 8 "   D a t a T y p e = " D e c i m a l " > T o t a l s _ S a l e s C o m m i s s i o n < / T o t a l s _ S a l e s C o m m i s s i o n > +     < T o t a l s > + 
+         < T o t a l s _ A d j P r o f i t > T o t a l s _ A d j P r o f i t < / T o t a l s _ A d j P r o f i t > + 
+         < T o t a l s _ A d j P r o f i t C o m m i s s i o n > T o t a l s _ A d j P r o f i t C o m m i s s i o n < / T o t a l s _ A d j P r o f i t C o m m i s s i o n > + 
+         < T o t a l s _ P r o f i t > T o t a l s _ P r o f i t < / T o t a l s _ P r o f i t > + 
+         < T o t a l s _ P r o f i t C o m m i s s i o n > T o t a l s _ P r o f i t C o m m i s s i o n < / T o t a l s _ P r o f i t C o m m i s s i o n > + 
+         < T o t a l s _ S a l e s > T o t a l s _ S a l e s < / T o t a l s _ S a l e s > + 
+         < T o t a l s _ S a l e s C o m m i s s i o n > T o t a l s _ S a l e s C o m m i s s i o n < / T o t a l s _ S a l e s C o m m i s s i o n >   
      < / T o t a l s >   
  < / N a v W o r d R e p o r t X m l P a r t > 
 </file>
 
-<file path=customXml/item2.xml>��< ? x m l   v e r s i o n = " 1 . 0 "   e n c o d i n g = " u t f - 1 6 " ? > < N a v W o r d R e p o r t X m l P a r t   x m l n s = " u r n : m i c r o s o f t - d y n a m i c s - n a v / r e p o r t s / S a l e s p e r s o n _ C o m m i s s i o n / 1 1 5 / " > +<file path=customXml/item2.xml>��< ? x m l   v e r s i o n = " 1 . 0 "   e n c o d i n g = " u t f - 1 6 " ? > < N a v W o r d R e p o r t X m l P a r t   x m l n s = " u r n : m i c r o s o f t - d y n a m i c s - b u s i n e s s c e n t r a l / i n t e r n a l / e x t e n d e d / r e p o r t s / S a l e s p e r s o n _ C o m m i s s i o n / 1 1 5 / " >   
      < B C R e p o r t I n f o r m a t i o n >   
@@ -4536,185 +4448,255 @@
  
      < L a b e l s >   
-         < A b o u t T h e R e p o r t L a b e l > A b o u t T h e R e p o r t L a b e l < / A b o u t T h e R e p o r t L a b e l > - 
-         < A d j u s t e d P r o f i t C o m m i s s i o n L a b e l > A d j u s t e d P r o f i t C o m m i s s i o n L a b e l < / A d j u s t e d P r o f i t C o m m i s s i o n L a b e l > - 
-         < A d j u s t e d P r o f i t L a b e l > A d j u s t e d P r o f i t L a b e l < / A d j u s t e d P r o f i t L a b e l > - 
-         < A l l A m o u n t s A r e I n L C Y L a b e l > A l l A m o u n t s A r e I n L C Y L a b e l < / A l l A m o u n t s A r e I n L C Y L a b e l > - 
-         < C o m m i s s i o n P e r c e n t L a b e l > C o m m i s s i o n P e r c e n t L a b e l < / C o m m i s s i o n P e r c e n t L a b e l > - 
-         < C o m p a n y L a b e l > C o m p a n y L a b e l < / C o m p a n y L a b e l > - 
-         < C u s t o m e r N a m e L a b e l > C u s t o m e r N a m e L a b e l < / C u s t o m e r N a m e L a b e l > - 
-         < C u s t o m e r N o L a b e l > C u s t o m e r N o L a b e l < / C u s t o m e r N o L a b e l > - 
-         < D a t a R e t r i e v e d > D a t a R e t r i e v e d < / D a t a R e t r i e v e d > - 
-         < D o c u m e n t a t i o n L a b e l > D o c u m e n t a t i o n L a b e l < / D o c u m e n t a t i o n L a b e l > - 
-         < D o c u m e n t N o L a b e l > D o c u m e n t N o L a b e l < / D o c u m e n t N o L a b e l > - 
-         < E n v i r o n m e n t L a b e l > E n v i r o n m e n t L a b e l < / E n v i r o n m e n t L a b e l > - 
-         < P e r i o d C a p t i o n > P e r i o d C a p t i o n < / P e r i o d C a p t i o n > - 
-         < P o s t i n g D a t e L a b e l > P o s t i n g D a t e L a b e l < / P o s t i n g D a t e L a b e l > - 
-         < P r o f i t C o m m i s s i o n L a b e l > P r o f i t C o m m i s s i o n L a b e l < / P r o f i t C o m m i s s i o n L a b e l > - 
-         < P r o f i t L a b e l > P r o f i t L a b e l < / P r o f i t L a b e l > - 
-         < R e p o r t N a m e L a b e l > R e p o r t N a m e L a b e l < / R e p o r t N a m e L a b e l > - 
-         < R u n O n L a b e l > R u n O n L a b e l < / R u n O n L a b e l > - 
-         < S a l e s C o m m i s s i o n L a b e l > S a l e s C o m m i s s i o n L a b e l < / S a l e s C o m m i s s i o n L a b e l > - 
-         < S a l e s L a b e l > S a l e s L a b e l < / S a l e s L a b e l > - 
-         < S a l e s p e r s o n _ P u r c h a s e r _ _ N a m e C a p t i o n > S a l e s p e r s o n _ P u r c h a s e r _ _ N a m e C a p t i o n < / S a l e s p e r s o n _ P u r c h a s e r _ _ N a m e C a p t i o n > - 
-         < S a l e s p e r s o n C o m m i s s i o n A n a l y s i s > S a l e s p e r s o n C o m m i s s i o n A n a l y s i s < / S a l e s p e r s o n C o m m i s s i o n A n a l y s i s > - 
-         < S a l e s p e r s o n C o m m i s s i o n L a b e l > S a l e s p e r s o n C o m m i s s i o n L a b e l < / S a l e s p e r s o n C o m m i s s i o n L a b e l > - 
-         < S a l e s p e r s o n C o m m i s s i o n P r i n t > S a l e s p e r s o n C o m m i s s i o n P r i n t < / S a l e s p e r s o n C o m m i s s i o n P r i n t > - 
-         < S a l e s p e r s o n P u r c h a s e r _ C o d e C a p t i o n > S a l e s p e r s o n P u r c h a s e r _ C o d e C a p t i o n < / S a l e s p e r s o n P u r c h a s e r _ C o d e C a p t i o n > - 
-         < T o t a l s C a p t i o n > T o t a l s C a p t i o n < / T o t a l s C a p t i o n > - 
-         < U s e r L a b e l > U s e r L a b e l < / U s e r L a b e l > +         < A b o u t T h e R e p o r t L a b e l   E l e m e n t T y p e = " P a r a m e t e r "   E l e m e n t I d = " 1 6 7 7 9 2 0 0 1 "   D a t a T y p e = " S t r i n g " > A b o u t T h e R e p o r t L a b e l < / A b o u t T h e R e p o r t L a b e l > + 
+         < A d j u s t e d P r o f i t C o m m i s s i o n L a b e l   E l e m e n t T y p e = " P a r a m e t e r "   E l e m e n t I d = " 9 1 5 5 5 7 0 2 0 "   D a t a T y p e = " S t r i n g " > A d j u s t e d P r o f i t C o m m i s s i o n L a b e l < / A d j u s t e d P r o f i t C o m m i s s i o n L a b e l > + 
+         < A d j u s t e d P r o f i t L a b e l   E l e m e n t T y p e = " P a r a m e t e r "   E l e m e n t I d = " 1 6 1 5 2 8 3 0 4 7 "   D a t a T y p e = " S t r i n g " > A d j u s t e d P r o f i t L a b e l < / A d j u s t e d P r o f i t L a b e l > + 
+         < A l l A m o u n t s A r e I n L C Y L a b e l   E l e m e n t T y p e = " P a r a m e t e r "   E l e m e n t I d = " 5 6 3 5 1 4 3 1 8 "   D a t a T y p e = " S t r i n g " > A l l A m o u n t s A r e I n L C Y L a b e l < / A l l A m o u n t s A r e I n L C Y L a b e l > + 
+         < C o m m i s s i o n P e r c e n t L a b e l   E l e m e n t T y p e = " P a r a m e t e r "   E l e m e n t I d = " 8 3 9 2 6 3 7 6 5 "   D a t a T y p e = " S t r i n g " > C o m m i s s i o n P e r c e n t L a b e l < / C o m m i s s i o n P e r c e n t L a b e l > + 
+         < C o m p a n y L a b e l   E l e m e n t T y p e = " P a r a m e t e r "   E l e m e n t I d = " 3 4 6 7 6 0 3 4 8 "   D a t a T y p e = " S t r i n g " > C o m p a n y L a b e l < / C o m p a n y L a b e l > + 
+         < C u s t o m e r N a m e L a b e l   E l e m e n t T y p e = " P a r a m e t e r "   E l e m e n t I d = " 1 1 1 8 7 9 0 8 8 "   D a t a T y p e = " S t r i n g " > C u s t o m e r N a m e L a b e l < / C u s t o m e r N a m e L a b e l > + 
+         < C u s t o m e r N o L a b e l   E l e m e n t T y p e = " P a r a m e t e r "   E l e m e n t I d = " 3 8 7 4 7 8 0 3 4 "   D a t a T y p e = " S t r i n g " > C u s t o m e r N o L a b e l < / C u s t o m e r N o L a b e l > + 
+         < D a t a R e t r i e v e d   E l e m e n t T y p e = " P a r a m e t e r "   E l e m e n t I d = " 2 9 1 9 1 1 8 0 7 "   D a t a T y p e = " S t r i n g " > D a t a R e t r i e v e d < / D a t a R e t r i e v e d > + 
+         < D o c u m e n t a t i o n L a b e l   E l e m e n t T y p e = " P a r a m e t e r "   E l e m e n t I d = " 1 7 3 8 9 2 4 8 1 5 "   D a t a T y p e = " S t r i n g " > D o c u m e n t a t i o n L a b e l < / D o c u m e n t a t i o n L a b e l > + 
+         < D o c u m e n t N o L a b e l   E l e m e n t T y p e = " P a r a m e t e r "   E l e m e n t I d = " 1 1 4 6 4 3 5 8 0 3 "   D a t a T y p e = " S t r i n g " > D o c u m e n t N o L a b e l < / D o c u m e n t N o L a b e l > + 
+         < E n v i r o n m e n t L a b e l   E l e m e n t T y p e = " P a r a m e t e r "   E l e m e n t I d = " 8 1 8 8 1 6 5 9 0 "   D a t a T y p e = " S t r i n g " > E n v i r o n m e n t L a b e l < / E n v i r o n m e n t L a b e l > + 
+         < P e r i o d C a p t i o n   E l e m e n t T y p e = " P a r a m e t e r "   E l e m e n t I d = " 1 4 7 8 2 5 3 4 2 2 "   D a t a T y p e = " S t r i n g " > P e r i o d C a p t i o n < / P e r i o d C a p t i o n > + 
+         < P o s t i n g D a t e L a b e l   E l e m e n t T y p e = " P a r a m e t e r "   E l e m e n t I d = " 1 7 7 5 7 9 4 2 4 9 "   D a t a T y p e = " S t r i n g " > P o s t i n g D a t e L a b e l < / P o s t i n g D a t e L a b e l > + 
+         < P r o f i t C o m m i s s i o n L a b e l   E l e m e n t T y p e = " P a r a m e t e r "   E l e m e n t I d = " 8 3 2 7 0 6 3 9 2 "   D a t a T y p e = " S t r i n g " > P r o f i t C o m m i s s i o n L a b e l < / P r o f i t C o m m i s s i o n L a b e l > + 
+         < P r o f i t L a b e l   E l e m e n t T y p e = " P a r a m e t e r "   E l e m e n t I d = " 2 5 4 6 3 3 6 4 5 "   D a t a T y p e = " S t r i n g " > P r o f i t L a b e l < / P r o f i t L a b e l > + 
+         < R e p o r t N a m e L a b e l   E l e m e n t T y p e = " P a r a m e t e r "   E l e m e n t I d = " 1 0 2 2 2 9 2 9 8 2 "   D a t a T y p e = " S t r i n g " > R e p o r t N a m e L a b e l < / R e p o r t N a m e L a b e l > + 
+         < R u n O n L a b e l   E l e m e n t T y p e = " P a r a m e t e r "   E l e m e n t I d = " 1 1 1 9 0 3 7 5 9 5 "   D a t a T y p e = " S t r i n g " > R u n O n L a b e l < / R u n O n L a b e l > + 
+         < S a l e s C o m m i s s i o n L a b e l   E l e m e n t T y p e = " P a r a m e t e r "   E l e m e n t I d = " 1 0 1 8 2 6 8 7 7 0 "   D a t a T y p e = " S t r i n g " > S a l e s C o m m i s s i o n L a b e l < / S a l e s C o m m i s s i o n L a b e l > + 
+         < S a l e s L a b e l   E l e m e n t T y p e = " P a r a m e t e r "   E l e m e n t I d = " 1 7 9 5 4 4 8 0 0 5 "   D a t a T y p e = " S t r i n g " > S a l e s L a b e l < / S a l e s L a b e l > + 
+         < S a l e s p e r s o n _ P u r c h a s e r _ _ N a m e C a p t i o n   E l e m e n t T y p e = " P a r a m e t e r "   E l e m e n t I d = " 1 1 9 5 8 7 9 8 7 3 "   D a t a T y p e = " S t r i n g " > S a l e s p e r s o n _ P u r c h a s e r _ _ N a m e C a p t i o n < / S a l e s p e r s o n _ P u r c h a s e r _ _ N a m e C a p t i o n > + 
+         < S a l e s p e r s o n C o m m i s s i o n A n a l y s i s   E l e m e n t T y p e = " P a r a m e t e r "   E l e m e n t I d = " 7 1 5 8 7 1 2 4 7 "   D a t a T y p e = " S t r i n g " > S a l e s p e r s o n C o m m i s s i o n A n a l y s i s < / S a l e s p e r s o n C o m m i s s i o n A n a l y s i s > + 
+         < S a l e s p e r s o n C o m m i s s i o n L a b e l   E l e m e n t T y p e = " P a r a m e t e r "   E l e m e n t I d = " 3 0 0 0 9 6 0 5 1 "   D a t a T y p e = " S t r i n g " > S a l e s p e r s o n C o m m i s s i o n L a b e l < / S a l e s p e r s o n C o m m i s s i o n L a b e l > + 
+         < S a l e s p e r s o n C o m m i s s i o n P r i n t   E l e m e n t T y p e = " P a r a m e t e r "   E l e m e n t I d = " 1 3 1 6 0 2 8 6 0 "   D a t a T y p e = " S t r i n g " > S a l e s p e r s o n C o m m i s s i o n P r i n t < / S a l e s p e r s o n C o m m i s s i o n P r i n t > + 
+         < S a l e s p e r s o n P u r c h a s e r _ C o d e C a p t i o n   E l e m e n t T y p e = " P a r a m e t e r "   E l e m e n t I d = " 1 2 2 1 2 1 9 2 4 5 "   D a t a T y p e = " S t r i n g " > S a l e s p e r s o n P u r c h a s e r _ C o d e C a p t i o n < / S a l e s p e r s o n P u r c h a s e r _ C o d e C a p t i o n > + 
+         < T o t a l s C a p t i o n   E l e m e n t T y p e = " P a r a m e t e r "   E l e m e n t I d = " 2 3 5 4 5 9 0 6 "   D a t a T y p e = " S t r i n g " > T o t a l s C a p t i o n < / T o t a l s C a p t i o n > + 
+         < U s e r L a b e l   E l e m e n t T y p e = " P a r a m e t e r "   E l e m e n t I d = " 8 4 8 8 1 6 7 9 4 "   D a t a T y p e = " S t r i n g " > U s e r L a b e l < / U s e r L a b e l >   
      < / L a b e l s >   
-     < S a l e s p e r s o n _ P u r c h a s e r > - 
-         < A d j P r o f i t > A d j P r o f i t < / A d j P r o f i t > - 
-         < A d j P r o f i t C o m m i s s i o n A m t > A d j P r o f i t C o m m i s s i o n A m t < / A d j P r o f i t C o m m i s s i o n A m t > - 
-         < A d j P r o f i t C o m m i s s i o n A m t _ C o n t r o l 4 5 C a p t i o n > A d j P r o f i t C o m m i s s i o n A m t _ C o n t r o l 4 5 C a p t i o n < / A d j P r o f i t C o m m i s s i o n A m t _ C o n t r o l 4 5 C a p t i o n > - 
-         < A d j P r o f i t _ C o n t r o l 3 9 C a p t i o n > A d j P r o f i t _ C o n t r o l 3 9 C a p t i o n < / A d j P r o f i t _ C o n t r o l 3 9 C a p t i o n > - 
-         < A l l _ a m o u n t s _ a r e _ i n _ L C Y C a p t i o n > A l l _ a m o u n t s _ a r e _ i n _ L C Y C a p t i o n < / A l l _ a m o u n t s _ a r e _ i n _ L C Y C a p t i o n > - 
-         < C O M P A N Y N A M E > C O M P A N Y N A M E < / C O M P A N Y N A M E > - 
-         < C u r r R e p o r t _ P A G E N O C a p t i o n > C u r r R e p o r t _ P A G E N O C a p t i o n < / C u r r R e p o r t _ P A G E N O C a p t i o n > - 
-         < C u s t L e d g E n t r y F i l t e r > C u s t L e d g E n t r y F i l t e r < / C u s t L e d g E n t r y F i l t e r > - 
-         < C u s t _ _ L e d g e r _ E n t r y _ _ C u s t o m e r _ N o _ _ C a p t i o n > C u s t _ _ L e d g e r _ E n t r y _ _ C u s t o m e r _ N o _ _ C a p t i o n < / C u s t _ _ L e d g e r _ E n t r y _ _ C u s t o m e r _ N o _ _ C a p t i o n > - 
-         < C u s t _ _ L e d g e r _ E n t r y _ _ D o c u m e n t _ N o _ _ C a p t i o n > C u s t _ _ L e d g e r _ E n t r y _ _ D o c u m e n t _ N o _ _ C a p t i o n < / C u s t _ _ L e d g e r _ E n t r y _ _ D o c u m e n t _ N o _ _ C a p t i o n > - 
-         < C u s t _ _ L e d g e r _ E n t r y _ _ P o s t i n g _ D a t e _ C a p t i o n > C u s t _ _ L e d g e r _ E n t r y _ _ P o s t i n g _ D a t e _ C a p t i o n < / C u s t _ _ L e d g e r _ E n t r y _ _ P o s t i n g _ D a t e _ C a p t i o n > - 
-         < C u s t _ _ L e d g e r _ E n t r y _ _ P r o f i t _ _ L C Y _ _ C a p t i o n > C u s t _ _ L e d g e r _ E n t r y _ _ P r o f i t _ _ L C Y _ _ C a p t i o n < / C u s t _ _ L e d g e r _ E n t r y _ _ P r o f i t _ _ L C Y _ _ C a p t i o n > - 
-         < C u s t _ _ L e d g e r _ E n t r y _ _ S a l e s _ _ L C Y _ _ C a p t i o n > C u s t _ _ L e d g e r _ E n t r y _ _ S a l e s _ _ L C Y _ _ C a p t i o n < / C u s t _ _ L e d g e r _ E n t r y _ _ S a l e s _ _ L C Y _ _ C a p t i o n > - 
-         < C u s t _ _ L e d g e r _ E n t r y _ _ T A B L E C A P T I O N _ _ _ _ _ _ _ _ _ _ C u s t L e d g E n t r y F i l t e r > C u s t _ _ L e d g e r _ E n t r y _ _ T A B L E C A P T I O N _ _ _ _ _ _ _ _ _ _ C u s t L e d g E n t r y F i l t e r < / C u s t _ _ L e d g e r _ E n t r y _ _ T A B L E C A P T I O N _ _ _ _ _ _ _ _ _ _ C u s t L e d g E n t r y F i l t e r > - 
-         < C u s t _ _ L e d g e r _ E n t r y _ _ _ P r o f i t _ _ L C Y _ _ > C u s t _ _ L e d g e r _ E n t r y _ _ _ P r o f i t _ _ L C Y _ _ < / C u s t _ _ L e d g e r _ E n t r y _ _ _ P r o f i t _ _ L C Y _ _ > - 
-         < C u s t _ _ L e d g e r _ E n t r y _ _ _ S a l e s _ _ L C Y _ _ > C u s t _ _ L e d g e r _ E n t r y _ _ _ S a l e s _ _ L C Y _ _ < / C u s t _ _ L e d g e r _ E n t r y _ _ _ S a l e s _ _ L C Y _ _ > - 
-         < P a g e G r o u p N o > P a g e G r o u p N o < / P a g e G r o u p N o > - 
-         < P r o f i t C o m m i s s i o n A m t > P r o f i t C o m m i s s i o n A m t < / P r o f i t C o m m i s s i o n A m t > - 
-         < P r o f i t C o m m i s s i o n A m t _ C o n t r o l 3 3 C a p t i o n > P r o f i t C o m m i s s i o n A m t _ C o n t r o l 3 3 C a p t i o n < / P r o f i t C o m m i s s i o n A m t _ C o n t r o l 3 3 C a p t i o n > - 
-         < S a l e s C o m m i s s i o n A m t > S a l e s C o m m i s s i o n A m t < / S a l e s C o m m i s s i o n A m t > - 
-         < S a l e s C o m m i s s i o n A m t _ C o n t r o l 3 2 C a p t i o n > S a l e s C o m m i s s i o n A m t _ C o n t r o l 3 2 C a p t i o n < / S a l e s C o m m i s s i o n A m t _ C o n t r o l 3 2 C a p t i o n > - 
-         < S a l e s p e r s o n F i l t e r > S a l e s p e r s o n F i l t e r < / S a l e s p e r s o n F i l t e r > - 
-         < S a l e s p e r s o n _ P u r c h a s e r _ C o d e > S a l e s p e r s o n _ P u r c h a s e r _ C o d e < / S a l e s p e r s o n _ P u r c h a s e r _ C o d e > - 
-         < S a l e s p e r s o n _ P u r c h a s e r _ N a m e > S a l e s p e r s o n _ P u r c h a s e r _ N a m e < / S a l e s p e r s o n _ P u r c h a s e r _ N a m e > - 
-         < S a l e s p e r s o n _ P u r c h a s e r _ _ C o m m i s s i o n _ _ _ > S a l e s p e r s o n _ P u r c h a s e r _ _ C o m m i s s i o n _ _ _ < / S a l e s p e r s o n _ P u r c h a s e r _ _ C o m m i s s i o n _ _ _ > - 
-         < S a l e s p e r s o n _ P u r c h a s e r _ _ C o m m i s s i o n _ _ _ C a p t i o n > S a l e s p e r s o n _ P u r c h a s e r _ _ C o m m i s s i o n _ _ _ C a p t i o n < / S a l e s p e r s o n _ P u r c h a s e r _ _ C o m m i s s i o n _ _ _ C a p t i o n > - 
-         < S a l e s p e r s o n _ P u r c h a s e r _ _ T A B L E C A P T I O N _ _ _ _ _ _ _ _ _ _ S a l e s p e r s o n F i l t e r > S a l e s p e r s o n _ P u r c h a s e r _ _ T A B L E C A P T I O N _ _ _ _ _ _ _ _ _ _ S a l e s p e r s o n F i l t e r < / S a l e s p e r s o n _ P u r c h a s e r _ _ T A B L E C A P T I O N _ _ _ _ _ _ _ _ _ _ S a l e s p e r s o n F i l t e r > - 
-         < S a l e s p e r s o n _ _ _ C o m m i s s i o n C a p t i o n > S a l e s p e r s o n _ _ _ C o m m i s s i o n C a p t i o n < / S a l e s p e r s o n _ _ _ C o m m i s s i o n C a p t i o n > - 
-         < S T R S U B S T N O _ T e x t 0 0 0 _ P e r i o d T e x t _ > S T R S U B S T N O _ T e x t 0 0 0 _ P e r i o d T e x t _ < / S T R S U B S T N O _ T e x t 0 0 0 _ P e r i o d T e x t _ > - 
-         < T o t a l C a p t i o n > T o t a l C a p t i o n < / T o t a l C a p t i o n > - 
-         < C u s t _ L e d g e r _ E n t r y > - 
-             < A d j P r o f i t C o m m i s s i o n A m t _ C o n t r o l 4 5 > A d j P r o f i t C o m m i s s i o n A m t _ C o n t r o l 4 5 < / A d j P r o f i t C o m m i s s i o n A m t _ C o n t r o l 4 5 > - 
-             < A d j P r o f i t _ C o n t r o l 3 9 > A d j P r o f i t _ C o n t r o l 3 9 < / A d j P r o f i t _ C o n t r o l 3 9 > - 
-             < C u s t L e d g e r E n t r y _ C u s t o m e r N a m e > C u s t L e d g e r E n t r y _ C u s t o m e r N a m e < / C u s t L e d g e r E n t r y _ C u s t o m e r N a m e > - 
-             < C u s t _ _ L e d g e r _ E n t r y _ _ C u s t o m e r _ N o _ _ > C u s t _ _ L e d g e r _ E n t r y _ _ C u s t o m e r _ N o _ _ < / C u s t _ _ L e d g e r _ E n t r y _ _ C u s t o m e r _ N o _ _ > - 
-             < C u s t _ _ L e d g e r _ E n t r y _ _ D o c u m e n t _ N o _ _ > C u s t _ _ L e d g e r _ E n t r y _ _ D o c u m e n t _ N o _ _ < / C u s t _ _ L e d g e r _ E n t r y _ _ D o c u m e n t _ N o _ _ > - 
-             < C u s t _ _ L e d g e r _ E n t r y _ _ P o s t i n g _ D a t e _ > C u s t _ _ L e d g e r _ E n t r y _ _ P o s t i n g _ D a t e _ < / C u s t _ _ L e d g e r _ E n t r y _ _ P o s t i n g _ D a t e _ > - 
-             < C u s t _ _ L e d g e r _ E n t r y _ _ P r o f i t _ _ L C Y _ _ > C u s t _ _ L e d g e r _ E n t r y _ _ P r o f i t _ _ L C Y _ _ < / C u s t _ _ L e d g e r _ E n t r y _ _ P r o f i t _ _ L C Y _ _ > - 
-             < C u s t _ _ L e d g e r _ E n t r y _ _ S a l e s _ _ L C Y _ _ > C u s t _ _ L e d g e r _ E n t r y _ _ S a l e s _ _ L C Y _ _ < / C u s t _ _ L e d g e r _ E n t r y _ _ S a l e s _ _ L C Y _ _ > - 
-             < P r o f i t C o m m i s s i o n A m t _ C o n t r o l 3 3 > P r o f i t C o m m i s s i o n A m t _ C o n t r o l 3 3 < / P r o f i t C o m m i s s i o n A m t _ C o n t r o l 3 3 > - 
-             < S a l e s C o m m i s s i o n A m t _ C o n t r o l 3 2 > S a l e s C o m m i s s i o n A m t _ C o n t r o l 3 2 < / S a l e s C o m m i s s i o n A m t _ C o n t r o l 3 2 > - 
-             < S a l e s p e r s o n P u r c h a s e r _ C o d e > S a l e s p e r s o n P u r c h a s e r _ C o d e < / S a l e s p e r s o n P u r c h a s e r _ C o d e > - 
-             < S a l e s p e r s o n _ P u r c h a s e r _ _ N a m e > S a l e s p e r s o n _ P u r c h a s e r _ _ N a m e < / S a l e s p e r s o n _ P u r c h a s e r _ _ N a m e > +     < T o o l t i p s > + 
+         < T o o l t i p   c o l u m n = " S a l e s p e r s o n _ P u r c h a s e r _ C o d e "   E l e m e n t I d = " 1 3 8 8 0 3 1 6 5 2 " > + 
+             < T o o l t i p T e x t   l a n g = " e n - U S " > S p e c i f i e s   a   c o d e   f o r   t h e   s a l e s p e r s o n   o r   p u r c h a s e r . < / T o o l t i p T e x t > + 
+         < / T o o l t i p > + 
+         < T o o l t i p   c o l u m n = " S a l e s p e r s o n _ P u r c h a s e r _ N a m e "   E l e m e n t I d = " 1 3 4 8 2 2 8 4 6 2 " > + 
+             < T o o l t i p T e x t   l a n g = " e n - U S " > S p e c i f i e s   t h e   n a m e   o f   t h e   s a l e s p e r s o n   o r   p u r c h a s e r . < / T o o l t i p T e x t > + 
+         < / T o o l t i p > + 
+         < T o o l t i p   c o l u m n = " S a l e s p e r s o n _ P u r c h a s e r _ _ C o m m i s s i o n _ _ _ "   E l e m e n t I d = " 1 5 9 0 6 8 9 0 0 4 " > + 
+             < T o o l t i p T e x t   l a n g = " e n - U S " > S p e c i f i e s   t h e   p e r c e n t a g e   t o   u s e   t o   c a l c u l a t e   t h e   s a l e s p e r s o n ' s   c o m m i s s i o n . < / T o o l t i p T e x t > + 
+         < / T o o l t i p > + 
+         < T o o l t i p   c o l u m n = " C u s t _ _ L e d g e r _ E n t r y _ _ _ S a l e s _ _ L C Y _ _ "   E l e m e n t I d = " 3 4 8 7 9 4 9 4 9 " > + 
+             < T o o l t i p T e x t   l a n g = " e n - U S " > S p e c i f i e s   t h e   t o t a l   s a l e s   a m o u n t   e x c l .   V A T   t o   t h e   c u s t o m e r   i n   L C Y . < / T o o l t i p T e x t > + 
+         < / T o o l t i p > + 
+         < T o o l t i p   c o l u m n = " C u s t _ _ L e d g e r _ E n t r y _ _ D o c u m e n t _ N o _ _ "   E l e m e n t I d = " 8 5 2 6 1 1 1 8 1 " > + 
+             < T o o l t i p T e x t   l a n g = " e n - U S " > S p e c i f i e s   t h e   e n t r y ' s   d o c u m e n t   n u m b e r . < / T o o l t i p T e x t > + 
+         < / T o o l t i p > + 
+         < T o o l t i p   c o l u m n = " C u s t _ _ L e d g e r _ E n t r y _ _ C u s t o m e r _ N o _ _ "   E l e m e n t I d = " 1 0 0 9 0 1 6 8 0 8 " > + 
+             < T o o l t i p T e x t   l a n g = " e n - U S " > S p e c i f i e s   t h e   c u s t o m e r   a c c o u n t   n u m b e r   t h a t   t h e   e n t r y   i s   l i n k e d   t o . < / T o o l t i p T e x t > + 
+         < / T o o l t i p > + 
+         < T o o l t i p   c o l u m n = " C u s t _ _ L e d g e r _ E n t r y _ _ S a l e s _ _ L C Y _ _ "   E l e m e n t I d = " 8 1 9 5 1 7 4 8 " > + 
+             < T o o l t i p T e x t   l a n g = " e n - U S " > S p e c i f i e s   t h e   t o t a l   s a l e s   a m o u n t   e x c l .   V A T   t o   t h e   c u s t o m e r   i n   L C Y . < / T o o l t i p T e x t > + 
+         < / T o o l t i p > + 
+         < T o o l t i p   c o l u m n = " C u s t L e d g e r E n t r y _ C u s t o m e r N a m e "   E l e m e n t I d = " 2 0 9 1 8 9 3 2 7 9 " > + 
+             < T o o l t i p T e x t   l a n g = " e n - U S " > S p e c i f i e s   t h e   c u s t o m e r   n a m e   t h a t   t h e   e n t r y   i s   l i n k e d   t o . < / T o o l t i p T e x t > + 
+         < / T o o l t i p > + 
+         < T o o l t i p   c o l u m n = " S a l e s p e r s o n P u r c h a s e r _ C o d e "   E l e m e n t I d = " 1 2 2 1 2 1 9 2 4 5 " > + 
+             < T o o l t i p T e x t   l a n g = " e n - U S " > S p e c i f i e s   a   c o d e   f o r   t h e   s a l e s p e r s o n   o r   p u r c h a s e r . < / T o o l t i p T e x t > + 
+         < / T o o l t i p > + 
+         < T o o l t i p   c o l u m n = " S a l e s p e r s o n _ P u r c h a s e r _ _ N a m e "   E l e m e n t I d = " 1 1 9 5 8 7 9 8 7 3 " > + 
+             < T o o l t i p T e x t   l a n g = " e n - U S " > S p e c i f i e s   t h e   n a m e   o f   t h e   s a l e s p e r s o n   o r   p u r c h a s e r . < / T o o l t i p T e x t > + 
+         < / T o o l t i p > + 
+         < T o o l t i p   c o l u m n = " S u b t o t a l s _ S a l e s p e r s o n _ C o d e "   E l e m e n t I d = " 1 1 9 8 5 9 4 2 7 2 " > + 
+             < T o o l t i p T e x t   l a n g = " e n - U S " > S p e c i f i e s   a   c o d e   f o r   t h e   s a l e s p e r s o n   o r   p u r c h a s e r . < / T o o l t i p T e x t > + 
+         < / T o o l t i p > + 
+     < / T o o l t i p s > + 
+     < S a l e s p e r s o n _ P u r c h a s e r   E l e m e n t T y p e = " D a t a I t e m "   E l e m e n t I d = " 7 1 5 0 0 7 1 9 8 " > + 
+         < A d j P r o f i t   E l e m e n t T y p e = " C o l u m n "   E l e m e n t I d = " 6 6 6 3 9 3 8 5 2 "   D a t a T y p e = " D e c i m a l "   O b s o l e t e S t a t e = " P e n d i n g " > A d j P r o f i t < / A d j P r o f i t > + 
+         < A d j P r o f i t C o m m i s s i o n A m t   E l e m e n t T y p e = " C o l u m n "   E l e m e n t I d = " 1 5 8 1 4 8 8 5 9 9 "   D a t a T y p e = " D e c i m a l "   O b s o l e t e S t a t e = " P e n d i n g " > A d j P r o f i t C o m m i s s i o n A m t < / A d j P r o f i t C o m m i s s i o n A m t > + 
+         < A d j P r o f i t C o m m i s s i o n A m t _ C o n t r o l 4 5 C a p t i o n   E l e m e n t T y p e = " C o l u m n "   E l e m e n t I d = " 6 2 1 2 7 7 8 5 4 "   D a t a T y p e = " L a b e l "   O b s o l e t e S t a t e = " P e n d i n g " > A d j P r o f i t C o m m i s s i o n A m t _ C o n t r o l 4 5 C a p t i o n < / A d j P r o f i t C o m m i s s i o n A m t _ C o n t r o l 4 5 C a p t i o n > + 
+         < A d j P r o f i t _ C o n t r o l 3 9 C a p t i o n   E l e m e n t T y p e = " C o l u m n "   E l e m e n t I d = " 2 1 3 3 9 8 4 3 2 "   D a t a T y p e = " L a b e l "   O b s o l e t e S t a t e = " P e n d i n g " > A d j P r o f i t _ C o n t r o l 3 9 C a p t i o n < / A d j P r o f i t _ C o n t r o l 3 9 C a p t i o n > + 
+         < A l l _ a m o u n t s _ a r e _ i n _ L C Y C a p t i o n   E l e m e n t T y p e = " C o l u m n "   E l e m e n t I d = " 6 9 7 4 8 4 8 0 2 "   D a t a T y p e = " L a b e l "   O b s o l e t e S t a t e = " P e n d i n g " > A l l _ a m o u n t s _ a r e _ i n _ L C Y C a p t i o n < / A l l _ a m o u n t s _ a r e _ i n _ L C Y C a p t i o n > + 
+         < C O M P A N Y N A M E   E l e m e n t T y p e = " C o l u m n "   E l e m e n t I d = " 1 7 5 3 0 1 5 1 5 5 "   D a t a T y p e = " S t r i n g "   O b s o l e t e S t a t e = " P e n d i n g " > C O M P A N Y N A M E < / C O M P A N Y N A M E > + 
+         < C u r r R e p o r t _ P A G E N O C a p t i o n   E l e m e n t T y p e = " C o l u m n "   E l e m e n t I d = " 1 8 4 6 2 6 2 1 5 8 "   D a t a T y p e = " L a b e l "   O b s o l e t e S t a t e = " P e n d i n g " > C u r r R e p o r t _ P A G E N O C a p t i o n < / C u r r R e p o r t _ P A G E N O C a p t i o n > + 
+         < C u s t L e d g E n t r y F i l t e r   E l e m e n t T y p e = " C o l u m n "   E l e m e n t I d = " 1 1 7 3 5 3 2 6 6 6 "   D a t a T y p e = " T e x t "   O b s o l e t e S t a t e = " P e n d i n g " > C u s t L e d g E n t r y F i l t e r < / C u s t L e d g E n t r y F i l t e r > + 
+         < C u s t _ _ L e d g e r _ E n t r y _ _ C u s t o m e r _ N o _ _ C a p t i o n   E l e m e n t T y p e = " C o l u m n "   E l e m e n t I d = " 1 2 2 3 8 5 6 2 7 8 "   D a t a T y p e = " S t r i n g "   O b s o l e t e S t a t e = " P e n d i n g " > C u s t _ _ L e d g e r _ E n t r y _ _ C u s t o m e r _ N o _ _ C a p t i o n < / C u s t _ _ L e d g e r _ E n t r y _ _ C u s t o m e r _ N o _ _ C a p t i o n > + 
+         < C u s t _ _ L e d g e r _ E n t r y _ _ D o c u m e n t _ N o _ _ C a p t i o n   E l e m e n t T y p e = " C o l u m n "   E l e m e n t I d = " 4 8 8 8 0 6 5 1 7 "   D a t a T y p e = " S t r i n g "   O b s o l e t e S t a t e = " P e n d i n g " > C u s t _ _ L e d g e r _ E n t r y _ _ D o c u m e n t _ N o _ _ C a p t i o n < / C u s t _ _ L e d g e r _ E n t r y _ _ D o c u m e n t _ N o _ _ C a p t i o n > + 
+         < C u s t _ _ L e d g e r _ E n t r y _ _ P o s t i n g _ D a t e _ C a p t i o n   E l e m e n t T y p e = " C o l u m n "   E l e m e n t I d = " 2 0 7 9 4 3 8 7 1 2 "   D a t a T y p e = " L a b e l "   O b s o l e t e S t a t e = " P e n d i n g " > C u s t _ _ L e d g e r _ E n t r y _ _ P o s t i n g _ D a t e _ C a p t i o n < / C u s t _ _ L e d g e r _ E n t r y _ _ P o s t i n g _ D a t e _ C a p t i o n > + 
+         < C u s t _ _ L e d g e r _ E n t r y _ _ P r o f i t _ _ L C Y _ _ C a p t i o n   E l e m e n t T y p e = " C o l u m n "   E l e m e n t I d = " 1 9 9 4 3 8 8 4 7 6 "   D a t a T y p e = " S t r i n g "   O b s o l e t e S t a t e = " P e n d i n g " > C u s t _ _ L e d g e r _ E n t r y _ _ P r o f i t _ _ L C Y _ _ C a p t i o n < / C u s t _ _ L e d g e r _ E n t r y _ _ P r o f i t _ _ L C Y _ _ C a p t i o n > + 
+         < C u s t _ _ L e d g e r _ E n t r y _ _ S a l e s _ _ L C Y _ _ C a p t i o n   E l e m e n t T y p e = " C o l u m n "   E l e m e n t I d = " 1 0 5 6 9 2 6 5 4 6 "   D a t a T y p e = " S t r i n g "   O b s o l e t e S t a t e = " P e n d i n g " > C u s t _ _ L e d g e r _ E n t r y _ _ S a l e s _ _ L C Y _ _ C a p t i o n < / C u s t _ _ L e d g e r _ E n t r y _ _ S a l e s _ _ L C Y _ _ C a p t i o n > + 
+         < C u s t _ _ L e d g e r _ E n t r y _ _ T A B L E C A P T I O N _ _ _ _ _ _ _ _ _ _ C u s t L e d g E n t r y F i l t e r   E l e m e n t T y p e = " C o l u m n "   E l e m e n t I d = " 7 1 0 6 3 3 9 1 7 "   D a t a T y p e = " T e x t " > C u s t _ _ L e d g e r _ E n t r y _ _ T A B L E C A P T I O N _ _ _ _ _ _ _ _ _ _ C u s t L e d g E n t r y F i l t e r < / C u s t _ _ L e d g e r _ E n t r y _ _ T A B L E C A P T I O N _ _ _ _ _ _ _ _ _ _ C u s t L e d g E n t r y F i l t e r > + 
+         < C u s t _ _ L e d g e r _ E n t r y _ _ _ P r o f i t _ _ L C Y _ _   E l e m e n t T y p e = " C o l u m n "   E l e m e n t I d = " 1 6 1 5 1 3 7 4 4 3 "   D a t a T y p e = " D e c i m a l "   O b s o l e t e S t a t e = " P e n d i n g " > C u s t _ _ L e d g e r _ E n t r y _ _ _ P r o f i t _ _ L C Y _ _ < / C u s t _ _ L e d g e r _ E n t r y _ _ _ P r o f i t _ _ L C Y _ _ > + 
+         < C u s t _ _ L e d g e r _ E n t r y _ _ _ S a l e s _ _ L C Y _ _   E l e m e n t T y p e = " C o l u m n "   E l e m e n t I d = " 3 4 8 7 9 4 9 4 9 "   D a t a T y p e = " D e c i m a l "   O b s o l e t e S t a t e = " P e n d i n g " > C u s t _ _ L e d g e r _ E n t r y _ _ _ S a l e s _ _ L C Y _ _ < / C u s t _ _ L e d g e r _ E n t r y _ _ _ S a l e s _ _ L C Y _ _ > + 
+         < P a g e G r o u p N o   E l e m e n t T y p e = " C o l u m n "   E l e m e n t I d = " 6 4 9 1 8 0 1 4 4 "   D a t a T y p e = " I n t e g e r "   O b s o l e t e S t a t e = " P e n d i n g " > P a g e G r o u p N o < / P a g e G r o u p N o > + 
+         < P r o f i t C o m m i s s i o n A m t   E l e m e n t T y p e = " C o l u m n "   E l e m e n t I d = " 4 1 6 2 2 4 2 0 6 "   D a t a T y p e = " D e c i m a l "   O b s o l e t e S t a t e = " P e n d i n g " > P r o f i t C o m m i s s i o n A m t < / P r o f i t C o m m i s s i o n A m t > + 
+         < P r o f i t C o m m i s s i o n A m t _ C o n t r o l 3 3 C a p t i o n   E l e m e n t T y p e = " C o l u m n "   E l e m e n t I d = " 4 6 5 8 1 2 5 3 6 "   D a t a T y p e = " L a b e l "   O b s o l e t e S t a t e = " P e n d i n g " > P r o f i t C o m m i s s i o n A m t _ C o n t r o l 3 3 C a p t i o n < / P r o f i t C o m m i s s i o n A m t _ C o n t r o l 3 3 C a p t i o n > + 
+         < S a l e s C o m m i s s i o n A m t   E l e m e n t T y p e = " C o l u m n "   E l e m e n t I d = " 1 6 5 6 6 7 5 0 1 6 "   D a t a T y p e = " D e c i m a l "   O b s o l e t e S t a t e = " P e n d i n g " > S a l e s C o m m i s s i o n A m t < / S a l e s C o m m i s s i o n A m t > + 
+         < S a l e s C o m m i s s i o n A m t _ C o n t r o l 3 2 C a p t i o n   E l e m e n t T y p e = " C o l u m n "   E l e m e n t I d = " 1 2 7 2 6 4 2 0 6 5 "   D a t a T y p e = " L a b e l "   O b s o l e t e S t a t e = " P e n d i n g " > S a l e s C o m m i s s i o n A m t _ C o n t r o l 3 2 C a p t i o n < / S a l e s C o m m i s s i o n A m t _ C o n t r o l 3 2 C a p t i o n > + 
+         < S a l e s p e r s o n F i l t e r   E l e m e n t T y p e = " C o l u m n "   E l e m e n t I d = " 1 2 4 2 2 8 3 2 5 6 "   D a t a T y p e = " T e x t "   O b s o l e t e S t a t e = " P e n d i n g " > S a l e s p e r s o n F i l t e r < / S a l e s p e r s o n F i l t e r > + 
+         < S a l e s p e r s o n _ P u r c h a s e r _ C o d e   E l e m e n t T y p e = " C o l u m n "   E l e m e n t I d = " 1 3 8 8 0 3 1 6 5 2 "   D a t a T y p e = " C o d e " > S a l e s p e r s o n _ P u r c h a s e r _ C o d e < / S a l e s p e r s o n _ P u r c h a s e r _ C o d e > + 
+         < S a l e s p e r s o n _ P u r c h a s e r _ N a m e   E l e m e n t T y p e = " C o l u m n "   E l e m e n t I d = " 1 3 4 8 2 2 8 4 6 2 "   D a t a T y p e = " T e x t " > S a l e s p e r s o n _ P u r c h a s e r _ N a m e < / S a l e s p e r s o n _ P u r c h a s e r _ N a m e > + 
+         < S a l e s p e r s o n _ P u r c h a s e r _ _ C o m m i s s i o n _ _ _   E l e m e n t T y p e = " C o l u m n "   E l e m e n t I d = " 1 5 9 0 6 8 9 0 0 4 "   D a t a T y p e = " D e c i m a l " > S a l e s p e r s o n _ P u r c h a s e r _ _ C o m m i s s i o n _ _ _ < / S a l e s p e r s o n _ P u r c h a s e r _ _ C o m m i s s i o n _ _ _ > + 
+         < S a l e s p e r s o n _ P u r c h a s e r _ _ C o m m i s s i o n _ _ _ C a p t i o n   E l e m e n t T y p e = " C o l u m n "   E l e m e n t I d = " 4 9 9 4 6 3 1 7 0 "   D a t a T y p e = " S t r i n g "   O b s o l e t e S t a t e = " P e n d i n g " > S a l e s p e r s o n _ P u r c h a s e r _ _ C o m m i s s i o n _ _ _ C a p t i o n < / S a l e s p e r s o n _ P u r c h a s e r _ _ C o m m i s s i o n _ _ _ C a p t i o n > + 
+         < S a l e s p e r s o n _ P u r c h a s e r _ _ T A B L E C A P T I O N _ _ _ _ _ _ _ _ _ _ S a l e s p e r s o n F i l t e r   E l e m e n t T y p e = " C o l u m n "   E l e m e n t I d = " 1 0 1 6 0 4 1 6 9 9 "   D a t a T y p e = " T e x t " > S a l e s p e r s o n _ P u r c h a s e r _ _ T A B L E C A P T I O N _ _ _ _ _ _ _ _ _ _ S a l e s p e r s o n F i l t e r < / S a l e s p e r s o n _ P u r c h a s e r _ _ T A B L E C A P T I O N _ _ _ _ _ _ _ _ _ _ S a l e s p e r s o n F i l t e r > + 
+         < S a l e s p e r s o n _ _ _ C o m m i s s i o n C a p t i o n   E l e m e n t T y p e = " C o l u m n "   E l e m e n t I d = " 1 7 6 9 4 7 1 9 4 8 "   D a t a T y p e = " L a b e l "   O b s o l e t e S t a t e = " P e n d i n g " > S a l e s p e r s o n _ _ _ C o m m i s s i o n C a p t i o n < / S a l e s p e r s o n _ _ _ C o m m i s s i o n C a p t i o n > + 
+         < S T R S U B S T N O _ T e x t 0 0 0 _ P e r i o d T e x t _   E l e m e n t T y p e = " C o l u m n "   E l e m e n t I d = " 7 2 2 9 9 1 7 0 4 "   D a t a T y p e = " S t r i n g " > S T R S U B S T N O _ T e x t 0 0 0 _ P e r i o d T e x t _ < / S T R S U B S T N O _ T e x t 0 0 0 _ P e r i o d T e x t _ > + 
+         < T o t a l C a p t i o n   E l e m e n t T y p e = " C o l u m n "   E l e m e n t I d = " 7 0 7 1 0 2 6 9 5 "   D a t a T y p e = " L a b e l "   O b s o l e t e S t a t e = " P e n d i n g " > T o t a l C a p t i o n < / T o t a l C a p t i o n > + 
+         < C u s t _ L e d g e r _ E n t r y   E l e m e n t T y p e = " D a t a I t e m "   E l e m e n t I d = " 1 6 3 9 1 4 6 4 4 5 " > + 
+             < A d j P r o f i t C o m m i s s i o n A m t _ C o n t r o l 4 5   E l e m e n t T y p e = " C o l u m n "   E l e m e n t I d = " 8 0 5 8 9 6 4 0 0 "   D a t a T y p e = " D e c i m a l " > A d j P r o f i t C o m m i s s i o n A m t _ C o n t r o l 4 5 < / A d j P r o f i t C o m m i s s i o n A m t _ C o n t r o l 4 5 > + 
+             < A d j P r o f i t _ C o n t r o l 3 9   E l e m e n t T y p e = " C o l u m n "   E l e m e n t I d = " 2 0 2 4 1 9 6 5 4 2 "   D a t a T y p e = " D e c i m a l " > A d j P r o f i t _ C o n t r o l 3 9 < / A d j P r o f i t _ C o n t r o l 3 9 > + 
+             < C u s t L e d g e r E n t r y _ C u s t o m e r N a m e   E l e m e n t T y p e = " C o l u m n "   E l e m e n t I d = " 2 0 9 1 8 9 3 2 7 9 "   D a t a T y p e = " T e x t " > C u s t L e d g e r E n t r y _ C u s t o m e r N a m e < / C u s t L e d g e r E n t r y _ C u s t o m e r N a m e > + 
+             < C u s t _ _ L e d g e r _ E n t r y _ _ C u s t o m e r _ N o _ _   E l e m e n t T y p e = " C o l u m n "   E l e m e n t I d = " 1 0 0 9 0 1 6 8 0 8 "   D a t a T y p e = " C o d e " > C u s t _ _ L e d g e r _ E n t r y _ _ C u s t o m e r _ N o _ _ < / C u s t _ _ L e d g e r _ E n t r y _ _ C u s t o m e r _ N o _ _ > + 
+             < C u s t _ _ L e d g e r _ E n t r y _ _ D o c u m e n t _ N o _ _   E l e m e n t T y p e = " C o l u m n "   E l e m e n t I d = " 8 5 2 6 1 1 1 8 1 "   D a t a T y p e = " C o d e " > C u s t _ _ L e d g e r _ E n t r y _ _ D o c u m e n t _ N o _ _ < / C u s t _ _ L e d g e r _ E n t r y _ _ D o c u m e n t _ N o _ _ > + 
+             < C u s t _ _ L e d g e r _ E n t r y _ _ P o s t i n g _ D a t e _   E l e m e n t T y p e = " C o l u m n "   E l e m e n t I d = " 2 1 4 2 6 5 7 1 6 2 "   D a t a T y p e = " S t r i n g " > C u s t _ _ L e d g e r _ E n t r y _ _ P o s t i n g _ D a t e _ < / C u s t _ _ L e d g e r _ E n t r y _ _ P o s t i n g _ D a t e _ > + 
+             < C u s t _ _ L e d g e r _ E n t r y _ _ P r o f i t _ _ L C Y _ _   E l e m e n t T y p e = " C o l u m n "   E l e m e n t I d = " 5 1 9 3 4 1 8 2 6 "   D a t a T y p e = " D e c i m a l " > C u s t _ _ L e d g e r _ E n t r y _ _ P r o f i t _ _ L C Y _ _ < / C u s t _ _ L e d g e r _ E n t r y _ _ P r o f i t _ _ L C Y _ _ > + 
+             < C u s t _ _ L e d g e r _ E n t r y _ _ S a l e s _ _ L C Y _ _   E l e m e n t T y p e = " C o l u m n "   E l e m e n t I d = " 8 1 9 5 1 7 4 8 "   D a t a T y p e = " D e c i m a l " > C u s t _ _ L e d g e r _ E n t r y _ _ S a l e s _ _ L C Y _ _ < / C u s t _ _ L e d g e r _ E n t r y _ _ S a l e s _ _ L C Y _ _ > + 
+             < P r o f i t C o m m i s s i o n A m t _ C o n t r o l 3 3   E l e m e n t T y p e = " C o l u m n "   E l e m e n t I d = " 3 1 2 1 8 6 8 2 6 "   D a t a T y p e = " D e c i m a l " > P r o f i t C o m m i s s i o n A m t _ C o n t r o l 3 3 < / P r o f i t C o m m i s s i o n A m t _ C o n t r o l 3 3 > + 
+             < S a l e s C o m m i s s i o n A m t _ C o n t r o l 3 2   E l e m e n t T y p e = " C o l u m n "   E l e m e n t I d = " 1 4 6 2 3 9 0 1 5 3 "   D a t a T y p e = " D e c i m a l " > S a l e s C o m m i s s i o n A m t _ C o n t r o l 3 2 < / S a l e s C o m m i s s i o n A m t _ C o n t r o l 3 2 > + 
+             < S a l e s p e r s o n P u r c h a s e r _ C o d e   E l e m e n t T y p e = " C o l u m n "   E l e m e n t I d = " 1 2 2 1 2 1 9 2 4 5 "   D a t a T y p e = " C o d e " > S a l e s p e r s o n P u r c h a s e r _ C o d e < / S a l e s p e r s o n P u r c h a s e r _ C o d e > + 
+             < S a l e s p e r s o n _ P u r c h a s e r _ _ N a m e   E l e m e n t T y p e = " C o l u m n "   E l e m e n t I d = " 1 1 9 5 8 7 9 8 7 3 "   D a t a T y p e = " T e x t " > S a l e s p e r s o n _ P u r c h a s e r _ _ N a m e < / S a l e s p e r s o n _ P u r c h a s e r _ _ N a m e >   
          < / C u s t _ L e d g e r _ E n t r y >   
-         < S u b t o t a l s > - 
-             < S u b t o t a l s _ A d j P r o f i t > S u b t o t a l s _ A d j P r o f i t < / S u b t o t a l s _ A d j P r o f i t > - 
-             < S u b t o t a l s _ A d j P r o f i t C o m m i s s i o n > S u b t o t a l s _ A d j P r o f i t C o m m i s s i o n < / S u b t o t a l s _ A d j P r o f i t C o m m i s s i o n > - 
-             < S u b t o t a l s _ P r o f i t > S u b t o t a l s _ P r o f i t < / S u b t o t a l s _ P r o f i t > - 
-             < S u b t o t a l s _ P r o f i t C o m m i s s i o n > S u b t o t a l s _ P r o f i t C o m m i s s i o n < / S u b t o t a l s _ P r o f i t C o m m i s s i o n > - 
-             < S u b t o t a l s _ S a l e s > S u b t o t a l s _ S a l e s < / S u b t o t a l s _ S a l e s > - 
-             < S u b t o t a l s _ S a l e s C o m m i s s i o n > S u b t o t a l s _ S a l e s C o m m i s s i o n < / S u b t o t a l s _ S a l e s C o m m i s s i o n > - 
-             < S u b t o t a l s _ S a l e s p e r s o n _ C o d e > S u b t o t a l s _ S a l e s p e r s o n _ C o d e < / S u b t o t a l s _ S a l e s p e r s o n _ C o d e > +         < S u b t o t a l s   E l e m e n t T y p e = " D a t a I t e m "   E l e m e n t I d = " 8 3 8 6 9 3 5 6 0 " > + 
+             < S u b t o t a l s _ A d j P r o f i t   E l e m e n t T y p e = " C o l u m n "   E l e m e n t I d = " 5 6 1 3 6 6 8 2 2 "   D a t a T y p e = " D e c i m a l " > S u b t o t a l s _ A d j P r o f i t < / S u b t o t a l s _ A d j P r o f i t > + 
+             < S u b t o t a l s _ A d j P r o f i t C o m m i s s i o n   E l e m e n t T y p e = " C o l u m n "   E l e m e n t I d = " 1 4 1 8 9 7 1 8 3 5 "   D a t a T y p e = " D e c i m a l " > S u b t o t a l s _ A d j P r o f i t C o m m i s s i o n < / S u b t o t a l s _ A d j P r o f i t C o m m i s s i o n > + 
+             < S u b t o t a l s _ P r o f i t   E l e m e n t T y p e = " C o l u m n "   E l e m e n t I d = " 2 4 1 5 0 0 6 9 7 "   D a t a T y p e = " D e c i m a l " > S u b t o t a l s _ P r o f i t < / S u b t o t a l s _ P r o f i t > + 
+             < S u b t o t a l s _ P r o f i t C o m m i s s i o n   E l e m e n t T y p e = " C o l u m n "   E l e m e n t I d = " 1 4 9 6 3 3 2 1 7 2 "   D a t a T y p e = " D e c i m a l " > S u b t o t a l s _ P r o f i t C o m m i s s i o n < / S u b t o t a l s _ P r o f i t C o m m i s s i o n > + 
+             < S u b t o t a l s _ S a l e s   E l e m e n t T y p e = " C o l u m n "   E l e m e n t I d = " 1 9 7 8 7 7 5 0 3 "   D a t a T y p e = " D e c i m a l " > S u b t o t a l s _ S a l e s < / S u b t o t a l s _ S a l e s > + 
+             < S u b t o t a l s _ S a l e s C o m m i s s i o n   E l e m e n t T y p e = " C o l u m n "   E l e m e n t I d = " 1 4 7 6 0 7 2 5 9 0 "   D a t a T y p e = " D e c i m a l " > S u b t o t a l s _ S a l e s C o m m i s s i o n < / S u b t o t a l s _ S a l e s C o m m i s s i o n > + 
+             < S u b t o t a l s _ S a l e s p e r s o n _ C o d e   E l e m e n t T y p e = " C o l u m n "   E l e m e n t I d = " 1 1 9 8 5 9 4 2 7 2 "   D a t a T y p e = " C o d e " > S u b t o t a l s _ S a l e s p e r s o n _ C o d e < / S u b t o t a l s _ S a l e s p e r s o n _ C o d e >   
          < / S u b t o t a l s >   
      < / S a l e s p e r s o n _ P u r c h a s e r >   
-     < T o t a l s > - 
-         < T o t a l s _ A d j P r o f i t > T o t a l s _ A d j P r o f i t < / T o t a l s _ A d j P r o f i t > - 
-         < T o t a l s _ A d j P r o f i t C o m m i s s i o n > T o t a l s _ A d j P r o f i t C o m m i s s i o n < / T o t a l s _ A d j P r o f i t C o m m i s s i o n > - 
-         < T o t a l s _ P r o f i t > T o t a l s _ P r o f i t < / T o t a l s _ P r o f i t > - 
-         < T o t a l s _ P r o f i t C o m m i s s i o n > T o t a l s _ P r o f i t C o m m i s s i o n < / T o t a l s _ P r o f i t C o m m i s s i o n > - 
-         < T o t a l s _ S a l e s > T o t a l s _ S a l e s < / T o t a l s _ S a l e s > - 
-         < T o t a l s _ S a l e s C o m m i s s i o n > T o t a l s _ S a l e s C o m m i s s i o n < / T o t a l s _ S a l e s C o m m i s s i o n > +     < T o t a l s   E l e m e n t T y p e = " D a t a I t e m "   E l e m e n t I d = " 1 8 2 3 9 5 0 0 4 4 " > + 
+         < T o t a l s _ A d j P r o f i t   E l e m e n t T y p e = " C o l u m n "   E l e m e n t I d = " 1 9 0 9 5 0 1 3 6 2 "   D a t a T y p e = " D e c i m a l " > T o t a l s _ A d j P r o f i t < / T o t a l s _ A d j P r o f i t > + 
+         < T o t a l s _ A d j P r o f i t C o m m i s s i o n   E l e m e n t T y p e = " C o l u m n "   E l e m e n t I d = " 9 4 6 1 0 3 7 5 9 "   D a t a T y p e = " D e c i m a l " > T o t a l s _ A d j P r o f i t C o m m i s s i o n < / T o t a l s _ A d j P r o f i t C o m m i s s i o n > + 
+         < T o t a l s _ P r o f i t   E l e m e n t T y p e = " C o l u m n "   E l e m e n t I d = " 6 4 6 2 9 5 2 1 9 "   D a t a T y p e = " D e c i m a l " > T o t a l s _ P r o f i t < / T o t a l s _ P r o f i t > + 
+         < T o t a l s _ P r o f i t C o m m i s s i o n   E l e m e n t T y p e = " C o l u m n "   E l e m e n t I d = " 3 6 7 7 9 1 3 9 2 "   D a t a T y p e = " D e c i m a l " > T o t a l s _ P r o f i t C o m m i s s i o n < / T o t a l s _ P r o f i t C o m m i s s i o n > + 
+         < T o t a l s _ S a l e s   E l e m e n t T y p e = " C o l u m n "   E l e m e n t I d = " 1 3 9 9 9 8 5 1 0 9 "   D a t a T y p e = " D e c i m a l " > T o t a l s _ S a l e s < / T o t a l s _ S a l e s > + 
+         < T o t a l s _ S a l e s C o m m i s s i o n   E l e m e n t T y p e = " C o l u m n "   E l e m e n t I d = " 4 6 4 8 2 3 3 9 8 "   D a t a T y p e = " D e c i m a l " > T o t a l s _ S a l e s C o m m i s s i o n < / T o t a l s _ S a l e s C o m m i s s i o n >   
      < / T o t a l s >   
@@ -4722,17 +4704,17 @@
 </file>
 
 <file path=customXml/itemProps1.xml><?xml version="1.0" encoding="utf-8"?>
-<ds:datastoreItem xmlns:ds="http://schemas.openxmlformats.org/officeDocument/2006/customXml" ds:itemID="{A0CC7945-5283-4905-A71D-472246249B67}">
+<ds:datastoreItem xmlns:ds="http://schemas.openxmlformats.org/officeDocument/2006/customXml" ds:itemID="{79D6D75F-D29A-40D3-A819-B215617F17D6}">
   <ds:schemaRefs>
-    <ds:schemaRef ds:uri="urn:microsoft-dynamics-businesscentral/internal/extended/reports/Salesperson_Commission/115/"/>
+    <ds:schemaRef ds:uri="urn:microsoft-dynamics-nav/reports/Salesperson_Commission/115/"/>
   </ds:schemaRefs>
 </ds:datastoreItem>
 </file>
 
 <file path=customXml/itemProps2.xml><?xml version="1.0" encoding="utf-8"?>
-<ds:datastoreItem xmlns:ds="http://schemas.openxmlformats.org/officeDocument/2006/customXml" ds:itemID="{79D6D75F-D29A-40D3-A819-B215617F17D6}">
+<ds:datastoreItem xmlns:ds="http://schemas.openxmlformats.org/officeDocument/2006/customXml" ds:itemID="{A0CC7945-5283-4905-A71D-472246249B67}">
   <ds:schemaRefs>
-    <ds:schemaRef ds:uri="urn:microsoft-dynamics-nav/reports/Salesperson_Commission/115/"/>
+    <ds:schemaRef ds:uri="urn:microsoft-dynamics-businesscentral/internal/extended/reports/Salesperson_Commission/115/"/>
   </ds:schemaRefs>
 </ds:datastoreItem>
 </file>

</xml_diff>

<commit_message>
[29.x] Bring in the corrected Salesperson Commission body template
Backports the LCY-notice binding fix from source PR #10495: the
template now binds Labels/AllAmountsAreInLCYLabel instead of the
CLEAN27-excluded Salesperson_Purchaser/All_amounts_are_in_LCYCaption
dataset column.

Blob now matches the source branch's 634b3f819.
</commit_message>
<xml_diff>
--- a/src/Layers/W1/BaseApp/Sales/Reports/SalespersonCommissionBody.docx
+++ b/src/Layers/W1/BaseApp/Sales/Reports/SalespersonCommissionBody.docx
@@ -54,13 +54,12 @@
         </w:trPr>
         <w:sdt>
           <w:sdtPr>
-            <w:alias w:val="All_amounts_are_in_LCYCaption"/>
-            <w:tag w:val="#BC:InsertDataItem,DataItems/Salesperson_Purchaser/All_amounts_are_in_LCYCaption"/>
-            <w:id w:val="1521658723"/>
+            <w:alias w:val="AllAmountsAreInLCYLabel"/>
+            <w:tag w:val="#BC:InsertDataItem,Labels/AllAmountsAreInLCYLabel"/>
+            <w:id w:val="1797175241"/>
             <w:placeholder>
               <w:docPart w:val="DefaultPlaceholder_-1854013440"/>
             </w:placeholder>
-            <w:dataBinding w:prefixMappings="xmlns:ns0='urn:microsoft-dynamics-nav/reports/Salesperson_Commission/115/'" w:xpath="/ns0:NavWordReportXmlPart[1]/ns0:Salesperson_Purchaser[1]/ns0:All_amounts_are_in_LCYCaption[1]" w:storeItemID="{79D6D75F-D29A-40D3-A819-B215617F17D6}"/>
             <w15:color w:val="808080"/>
             <w:text/>
           </w:sdtPr>
@@ -73,9 +72,11 @@
                 <w:pPr>
                   <w:pStyle w:val="NoSpacing"/>
                 </w:pPr>
+                <w:proofErr w:type="spellStart"/>
                 <w:r>
-                  <w:t>All_amounts_are_in_LCYCaption</w:t>
+                  <w:t>AllAmountsAreInLCYLabel</w:t>
                 </w:r>
+                <w:proofErr w:type="spellEnd"/>
               </w:p>
             </w:tc>
           </w:sdtContent>
@@ -457,7 +458,6 @@
           <w15:dataBinding w:prefixMappings="xmlns:ns0='urn:microsoft-dynamics-nav/reports/Salesperson_Commission/115/' " w:xpath="/ns0:NavWordReportXmlPart[1]/ns0:Salesperson_Purchaser" w:storeItemID="{79D6D75F-D29A-40D3-A819-B215617F17D6}"/>
           <w15:repeatingSection/>
         </w:sdtPr>
-        <w:sdtEndPr/>
         <w:sdtContent>
           <w:sdt>
             <w:sdtPr>
@@ -470,7 +470,6 @@
               </w:placeholder>
               <w15:repeatingSectionItem/>
             </w:sdtPr>
-            <w:sdtEndPr/>
             <w:sdtContent>
               <w:tr>
                 <w:trPr>
@@ -2945,6 +2944,7 @@
     <w:rsid w:val="00115A94"/>
     <w:rsid w:val="001557A7"/>
     <w:rsid w:val="00193CFB"/>
+    <w:rsid w:val="002217FC"/>
     <w:rsid w:val="002409E2"/>
     <w:rsid w:val="00280142"/>
     <w:rsid w:val="002B3616"/>
@@ -2986,6 +2986,7 @@
     <w:rsid w:val="00753B56"/>
     <w:rsid w:val="007A0F74"/>
     <w:rsid w:val="007A75D3"/>
+    <w:rsid w:val="007D6844"/>
     <w:rsid w:val="00843CE7"/>
     <w:rsid w:val="0086264C"/>
     <w:rsid w:val="008858E8"/>
@@ -2995,6 +2996,7 @@
     <w:rsid w:val="009051A9"/>
     <w:rsid w:val="0091315A"/>
     <w:rsid w:val="00933416"/>
+    <w:rsid w:val="00951E4E"/>
     <w:rsid w:val="009B3459"/>
     <w:rsid w:val="009D3079"/>
     <w:rsid w:val="009E275F"/>
@@ -3553,13 +3555,6 @@
       <w:lang w:val="da-DK" w:eastAsia="da-DK"/>
     </w:rPr>
   </w:style>
-  <w:style w:type="paragraph" w:customStyle="1" w:styleId="FE268EC6B73C45C69982695EA660ACAC">
-    <w:name w:val="FE268EC6B73C45C69982695EA660ACAC"/>
-    <w:rsid w:val="00115A94"/>
-    <w:rPr>
-      <w:lang w:val="en-US" w:eastAsia="en-US"/>
-    </w:rPr>
-  </w:style>
   <w:style w:type="paragraph" w:customStyle="1" w:styleId="07B3927F190F42D19E177B7F12BBAA0D">
     <w:name w:val="07B3927F190F42D19E177B7F12BBAA0D"/>
     <w:rsid w:val="00115A94"/>
@@ -3591,34 +3586,6 @@
   <w:style w:type="paragraph" w:customStyle="1" w:styleId="C41C9EC9AFA54E0BB32956D2C6A0BE8D">
     <w:name w:val="C41C9EC9AFA54E0BB32956D2C6A0BE8D"/>
     <w:rsid w:val="00115A94"/>
-    <w:rPr>
-      <w:lang w:val="en-US" w:eastAsia="en-US"/>
-    </w:rPr>
-  </w:style>
-  <w:style w:type="paragraph" w:customStyle="1" w:styleId="C794FD860E444D3AB10D10EA8F2F89B6">
-    <w:name w:val="C794FD860E444D3AB10D10EA8F2F89B6"/>
-    <w:rsid w:val="00475EE0"/>
-    <w:rPr>
-      <w:lang w:val="en-US" w:eastAsia="en-US"/>
-    </w:rPr>
-  </w:style>
-  <w:style w:type="paragraph" w:customStyle="1" w:styleId="260CCBCB6F184F98939C6790AD527268">
-    <w:name w:val="260CCBCB6F184F98939C6790AD527268"/>
-    <w:rsid w:val="00475EE0"/>
-    <w:rPr>
-      <w:lang w:val="en-US" w:eastAsia="en-US"/>
-    </w:rPr>
-  </w:style>
-  <w:style w:type="paragraph" w:customStyle="1" w:styleId="1972C88321944DA7BCF7DD61D956D2F1">
-    <w:name w:val="1972C88321944DA7BCF7DD61D956D2F1"/>
-    <w:rsid w:val="00475EE0"/>
-    <w:rPr>
-      <w:lang w:val="en-US" w:eastAsia="en-US"/>
-    </w:rPr>
-  </w:style>
-  <w:style w:type="paragraph" w:customStyle="1" w:styleId="B25EB7399EAE40469875C4F3B1FA4AD6">
-    <w:name w:val="B25EB7399EAE40469875C4F3B1FA4AD6"/>
-    <w:rsid w:val="00475EE0"/>
     <w:rPr>
       <w:lang w:val="en-US" w:eastAsia="en-US"/>
     </w:rPr>
@@ -3956,6 +3923,9 @@
   <wetp:taskpane dockstate="right" visibility="0" width="350" row="2">
     <wetp:webextensionref xmlns:r="http://schemas.openxmlformats.org/officeDocument/2006/relationships" r:id="rId2"/>
   </wetp:taskpane>
+  <wetp:taskpane dockstate="right" visibility="0" width="350" row="3">
+    <wetp:webextensionref xmlns:r="http://schemas.openxmlformats.org/officeDocument/2006/relationships" r:id="rId3"/>
+  </wetp:taskpane>
 </wetp:taskpanes>
 </file>
 
@@ -3985,7 +3955,19 @@
 </we:webextension>
 </file>
 
-<file path=customXml/item1.xml>��< ? x m l   v e r s i o n = " 1 . 0 "   e n c o d i n g = " u t f - 1 6 " ? > < N a v W o r d R e p o r t X m l P a r t   x m l n s = " u r n : m i c r o s o f t - d y n a m i c s - b u s i n e s s c e n t r a l / i n t e r n a l / e x t e n d e d / r e p o r t s / S a l e s p e r s o n _ C o m m i s s i o n / 1 1 5 / " > +<file path=word/webextensions/webextension3.xml><?xml version="1.0" encoding="utf-8"?>
+<we:webextension xmlns:we="http://schemas.microsoft.com/office/webextensions/webextension/2010/11" id="{BE860300-A89B-410C-A34C-3BA7FAA2B841}">
+  <we:reference id="WA200009156" version="2.0.3.0" store="Omex" storeType="OMEX"/>
+  <we:alternateReferences>
+    <we:reference id="WA200009156" version="2.0.3.0" store="WA200009156" storeType="OMEX"/>
+  </we:alternateReferences>
+  <we:properties/>
+  <we:bindings/>
+  <we:snapshot xmlns:r="http://schemas.openxmlformats.org/officeDocument/2006/relationships"/>
+</we:webextension>
+</file>
+
+<file path=customXml/item1.xml>��< ? x m l   v e r s i o n = " 1 . 0 "   e n c o d i n g = " u t f - 1 6 " ? > < N a v W o r d R e p o r t X m l P a r t   x m l n s = " u r n : m i c r o s o f t - d y n a m i c s - n a v / r e p o r t s / S a l e s p e r s o n _ C o m m i s s i o n / 1 1 5 / " >   
      < B C R e p o r t I n f o r m a t i o n >   
@@ -4133,262 +4115,192 @@
  
      < L a b e l s >   
-         < A b o u t T h e R e p o r t L a b e l   E l e m e n t T y p e = " P a r a m e t e r "   E l e m e n t I d = " 1 6 7 7 9 2 0 0 1 "   D a t a T y p e = " S t r i n g " > A b o u t T h e R e p o r t L a b e l < / A b o u t T h e R e p o r t L a b e l > - 
-         < A d j u s t e d P r o f i t C o m m i s s i o n L a b e l   E l e m e n t T y p e = " P a r a m e t e r "   E l e m e n t I d = " 9 1 5 5 5 7 0 2 0 "   D a t a T y p e = " S t r i n g " > A d j u s t e d P r o f i t C o m m i s s i o n L a b e l < / A d j u s t e d P r o f i t C o m m i s s i o n L a b e l > - 
-         < A d j u s t e d P r o f i t L a b e l   E l e m e n t T y p e = " P a r a m e t e r "   E l e m e n t I d = " 1 6 1 5 2 8 3 0 4 7 "   D a t a T y p e = " S t r i n g " > A d j u s t e d P r o f i t L a b e l < / A d j u s t e d P r o f i t L a b e l > - 
-         < A l l A m o u n t s A r e I n L C Y L a b e l   E l e m e n t T y p e = " P a r a m e t e r "   E l e m e n t I d = " 5 6 3 5 1 4 3 1 8 "   D a t a T y p e = " S t r i n g " > A l l A m o u n t s A r e I n L C Y L a b e l < / A l l A m o u n t s A r e I n L C Y L a b e l > - 
-         < C o m m i s s i o n P e r c e n t L a b e l   E l e m e n t T y p e = " P a r a m e t e r "   E l e m e n t I d = " 8 3 9 2 6 3 7 6 5 "   D a t a T y p e = " S t r i n g " > C o m m i s s i o n P e r c e n t L a b e l < / C o m m i s s i o n P e r c e n t L a b e l > - 
-         < C o m p a n y L a b e l   E l e m e n t T y p e = " P a r a m e t e r "   E l e m e n t I d = " 3 4 6 7 6 0 3 4 8 "   D a t a T y p e = " S t r i n g " > C o m p a n y L a b e l < / C o m p a n y L a b e l > - 
-         < C u s t o m e r N a m e L a b e l   E l e m e n t T y p e = " P a r a m e t e r "   E l e m e n t I d = " 1 1 1 8 7 9 0 8 8 "   D a t a T y p e = " S t r i n g " > C u s t o m e r N a m e L a b e l < / C u s t o m e r N a m e L a b e l > - 
-         < C u s t o m e r N o L a b e l   E l e m e n t T y p e = " P a r a m e t e r "   E l e m e n t I d = " 3 8 7 4 7 8 0 3 4 "   D a t a T y p e = " S t r i n g " > C u s t o m e r N o L a b e l < / C u s t o m e r N o L a b e l > - 
-         < D a t a R e t r i e v e d   E l e m e n t T y p e = " P a r a m e t e r "   E l e m e n t I d = " 2 9 1 9 1 1 8 0 7 "   D a t a T y p e = " S t r i n g " > D a t a R e t r i e v e d < / D a t a R e t r i e v e d > - 
-         < D o c u m e n t a t i o n L a b e l   E l e m e n t T y p e = " P a r a m e t e r "   E l e m e n t I d = " 1 7 3 8 9 2 4 8 1 5 "   D a t a T y p e = " S t r i n g " > D o c u m e n t a t i o n L a b e l < / D o c u m e n t a t i o n L a b e l > - 
-         < D o c u m e n t N o L a b e l   E l e m e n t T y p e = " P a r a m e t e r "   E l e m e n t I d = " 1 1 4 6 4 3 5 8 0 3 "   D a t a T y p e = " S t r i n g " > D o c u m e n t N o L a b e l < / D o c u m e n t N o L a b e l > - 
-         < E n v i r o n m e n t L a b e l   E l e m e n t T y p e = " P a r a m e t e r "   E l e m e n t I d = " 8 1 8 8 1 6 5 9 0 "   D a t a T y p e = " S t r i n g " > E n v i r o n m e n t L a b e l < / E n v i r o n m e n t L a b e l > - 
-         < P e r i o d C a p t i o n   E l e m e n t T y p e = " P a r a m e t e r "   E l e m e n t I d = " 1 4 7 8 2 5 3 4 2 2 "   D a t a T y p e = " S t r i n g " > P e r i o d C a p t i o n < / P e r i o d C a p t i o n > - 
-         < P o s t i n g D a t e L a b e l   E l e m e n t T y p e = " P a r a m e t e r "   E l e m e n t I d = " 1 7 7 5 7 9 4 2 4 9 "   D a t a T y p e = " S t r i n g " > P o s t i n g D a t e L a b e l < / P o s t i n g D a t e L a b e l > - 
-         < P r o f i t C o m m i s s i o n L a b e l   E l e m e n t T y p e = " P a r a m e t e r "   E l e m e n t I d = " 8 3 2 7 0 6 3 9 2 "   D a t a T y p e = " S t r i n g " > P r o f i t C o m m i s s i o n L a b e l < / P r o f i t C o m m i s s i o n L a b e l > - 
-         < P r o f i t L a b e l   E l e m e n t T y p e = " P a r a m e t e r "   E l e m e n t I d = " 2 5 4 6 3 3 6 4 5 "   D a t a T y p e = " S t r i n g " > P r o f i t L a b e l < / P r o f i t L a b e l > - 
-         < R e p o r t N a m e L a b e l   E l e m e n t T y p e = " P a r a m e t e r "   E l e m e n t I d = " 1 0 2 2 2 9 2 9 8 2 "   D a t a T y p e = " S t r i n g " > R e p o r t N a m e L a b e l < / R e p o r t N a m e L a b e l > - 
-         < R u n O n L a b e l   E l e m e n t T y p e = " P a r a m e t e r "   E l e m e n t I d = " 1 1 1 9 0 3 7 5 9 5 "   D a t a T y p e = " S t r i n g " > R u n O n L a b e l < / R u n O n L a b e l > - 
-         < S a l e s C o m m i s s i o n L a b e l   E l e m e n t T y p e = " P a r a m e t e r "   E l e m e n t I d = " 1 0 1 8 2 6 8 7 7 0 "   D a t a T y p e = " S t r i n g " > S a l e s C o m m i s s i o n L a b e l < / S a l e s C o m m i s s i o n L a b e l > - 
-         < S a l e s L a b e l   E l e m e n t T y p e = " P a r a m e t e r "   E l e m e n t I d = " 1 7 9 5 4 4 8 0 0 5 "   D a t a T y p e = " S t r i n g " > S a l e s L a b e l < / S a l e s L a b e l > - 
-         < S a l e s p e r s o n _ P u r c h a s e r _ _ N a m e C a p t i o n   E l e m e n t T y p e = " P a r a m e t e r "   E l e m e n t I d = " 1 1 9 5 8 7 9 8 7 3 "   D a t a T y p e = " S t r i n g " > S a l e s p e r s o n _ P u r c h a s e r _ _ N a m e C a p t i o n < / S a l e s p e r s o n _ P u r c h a s e r _ _ N a m e C a p t i o n > - 
-         < S a l e s p e r s o n C o m m i s s i o n A n a l y s i s   E l e m e n t T y p e = " P a r a m e t e r "   E l e m e n t I d = " 7 1 5 8 7 1 2 4 7 "   D a t a T y p e = " S t r i n g " > S a l e s p e r s o n C o m m i s s i o n A n a l y s i s < / S a l e s p e r s o n C o m m i s s i o n A n a l y s i s > - 
-         < S a l e s p e r s o n C o m m i s s i o n L a b e l   E l e m e n t T y p e = " P a r a m e t e r "   E l e m e n t I d = " 3 0 0 0 9 6 0 5 1 "   D a t a T y p e = " S t r i n g " > S a l e s p e r s o n C o m m i s s i o n L a b e l < / S a l e s p e r s o n C o m m i s s i o n L a b e l > - 
-         < S a l e s p e r s o n C o m m i s s i o n P r i n t   E l e m e n t T y p e = " P a r a m e t e r "   E l e m e n t I d = " 1 3 1 6 0 2 8 6 0 "   D a t a T y p e = " S t r i n g " > S a l e s p e r s o n C o m m i s s i o n P r i n t < / S a l e s p e r s o n C o m m i s s i o n P r i n t > - 
-         < S a l e s p e r s o n P u r c h a s e r _ C o d e C a p t i o n   E l e m e n t T y p e = " P a r a m e t e r "   E l e m e n t I d = " 1 2 2 1 2 1 9 2 4 5 "   D a t a T y p e = " S t r i n g " > S a l e s p e r s o n P u r c h a s e r _ C o d e C a p t i o n < / S a l e s p e r s o n P u r c h a s e r _ C o d e C a p t i o n > - 
-         < T o t a l s C a p t i o n   E l e m e n t T y p e = " P a r a m e t e r "   E l e m e n t I d = " 2 3 5 4 5 9 0 6 "   D a t a T y p e = " S t r i n g " > T o t a l s C a p t i o n < / T o t a l s C a p t i o n > - 
-         < U s e r L a b e l   E l e m e n t T y p e = " P a r a m e t e r "   E l e m e n t I d = " 8 4 8 8 1 6 7 9 4 "   D a t a T y p e = " S t r i n g " > U s e r L a b e l < / U s e r L a b e l > +         < A b o u t T h e R e p o r t L a b e l > A b o u t T h e R e p o r t L a b e l < / A b o u t T h e R e p o r t L a b e l > + 
+         < A d j u s t e d P r o f i t C o m m i s s i o n L a b e l > A d j u s t e d P r o f i t C o m m i s s i o n L a b e l < / A d j u s t e d P r o f i t C o m m i s s i o n L a b e l > + 
+         < A d j u s t e d P r o f i t L a b e l > A d j u s t e d P r o f i t L a b e l < / A d j u s t e d P r o f i t L a b e l > + 
+         < A l l A m o u n t s A r e I n L C Y L a b e l > A l l A m o u n t s A r e I n L C Y L a b e l < / A l l A m o u n t s A r e I n L C Y L a b e l > + 
+         < C o m m i s s i o n P e r c e n t L a b e l > C o m m i s s i o n P e r c e n t L a b e l < / C o m m i s s i o n P e r c e n t L a b e l > + 
+         < C o m p a n y L a b e l > C o m p a n y L a b e l < / C o m p a n y L a b e l > + 
+         < C u s t o m e r N a m e L a b e l > C u s t o m e r N a m e L a b e l < / C u s t o m e r N a m e L a b e l > + 
+         < C u s t o m e r N o L a b e l > C u s t o m e r N o L a b e l < / C u s t o m e r N o L a b e l > + 
+         < D a t a R e t r i e v e d > D a t a R e t r i e v e d < / D a t a R e t r i e v e d > + 
+         < D o c u m e n t a t i o n L a b e l > D o c u m e n t a t i o n L a b e l < / D o c u m e n t a t i o n L a b e l > + 
+         < D o c u m e n t N o L a b e l > D o c u m e n t N o L a b e l < / D o c u m e n t N o L a b e l > + 
+         < E n v i r o n m e n t L a b e l > E n v i r o n m e n t L a b e l < / E n v i r o n m e n t L a b e l > + 
+         < P e r i o d C a p t i o n > P e r i o d C a p t i o n < / P e r i o d C a p t i o n > + 
+         < P o s t i n g D a t e L a b e l > P o s t i n g D a t e L a b e l < / P o s t i n g D a t e L a b e l > + 
+         < P r o f i t C o m m i s s i o n L a b e l > P r o f i t C o m m i s s i o n L a b e l < / P r o f i t C o m m i s s i o n L a b e l > + 
+         < P r o f i t L a b e l > P r o f i t L a b e l < / P r o f i t L a b e l > + 
+         < R e p o r t N a m e L a b e l > R e p o r t N a m e L a b e l < / R e p o r t N a m e L a b e l > + 
+         < R u n O n L a b e l > R u n O n L a b e l < / R u n O n L a b e l > + 
+         < S a l e s C o m m i s s i o n L a b e l > S a l e s C o m m i s s i o n L a b e l < / S a l e s C o m m i s s i o n L a b e l > + 
+         < S a l e s L a b e l > S a l e s L a b e l < / S a l e s L a b e l > + 
+         < S a l e s p e r s o n _ P u r c h a s e r _ _ N a m e C a p t i o n > S a l e s p e r s o n _ P u r c h a s e r _ _ N a m e C a p t i o n < / S a l e s p e r s o n _ P u r c h a s e r _ _ N a m e C a p t i o n > + 
+         < S a l e s p e r s o n C o m m i s s i o n A n a l y s i s > S a l e s p e r s o n C o m m i s s i o n A n a l y s i s < / S a l e s p e r s o n C o m m i s s i o n A n a l y s i s > + 
+         < S a l e s p e r s o n C o m m i s s i o n L a b e l > S a l e s p e r s o n C o m m i s s i o n L a b e l < / S a l e s p e r s o n C o m m i s s i o n L a b e l > + 
+         < S a l e s p e r s o n C o m m i s s i o n P r i n t > S a l e s p e r s o n C o m m i s s i o n P r i n t < / S a l e s p e r s o n C o m m i s s i o n P r i n t > + 
+         < S a l e s p e r s o n P u r c h a s e r _ C o d e C a p t i o n > S a l e s p e r s o n P u r c h a s e r _ C o d e C a p t i o n < / S a l e s p e r s o n P u r c h a s e r _ C o d e C a p t i o n > + 
+         < T o t a l s C a p t i o n > T o t a l s C a p t i o n < / T o t a l s C a p t i o n > + 
+         < U s e r L a b e l > U s e r L a b e l < / U s e r L a b e l >   
      < / L a b e l s >   
-     < T o o l t i p s > - 
-         < T o o l t i p   c o l u m n = " S a l e s p e r s o n _ P u r c h a s e r _ C o d e "   E l e m e n t I d = " 1 3 8 8 0 3 1 6 5 2 " > - 
-             < T o o l t i p T e x t   l a n g = " e n - U S " > S p e c i f i e s   a   c o d e   f o r   t h e   s a l e s p e r s o n   o r   p u r c h a s e r . < / T o o l t i p T e x t > - 
-         < / T o o l t i p > - 
-         < T o o l t i p   c o l u m n = " S a l e s p e r s o n _ P u r c h a s e r _ N a m e "   E l e m e n t I d = " 1 3 4 8 2 2 8 4 6 2 " > - 
-             < T o o l t i p T e x t   l a n g = " e n - U S " > S p e c i f i e s   t h e   n a m e   o f   t h e   s a l e s p e r s o n   o r   p u r c h a s e r . < / T o o l t i p T e x t > - 
-         < / T o o l t i p > - 
-         < T o o l t i p   c o l u m n = " S a l e s p e r s o n _ P u r c h a s e r _ _ C o m m i s s i o n _ _ _ "   E l e m e n t I d = " 1 5 9 0 6 8 9 0 0 4 " > - 
-             < T o o l t i p T e x t   l a n g = " e n - U S " > S p e c i f i e s   t h e   p e r c e n t a g e   t o   u s e   t o   c a l c u l a t e   t h e   s a l e s p e r s o n ' s   c o m m i s s i o n . < / T o o l t i p T e x t > - 
-         < / T o o l t i p > - 
-         < T o o l t i p   c o l u m n = " C u s t _ _ L e d g e r _ E n t r y _ _ _ S a l e s _ _ L C Y _ _ "   E l e m e n t I d = " 3 4 8 7 9 4 9 4 9 " > - 
-             < T o o l t i p T e x t   l a n g = " e n - U S " > S p e c i f i e s   t h e   t o t a l   s a l e s   a m o u n t   e x c l .   V A T   t o   t h e   c u s t o m e r   i n   L C Y . < / T o o l t i p T e x t > - 
-         < / T o o l t i p > - 
-         < T o o l t i p   c o l u m n = " C u s t _ _ L e d g e r _ E n t r y _ _ D o c u m e n t _ N o _ _ "   E l e m e n t I d = " 8 5 2 6 1 1 1 8 1 " > - 
-             < T o o l t i p T e x t   l a n g = " e n - U S " > S p e c i f i e s   t h e   e n t r y ' s   d o c u m e n t   n u m b e r . < / T o o l t i p T e x t > - 
-         < / T o o l t i p > - 
-         < T o o l t i p   c o l u m n = " C u s t _ _ L e d g e r _ E n t r y _ _ C u s t o m e r _ N o _ _ "   E l e m e n t I d = " 1 0 0 9 0 1 6 8 0 8 " > - 
-             < T o o l t i p T e x t   l a n g = " e n - U S " > S p e c i f i e s   t h e   c u s t o m e r   a c c o u n t   n u m b e r   t h a t   t h e   e n t r y   i s   l i n k e d   t o . < / T o o l t i p T e x t > - 
-         < / T o o l t i p > - 
-         < T o o l t i p   c o l u m n = " C u s t _ _ L e d g e r _ E n t r y _ _ S a l e s _ _ L C Y _ _ "   E l e m e n t I d = " 8 1 9 5 1 7 4 8 " > - 
-             < T o o l t i p T e x t   l a n g = " e n - U S " > S p e c i f i e s   t h e   t o t a l   s a l e s   a m o u n t   e x c l .   V A T   t o   t h e   c u s t o m e r   i n   L C Y . < / T o o l t i p T e x t > - 
-         < / T o o l t i p > - 
-         < T o o l t i p   c o l u m n = " C u s t L e d g e r E n t r y _ C u s t o m e r N a m e "   E l e m e n t I d = " 2 0 9 1 8 9 3 2 7 9 " > - 
-             < T o o l t i p T e x t   l a n g = " e n - U S " > S p e c i f i e s   t h e   c u s t o m e r   n a m e   t h a t   t h e   e n t r y   i s   l i n k e d   t o . < / T o o l t i p T e x t > - 
-         < / T o o l t i p > - 
-         < T o o l t i p   c o l u m n = " S a l e s p e r s o n P u r c h a s e r _ C o d e "   E l e m e n t I d = " 1 2 2 1 2 1 9 2 4 5 " > - 
-             < T o o l t i p T e x t   l a n g = " e n - U S " > S p e c i f i e s   a   c o d e   f o r   t h e   s a l e s p e r s o n   o r   p u r c h a s e r . < / T o o l t i p T e x t > - 
-         < / T o o l t i p > - 
-         < T o o l t i p   c o l u m n = " S a l e s p e r s o n _ P u r c h a s e r _ _ N a m e "   E l e m e n t I d = " 1 1 9 5 8 7 9 8 7 3 " > - 
-             < T o o l t i p T e x t   l a n g = " e n - U S " > S p e c i f i e s   t h e   n a m e   o f   t h e   s a l e s p e r s o n   o r   p u r c h a s e r . < / T o o l t i p T e x t > - 
-         < / T o o l t i p > - 
-         < T o o l t i p   c o l u m n = " S u b t o t a l s _ S a l e s p e r s o n _ C o d e "   E l e m e n t I d = " 1 1 9 8 5 9 4 2 7 2 " > - 
-             < T o o l t i p T e x t   l a n g = " e n - U S " > S p e c i f i e s   a   c o d e   f o r   t h e   s a l e s p e r s o n   o r   p u r c h a s e r . < / T o o l t i p T e x t > - 
-         < / T o o l t i p > - 
-     < / T o o l t i p s > - 
-     < S a l e s p e r s o n _ P u r c h a s e r   E l e m e n t T y p e = " D a t a I t e m "   E l e m e n t I d = " 7 1 5 0 0 7 1 9 8 " > - 
-         < A d j P r o f i t   E l e m e n t T y p e = " C o l u m n "   E l e m e n t I d = " 6 6 6 3 9 3 8 5 2 "   D a t a T y p e = " D e c i m a l "   O b s o l e t e S t a t e = " P e n d i n g " > A d j P r o f i t < / A d j P r o f i t > - 
-         < A d j P r o f i t C o m m i s s i o n A m t   E l e m e n t T y p e = " C o l u m n "   E l e m e n t I d = " 1 5 8 1 4 8 8 5 9 9 "   D a t a T y p e = " D e c i m a l "   O b s o l e t e S t a t e = " P e n d i n g " > A d j P r o f i t C o m m i s s i o n A m t < / A d j P r o f i t C o m m i s s i o n A m t > - 
-         < A d j P r o f i t C o m m i s s i o n A m t _ C o n t r o l 4 5 C a p t i o n   E l e m e n t T y p e = " C o l u m n "   E l e m e n t I d = " 6 2 1 2 7 7 8 5 4 "   D a t a T y p e = " L a b e l "   O b s o l e t e S t a t e = " P e n d i n g " > A d j P r o f i t C o m m i s s i o n A m t _ C o n t r o l 4 5 C a p t i o n < / A d j P r o f i t C o m m i s s i o n A m t _ C o n t r o l 4 5 C a p t i o n > - 
-         < A d j P r o f i t _ C o n t r o l 3 9 C a p t i o n   E l e m e n t T y p e = " C o l u m n "   E l e m e n t I d = " 2 1 3 3 9 8 4 3 2 "   D a t a T y p e = " L a b e l "   O b s o l e t e S t a t e = " P e n d i n g " > A d j P r o f i t _ C o n t r o l 3 9 C a p t i o n < / A d j P r o f i t _ C o n t r o l 3 9 C a p t i o n > - 
-         < A l l _ a m o u n t s _ a r e _ i n _ L C Y C a p t i o n   E l e m e n t T y p e = " C o l u m n "   E l e m e n t I d = " 6 9 7 4 8 4 8 0 2 "   D a t a T y p e = " L a b e l "   O b s o l e t e S t a t e = " P e n d i n g " > A l l _ a m o u n t s _ a r e _ i n _ L C Y C a p t i o n < / A l l _ a m o u n t s _ a r e _ i n _ L C Y C a p t i o n > - 
-         < C O M P A N Y N A M E   E l e m e n t T y p e = " C o l u m n "   E l e m e n t I d = " 1 7 5 3 0 1 5 1 5 5 "   D a t a T y p e = " S t r i n g "   O b s o l e t e S t a t e = " P e n d i n g " > C O M P A N Y N A M E < / C O M P A N Y N A M E > - 
-         < C u r r R e p o r t _ P A G E N O C a p t i o n   E l e m e n t T y p e = " C o l u m n "   E l e m e n t I d = " 1 8 4 6 2 6 2 1 5 8 "   D a t a T y p e = " L a b e l "   O b s o l e t e S t a t e = " P e n d i n g " > C u r r R e p o r t _ P A G E N O C a p t i o n < / C u r r R e p o r t _ P A G E N O C a p t i o n > - 
-         < C u s t L e d g E n t r y F i l t e r   E l e m e n t T y p e = " C o l u m n "   E l e m e n t I d = " 1 1 7 3 5 3 2 6 6 6 "   D a t a T y p e = " T e x t "   O b s o l e t e S t a t e = " P e n d i n g " > C u s t L e d g E n t r y F i l t e r < / C u s t L e d g E n t r y F i l t e r > - 
-         < C u s t _ _ L e d g e r _ E n t r y _ _ C u s t o m e r _ N o _ _ C a p t i o n   E l e m e n t T y p e = " C o l u m n "   E l e m e n t I d = " 1 2 2 3 8 5 6 2 7 8 "   D a t a T y p e = " S t r i n g "   O b s o l e t e S t a t e = " P e n d i n g " > C u s t _ _ L e d g e r _ E n t r y _ _ C u s t o m e r _ N o _ _ C a p t i o n < / C u s t _ _ L e d g e r _ E n t r y _ _ C u s t o m e r _ N o _ _ C a p t i o n > - 
-         < C u s t _ _ L e d g e r _ E n t r y _ _ D o c u m e n t _ N o _ _ C a p t i o n   E l e m e n t T y p e = " C o l u m n "   E l e m e n t I d = " 4 8 8 8 0 6 5 1 7 "   D a t a T y p e = " S t r i n g "   O b s o l e t e S t a t e = " P e n d i n g " > C u s t _ _ L e d g e r _ E n t r y _ _ D o c u m e n t _ N o _ _ C a p t i o n < / C u s t _ _ L e d g e r _ E n t r y _ _ D o c u m e n t _ N o _ _ C a p t i o n > - 
-         < C u s t _ _ L e d g e r _ E n t r y _ _ P o s t i n g _ D a t e _ C a p t i o n   E l e m e n t T y p e = " C o l u m n "   E l e m e n t I d = " 2 0 7 9 4 3 8 7 1 2 "   D a t a T y p e = " L a b e l "   O b s o l e t e S t a t e = " P e n d i n g " > C u s t _ _ L e d g e r _ E n t r y _ _ P o s t i n g _ D a t e _ C a p t i o n < / C u s t _ _ L e d g e r _ E n t r y _ _ P o s t i n g _ D a t e _ C a p t i o n > - 
-         < C u s t _ _ L e d g e r _ E n t r y _ _ P r o f i t _ _ L C Y _ _ C a p t i o n   E l e m e n t T y p e = " C o l u m n "   E l e m e n t I d = " 1 9 9 4 3 8 8 4 7 6 "   D a t a T y p e = " S t r i n g "   O b s o l e t e S t a t e = " P e n d i n g " > C u s t _ _ L e d g e r _ E n t r y _ _ P r o f i t _ _ L C Y _ _ C a p t i o n < / C u s t _ _ L e d g e r _ E n t r y _ _ P r o f i t _ _ L C Y _ _ C a p t i o n > - 
-         < C u s t _ _ L e d g e r _ E n t r y _ _ S a l e s _ _ L C Y _ _ C a p t i o n   E l e m e n t T y p e = " C o l u m n "   E l e m e n t I d = " 1 0 5 6 9 2 6 5 4 6 "   D a t a T y p e = " S t r i n g "   O b s o l e t e S t a t e = " P e n d i n g " > C u s t _ _ L e d g e r _ E n t r y _ _ S a l e s _ _ L C Y _ _ C a p t i o n < / C u s t _ _ L e d g e r _ E n t r y _ _ S a l e s _ _ L C Y _ _ C a p t i o n > - 
-         < C u s t _ _ L e d g e r _ E n t r y _ _ T A B L E C A P T I O N _ _ _ _ _ _ _ _ _ _ C u s t L e d g E n t r y F i l t e r   E l e m e n t T y p e = " C o l u m n "   E l e m e n t I d = " 7 1 0 6 3 3 9 1 7 "   D a t a T y p e = " T e x t " > C u s t _ _ L e d g e r _ E n t r y _ _ T A B L E C A P T I O N _ _ _ _ _ _ _ _ _ _ C u s t L e d g E n t r y F i l t e r < / C u s t _ _ L e d g e r _ E n t r y _ _ T A B L E C A P T I O N _ _ _ _ _ _ _ _ _ _ C u s t L e d g E n t r y F i l t e r > - 
-         < C u s t _ _ L e d g e r _ E n t r y _ _ _ P r o f i t _ _ L C Y _ _   E l e m e n t T y p e = " C o l u m n "   E l e m e n t I d = " 1 6 1 5 1 3 7 4 4 3 "   D a t a T y p e = " D e c i m a l "   O b s o l e t e S t a t e = " P e n d i n g " > C u s t _ _ L e d g e r _ E n t r y _ _ _ P r o f i t _ _ L C Y _ _ < / C u s t _ _ L e d g e r _ E n t r y _ _ _ P r o f i t _ _ L C Y _ _ > - 
-         < C u s t _ _ L e d g e r _ E n t r y _ _ _ S a l e s _ _ L C Y _ _   E l e m e n t T y p e = " C o l u m n "   E l e m e n t I d = " 3 4 8 7 9 4 9 4 9 "   D a t a T y p e = " D e c i m a l "   O b s o l e t e S t a t e = " P e n d i n g " > C u s t _ _ L e d g e r _ E n t r y _ _ _ S a l e s _ _ L C Y _ _ < / C u s t _ _ L e d g e r _ E n t r y _ _ _ S a l e s _ _ L C Y _ _ > - 
-         < P a g e G r o u p N o   E l e m e n t T y p e = " C o l u m n "   E l e m e n t I d = " 6 4 9 1 8 0 1 4 4 "   D a t a T y p e = " I n t e g e r "   O b s o l e t e S t a t e = " P e n d i n g " > P a g e G r o u p N o < / P a g e G r o u p N o > - 
-         < P r o f i t C o m m i s s i o n A m t   E l e m e n t T y p e = " C o l u m n "   E l e m e n t I d = " 4 1 6 2 2 4 2 0 6 "   D a t a T y p e = " D e c i m a l "   O b s o l e t e S t a t e = " P e n d i n g " > P r o f i t C o m m i s s i o n A m t < / P r o f i t C o m m i s s i o n A m t > - 
-         < P r o f i t C o m m i s s i o n A m t _ C o n t r o l 3 3 C a p t i o n   E l e m e n t T y p e = " C o l u m n "   E l e m e n t I d = " 4 6 5 8 1 2 5 3 6 "   D a t a T y p e = " L a b e l "   O b s o l e t e S t a t e = " P e n d i n g " > P r o f i t C o m m i s s i o n A m t _ C o n t r o l 3 3 C a p t i o n < / P r o f i t C o m m i s s i o n A m t _ C o n t r o l 3 3 C a p t i o n > - 
-         < S a l e s C o m m i s s i o n A m t   E l e m e n t T y p e = " C o l u m n "   E l e m e n t I d = " 1 6 5 6 6 7 5 0 1 6 "   D a t a T y p e = " D e c i m a l "   O b s o l e t e S t a t e = " P e n d i n g " > S a l e s C o m m i s s i o n A m t < / S a l e s C o m m i s s i o n A m t > - 
-         < S a l e s C o m m i s s i o n A m t _ C o n t r o l 3 2 C a p t i o n   E l e m e n t T y p e = " C o l u m n "   E l e m e n t I d = " 1 2 7 2 6 4 2 0 6 5 "   D a t a T y p e = " L a b e l "   O b s o l e t e S t a t e = " P e n d i n g " > S a l e s C o m m i s s i o n A m t _ C o n t r o l 3 2 C a p t i o n < / S a l e s C o m m i s s i o n A m t _ C o n t r o l 3 2 C a p t i o n > - 
-         < S a l e s p e r s o n F i l t e r   E l e m e n t T y p e = " C o l u m n "   E l e m e n t I d = " 1 2 4 2 2 8 3 2 5 6 "   D a t a T y p e = " T e x t "   O b s o l e t e S t a t e = " P e n d i n g " > S a l e s p e r s o n F i l t e r < / S a l e s p e r s o n F i l t e r > - 
-         < S a l e s p e r s o n _ P u r c h a s e r _ C o d e   E l e m e n t T y p e = " C o l u m n "   E l e m e n t I d = " 1 3 8 8 0 3 1 6 5 2 "   D a t a T y p e = " C o d e " > S a l e s p e r s o n _ P u r c h a s e r _ C o d e < / S a l e s p e r s o n _ P u r c h a s e r _ C o d e > - 
-         < S a l e s p e r s o n _ P u r c h a s e r _ N a m e   E l e m e n t T y p e = " C o l u m n "   E l e m e n t I d = " 1 3 4 8 2 2 8 4 6 2 "   D a t a T y p e = " T e x t " > S a l e s p e r s o n _ P u r c h a s e r _ N a m e < / S a l e s p e r s o n _ P u r c h a s e r _ N a m e > - 
-         < S a l e s p e r s o n _ P u r c h a s e r _ _ C o m m i s s i o n _ _ _   E l e m e n t T y p e = " C o l u m n "   E l e m e n t I d = " 1 5 9 0 6 8 9 0 0 4 "   D a t a T y p e = " D e c i m a l " > S a l e s p e r s o n _ P u r c h a s e r _ _ C o m m i s s i o n _ _ _ < / S a l e s p e r s o n _ P u r c h a s e r _ _ C o m m i s s i o n _ _ _ > - 
-         < S a l e s p e r s o n _ P u r c h a s e r _ _ C o m m i s s i o n _ _ _ C a p t i o n   E l e m e n t T y p e = " C o l u m n "   E l e m e n t I d = " 4 9 9 4 6 3 1 7 0 "   D a t a T y p e = " S t r i n g "   O b s o l e t e S t a t e = " P e n d i n g " > S a l e s p e r s o n _ P u r c h a s e r _ _ C o m m i s s i o n _ _ _ C a p t i o n < / S a l e s p e r s o n _ P u r c h a s e r _ _ C o m m i s s i o n _ _ _ C a p t i o n > - 
-         < S a l e s p e r s o n _ P u r c h a s e r _ _ T A B L E C A P T I O N _ _ _ _ _ _ _ _ _ _ S a l e s p e r s o n F i l t e r   E l e m e n t T y p e = " C o l u m n "   E l e m e n t I d = " 1 0 1 6 0 4 1 6 9 9 "   D a t a T y p e = " T e x t " > S a l e s p e r s o n _ P u r c h a s e r _ _ T A B L E C A P T I O N _ _ _ _ _ _ _ _ _ _ S a l e s p e r s o n F i l t e r < / S a l e s p e r s o n _ P u r c h a s e r _ _ T A B L E C A P T I O N _ _ _ _ _ _ _ _ _ _ S a l e s p e r s o n F i l t e r > - 
-         < S a l e s p e r s o n _ _ _ C o m m i s s i o n C a p t i o n   E l e m e n t T y p e = " C o l u m n "   E l e m e n t I d = " 1 7 6 9 4 7 1 9 4 8 "   D a t a T y p e = " L a b e l "   O b s o l e t e S t a t e = " P e n d i n g " > S a l e s p e r s o n _ _ _ C o m m i s s i o n C a p t i o n < / S a l e s p e r s o n _ _ _ C o m m i s s i o n C a p t i o n > - 
-         < S T R S U B S T N O _ T e x t 0 0 0 _ P e r i o d T e x t _   E l e m e n t T y p e = " C o l u m n "   E l e m e n t I d = " 7 2 2 9 9 1 7 0 4 "   D a t a T y p e = " S t r i n g " > S T R S U B S T N O _ T e x t 0 0 0 _ P e r i o d T e x t _ < / S T R S U B S T N O _ T e x t 0 0 0 _ P e r i o d T e x t _ > - 
-         < T o t a l C a p t i o n   E l e m e n t T y p e = " C o l u m n "   E l e m e n t I d = " 7 0 7 1 0 2 6 9 5 "   D a t a T y p e = " L a b e l "   O b s o l e t e S t a t e = " P e n d i n g " > T o t a l C a p t i o n < / T o t a l C a p t i o n > - 
-         < C u s t _ L e d g e r _ E n t r y   E l e m e n t T y p e = " D a t a I t e m "   E l e m e n t I d = " 1 6 3 9 1 4 6 4 4 5 " > - 
-             < A d j P r o f i t C o m m i s s i o n A m t _ C o n t r o l 4 5   E l e m e n t T y p e = " C o l u m n "   E l e m e n t I d = " 8 0 5 8 9 6 4 0 0 "   D a t a T y p e = " D e c i m a l " > A d j P r o f i t C o m m i s s i o n A m t _ C o n t r o l 4 5 < / A d j P r o f i t C o m m i s s i o n A m t _ C o n t r o l 4 5 > - 
-             < A d j P r o f i t _ C o n t r o l 3 9   E l e m e n t T y p e = " C o l u m n "   E l e m e n t I d = " 2 0 2 4 1 9 6 5 4 2 "   D a t a T y p e = " D e c i m a l " > A d j P r o f i t _ C o n t r o l 3 9 < / A d j P r o f i t _ C o n t r o l 3 9 > - 
-             < C u s t L e d g e r E n t r y _ C u s t o m e r N a m e   E l e m e n t T y p e = " C o l u m n "   E l e m e n t I d = " 2 0 9 1 8 9 3 2 7 9 "   D a t a T y p e = " T e x t " > C u s t L e d g e r E n t r y _ C u s t o m e r N a m e < / C u s t L e d g e r E n t r y _ C u s t o m e r N a m e > - 
-             < C u s t _ _ L e d g e r _ E n t r y _ _ C u s t o m e r _ N o _ _   E l e m e n t T y p e = " C o l u m n "   E l e m e n t I d = " 1 0 0 9 0 1 6 8 0 8 "   D a t a T y p e = " C o d e " > C u s t _ _ L e d g e r _ E n t r y _ _ C u s t o m e r _ N o _ _ < / C u s t _ _ L e d g e r _ E n t r y _ _ C u s t o m e r _ N o _ _ > - 
-             < C u s t _ _ L e d g e r _ E n t r y _ _ D o c u m e n t _ N o _ _   E l e m e n t T y p e = " C o l u m n "   E l e m e n t I d = " 8 5 2 6 1 1 1 8 1 "   D a t a T y p e = " C o d e " > C u s t _ _ L e d g e r _ E n t r y _ _ D o c u m e n t _ N o _ _ < / C u s t _ _ L e d g e r _ E n t r y _ _ D o c u m e n t _ N o _ _ > - 
-             < C u s t _ _ L e d g e r _ E n t r y _ _ P o s t i n g _ D a t e _   E l e m e n t T y p e = " C o l u m n "   E l e m e n t I d = " 2 1 4 2 6 5 7 1 6 2 "   D a t a T y p e = " S t r i n g " > C u s t _ _ L e d g e r _ E n t r y _ _ P o s t i n g _ D a t e _ < / C u s t _ _ L e d g e r _ E n t r y _ _ P o s t i n g _ D a t e _ > - 
-             < C u s t _ _ L e d g e r _ E n t r y _ _ P r o f i t _ _ L C Y _ _   E l e m e n t T y p e = " C o l u m n "   E l e m e n t I d = " 5 1 9 3 4 1 8 2 6 "   D a t a T y p e = " D e c i m a l " > C u s t _ _ L e d g e r _ E n t r y _ _ P r o f i t _ _ L C Y _ _ < / C u s t _ _ L e d g e r _ E n t r y _ _ P r o f i t _ _ L C Y _ _ > - 
-             < C u s t _ _ L e d g e r _ E n t r y _ _ S a l e s _ _ L C Y _ _   E l e m e n t T y p e = " C o l u m n "   E l e m e n t I d = " 8 1 9 5 1 7 4 8 "   D a t a T y p e = " D e c i m a l " > C u s t _ _ L e d g e r _ E n t r y _ _ S a l e s _ _ L C Y _ _ < / C u s t _ _ L e d g e r _ E n t r y _ _ S a l e s _ _ L C Y _ _ > - 
-             < P r o f i t C o m m i s s i o n A m t _ C o n t r o l 3 3   E l e m e n t T y p e = " C o l u m n "   E l e m e n t I d = " 3 1 2 1 8 6 8 2 6 "   D a t a T y p e = " D e c i m a l " > P r o f i t C o m m i s s i o n A m t _ C o n t r o l 3 3 < / P r o f i t C o m m i s s i o n A m t _ C o n t r o l 3 3 > - 
-             < S a l e s C o m m i s s i o n A m t _ C o n t r o l 3 2   E l e m e n t T y p e = " C o l u m n "   E l e m e n t I d = " 1 4 6 2 3 9 0 1 5 3 "   D a t a T y p e = " D e c i m a l " > S a l e s C o m m i s s i o n A m t _ C o n t r o l 3 2 < / S a l e s C o m m i s s i o n A m t _ C o n t r o l 3 2 > - 
-             < S a l e s p e r s o n P u r c h a s e r _ C o d e   E l e m e n t T y p e = " C o l u m n "   E l e m e n t I d = " 1 2 2 1 2 1 9 2 4 5 "   D a t a T y p e = " C o d e " > S a l e s p e r s o n P u r c h a s e r _ C o d e < / S a l e s p e r s o n P u r c h a s e r _ C o d e > - 
-             < S a l e s p e r s o n _ P u r c h a s e r _ _ N a m e   E l e m e n t T y p e = " C o l u m n "   E l e m e n t I d = " 1 1 9 5 8 7 9 8 7 3 "   D a t a T y p e = " T e x t " > S a l e s p e r s o n _ P u r c h a s e r _ _ N a m e < / S a l e s p e r s o n _ P u r c h a s e r _ _ N a m e > +     < S a l e s p e r s o n _ P u r c h a s e r > + 
+         < A d j P r o f i t > A d j P r o f i t < / A d j P r o f i t > + 
+         < A d j P r o f i t C o m m i s s i o n A m t > A d j P r o f i t C o m m i s s i o n A m t < / A d j P r o f i t C o m m i s s i o n A m t > + 
+         < A d j P r o f i t C o m m i s s i o n A m t _ C o n t r o l 4 5 C a p t i o n > A d j P r o f i t C o m m i s s i o n A m t _ C o n t r o l 4 5 C a p t i o n < / A d j P r o f i t C o m m i s s i o n A m t _ C o n t r o l 4 5 C a p t i o n > + 
+         < A d j P r o f i t _ C o n t r o l 3 9 C a p t i o n > A d j P r o f i t _ C o n t r o l 3 9 C a p t i o n < / A d j P r o f i t _ C o n t r o l 3 9 C a p t i o n > + 
+         < A l l _ a m o u n t s _ a r e _ i n _ L C Y C a p t i o n > A l l _ a m o u n t s _ a r e _ i n _ L C Y C a p t i o n < / A l l _ a m o u n t s _ a r e _ i n _ L C Y C a p t i o n > + 
+         < C O M P A N Y N A M E > C O M P A N Y N A M E < / C O M P A N Y N A M E > + 
+         < C u r r R e p o r t _ P A G E N O C a p t i o n > C u r r R e p o r t _ P A G E N O C a p t i o n < / C u r r R e p o r t _ P A G E N O C a p t i o n > + 
+         < C u s t L e d g E n t r y F i l t e r > C u s t L e d g E n t r y F i l t e r < / C u s t L e d g E n t r y F i l t e r > + 
+         < C u s t _ _ L e d g e r _ E n t r y _ _ C u s t o m e r _ N o _ _ C a p t i o n > C u s t _ _ L e d g e r _ E n t r y _ _ C u s t o m e r _ N o _ _ C a p t i o n < / C u s t _ _ L e d g e r _ E n t r y _ _ C u s t o m e r _ N o _ _ C a p t i o n > + 
+         < C u s t _ _ L e d g e r _ E n t r y _ _ D o c u m e n t _ N o _ _ C a p t i o n > C u s t _ _ L e d g e r _ E n t r y _ _ D o c u m e n t _ N o _ _ C a p t i o n < / C u s t _ _ L e d g e r _ E n t r y _ _ D o c u m e n t _ N o _ _ C a p t i o n > + 
+         < C u s t _ _ L e d g e r _ E n t r y _ _ P o s t i n g _ D a t e _ C a p t i o n > C u s t _ _ L e d g e r _ E n t r y _ _ P o s t i n g _ D a t e _ C a p t i o n < / C u s t _ _ L e d g e r _ E n t r y _ _ P o s t i n g _ D a t e _ C a p t i o n > + 
+         < C u s t _ _ L e d g e r _ E n t r y _ _ P r o f i t _ _ L C Y _ _ C a p t i o n > C u s t _ _ L e d g e r _ E n t r y _ _ P r o f i t _ _ L C Y _ _ C a p t i o n < / C u s t _ _ L e d g e r _ E n t r y _ _ P r o f i t _ _ L C Y _ _ C a p t i o n > + 
+         < C u s t _ _ L e d g e r _ E n t r y _ _ S a l e s _ _ L C Y _ _ C a p t i o n > C u s t _ _ L e d g e r _ E n t r y _ _ S a l e s _ _ L C Y _ _ C a p t i o n < / C u s t _ _ L e d g e r _ E n t r y _ _ S a l e s _ _ L C Y _ _ C a p t i o n > + 
+         < C u s t _ _ L e d g e r _ E n t r y _ _ T A B L E C A P T I O N _ _ _ _ _ _ _ _ _ _ C u s t L e d g E n t r y F i l t e r > C u s t _ _ L e d g e r _ E n t r y _ _ T A B L E C A P T I O N _ _ _ _ _ _ _ _ _ _ C u s t L e d g E n t r y F i l t e r < / C u s t _ _ L e d g e r _ E n t r y _ _ T A B L E C A P T I O N _ _ _ _ _ _ _ _ _ _ C u s t L e d g E n t r y F i l t e r > + 
+         < C u s t _ _ L e d g e r _ E n t r y _ _ _ P r o f i t _ _ L C Y _ _ > C u s t _ _ L e d g e r _ E n t r y _ _ _ P r o f i t _ _ L C Y _ _ < / C u s t _ _ L e d g e r _ E n t r y _ _ _ P r o f i t _ _ L C Y _ _ > + 
+         < C u s t _ _ L e d g e r _ E n t r y _ _ _ S a l e s _ _ L C Y _ _ > C u s t _ _ L e d g e r _ E n t r y _ _ _ S a l e s _ _ L C Y _ _ < / C u s t _ _ L e d g e r _ E n t r y _ _ _ S a l e s _ _ L C Y _ _ > + 
+         < P a g e G r o u p N o > P a g e G r o u p N o < / P a g e G r o u p N o > + 
+         < P r o f i t C o m m i s s i o n A m t > P r o f i t C o m m i s s i o n A m t < / P r o f i t C o m m i s s i o n A m t > + 
+         < P r o f i t C o m m i s s i o n A m t _ C o n t r o l 3 3 C a p t i o n > P r o f i t C o m m i s s i o n A m t _ C o n t r o l 3 3 C a p t i o n < / P r o f i t C o m m i s s i o n A m t _ C o n t r o l 3 3 C a p t i o n > + 
+         < S a l e s C o m m i s s i o n A m t > S a l e s C o m m i s s i o n A m t < / S a l e s C o m m i s s i o n A m t > + 
+         < S a l e s C o m m i s s i o n A m t _ C o n t r o l 3 2 C a p t i o n > S a l e s C o m m i s s i o n A m t _ C o n t r o l 3 2 C a p t i o n < / S a l e s C o m m i s s i o n A m t _ C o n t r o l 3 2 C a p t i o n > + 
+         < S a l e s p e r s o n F i l t e r > S a l e s p e r s o n F i l t e r < / S a l e s p e r s o n F i l t e r > + 
+         < S a l e s p e r s o n _ P u r c h a s e r _ C o d e > S a l e s p e r s o n _ P u r c h a s e r _ C o d e < / S a l e s p e r s o n _ P u r c h a s e r _ C o d e > + 
+         < S a l e s p e r s o n _ P u r c h a s e r _ N a m e > S a l e s p e r s o n _ P u r c h a s e r _ N a m e < / S a l e s p e r s o n _ P u r c h a s e r _ N a m e > + 
+         < S a l e s p e r s o n _ P u r c h a s e r _ _ C o m m i s s i o n _ _ _ > S a l e s p e r s o n _ P u r c h a s e r _ _ C o m m i s s i o n _ _ _ < / S a l e s p e r s o n _ P u r c h a s e r _ _ C o m m i s s i o n _ _ _ > + 
+         < S a l e s p e r s o n _ P u r c h a s e r _ _ C o m m i s s i o n _ _ _ C a p t i o n > S a l e s p e r s o n _ P u r c h a s e r _ _ C o m m i s s i o n _ _ _ C a p t i o n < / S a l e s p e r s o n _ P u r c h a s e r _ _ C o m m i s s i o n _ _ _ C a p t i o n > + 
+         < S a l e s p e r s o n _ P u r c h a s e r _ _ T A B L E C A P T I O N _ _ _ _ _ _ _ _ _ _ S a l e s p e r s o n F i l t e r > S a l e s p e r s o n _ P u r c h a s e r _ _ T A B L E C A P T I O N _ _ _ _ _ _ _ _ _ _ S a l e s p e r s o n F i l t e r < / S a l e s p e r s o n _ P u r c h a s e r _ _ T A B L E C A P T I O N _ _ _ _ _ _ _ _ _ _ S a l e s p e r s o n F i l t e r > + 
+         < S a l e s p e r s o n _ _ _ C o m m i s s i o n C a p t i o n > S a l e s p e r s o n _ _ _ C o m m i s s i o n C a p t i o n < / S a l e s p e r s o n _ _ _ C o m m i s s i o n C a p t i o n > + 
+         < S T R S U B S T N O _ T e x t 0 0 0 _ P e r i o d T e x t _ > S T R S U B S T N O _ T e x t 0 0 0 _ P e r i o d T e x t _ < / S T R S U B S T N O _ T e x t 0 0 0 _ P e r i o d T e x t _ > + 
+         < T o t a l C a p t i o n > T o t a l C a p t i o n < / T o t a l C a p t i o n > + 
+         < C u s t _ L e d g e r _ E n t r y > + 
+             < A d j P r o f i t C o m m i s s i o n A m t _ C o n t r o l 4 5 > A d j P r o f i t C o m m i s s i o n A m t _ C o n t r o l 4 5 < / A d j P r o f i t C o m m i s s i o n A m t _ C o n t r o l 4 5 > + 
+             < A d j P r o f i t _ C o n t r o l 3 9 > A d j P r o f i t _ C o n t r o l 3 9 < / A d j P r o f i t _ C o n t r o l 3 9 > + 
+             < C u s t L e d g e r E n t r y _ C u s t o m e r N a m e > C u s t L e d g e r E n t r y _ C u s t o m e r N a m e < / C u s t L e d g e r E n t r y _ C u s t o m e r N a m e > + 
+             < C u s t _ _ L e d g e r _ E n t r y _ _ C u s t o m e r _ N o _ _ > C u s t _ _ L e d g e r _ E n t r y _ _ C u s t o m e r _ N o _ _ < / C u s t _ _ L e d g e r _ E n t r y _ _ C u s t o m e r _ N o _ _ > + 
+             < C u s t _ _ L e d g e r _ E n t r y _ _ D o c u m e n t _ N o _ _ > C u s t _ _ L e d g e r _ E n t r y _ _ D o c u m e n t _ N o _ _ < / C u s t _ _ L e d g e r _ E n t r y _ _ D o c u m e n t _ N o _ _ > + 
+             < C u s t _ _ L e d g e r _ E n t r y _ _ P o s t i n g _ D a t e _ > C u s t _ _ L e d g e r _ E n t r y _ _ P o s t i n g _ D a t e _ < / C u s t _ _ L e d g e r _ E n t r y _ _ P o s t i n g _ D a t e _ > + 
+             < C u s t _ _ L e d g e r _ E n t r y _ _ P r o f i t _ _ L C Y _ _ > C u s t _ _ L e d g e r _ E n t r y _ _ P r o f i t _ _ L C Y _ _ < / C u s t _ _ L e d g e r _ E n t r y _ _ P r o f i t _ _ L C Y _ _ > + 
+             < C u s t _ _ L e d g e r _ E n t r y _ _ S a l e s _ _ L C Y _ _ > C u s t _ _ L e d g e r _ E n t r y _ _ S a l e s _ _ L C Y _ _ < / C u s t _ _ L e d g e r _ E n t r y _ _ S a l e s _ _ L C Y _ _ > + 
+             < P r o f i t C o m m i s s i o n A m t _ C o n t r o l 3 3 > P r o f i t C o m m i s s i o n A m t _ C o n t r o l 3 3 < / P r o f i t C o m m i s s i o n A m t _ C o n t r o l 3 3 > + 
+             < S a l e s C o m m i s s i o n A m t _ C o n t r o l 3 2 > S a l e s C o m m i s s i o n A m t _ C o n t r o l 3 2 < / S a l e s C o m m i s s i o n A m t _ C o n t r o l 3 2 > + 
+             < S a l e s p e r s o n P u r c h a s e r _ C o d e > S a l e s p e r s o n P u r c h a s e r _ C o d e < / S a l e s p e r s o n P u r c h a s e r _ C o d e > + 
+             < S a l e s p e r s o n _ P u r c h a s e r _ _ N a m e > S a l e s p e r s o n _ P u r c h a s e r _ _ N a m e < / S a l e s p e r s o n _ P u r c h a s e r _ _ N a m e >   
          < / C u s t _ L e d g e r _ E n t r y >   
-         < S u b t o t a l s   E l e m e n t T y p e = " D a t a I t e m "   E l e m e n t I d = " 8 3 8 6 9 3 5 6 0 " > - 
-             < S u b t o t a l s _ A d j P r o f i t   E l e m e n t T y p e = " C o l u m n "   E l e m e n t I d = " 5 6 1 3 6 6 8 2 2 "   D a t a T y p e = " D e c i m a l " > S u b t o t a l s _ A d j P r o f i t < / S u b t o t a l s _ A d j P r o f i t > - 
-             < S u b t o t a l s _ A d j P r o f i t C o m m i s s i o n   E l e m e n t T y p e = " C o l u m n "   E l e m e n t I d = " 1 4 1 8 9 7 1 8 3 5 "   D a t a T y p e = " D e c i m a l " > S u b t o t a l s _ A d j P r o f i t C o m m i s s i o n < / S u b t o t a l s _ A d j P r o f i t C o m m i s s i o n > - 
-             < S u b t o t a l s _ P r o f i t   E l e m e n t T y p e = " C o l u m n "   E l e m e n t I d = " 2 4 1 5 0 0 6 9 7 "   D a t a T y p e = " D e c i m a l " > S u b t o t a l s _ P r o f i t < / S u b t o t a l s _ P r o f i t > - 
-             < S u b t o t a l s _ P r o f i t C o m m i s s i o n   E l e m e n t T y p e = " C o l u m n "   E l e m e n t I d = " 1 4 9 6 3 3 2 1 7 2 "   D a t a T y p e = " D e c i m a l " > S u b t o t a l s _ P r o f i t C o m m i s s i o n < / S u b t o t a l s _ P r o f i t C o m m i s s i o n > - 
-             < S u b t o t a l s _ S a l e s   E l e m e n t T y p e = " C o l u m n "   E l e m e n t I d = " 1 9 7 8 7 7 5 0 3 "   D a t a T y p e = " D e c i m a l " > S u b t o t a l s _ S a l e s < / S u b t o t a l s _ S a l e s > - 
-             < S u b t o t a l s _ S a l e s C o m m i s s i o n   E l e m e n t T y p e = " C o l u m n "   E l e m e n t I d = " 1 4 7 6 0 7 2 5 9 0 "   D a t a T y p e = " D e c i m a l " > S u b t o t a l s _ S a l e s C o m m i s s i o n < / S u b t o t a l s _ S a l e s C o m m i s s i o n > - 
-             < S u b t o t a l s _ S a l e s p e r s o n _ C o d e   E l e m e n t T y p e = " C o l u m n "   E l e m e n t I d = " 1 1 9 8 5 9 4 2 7 2 "   D a t a T y p e = " C o d e " > S u b t o t a l s _ S a l e s p e r s o n _ C o d e < / S u b t o t a l s _ S a l e s p e r s o n _ C o d e > +         < S u b t o t a l s > + 
+             < S u b t o t a l s _ A d j P r o f i t > S u b t o t a l s _ A d j P r o f i t < / S u b t o t a l s _ A d j P r o f i t > + 
+             < S u b t o t a l s _ A d j P r o f i t C o m m i s s i o n > S u b t o t a l s _ A d j P r o f i t C o m m i s s i o n < / S u b t o t a l s _ A d j P r o f i t C o m m i s s i o n > + 
+             < S u b t o t a l s _ P r o f i t > S u b t o t a l s _ P r o f i t < / S u b t o t a l s _ P r o f i t > + 
+             < S u b t o t a l s _ P r o f i t C o m m i s s i o n > S u b t o t a l s _ P r o f i t C o m m i s s i o n < / S u b t o t a l s _ P r o f i t C o m m i s s i o n > + 
+             < S u b t o t a l s _ S a l e s > S u b t o t a l s _ S a l e s < / S u b t o t a l s _ S a l e s > + 
+             < S u b t o t a l s _ S a l e s C o m m i s s i o n > S u b t o t a l s _ S a l e s C o m m i s s i o n < / S u b t o t a l s _ S a l e s C o m m i s s i o n > + 
+             < S u b t o t a l s _ S a l e s p e r s o n _ C o d e > S u b t o t a l s _ S a l e s p e r s o n _ C o d e < / S u b t o t a l s _ S a l e s p e r s o n _ C o d e >   
          < / S u b t o t a l s >   
      < / S a l e s p e r s o n _ P u r c h a s e r >   
-     < T o t a l s   E l e m e n t T y p e = " D a t a I t e m "   E l e m e n t I d = " 1 8 2 3 9 5 0 0 4 4 " > - 
-         < T o t a l s _ A d j P r o f i t   E l e m e n t T y p e = " C o l u m n "   E l e m e n t I d = " 1 9 0 9 5 0 1 3 6 2 "   D a t a T y p e = " D e c i m a l " > T o t a l s _ A d j P r o f i t < / T o t a l s _ A d j P r o f i t > - 
-         < T o t a l s _ A d j P r o f i t C o m m i s s i o n   E l e m e n t T y p e = " C o l u m n "   E l e m e n t I d = " 9 4 6 1 0 3 7 5 9 "   D a t a T y p e = " D e c i m a l " > T o t a l s _ A d j P r o f i t C o m m i s s i o n < / T o t a l s _ A d j P r o f i t C o m m i s s i o n > - 
-         < T o t a l s _ P r o f i t   E l e m e n t T y p e = " C o l u m n "   E l e m e n t I d = " 6 4 6 2 9 5 2 1 9 "   D a t a T y p e = " D e c i m a l " > T o t a l s _ P r o f i t < / T o t a l s _ P r o f i t > - 
-         < T o t a l s _ P r o f i t C o m m i s s i o n   E l e m e n t T y p e = " C o l u m n "   E l e m e n t I d = " 3 6 7 7 9 1 3 9 2 "   D a t a T y p e = " D e c i m a l " > T o t a l s _ P r o f i t C o m m i s s i o n < / T o t a l s _ P r o f i t C o m m i s s i o n > - 
-         < T o t a l s _ S a l e s   E l e m e n t T y p e = " C o l u m n "   E l e m e n t I d = " 1 3 9 9 9 8 5 1 0 9 "   D a t a T y p e = " D e c i m a l " > T o t a l s _ S a l e s < / T o t a l s _ S a l e s > - 
-         < T o t a l s _ S a l e s C o m m i s s i o n   E l e m e n t T y p e = " C o l u m n "   E l e m e n t I d = " 4 6 4 8 2 3 3 9 8 "   D a t a T y p e = " D e c i m a l " > T o t a l s _ S a l e s C o m m i s s i o n < / T o t a l s _ S a l e s C o m m i s s i o n > +     < T o t a l s > + 
+         < T o t a l s _ A d j P r o f i t > T o t a l s _ A d j P r o f i t < / T o t a l s _ A d j P r o f i t > + 
+         < T o t a l s _ A d j P r o f i t C o m m i s s i o n > T o t a l s _ A d j P r o f i t C o m m i s s i o n < / T o t a l s _ A d j P r o f i t C o m m i s s i o n > + 
+         < T o t a l s _ P r o f i t > T o t a l s _ P r o f i t < / T o t a l s _ P r o f i t > + 
+         < T o t a l s _ P r o f i t C o m m i s s i o n > T o t a l s _ P r o f i t C o m m i s s i o n < / T o t a l s _ P r o f i t C o m m i s s i o n > + 
+         < T o t a l s _ S a l e s > T o t a l s _ S a l e s < / T o t a l s _ S a l e s > + 
+         < T o t a l s _ S a l e s C o m m i s s i o n > T o t a l s _ S a l e s C o m m i s s i o n < / T o t a l s _ S a l e s C o m m i s s i o n >   
      < / T o t a l s >   
  < / N a v W o r d R e p o r t X m l P a r t > 
 </file>
 
-<file path=customXml/item2.xml>��< ? x m l   v e r s i o n = " 1 . 0 "   e n c o d i n g = " u t f - 1 6 " ? > < N a v W o r d R e p o r t X m l P a r t   x m l n s = " u r n : m i c r o s o f t - d y n a m i c s - n a v / r e p o r t s / S a l e s p e r s o n _ C o m m i s s i o n / 1 1 5 / " > +<file path=customXml/item2.xml>��< ? x m l   v e r s i o n = " 1 . 0 "   e n c o d i n g = " u t f - 1 6 " ? > < N a v W o r d R e p o r t X m l P a r t   x m l n s = " u r n : m i c r o s o f t - d y n a m i c s - b u s i n e s s c e n t r a l / i n t e r n a l / e x t e n d e d / r e p o r t s / S a l e s p e r s o n _ C o m m i s s i o n / 1 1 5 / " >   
      < B C R e p o r t I n f o r m a t i o n >   
@@ -4536,185 +4448,255 @@
  
      < L a b e l s >   
-         < A b o u t T h e R e p o r t L a b e l > A b o u t T h e R e p o r t L a b e l < / A b o u t T h e R e p o r t L a b e l > - 
-         < A d j u s t e d P r o f i t C o m m i s s i o n L a b e l > A d j u s t e d P r o f i t C o m m i s s i o n L a b e l < / A d j u s t e d P r o f i t C o m m i s s i o n L a b e l > - 
-         < A d j u s t e d P r o f i t L a b e l > A d j u s t e d P r o f i t L a b e l < / A d j u s t e d P r o f i t L a b e l > - 
-         < A l l A m o u n t s A r e I n L C Y L a b e l > A l l A m o u n t s A r e I n L C Y L a b e l < / A l l A m o u n t s A r e I n L C Y L a b e l > - 
-         < C o m m i s s i o n P e r c e n t L a b e l > C o m m i s s i o n P e r c e n t L a b e l < / C o m m i s s i o n P e r c e n t L a b e l > - 
-         < C o m p a n y L a b e l > C o m p a n y L a b e l < / C o m p a n y L a b e l > - 
-         < C u s t o m e r N a m e L a b e l > C u s t o m e r N a m e L a b e l < / C u s t o m e r N a m e L a b e l > - 
-         < C u s t o m e r N o L a b e l > C u s t o m e r N o L a b e l < / C u s t o m e r N o L a b e l > - 
-         < D a t a R e t r i e v e d > D a t a R e t r i e v e d < / D a t a R e t r i e v e d > - 
-         < D o c u m e n t a t i o n L a b e l > D o c u m e n t a t i o n L a b e l < / D o c u m e n t a t i o n L a b e l > - 
-         < D o c u m e n t N o L a b e l > D o c u m e n t N o L a b e l < / D o c u m e n t N o L a b e l > - 
-         < E n v i r o n m e n t L a b e l > E n v i r o n m e n t L a b e l < / E n v i r o n m e n t L a b e l > - 
-         < P e r i o d C a p t i o n > P e r i o d C a p t i o n < / P e r i o d C a p t i o n > - 
-         < P o s t i n g D a t e L a b e l > P o s t i n g D a t e L a b e l < / P o s t i n g D a t e L a b e l > - 
-         < P r o f i t C o m m i s s i o n L a b e l > P r o f i t C o m m i s s i o n L a b e l < / P r o f i t C o m m i s s i o n L a b e l > - 
-         < P r o f i t L a b e l > P r o f i t L a b e l < / P r o f i t L a b e l > - 
-         < R e p o r t N a m e L a b e l > R e p o r t N a m e L a b e l < / R e p o r t N a m e L a b e l > - 
-         < R u n O n L a b e l > R u n O n L a b e l < / R u n O n L a b e l > - 
-         < S a l e s C o m m i s s i o n L a b e l > S a l e s C o m m i s s i o n L a b e l < / S a l e s C o m m i s s i o n L a b e l > - 
-         < S a l e s L a b e l > S a l e s L a b e l < / S a l e s L a b e l > - 
-         < S a l e s p e r s o n _ P u r c h a s e r _ _ N a m e C a p t i o n > S a l e s p e r s o n _ P u r c h a s e r _ _ N a m e C a p t i o n < / S a l e s p e r s o n _ P u r c h a s e r _ _ N a m e C a p t i o n > - 
-         < S a l e s p e r s o n C o m m i s s i o n A n a l y s i s > S a l e s p e r s o n C o m m i s s i o n A n a l y s i s < / S a l e s p e r s o n C o m m i s s i o n A n a l y s i s > - 
-         < S a l e s p e r s o n C o m m i s s i o n L a b e l > S a l e s p e r s o n C o m m i s s i o n L a b e l < / S a l e s p e r s o n C o m m i s s i o n L a b e l > - 
-         < S a l e s p e r s o n C o m m i s s i o n P r i n t > S a l e s p e r s o n C o m m i s s i o n P r i n t < / S a l e s p e r s o n C o m m i s s i o n P r i n t > - 
-         < S a l e s p e r s o n P u r c h a s e r _ C o d e C a p t i o n > S a l e s p e r s o n P u r c h a s e r _ C o d e C a p t i o n < / S a l e s p e r s o n P u r c h a s e r _ C o d e C a p t i o n > - 
-         < T o t a l s C a p t i o n > T o t a l s C a p t i o n < / T o t a l s C a p t i o n > - 
-         < U s e r L a b e l > U s e r L a b e l < / U s e r L a b e l > +         < A b o u t T h e R e p o r t L a b e l   E l e m e n t T y p e = " P a r a m e t e r "   E l e m e n t I d = " 1 6 7 7 9 2 0 0 1 "   D a t a T y p e = " S t r i n g " > A b o u t T h e R e p o r t L a b e l < / A b o u t T h e R e p o r t L a b e l > + 
+         < A d j u s t e d P r o f i t C o m m i s s i o n L a b e l   E l e m e n t T y p e = " P a r a m e t e r "   E l e m e n t I d = " 9 1 5 5 5 7 0 2 0 "   D a t a T y p e = " S t r i n g " > A d j u s t e d P r o f i t C o m m i s s i o n L a b e l < / A d j u s t e d P r o f i t C o m m i s s i o n L a b e l > + 
+         < A d j u s t e d P r o f i t L a b e l   E l e m e n t T y p e = " P a r a m e t e r "   E l e m e n t I d = " 1 6 1 5 2 8 3 0 4 7 "   D a t a T y p e = " S t r i n g " > A d j u s t e d P r o f i t L a b e l < / A d j u s t e d P r o f i t L a b e l > + 
+         < A l l A m o u n t s A r e I n L C Y L a b e l   E l e m e n t T y p e = " P a r a m e t e r "   E l e m e n t I d = " 5 6 3 5 1 4 3 1 8 "   D a t a T y p e = " S t r i n g " > A l l A m o u n t s A r e I n L C Y L a b e l < / A l l A m o u n t s A r e I n L C Y L a b e l > + 
+         < C o m m i s s i o n P e r c e n t L a b e l   E l e m e n t T y p e = " P a r a m e t e r "   E l e m e n t I d = " 8 3 9 2 6 3 7 6 5 "   D a t a T y p e = " S t r i n g " > C o m m i s s i o n P e r c e n t L a b e l < / C o m m i s s i o n P e r c e n t L a b e l > + 
+         < C o m p a n y L a b e l   E l e m e n t T y p e = " P a r a m e t e r "   E l e m e n t I d = " 3 4 6 7 6 0 3 4 8 "   D a t a T y p e = " S t r i n g " > C o m p a n y L a b e l < / C o m p a n y L a b e l > + 
+         < C u s t o m e r N a m e L a b e l   E l e m e n t T y p e = " P a r a m e t e r "   E l e m e n t I d = " 1 1 1 8 7 9 0 8 8 "   D a t a T y p e = " S t r i n g " > C u s t o m e r N a m e L a b e l < / C u s t o m e r N a m e L a b e l > + 
+         < C u s t o m e r N o L a b e l   E l e m e n t T y p e = " P a r a m e t e r "   E l e m e n t I d = " 3 8 7 4 7 8 0 3 4 "   D a t a T y p e = " S t r i n g " > C u s t o m e r N o L a b e l < / C u s t o m e r N o L a b e l > + 
+         < D a t a R e t r i e v e d   E l e m e n t T y p e = " P a r a m e t e r "   E l e m e n t I d = " 2 9 1 9 1 1 8 0 7 "   D a t a T y p e = " S t r i n g " > D a t a R e t r i e v e d < / D a t a R e t r i e v e d > + 
+         < D o c u m e n t a t i o n L a b e l   E l e m e n t T y p e = " P a r a m e t e r "   E l e m e n t I d = " 1 7 3 8 9 2 4 8 1 5 "   D a t a T y p e = " S t r i n g " > D o c u m e n t a t i o n L a b e l < / D o c u m e n t a t i o n L a b e l > + 
+         < D o c u m e n t N o L a b e l   E l e m e n t T y p e = " P a r a m e t e r "   E l e m e n t I d = " 1 1 4 6 4 3 5 8 0 3 "   D a t a T y p e = " S t r i n g " > D o c u m e n t N o L a b e l < / D o c u m e n t N o L a b e l > + 
+         < E n v i r o n m e n t L a b e l   E l e m e n t T y p e = " P a r a m e t e r "   E l e m e n t I d = " 8 1 8 8 1 6 5 9 0 "   D a t a T y p e = " S t r i n g " > E n v i r o n m e n t L a b e l < / E n v i r o n m e n t L a b e l > + 
+         < P e r i o d C a p t i o n   E l e m e n t T y p e = " P a r a m e t e r "   E l e m e n t I d = " 1 4 7 8 2 5 3 4 2 2 "   D a t a T y p e = " S t r i n g " > P e r i o d C a p t i o n < / P e r i o d C a p t i o n > + 
+         < P o s t i n g D a t e L a b e l   E l e m e n t T y p e = " P a r a m e t e r "   E l e m e n t I d = " 1 7 7 5 7 9 4 2 4 9 "   D a t a T y p e = " S t r i n g " > P o s t i n g D a t e L a b e l < / P o s t i n g D a t e L a b e l > + 
+         < P r o f i t C o m m i s s i o n L a b e l   E l e m e n t T y p e = " P a r a m e t e r "   E l e m e n t I d = " 8 3 2 7 0 6 3 9 2 "   D a t a T y p e = " S t r i n g " > P r o f i t C o m m i s s i o n L a b e l < / P r o f i t C o m m i s s i o n L a b e l > + 
+         < P r o f i t L a b e l   E l e m e n t T y p e = " P a r a m e t e r "   E l e m e n t I d = " 2 5 4 6 3 3 6 4 5 "   D a t a T y p e = " S t r i n g " > P r o f i t L a b e l < / P r o f i t L a b e l > + 
+         < R e p o r t N a m e L a b e l   E l e m e n t T y p e = " P a r a m e t e r "   E l e m e n t I d = " 1 0 2 2 2 9 2 9 8 2 "   D a t a T y p e = " S t r i n g " > R e p o r t N a m e L a b e l < / R e p o r t N a m e L a b e l > + 
+         < R u n O n L a b e l   E l e m e n t T y p e = " P a r a m e t e r "   E l e m e n t I d = " 1 1 1 9 0 3 7 5 9 5 "   D a t a T y p e = " S t r i n g " > R u n O n L a b e l < / R u n O n L a b e l > + 
+         < S a l e s C o m m i s s i o n L a b e l   E l e m e n t T y p e = " P a r a m e t e r "   E l e m e n t I d = " 1 0 1 8 2 6 8 7 7 0 "   D a t a T y p e = " S t r i n g " > S a l e s C o m m i s s i o n L a b e l < / S a l e s C o m m i s s i o n L a b e l > + 
+         < S a l e s L a b e l   E l e m e n t T y p e = " P a r a m e t e r "   E l e m e n t I d = " 1 7 9 5 4 4 8 0 0 5 "   D a t a T y p e = " S t r i n g " > S a l e s L a b e l < / S a l e s L a b e l > + 
+         < S a l e s p e r s o n _ P u r c h a s e r _ _ N a m e C a p t i o n   E l e m e n t T y p e = " P a r a m e t e r "   E l e m e n t I d = " 1 1 9 5 8 7 9 8 7 3 "   D a t a T y p e = " S t r i n g " > S a l e s p e r s o n _ P u r c h a s e r _ _ N a m e C a p t i o n < / S a l e s p e r s o n _ P u r c h a s e r _ _ N a m e C a p t i o n > + 
+         < S a l e s p e r s o n C o m m i s s i o n A n a l y s i s   E l e m e n t T y p e = " P a r a m e t e r "   E l e m e n t I d = " 7 1 5 8 7 1 2 4 7 "   D a t a T y p e = " S t r i n g " > S a l e s p e r s o n C o m m i s s i o n A n a l y s i s < / S a l e s p e r s o n C o m m i s s i o n A n a l y s i s > + 
+         < S a l e s p e r s o n C o m m i s s i o n L a b e l   E l e m e n t T y p e = " P a r a m e t e r "   E l e m e n t I d = " 3 0 0 0 9 6 0 5 1 "   D a t a T y p e = " S t r i n g " > S a l e s p e r s o n C o m m i s s i o n L a b e l < / S a l e s p e r s o n C o m m i s s i o n L a b e l > + 
+         < S a l e s p e r s o n C o m m i s s i o n P r i n t   E l e m e n t T y p e = " P a r a m e t e r "   E l e m e n t I d = " 1 3 1 6 0 2 8 6 0 "   D a t a T y p e = " S t r i n g " > S a l e s p e r s o n C o m m i s s i o n P r i n t < / S a l e s p e r s o n C o m m i s s i o n P r i n t > + 
+         < S a l e s p e r s o n P u r c h a s e r _ C o d e C a p t i o n   E l e m e n t T y p e = " P a r a m e t e r "   E l e m e n t I d = " 1 2 2 1 2 1 9 2 4 5 "   D a t a T y p e = " S t r i n g " > S a l e s p e r s o n P u r c h a s e r _ C o d e C a p t i o n < / S a l e s p e r s o n P u r c h a s e r _ C o d e C a p t i o n > + 
+         < T o t a l s C a p t i o n   E l e m e n t T y p e = " P a r a m e t e r "   E l e m e n t I d = " 2 3 5 4 5 9 0 6 "   D a t a T y p e = " S t r i n g " > T o t a l s C a p t i o n < / T o t a l s C a p t i o n > + 
+         < U s e r L a b e l   E l e m e n t T y p e = " P a r a m e t e r "   E l e m e n t I d = " 8 4 8 8 1 6 7 9 4 "   D a t a T y p e = " S t r i n g " > U s e r L a b e l < / U s e r L a b e l >   
      < / L a b e l s >   
-     < S a l e s p e r s o n _ P u r c h a s e r > - 
-         < A d j P r o f i t > A d j P r o f i t < / A d j P r o f i t > - 
-         < A d j P r o f i t C o m m i s s i o n A m t > A d j P r o f i t C o m m i s s i o n A m t < / A d j P r o f i t C o m m i s s i o n A m t > - 
-         < A d j P r o f i t C o m m i s s i o n A m t _ C o n t r o l 4 5 C a p t i o n > A d j P r o f i t C o m m i s s i o n A m t _ C o n t r o l 4 5 C a p t i o n < / A d j P r o f i t C o m m i s s i o n A m t _ C o n t r o l 4 5 C a p t i o n > - 
-         < A d j P r o f i t _ C o n t r o l 3 9 C a p t i o n > A d j P r o f i t _ C o n t r o l 3 9 C a p t i o n < / A d j P r o f i t _ C o n t r o l 3 9 C a p t i o n > - 
-         < A l l _ a m o u n t s _ a r e _ i n _ L C Y C a p t i o n > A l l _ a m o u n t s _ a r e _ i n _ L C Y C a p t i o n < / A l l _ a m o u n t s _ a r e _ i n _ L C Y C a p t i o n > - 
-         < C O M P A N Y N A M E > C O M P A N Y N A M E < / C O M P A N Y N A M E > - 
-         < C u r r R e p o r t _ P A G E N O C a p t i o n > C u r r R e p o r t _ P A G E N O C a p t i o n < / C u r r R e p o r t _ P A G E N O C a p t i o n > - 
-         < C u s t L e d g E n t r y F i l t e r > C u s t L e d g E n t r y F i l t e r < / C u s t L e d g E n t r y F i l t e r > - 
-         < C u s t _ _ L e d g e r _ E n t r y _ _ C u s t o m e r _ N o _ _ C a p t i o n > C u s t _ _ L e d g e r _ E n t r y _ _ C u s t o m e r _ N o _ _ C a p t i o n < / C u s t _ _ L e d g e r _ E n t r y _ _ C u s t o m e r _ N o _ _ C a p t i o n > - 
-         < C u s t _ _ L e d g e r _ E n t r y _ _ D o c u m e n t _ N o _ _ C a p t i o n > C u s t _ _ L e d g e r _ E n t r y _ _ D o c u m e n t _ N o _ _ C a p t i o n < / C u s t _ _ L e d g e r _ E n t r y _ _ D o c u m e n t _ N o _ _ C a p t i o n > - 
-         < C u s t _ _ L e d g e r _ E n t r y _ _ P o s t i n g _ D a t e _ C a p t i o n > C u s t _ _ L e d g e r _ E n t r y _ _ P o s t i n g _ D a t e _ C a p t i o n < / C u s t _ _ L e d g e r _ E n t r y _ _ P o s t i n g _ D a t e _ C a p t i o n > - 
-         < C u s t _ _ L e d g e r _ E n t r y _ _ P r o f i t _ _ L C Y _ _ C a p t i o n > C u s t _ _ L e d g e r _ E n t r y _ _ P r o f i t _ _ L C Y _ _ C a p t i o n < / C u s t _ _ L e d g e r _ E n t r y _ _ P r o f i t _ _ L C Y _ _ C a p t i o n > - 
-         < C u s t _ _ L e d g e r _ E n t r y _ _ S a l e s _ _ L C Y _ _ C a p t i o n > C u s t _ _ L e d g e r _ E n t r y _ _ S a l e s _ _ L C Y _ _ C a p t i o n < / C u s t _ _ L e d g e r _ E n t r y _ _ S a l e s _ _ L C Y _ _ C a p t i o n > - 
-         < C u s t _ _ L e d g e r _ E n t r y _ _ T A B L E C A P T I O N _ _ _ _ _ _ _ _ _ _ C u s t L e d g E n t r y F i l t e r > C u s t _ _ L e d g e r _ E n t r y _ _ T A B L E C A P T I O N _ _ _ _ _ _ _ _ _ _ C u s t L e d g E n t r y F i l t e r < / C u s t _ _ L e d g e r _ E n t r y _ _ T A B L E C A P T I O N _ _ _ _ _ _ _ _ _ _ C u s t L e d g E n t r y F i l t e r > - 
-         < C u s t _ _ L e d g e r _ E n t r y _ _ _ P r o f i t _ _ L C Y _ _ > C u s t _ _ L e d g e r _ E n t r y _ _ _ P r o f i t _ _ L C Y _ _ < / C u s t _ _ L e d g e r _ E n t r y _ _ _ P r o f i t _ _ L C Y _ _ > - 
-         < C u s t _ _ L e d g e r _ E n t r y _ _ _ S a l e s _ _ L C Y _ _ > C u s t _ _ L e d g e r _ E n t r y _ _ _ S a l e s _ _ L C Y _ _ < / C u s t _ _ L e d g e r _ E n t r y _ _ _ S a l e s _ _ L C Y _ _ > - 
-         < P a g e G r o u p N o > P a g e G r o u p N o < / P a g e G r o u p N o > - 
-         < P r o f i t C o m m i s s i o n A m t > P r o f i t C o m m i s s i o n A m t < / P r o f i t C o m m i s s i o n A m t > - 
-         < P r o f i t C o m m i s s i o n A m t _ C o n t r o l 3 3 C a p t i o n > P r o f i t C o m m i s s i o n A m t _ C o n t r o l 3 3 C a p t i o n < / P r o f i t C o m m i s s i o n A m t _ C o n t r o l 3 3 C a p t i o n > - 
-         < S a l e s C o m m i s s i o n A m t > S a l e s C o m m i s s i o n A m t < / S a l e s C o m m i s s i o n A m t > - 
-         < S a l e s C o m m i s s i o n A m t _ C o n t r o l 3 2 C a p t i o n > S a l e s C o m m i s s i o n A m t _ C o n t r o l 3 2 C a p t i o n < / S a l e s C o m m i s s i o n A m t _ C o n t r o l 3 2 C a p t i o n > - 
-         < S a l e s p e r s o n F i l t e r > S a l e s p e r s o n F i l t e r < / S a l e s p e r s o n F i l t e r > - 
-         < S a l e s p e r s o n _ P u r c h a s e r _ C o d e > S a l e s p e r s o n _ P u r c h a s e r _ C o d e < / S a l e s p e r s o n _ P u r c h a s e r _ C o d e > - 
-         < S a l e s p e r s o n _ P u r c h a s e r _ N a m e > S a l e s p e r s o n _ P u r c h a s e r _ N a m e < / S a l e s p e r s o n _ P u r c h a s e r _ N a m e > - 
-         < S a l e s p e r s o n _ P u r c h a s e r _ _ C o m m i s s i o n _ _ _ > S a l e s p e r s o n _ P u r c h a s e r _ _ C o m m i s s i o n _ _ _ < / S a l e s p e r s o n _ P u r c h a s e r _ _ C o m m i s s i o n _ _ _ > - 
-         < S a l e s p e r s o n _ P u r c h a s e r _ _ C o m m i s s i o n _ _ _ C a p t i o n > S a l e s p e r s o n _ P u r c h a s e r _ _ C o m m i s s i o n _ _ _ C a p t i o n < / S a l e s p e r s o n _ P u r c h a s e r _ _ C o m m i s s i o n _ _ _ C a p t i o n > - 
-         < S a l e s p e r s o n _ P u r c h a s e r _ _ T A B L E C A P T I O N _ _ _ _ _ _ _ _ _ _ S a l e s p e r s o n F i l t e r > S a l e s p e r s o n _ P u r c h a s e r _ _ T A B L E C A P T I O N _ _ _ _ _ _ _ _ _ _ S a l e s p e r s o n F i l t e r < / S a l e s p e r s o n _ P u r c h a s e r _ _ T A B L E C A P T I O N _ _ _ _ _ _ _ _ _ _ S a l e s p e r s o n F i l t e r > - 
-         < S a l e s p e r s o n _ _ _ C o m m i s s i o n C a p t i o n > S a l e s p e r s o n _ _ _ C o m m i s s i o n C a p t i o n < / S a l e s p e r s o n _ _ _ C o m m i s s i o n C a p t i o n > - 
-         < S T R S U B S T N O _ T e x t 0 0 0 _ P e r i o d T e x t _ > S T R S U B S T N O _ T e x t 0 0 0 _ P e r i o d T e x t _ < / S T R S U B S T N O _ T e x t 0 0 0 _ P e r i o d T e x t _ > - 
-         < T o t a l C a p t i o n > T o t a l C a p t i o n < / T o t a l C a p t i o n > - 
-         < C u s t _ L e d g e r _ E n t r y > - 
-             < A d j P r o f i t C o m m i s s i o n A m t _ C o n t r o l 4 5 > A d j P r o f i t C o m m i s s i o n A m t _ C o n t r o l 4 5 < / A d j P r o f i t C o m m i s s i o n A m t _ C o n t r o l 4 5 > - 
-             < A d j P r o f i t _ C o n t r o l 3 9 > A d j P r o f i t _ C o n t r o l 3 9 < / A d j P r o f i t _ C o n t r o l 3 9 > - 
-             < C u s t L e d g e r E n t r y _ C u s t o m e r N a m e > C u s t L e d g e r E n t r y _ C u s t o m e r N a m e < / C u s t L e d g e r E n t r y _ C u s t o m e r N a m e > - 
-             < C u s t _ _ L e d g e r _ E n t r y _ _ C u s t o m e r _ N o _ _ > C u s t _ _ L e d g e r _ E n t r y _ _ C u s t o m e r _ N o _ _ < / C u s t _ _ L e d g e r _ E n t r y _ _ C u s t o m e r _ N o _ _ > - 
-             < C u s t _ _ L e d g e r _ E n t r y _ _ D o c u m e n t _ N o _ _ > C u s t _ _ L e d g e r _ E n t r y _ _ D o c u m e n t _ N o _ _ < / C u s t _ _ L e d g e r _ E n t r y _ _ D o c u m e n t _ N o _ _ > - 
-             < C u s t _ _ L e d g e r _ E n t r y _ _ P o s t i n g _ D a t e _ > C u s t _ _ L e d g e r _ E n t r y _ _ P o s t i n g _ D a t e _ < / C u s t _ _ L e d g e r _ E n t r y _ _ P o s t i n g _ D a t e _ > - 
-             < C u s t _ _ L e d g e r _ E n t r y _ _ P r o f i t _ _ L C Y _ _ > C u s t _ _ L e d g e r _ E n t r y _ _ P r o f i t _ _ L C Y _ _ < / C u s t _ _ L e d g e r _ E n t r y _ _ P r o f i t _ _ L C Y _ _ > - 
-             < C u s t _ _ L e d g e r _ E n t r y _ _ S a l e s _ _ L C Y _ _ > C u s t _ _ L e d g e r _ E n t r y _ _ S a l e s _ _ L C Y _ _ < / C u s t _ _ L e d g e r _ E n t r y _ _ S a l e s _ _ L C Y _ _ > - 
-             < P r o f i t C o m m i s s i o n A m t _ C o n t r o l 3 3 > P r o f i t C o m m i s s i o n A m t _ C o n t r o l 3 3 < / P r o f i t C o m m i s s i o n A m t _ C o n t r o l 3 3 > - 
-             < S a l e s C o m m i s s i o n A m t _ C o n t r o l 3 2 > S a l e s C o m m i s s i o n A m t _ C o n t r o l 3 2 < / S a l e s C o m m i s s i o n A m t _ C o n t r o l 3 2 > - 
-             < S a l e s p e r s o n P u r c h a s e r _ C o d e > S a l e s p e r s o n P u r c h a s e r _ C o d e < / S a l e s p e r s o n P u r c h a s e r _ C o d e > - 
-             < S a l e s p e r s o n _ P u r c h a s e r _ _ N a m e > S a l e s p e r s o n _ P u r c h a s e r _ _ N a m e < / S a l e s p e r s o n _ P u r c h a s e r _ _ N a m e > +     < T o o l t i p s > + 
+         < T o o l t i p   c o l u m n = " S a l e s p e r s o n _ P u r c h a s e r _ C o d e "   E l e m e n t I d = " 1 3 8 8 0 3 1 6 5 2 " > + 
+             < T o o l t i p T e x t   l a n g = " e n - U S " > S p e c i f i e s   a   c o d e   f o r   t h e   s a l e s p e r s o n   o r   p u r c h a s e r . < / T o o l t i p T e x t > + 
+         < / T o o l t i p > + 
+         < T o o l t i p   c o l u m n = " S a l e s p e r s o n _ P u r c h a s e r _ N a m e "   E l e m e n t I d = " 1 3 4 8 2 2 8 4 6 2 " > + 
+             < T o o l t i p T e x t   l a n g = " e n - U S " > S p e c i f i e s   t h e   n a m e   o f   t h e   s a l e s p e r s o n   o r   p u r c h a s e r . < / T o o l t i p T e x t > + 
+         < / T o o l t i p > + 
+         < T o o l t i p   c o l u m n = " S a l e s p e r s o n _ P u r c h a s e r _ _ C o m m i s s i o n _ _ _ "   E l e m e n t I d = " 1 5 9 0 6 8 9 0 0 4 " > + 
+             < T o o l t i p T e x t   l a n g = " e n - U S " > S p e c i f i e s   t h e   p e r c e n t a g e   t o   u s e   t o   c a l c u l a t e   t h e   s a l e s p e r s o n ' s   c o m m i s s i o n . < / T o o l t i p T e x t > + 
+         < / T o o l t i p > + 
+         < T o o l t i p   c o l u m n = " C u s t _ _ L e d g e r _ E n t r y _ _ _ S a l e s _ _ L C Y _ _ "   E l e m e n t I d = " 3 4 8 7 9 4 9 4 9 " > + 
+             < T o o l t i p T e x t   l a n g = " e n - U S " > S p e c i f i e s   t h e   t o t a l   s a l e s   a m o u n t   e x c l .   V A T   t o   t h e   c u s t o m e r   i n   L C Y . < / T o o l t i p T e x t > + 
+         < / T o o l t i p > + 
+         < T o o l t i p   c o l u m n = " C u s t _ _ L e d g e r _ E n t r y _ _ D o c u m e n t _ N o _ _ "   E l e m e n t I d = " 8 5 2 6 1 1 1 8 1 " > + 
+             < T o o l t i p T e x t   l a n g = " e n - U S " > S p e c i f i e s   t h e   e n t r y ' s   d o c u m e n t   n u m b e r . < / T o o l t i p T e x t > + 
+         < / T o o l t i p > + 
+         < T o o l t i p   c o l u m n = " C u s t _ _ L e d g e r _ E n t r y _ _ C u s t o m e r _ N o _ _ "   E l e m e n t I d = " 1 0 0 9 0 1 6 8 0 8 " > + 
+             < T o o l t i p T e x t   l a n g = " e n - U S " > S p e c i f i e s   t h e   c u s t o m e r   a c c o u n t   n u m b e r   t h a t   t h e   e n t r y   i s   l i n k e d   t o . < / T o o l t i p T e x t > + 
+         < / T o o l t i p > + 
+         < T o o l t i p   c o l u m n = " C u s t _ _ L e d g e r _ E n t r y _ _ S a l e s _ _ L C Y _ _ "   E l e m e n t I d = " 8 1 9 5 1 7 4 8 " > + 
+             < T o o l t i p T e x t   l a n g = " e n - U S " > S p e c i f i e s   t h e   t o t a l   s a l e s   a m o u n t   e x c l .   V A T   t o   t h e   c u s t o m e r   i n   L C Y . < / T o o l t i p T e x t > + 
+         < / T o o l t i p > + 
+         < T o o l t i p   c o l u m n = " C u s t L e d g e r E n t r y _ C u s t o m e r N a m e "   E l e m e n t I d = " 2 0 9 1 8 9 3 2 7 9 " > + 
+             < T o o l t i p T e x t   l a n g = " e n - U S " > S p e c i f i e s   t h e   c u s t o m e r   n a m e   t h a t   t h e   e n t r y   i s   l i n k e d   t o . < / T o o l t i p T e x t > + 
+         < / T o o l t i p > + 
+         < T o o l t i p   c o l u m n = " S a l e s p e r s o n P u r c h a s e r _ C o d e "   E l e m e n t I d = " 1 2 2 1 2 1 9 2 4 5 " > + 
+             < T o o l t i p T e x t   l a n g = " e n - U S " > S p e c i f i e s   a   c o d e   f o r   t h e   s a l e s p e r s o n   o r   p u r c h a s e r . < / T o o l t i p T e x t > + 
+         < / T o o l t i p > + 
+         < T o o l t i p   c o l u m n = " S a l e s p e r s o n _ P u r c h a s e r _ _ N a m e "   E l e m e n t I d = " 1 1 9 5 8 7 9 8 7 3 " > + 
+             < T o o l t i p T e x t   l a n g = " e n - U S " > S p e c i f i e s   t h e   n a m e   o f   t h e   s a l e s p e r s o n   o r   p u r c h a s e r . < / T o o l t i p T e x t > + 
+         < / T o o l t i p > + 
+         < T o o l t i p   c o l u m n = " S u b t o t a l s _ S a l e s p e r s o n _ C o d e "   E l e m e n t I d = " 1 1 9 8 5 9 4 2 7 2 " > + 
+             < T o o l t i p T e x t   l a n g = " e n - U S " > S p e c i f i e s   a   c o d e   f o r   t h e   s a l e s p e r s o n   o r   p u r c h a s e r . < / T o o l t i p T e x t > + 
+         < / T o o l t i p > + 
+     < / T o o l t i p s > + 
+     < S a l e s p e r s o n _ P u r c h a s e r   E l e m e n t T y p e = " D a t a I t e m "   E l e m e n t I d = " 7 1 5 0 0 7 1 9 8 " > + 
+         < A d j P r o f i t   E l e m e n t T y p e = " C o l u m n "   E l e m e n t I d = " 6 6 6 3 9 3 8 5 2 "   D a t a T y p e = " D e c i m a l "   O b s o l e t e S t a t e = " P e n d i n g " > A d j P r o f i t < / A d j P r o f i t > + 
+         < A d j P r o f i t C o m m i s s i o n A m t   E l e m e n t T y p e = " C o l u m n "   E l e m e n t I d = " 1 5 8 1 4 8 8 5 9 9 "   D a t a T y p e = " D e c i m a l "   O b s o l e t e S t a t e = " P e n d i n g " > A d j P r o f i t C o m m i s s i o n A m t < / A d j P r o f i t C o m m i s s i o n A m t > + 
+         < A d j P r o f i t C o m m i s s i o n A m t _ C o n t r o l 4 5 C a p t i o n   E l e m e n t T y p e = " C o l u m n "   E l e m e n t I d = " 6 2 1 2 7 7 8 5 4 "   D a t a T y p e = " L a b e l "   O b s o l e t e S t a t e = " P e n d i n g " > A d j P r o f i t C o m m i s s i o n A m t _ C o n t r o l 4 5 C a p t i o n < / A d j P r o f i t C o m m i s s i o n A m t _ C o n t r o l 4 5 C a p t i o n > + 
+         < A d j P r o f i t _ C o n t r o l 3 9 C a p t i o n   E l e m e n t T y p e = " C o l u m n "   E l e m e n t I d = " 2 1 3 3 9 8 4 3 2 "   D a t a T y p e = " L a b e l "   O b s o l e t e S t a t e = " P e n d i n g " > A d j P r o f i t _ C o n t r o l 3 9 C a p t i o n < / A d j P r o f i t _ C o n t r o l 3 9 C a p t i o n > + 
+         < A l l _ a m o u n t s _ a r e _ i n _ L C Y C a p t i o n   E l e m e n t T y p e = " C o l u m n "   E l e m e n t I d = " 6 9 7 4 8 4 8 0 2 "   D a t a T y p e = " L a b e l "   O b s o l e t e S t a t e = " P e n d i n g " > A l l _ a m o u n t s _ a r e _ i n _ L C Y C a p t i o n < / A l l _ a m o u n t s _ a r e _ i n _ L C Y C a p t i o n > + 
+         < C O M P A N Y N A M E   E l e m e n t T y p e = " C o l u m n "   E l e m e n t I d = " 1 7 5 3 0 1 5 1 5 5 "   D a t a T y p e = " S t r i n g "   O b s o l e t e S t a t e = " P e n d i n g " > C O M P A N Y N A M E < / C O M P A N Y N A M E > + 
+         < C u r r R e p o r t _ P A G E N O C a p t i o n   E l e m e n t T y p e = " C o l u m n "   E l e m e n t I d = " 1 8 4 6 2 6 2 1 5 8 "   D a t a T y p e = " L a b e l "   O b s o l e t e S t a t e = " P e n d i n g " > C u r r R e p o r t _ P A G E N O C a p t i o n < / C u r r R e p o r t _ P A G E N O C a p t i o n > + 
+         < C u s t L e d g E n t r y F i l t e r   E l e m e n t T y p e = " C o l u m n "   E l e m e n t I d = " 1 1 7 3 5 3 2 6 6 6 "   D a t a T y p e = " T e x t "   O b s o l e t e S t a t e = " P e n d i n g " > C u s t L e d g E n t r y F i l t e r < / C u s t L e d g E n t r y F i l t e r > + 
+         < C u s t _ _ L e d g e r _ E n t r y _ _ C u s t o m e r _ N o _ _ C a p t i o n   E l e m e n t T y p e = " C o l u m n "   E l e m e n t I d = " 1 2 2 3 8 5 6 2 7 8 "   D a t a T y p e = " S t r i n g "   O b s o l e t e S t a t e = " P e n d i n g " > C u s t _ _ L e d g e r _ E n t r y _ _ C u s t o m e r _ N o _ _ C a p t i o n < / C u s t _ _ L e d g e r _ E n t r y _ _ C u s t o m e r _ N o _ _ C a p t i o n > + 
+         < C u s t _ _ L e d g e r _ E n t r y _ _ D o c u m e n t _ N o _ _ C a p t i o n   E l e m e n t T y p e = " C o l u m n "   E l e m e n t I d = " 4 8 8 8 0 6 5 1 7 "   D a t a T y p e = " S t r i n g "   O b s o l e t e S t a t e = " P e n d i n g " > C u s t _ _ L e d g e r _ E n t r y _ _ D o c u m e n t _ N o _ _ C a p t i o n < / C u s t _ _ L e d g e r _ E n t r y _ _ D o c u m e n t _ N o _ _ C a p t i o n > + 
+         < C u s t _ _ L e d g e r _ E n t r y _ _ P o s t i n g _ D a t e _ C a p t i o n   E l e m e n t T y p e = " C o l u m n "   E l e m e n t I d = " 2 0 7 9 4 3 8 7 1 2 "   D a t a T y p e = " L a b e l "   O b s o l e t e S t a t e = " P e n d i n g " > C u s t _ _ L e d g e r _ E n t r y _ _ P o s t i n g _ D a t e _ C a p t i o n < / C u s t _ _ L e d g e r _ E n t r y _ _ P o s t i n g _ D a t e _ C a p t i o n > + 
+         < C u s t _ _ L e d g e r _ E n t r y _ _ P r o f i t _ _ L C Y _ _ C a p t i o n   E l e m e n t T y p e = " C o l u m n "   E l e m e n t I d = " 1 9 9 4 3 8 8 4 7 6 "   D a t a T y p e = " S t r i n g "   O b s o l e t e S t a t e = " P e n d i n g " > C u s t _ _ L e d g e r _ E n t r y _ _ P r o f i t _ _ L C Y _ _ C a p t i o n < / C u s t _ _ L e d g e r _ E n t r y _ _ P r o f i t _ _ L C Y _ _ C a p t i o n > + 
+         < C u s t _ _ L e d g e r _ E n t r y _ _ S a l e s _ _ L C Y _ _ C a p t i o n   E l e m e n t T y p e = " C o l u m n "   E l e m e n t I d = " 1 0 5 6 9 2 6 5 4 6 "   D a t a T y p e = " S t r i n g "   O b s o l e t e S t a t e = " P e n d i n g " > C u s t _ _ L e d g e r _ E n t r y _ _ S a l e s _ _ L C Y _ _ C a p t i o n < / C u s t _ _ L e d g e r _ E n t r y _ _ S a l e s _ _ L C Y _ _ C a p t i o n > + 
+         < C u s t _ _ L e d g e r _ E n t r y _ _ T A B L E C A P T I O N _ _ _ _ _ _ _ _ _ _ C u s t L e d g E n t r y F i l t e r   E l e m e n t T y p e = " C o l u m n "   E l e m e n t I d = " 7 1 0 6 3 3 9 1 7 "   D a t a T y p e = " T e x t " > C u s t _ _ L e d g e r _ E n t r y _ _ T A B L E C A P T I O N _ _ _ _ _ _ _ _ _ _ C u s t L e d g E n t r y F i l t e r < / C u s t _ _ L e d g e r _ E n t r y _ _ T A B L E C A P T I O N _ _ _ _ _ _ _ _ _ _ C u s t L e d g E n t r y F i l t e r > + 
+         < C u s t _ _ L e d g e r _ E n t r y _ _ _ P r o f i t _ _ L C Y _ _   E l e m e n t T y p e = " C o l u m n "   E l e m e n t I d = " 1 6 1 5 1 3 7 4 4 3 "   D a t a T y p e = " D e c i m a l "   O b s o l e t e S t a t e = " P e n d i n g " > C u s t _ _ L e d g e r _ E n t r y _ _ _ P r o f i t _ _ L C Y _ _ < / C u s t _ _ L e d g e r _ E n t r y _ _ _ P r o f i t _ _ L C Y _ _ > + 
+         < C u s t _ _ L e d g e r _ E n t r y _ _ _ S a l e s _ _ L C Y _ _   E l e m e n t T y p e = " C o l u m n "   E l e m e n t I d = " 3 4 8 7 9 4 9 4 9 "   D a t a T y p e = " D e c i m a l "   O b s o l e t e S t a t e = " P e n d i n g " > C u s t _ _ L e d g e r _ E n t r y _ _ _ S a l e s _ _ L C Y _ _ < / C u s t _ _ L e d g e r _ E n t r y _ _ _ S a l e s _ _ L C Y _ _ > + 
+         < P a g e G r o u p N o   E l e m e n t T y p e = " C o l u m n "   E l e m e n t I d = " 6 4 9 1 8 0 1 4 4 "   D a t a T y p e = " I n t e g e r "   O b s o l e t e S t a t e = " P e n d i n g " > P a g e G r o u p N o < / P a g e G r o u p N o > + 
+         < P r o f i t C o m m i s s i o n A m t   E l e m e n t T y p e = " C o l u m n "   E l e m e n t I d = " 4 1 6 2 2 4 2 0 6 "   D a t a T y p e = " D e c i m a l "   O b s o l e t e S t a t e = " P e n d i n g " > P r o f i t C o m m i s s i o n A m t < / P r o f i t C o m m i s s i o n A m t > + 
+         < P r o f i t C o m m i s s i o n A m t _ C o n t r o l 3 3 C a p t i o n   E l e m e n t T y p e = " C o l u m n "   E l e m e n t I d = " 4 6 5 8 1 2 5 3 6 "   D a t a T y p e = " L a b e l "   O b s o l e t e S t a t e = " P e n d i n g " > P r o f i t C o m m i s s i o n A m t _ C o n t r o l 3 3 C a p t i o n < / P r o f i t C o m m i s s i o n A m t _ C o n t r o l 3 3 C a p t i o n > + 
+         < S a l e s C o m m i s s i o n A m t   E l e m e n t T y p e = " C o l u m n "   E l e m e n t I d = " 1 6 5 6 6 7 5 0 1 6 "   D a t a T y p e = " D e c i m a l "   O b s o l e t e S t a t e = " P e n d i n g " > S a l e s C o m m i s s i o n A m t < / S a l e s C o m m i s s i o n A m t > + 
+         < S a l e s C o m m i s s i o n A m t _ C o n t r o l 3 2 C a p t i o n   E l e m e n t T y p e = " C o l u m n "   E l e m e n t I d = " 1 2 7 2 6 4 2 0 6 5 "   D a t a T y p e = " L a b e l "   O b s o l e t e S t a t e = " P e n d i n g " > S a l e s C o m m i s s i o n A m t _ C o n t r o l 3 2 C a p t i o n < / S a l e s C o m m i s s i o n A m t _ C o n t r o l 3 2 C a p t i o n > + 
+         < S a l e s p e r s o n F i l t e r   E l e m e n t T y p e = " C o l u m n "   E l e m e n t I d = " 1 2 4 2 2 8 3 2 5 6 "   D a t a T y p e = " T e x t "   O b s o l e t e S t a t e = " P e n d i n g " > S a l e s p e r s o n F i l t e r < / S a l e s p e r s o n F i l t e r > + 
+         < S a l e s p e r s o n _ P u r c h a s e r _ C o d e   E l e m e n t T y p e = " C o l u m n "   E l e m e n t I d = " 1 3 8 8 0 3 1 6 5 2 "   D a t a T y p e = " C o d e " > S a l e s p e r s o n _ P u r c h a s e r _ C o d e < / S a l e s p e r s o n _ P u r c h a s e r _ C o d e > + 
+         < S a l e s p e r s o n _ P u r c h a s e r _ N a m e   E l e m e n t T y p e = " C o l u m n "   E l e m e n t I d = " 1 3 4 8 2 2 8 4 6 2 "   D a t a T y p e = " T e x t " > S a l e s p e r s o n _ P u r c h a s e r _ N a m e < / S a l e s p e r s o n _ P u r c h a s e r _ N a m e > + 
+         < S a l e s p e r s o n _ P u r c h a s e r _ _ C o m m i s s i o n _ _ _   E l e m e n t T y p e = " C o l u m n "   E l e m e n t I d = " 1 5 9 0 6 8 9 0 0 4 "   D a t a T y p e = " D e c i m a l " > S a l e s p e r s o n _ P u r c h a s e r _ _ C o m m i s s i o n _ _ _ < / S a l e s p e r s o n _ P u r c h a s e r _ _ C o m m i s s i o n _ _ _ > + 
+         < S a l e s p e r s o n _ P u r c h a s e r _ _ C o m m i s s i o n _ _ _ C a p t i o n   E l e m e n t T y p e = " C o l u m n "   E l e m e n t I d = " 4 9 9 4 6 3 1 7 0 "   D a t a T y p e = " S t r i n g "   O b s o l e t e S t a t e = " P e n d i n g " > S a l e s p e r s o n _ P u r c h a s e r _ _ C o m m i s s i o n _ _ _ C a p t i o n < / S a l e s p e r s o n _ P u r c h a s e r _ _ C o m m i s s i o n _ _ _ C a p t i o n > + 
+         < S a l e s p e r s o n _ P u r c h a s e r _ _ T A B L E C A P T I O N _ _ _ _ _ _ _ _ _ _ S a l e s p e r s o n F i l t e r   E l e m e n t T y p e = " C o l u m n "   E l e m e n t I d = " 1 0 1 6 0 4 1 6 9 9 "   D a t a T y p e = " T e x t " > S a l e s p e r s o n _ P u r c h a s e r _ _ T A B L E C A P T I O N _ _ _ _ _ _ _ _ _ _ S a l e s p e r s o n F i l t e r < / S a l e s p e r s o n _ P u r c h a s e r _ _ T A B L E C A P T I O N _ _ _ _ _ _ _ _ _ _ S a l e s p e r s o n F i l t e r > + 
+         < S a l e s p e r s o n _ _ _ C o m m i s s i o n C a p t i o n   E l e m e n t T y p e = " C o l u m n "   E l e m e n t I d = " 1 7 6 9 4 7 1 9 4 8 "   D a t a T y p e = " L a b e l "   O b s o l e t e S t a t e = " P e n d i n g " > S a l e s p e r s o n _ _ _ C o m m i s s i o n C a p t i o n < / S a l e s p e r s o n _ _ _ C o m m i s s i o n C a p t i o n > + 
+         < S T R S U B S T N O _ T e x t 0 0 0 _ P e r i o d T e x t _   E l e m e n t T y p e = " C o l u m n "   E l e m e n t I d = " 7 2 2 9 9 1 7 0 4 "   D a t a T y p e = " S t r i n g " > S T R S U B S T N O _ T e x t 0 0 0 _ P e r i o d T e x t _ < / S T R S U B S T N O _ T e x t 0 0 0 _ P e r i o d T e x t _ > + 
+         < T o t a l C a p t i o n   E l e m e n t T y p e = " C o l u m n "   E l e m e n t I d = " 7 0 7 1 0 2 6 9 5 "   D a t a T y p e = " L a b e l "   O b s o l e t e S t a t e = " P e n d i n g " > T o t a l C a p t i o n < / T o t a l C a p t i o n > + 
+         < C u s t _ L e d g e r _ E n t r y   E l e m e n t T y p e = " D a t a I t e m "   E l e m e n t I d = " 1 6 3 9 1 4 6 4 4 5 " > + 
+             < A d j P r o f i t C o m m i s s i o n A m t _ C o n t r o l 4 5   E l e m e n t T y p e = " C o l u m n "   E l e m e n t I d = " 8 0 5 8 9 6 4 0 0 "   D a t a T y p e = " D e c i m a l " > A d j P r o f i t C o m m i s s i o n A m t _ C o n t r o l 4 5 < / A d j P r o f i t C o m m i s s i o n A m t _ C o n t r o l 4 5 > + 
+             < A d j P r o f i t _ C o n t r o l 3 9   E l e m e n t T y p e = " C o l u m n "   E l e m e n t I d = " 2 0 2 4 1 9 6 5 4 2 "   D a t a T y p e = " D e c i m a l " > A d j P r o f i t _ C o n t r o l 3 9 < / A d j P r o f i t _ C o n t r o l 3 9 > + 
+             < C u s t L e d g e r E n t r y _ C u s t o m e r N a m e   E l e m e n t T y p e = " C o l u m n "   E l e m e n t I d = " 2 0 9 1 8 9 3 2 7 9 "   D a t a T y p e = " T e x t " > C u s t L e d g e r E n t r y _ C u s t o m e r N a m e < / C u s t L e d g e r E n t r y _ C u s t o m e r N a m e > + 
+             < C u s t _ _ L e d g e r _ E n t r y _ _ C u s t o m e r _ N o _ _   E l e m e n t T y p e = " C o l u m n "   E l e m e n t I d = " 1 0 0 9 0 1 6 8 0 8 "   D a t a T y p e = " C o d e " > C u s t _ _ L e d g e r _ E n t r y _ _ C u s t o m e r _ N o _ _ < / C u s t _ _ L e d g e r _ E n t r y _ _ C u s t o m e r _ N o _ _ > + 
+             < C u s t _ _ L e d g e r _ E n t r y _ _ D o c u m e n t _ N o _ _   E l e m e n t T y p e = " C o l u m n "   E l e m e n t I d = " 8 5 2 6 1 1 1 8 1 "   D a t a T y p e = " C o d e " > C u s t _ _ L e d g e r _ E n t r y _ _ D o c u m e n t _ N o _ _ < / C u s t _ _ L e d g e r _ E n t r y _ _ D o c u m e n t _ N o _ _ > + 
+             < C u s t _ _ L e d g e r _ E n t r y _ _ P o s t i n g _ D a t e _   E l e m e n t T y p e = " C o l u m n "   E l e m e n t I d = " 2 1 4 2 6 5 7 1 6 2 "   D a t a T y p e = " S t r i n g " > C u s t _ _ L e d g e r _ E n t r y _ _ P o s t i n g _ D a t e _ < / C u s t _ _ L e d g e r _ E n t r y _ _ P o s t i n g _ D a t e _ > + 
+             < C u s t _ _ L e d g e r _ E n t r y _ _ P r o f i t _ _ L C Y _ _   E l e m e n t T y p e = " C o l u m n "   E l e m e n t I d = " 5 1 9 3 4 1 8 2 6 "   D a t a T y p e = " D e c i m a l " > C u s t _ _ L e d g e r _ E n t r y _ _ P r o f i t _ _ L C Y _ _ < / C u s t _ _ L e d g e r _ E n t r y _ _ P r o f i t _ _ L C Y _ _ > + 
+             < C u s t _ _ L e d g e r _ E n t r y _ _ S a l e s _ _ L C Y _ _   E l e m e n t T y p e = " C o l u m n "   E l e m e n t I d = " 8 1 9 5 1 7 4 8 "   D a t a T y p e = " D e c i m a l " > C u s t _ _ L e d g e r _ E n t r y _ _ S a l e s _ _ L C Y _ _ < / C u s t _ _ L e d g e r _ E n t r y _ _ S a l e s _ _ L C Y _ _ > + 
+             < P r o f i t C o m m i s s i o n A m t _ C o n t r o l 3 3   E l e m e n t T y p e = " C o l u m n "   E l e m e n t I d = " 3 1 2 1 8 6 8 2 6 "   D a t a T y p e = " D e c i m a l " > P r o f i t C o m m i s s i o n A m t _ C o n t r o l 3 3 < / P r o f i t C o m m i s s i o n A m t _ C o n t r o l 3 3 > + 
+             < S a l e s C o m m i s s i o n A m t _ C o n t r o l 3 2   E l e m e n t T y p e = " C o l u m n "   E l e m e n t I d = " 1 4 6 2 3 9 0 1 5 3 "   D a t a T y p e = " D e c i m a l " > S a l e s C o m m i s s i o n A m t _ C o n t r o l 3 2 < / S a l e s C o m m i s s i o n A m t _ C o n t r o l 3 2 > + 
+             < S a l e s p e r s o n P u r c h a s e r _ C o d e   E l e m e n t T y p e = " C o l u m n "   E l e m e n t I d = " 1 2 2 1 2 1 9 2 4 5 "   D a t a T y p e = " C o d e " > S a l e s p e r s o n P u r c h a s e r _ C o d e < / S a l e s p e r s o n P u r c h a s e r _ C o d e > + 
+             < S a l e s p e r s o n _ P u r c h a s e r _ _ N a m e   E l e m e n t T y p e = " C o l u m n "   E l e m e n t I d = " 1 1 9 5 8 7 9 8 7 3 "   D a t a T y p e = " T e x t " > S a l e s p e r s o n _ P u r c h a s e r _ _ N a m e < / S a l e s p e r s o n _ P u r c h a s e r _ _ N a m e >   
          < / C u s t _ L e d g e r _ E n t r y >   
-         < S u b t o t a l s > - 
-             < S u b t o t a l s _ A d j P r o f i t > S u b t o t a l s _ A d j P r o f i t < / S u b t o t a l s _ A d j P r o f i t > - 
-             < S u b t o t a l s _ A d j P r o f i t C o m m i s s i o n > S u b t o t a l s _ A d j P r o f i t C o m m i s s i o n < / S u b t o t a l s _ A d j P r o f i t C o m m i s s i o n > - 
-             < S u b t o t a l s _ P r o f i t > S u b t o t a l s _ P r o f i t < / S u b t o t a l s _ P r o f i t > - 
-             < S u b t o t a l s _ P r o f i t C o m m i s s i o n > S u b t o t a l s _ P r o f i t C o m m i s s i o n < / S u b t o t a l s _ P r o f i t C o m m i s s i o n > - 
-             < S u b t o t a l s _ S a l e s > S u b t o t a l s _ S a l e s < / S u b t o t a l s _ S a l e s > - 
-             < S u b t o t a l s _ S a l e s C o m m i s s i o n > S u b t o t a l s _ S a l e s C o m m i s s i o n < / S u b t o t a l s _ S a l e s C o m m i s s i o n > - 
-             < S u b t o t a l s _ S a l e s p e r s o n _ C o d e > S u b t o t a l s _ S a l e s p e r s o n _ C o d e < / S u b t o t a l s _ S a l e s p e r s o n _ C o d e > +         < S u b t o t a l s   E l e m e n t T y p e = " D a t a I t e m "   E l e m e n t I d = " 8 3 8 6 9 3 5 6 0 " > + 
+             < S u b t o t a l s _ A d j P r o f i t   E l e m e n t T y p e = " C o l u m n "   E l e m e n t I d = " 5 6 1 3 6 6 8 2 2 "   D a t a T y p e = " D e c i m a l " > S u b t o t a l s _ A d j P r o f i t < / S u b t o t a l s _ A d j P r o f i t > + 
+             < S u b t o t a l s _ A d j P r o f i t C o m m i s s i o n   E l e m e n t T y p e = " C o l u m n "   E l e m e n t I d = " 1 4 1 8 9 7 1 8 3 5 "   D a t a T y p e = " D e c i m a l " > S u b t o t a l s _ A d j P r o f i t C o m m i s s i o n < / S u b t o t a l s _ A d j P r o f i t C o m m i s s i o n > + 
+             < S u b t o t a l s _ P r o f i t   E l e m e n t T y p e = " C o l u m n "   E l e m e n t I d = " 2 4 1 5 0 0 6 9 7 "   D a t a T y p e = " D e c i m a l " > S u b t o t a l s _ P r o f i t < / S u b t o t a l s _ P r o f i t > + 
+             < S u b t o t a l s _ P r o f i t C o m m i s s i o n   E l e m e n t T y p e = " C o l u m n "   E l e m e n t I d = " 1 4 9 6 3 3 2 1 7 2 "   D a t a T y p e = " D e c i m a l " > S u b t o t a l s _ P r o f i t C o m m i s s i o n < / S u b t o t a l s _ P r o f i t C o m m i s s i o n > + 
+             < S u b t o t a l s _ S a l e s   E l e m e n t T y p e = " C o l u m n "   E l e m e n t I d = " 1 9 7 8 7 7 5 0 3 "   D a t a T y p e = " D e c i m a l " > S u b t o t a l s _ S a l e s < / S u b t o t a l s _ S a l e s > + 
+             < S u b t o t a l s _ S a l e s C o m m i s s i o n   E l e m e n t T y p e = " C o l u m n "   E l e m e n t I d = " 1 4 7 6 0 7 2 5 9 0 "   D a t a T y p e = " D e c i m a l " > S u b t o t a l s _ S a l e s C o m m i s s i o n < / S u b t o t a l s _ S a l e s C o m m i s s i o n > + 
+             < S u b t o t a l s _ S a l e s p e r s o n _ C o d e   E l e m e n t T y p e = " C o l u m n "   E l e m e n t I d = " 1 1 9 8 5 9 4 2 7 2 "   D a t a T y p e = " C o d e " > S u b t o t a l s _ S a l e s p e r s o n _ C o d e < / S u b t o t a l s _ S a l e s p e r s o n _ C o d e >   
          < / S u b t o t a l s >   
      < / S a l e s p e r s o n _ P u r c h a s e r >   
-     < T o t a l s > - 
-         < T o t a l s _ A d j P r o f i t > T o t a l s _ A d j P r o f i t < / T o t a l s _ A d j P r o f i t > - 
-         < T o t a l s _ A d j P r o f i t C o m m i s s i o n > T o t a l s _ A d j P r o f i t C o m m i s s i o n < / T o t a l s _ A d j P r o f i t C o m m i s s i o n > - 
-         < T o t a l s _ P r o f i t > T o t a l s _ P r o f i t < / T o t a l s _ P r o f i t > - 
-         < T o t a l s _ P r o f i t C o m m i s s i o n > T o t a l s _ P r o f i t C o m m i s s i o n < / T o t a l s _ P r o f i t C o m m i s s i o n > - 
-         < T o t a l s _ S a l e s > T o t a l s _ S a l e s < / T o t a l s _ S a l e s > - 
-         < T o t a l s _ S a l e s C o m m i s s i o n > T o t a l s _ S a l e s C o m m i s s i o n < / T o t a l s _ S a l e s C o m m i s s i o n > +     < T o t a l s   E l e m e n t T y p e = " D a t a I t e m "   E l e m e n t I d = " 1 8 2 3 9 5 0 0 4 4 " > + 
+         < T o t a l s _ A d j P r o f i t   E l e m e n t T y p e = " C o l u m n "   E l e m e n t I d = " 1 9 0 9 5 0 1 3 6 2 "   D a t a T y p e = " D e c i m a l " > T o t a l s _ A d j P r o f i t < / T o t a l s _ A d j P r o f i t > + 
+         < T o t a l s _ A d j P r o f i t C o m m i s s i o n   E l e m e n t T y p e = " C o l u m n "   E l e m e n t I d = " 9 4 6 1 0 3 7 5 9 "   D a t a T y p e = " D e c i m a l " > T o t a l s _ A d j P r o f i t C o m m i s s i o n < / T o t a l s _ A d j P r o f i t C o m m i s s i o n > + 
+         < T o t a l s _ P r o f i t   E l e m e n t T y p e = " C o l u m n "   E l e m e n t I d = " 6 4 6 2 9 5 2 1 9 "   D a t a T y p e = " D e c i m a l " > T o t a l s _ P r o f i t < / T o t a l s _ P r o f i t > + 
+         < T o t a l s _ P r o f i t C o m m i s s i o n   E l e m e n t T y p e = " C o l u m n "   E l e m e n t I d = " 3 6 7 7 9 1 3 9 2 "   D a t a T y p e = " D e c i m a l " > T o t a l s _ P r o f i t C o m m i s s i o n < / T o t a l s _ P r o f i t C o m m i s s i o n > + 
+         < T o t a l s _ S a l e s   E l e m e n t T y p e = " C o l u m n "   E l e m e n t I d = " 1 3 9 9 9 8 5 1 0 9 "   D a t a T y p e = " D e c i m a l " > T o t a l s _ S a l e s < / T o t a l s _ S a l e s > + 
+         < T o t a l s _ S a l e s C o m m i s s i o n   E l e m e n t T y p e = " C o l u m n "   E l e m e n t I d = " 4 6 4 8 2 3 3 9 8 "   D a t a T y p e = " D e c i m a l " > T o t a l s _ S a l e s C o m m i s s i o n < / T o t a l s _ S a l e s C o m m i s s i o n >   
      < / T o t a l s >   
@@ -4722,17 +4704,17 @@
 </file>
 
 <file path=customXml/itemProps1.xml><?xml version="1.0" encoding="utf-8"?>
-<ds:datastoreItem xmlns:ds="http://schemas.openxmlformats.org/officeDocument/2006/customXml" ds:itemID="{A0CC7945-5283-4905-A71D-472246249B67}">
+<ds:datastoreItem xmlns:ds="http://schemas.openxmlformats.org/officeDocument/2006/customXml" ds:itemID="{79D6D75F-D29A-40D3-A819-B215617F17D6}">
   <ds:schemaRefs>
-    <ds:schemaRef ds:uri="urn:microsoft-dynamics-businesscentral/internal/extended/reports/Salesperson_Commission/115/"/>
+    <ds:schemaRef ds:uri="urn:microsoft-dynamics-nav/reports/Salesperson_Commission/115/"/>
   </ds:schemaRefs>
 </ds:datastoreItem>
 </file>
 
 <file path=customXml/itemProps2.xml><?xml version="1.0" encoding="utf-8"?>
-<ds:datastoreItem xmlns:ds="http://schemas.openxmlformats.org/officeDocument/2006/customXml" ds:itemID="{79D6D75F-D29A-40D3-A819-B215617F17D6}">
+<ds:datastoreItem xmlns:ds="http://schemas.openxmlformats.org/officeDocument/2006/customXml" ds:itemID="{A0CC7945-5283-4905-A71D-472246249B67}">
   <ds:schemaRefs>
-    <ds:schemaRef ds:uri="urn:microsoft-dynamics-nav/reports/Salesperson_Commission/115/"/>
+    <ds:schemaRef ds:uri="urn:microsoft-dynamics-businesscentral/internal/extended/reports/Salesperson_Commission/115/"/>
   </ds:schemaRefs>
 </ds:datastoreItem>
 </file>

</xml_diff>

<commit_message>
Strip header/footer parts from the two body-only Word layouts
SalespersonCommissionBody.docx and SalespersonSalesStatisticsBody.docx
were registered with Subtype = Body but still carried full document
sections: header1-3.xml/footer1-3.xml parts, their six relationships
in word/_rels/document.xml.rels and [Content_Types].xml, and the
matching headerReference/footerReference elements in the section
properties. Those empty section references could override or
suppress the header/footer supplied by the composed report layout in
composite rendering.

Removes the six header/footer parts, their content-type overrides,
their relationships, and their sectPr references from both files,
matching the clean body-only structure CustomerOrderSummaryBody.docx
already has. No visible content changed — same paragraph text before
and after in both files.
</commit_message>
<xml_diff>
--- a/src/Layers/W1/BaseApp/Sales/Reports/SalespersonCommissionBody.docx
+++ b/src/Layers/W1/BaseApp/Sales/Reports/SalespersonCommissionBody.docx
@@ -1544,12 +1544,6 @@
     </w:tbl>
     <w:p/>
     <w:sectPr>
-      <w:headerReference w:type="even" r:id="rId8"/>
-      <w:headerReference w:type="default" r:id="rId9"/>
-      <w:footerReference w:type="even" r:id="rId10"/>
-      <w:footerReference w:type="default" r:id="rId11"/>
-      <w:headerReference w:type="first" r:id="rId12"/>
-      <w:footerReference w:type="first" r:id="rId13"/>
       <w:pgSz w:w="16838" w:h="11906" w:orient="landscape"/>
       <w:pgMar w:top="720" w:right="720" w:bottom="720" w:left="720" w:header="425" w:footer="708" w:gutter="0"/>
       <w:cols w:space="708"/>
@@ -1584,36 +1578,6 @@
 </w:endnotes>
 </file>
 
-<file path=word/footer1.xml><?xml version="1.0" encoding="utf-8"?>
-<w:ftr xmlns:wpc="http://schemas.microsoft.com/office/word/2010/wordprocessingCanvas" xmlns:cx="http://schemas.microsoft.com/office/drawing/2014/chartex" xmlns:cx1="http://schemas.microsoft.com/office/drawing/2015/9/8/chartex" xmlns:cx2="http://schemas.microsoft.com/office/drawing/2015/10/21/chartex" xmlns:cx3="http://schemas.microsoft.com/office/drawing/2016/5/9/chartex" xmlns:cx4="http://schemas.microsoft.com/office/drawing/2016/5/10/chartex" xmlns:cx5="http://schemas.microsoft.com/office/drawing/2016/5/11/chartex" xmlns:cx6="http://schemas.microsoft.com/office/drawing/2016/5/12/chartex" xmlns:cx7="http://schemas.microsoft.com/office/drawing/2016/5/13/chartex" xmlns:cx8="http://schemas.microsoft.com/office/drawing/2016/5/14/chartex" xmlns:mc="http://schemas.openxmlformats.org/markup-compatibility/2006" xmlns:aink="http://schemas.microsoft.com/office/drawing/2016/ink" xmlns:am3d="http://schemas.microsoft.com/office/drawing/2017/model3d" xmlns:o="urn:schemas-microsoft-com:office:office" xmlns:oel="http://schemas.microsoft.com/office/2019/extlst" xmlns:r="http://schemas.openxmlformats.org/officeDocument/2006/relationships" xmlns:m="http://schemas.openxmlformats.org/officeDocument/2006/math" xmlns:v="urn:schemas-microsoft-com:vml" xmlns:wp14="http://schemas.microsoft.com/office/word/2010/wordprocessingDrawing" xmlns:wp="http://schemas.openxmlformats.org/drawingml/2006/wordprocessingDrawing" xmlns:w10="urn:schemas-microsoft-com:office:word" xmlns:w="http://schemas.openxmlformats.org/wordprocessingml/2006/main" xmlns:w14="http://schemas.microsoft.com/office/word/2010/wordml" xmlns:w15="http://schemas.microsoft.com/office/word/2012/wordml" xmlns:w16cex="http://schemas.microsoft.com/office/word/2018/wordml/cex" xmlns:w16cid="http://schemas.microsoft.com/office/word/2016/wordml/cid" xmlns:w16="http://schemas.microsoft.com/office/word/2018/wordml" xmlns:w16du="http://schemas.microsoft.com/office/word/2023/wordml/word16du" xmlns:w16sdtdh="http://schemas.microsoft.com/office/word/2020/wordml/sdtdatahash" xmlns:w16sdtfl="http://schemas.microsoft.com/office/word/2024/wordml/sdtformatlock" xmlns:w16se="http://schemas.microsoft.com/office/word/2015/wordml/symex" xmlns:wpg="http://schemas.microsoft.com/office/word/2010/wordprocessingGroup" xmlns:wpi="http://schemas.microsoft.com/office/word/2010/wordprocessingInk" xmlns:wne="http://schemas.microsoft.com/office/word/2006/wordml" xmlns:wps="http://schemas.microsoft.com/office/word/2010/wordprocessingShape" mc:Ignorable="w14 w15 w16se w16cid w16 w16cex w16sdtdh w16sdtfl w16du wp14">
-  <w:p>
-    <w:pPr>
-      <w:pStyle w:val="Footer"/>
-    </w:pPr>
-  </w:p>
-</w:ftr>
-</file>
-
-<file path=word/footer2.xml><?xml version="1.0" encoding="utf-8"?>
-<w:ftr xmlns:wpc="http://schemas.microsoft.com/office/word/2010/wordprocessingCanvas" xmlns:cx="http://schemas.microsoft.com/office/drawing/2014/chartex" xmlns:cx1="http://schemas.microsoft.com/office/drawing/2015/9/8/chartex" xmlns:cx2="http://schemas.microsoft.com/office/drawing/2015/10/21/chartex" xmlns:cx3="http://schemas.microsoft.com/office/drawing/2016/5/9/chartex" xmlns:cx4="http://schemas.microsoft.com/office/drawing/2016/5/10/chartex" xmlns:cx5="http://schemas.microsoft.com/office/drawing/2016/5/11/chartex" xmlns:cx6="http://schemas.microsoft.com/office/drawing/2016/5/12/chartex" xmlns:cx7="http://schemas.microsoft.com/office/drawing/2016/5/13/chartex" xmlns:cx8="http://schemas.microsoft.com/office/drawing/2016/5/14/chartex" xmlns:mc="http://schemas.openxmlformats.org/markup-compatibility/2006" xmlns:aink="http://schemas.microsoft.com/office/drawing/2016/ink" xmlns:am3d="http://schemas.microsoft.com/office/drawing/2017/model3d" xmlns:o="urn:schemas-microsoft-com:office:office" xmlns:oel="http://schemas.microsoft.com/office/2019/extlst" xmlns:r="http://schemas.openxmlformats.org/officeDocument/2006/relationships" xmlns:m="http://schemas.openxmlformats.org/officeDocument/2006/math" xmlns:v="urn:schemas-microsoft-com:vml" xmlns:wp14="http://schemas.microsoft.com/office/word/2010/wordprocessingDrawing" xmlns:wp="http://schemas.openxmlformats.org/drawingml/2006/wordprocessingDrawing" xmlns:w10="urn:schemas-microsoft-com:office:word" xmlns:w="http://schemas.openxmlformats.org/wordprocessingml/2006/main" xmlns:w14="http://schemas.microsoft.com/office/word/2010/wordml" xmlns:w15="http://schemas.microsoft.com/office/word/2012/wordml" xmlns:w16cex="http://schemas.microsoft.com/office/word/2018/wordml/cex" xmlns:w16cid="http://schemas.microsoft.com/office/word/2016/wordml/cid" xmlns:w16="http://schemas.microsoft.com/office/word/2018/wordml" xmlns:w16du="http://schemas.microsoft.com/office/word/2023/wordml/word16du" xmlns:w16sdtdh="http://schemas.microsoft.com/office/word/2020/wordml/sdtdatahash" xmlns:w16sdtfl="http://schemas.microsoft.com/office/word/2024/wordml/sdtformatlock" xmlns:w16se="http://schemas.microsoft.com/office/word/2015/wordml/symex" xmlns:wpg="http://schemas.microsoft.com/office/word/2010/wordprocessingGroup" xmlns:wpi="http://schemas.microsoft.com/office/word/2010/wordprocessingInk" xmlns:wne="http://schemas.microsoft.com/office/word/2006/wordml" xmlns:wps="http://schemas.microsoft.com/office/word/2010/wordprocessingShape" mc:Ignorable="w14 w15 w16se w16cid w16 w16cex w16sdtdh w16sdtfl w16du wp14">
-  <w:p>
-    <w:pPr>
-      <w:pStyle w:val="Footer"/>
-    </w:pPr>
-  </w:p>
-</w:ftr>
-</file>
-
-<file path=word/footer3.xml><?xml version="1.0" encoding="utf-8"?>
-<w:ftr xmlns:wpc="http://schemas.microsoft.com/office/word/2010/wordprocessingCanvas" xmlns:cx="http://schemas.microsoft.com/office/drawing/2014/chartex" xmlns:cx1="http://schemas.microsoft.com/office/drawing/2015/9/8/chartex" xmlns:cx2="http://schemas.microsoft.com/office/drawing/2015/10/21/chartex" xmlns:cx3="http://schemas.microsoft.com/office/drawing/2016/5/9/chartex" xmlns:cx4="http://schemas.microsoft.com/office/drawing/2016/5/10/chartex" xmlns:cx5="http://schemas.microsoft.com/office/drawing/2016/5/11/chartex" xmlns:cx6="http://schemas.microsoft.com/office/drawing/2016/5/12/chartex" xmlns:cx7="http://schemas.microsoft.com/office/drawing/2016/5/13/chartex" xmlns:cx8="http://schemas.microsoft.com/office/drawing/2016/5/14/chartex" xmlns:mc="http://schemas.openxmlformats.org/markup-compatibility/2006" xmlns:aink="http://schemas.microsoft.com/office/drawing/2016/ink" xmlns:am3d="http://schemas.microsoft.com/office/drawing/2017/model3d" xmlns:o="urn:schemas-microsoft-com:office:office" xmlns:oel="http://schemas.microsoft.com/office/2019/extlst" xmlns:r="http://schemas.openxmlformats.org/officeDocument/2006/relationships" xmlns:m="http://schemas.openxmlformats.org/officeDocument/2006/math" xmlns:v="urn:schemas-microsoft-com:vml" xmlns:wp14="http://schemas.microsoft.com/office/word/2010/wordprocessingDrawing" xmlns:wp="http://schemas.openxmlformats.org/drawingml/2006/wordprocessingDrawing" xmlns:w10="urn:schemas-microsoft-com:office:word" xmlns:w="http://schemas.openxmlformats.org/wordprocessingml/2006/main" xmlns:w14="http://schemas.microsoft.com/office/word/2010/wordml" xmlns:w15="http://schemas.microsoft.com/office/word/2012/wordml" xmlns:w16cex="http://schemas.microsoft.com/office/word/2018/wordml/cex" xmlns:w16cid="http://schemas.microsoft.com/office/word/2016/wordml/cid" xmlns:w16="http://schemas.microsoft.com/office/word/2018/wordml" xmlns:w16du="http://schemas.microsoft.com/office/word/2023/wordml/word16du" xmlns:w16sdtdh="http://schemas.microsoft.com/office/word/2020/wordml/sdtdatahash" xmlns:w16sdtfl="http://schemas.microsoft.com/office/word/2024/wordml/sdtformatlock" xmlns:w16se="http://schemas.microsoft.com/office/word/2015/wordml/symex" xmlns:wpg="http://schemas.microsoft.com/office/word/2010/wordprocessingGroup" xmlns:wpi="http://schemas.microsoft.com/office/word/2010/wordprocessingInk" xmlns:wne="http://schemas.microsoft.com/office/word/2006/wordml" xmlns:wps="http://schemas.microsoft.com/office/word/2010/wordprocessingShape" mc:Ignorable="w14 w15 w16se w16cid w16 w16cex w16sdtdh w16sdtfl w16du wp14">
-  <w:p>
-    <w:pPr>
-      <w:pStyle w:val="Footer"/>
-    </w:pPr>
-  </w:p>
-</w:ftr>
-</file>
-
 <file path=word/footnotes.xml><?xml version="1.0" encoding="utf-8"?>
 <w:footnotes xmlns:wpc="http://schemas.microsoft.com/office/word/2010/wordprocessingCanvas" xmlns:cx="http://schemas.microsoft.com/office/drawing/2014/chartex" xmlns:cx1="http://schemas.microsoft.com/office/drawing/2015/9/8/chartex" xmlns:cx2="http://schemas.microsoft.com/office/drawing/2015/10/21/chartex" xmlns:cx3="http://schemas.microsoft.com/office/drawing/2016/5/9/chartex" xmlns:cx4="http://schemas.microsoft.com/office/drawing/2016/5/10/chartex" xmlns:cx5="http://schemas.microsoft.com/office/drawing/2016/5/11/chartex" xmlns:cx6="http://schemas.microsoft.com/office/drawing/2016/5/12/chartex" xmlns:cx7="http://schemas.microsoft.com/office/drawing/2016/5/13/chartex" xmlns:cx8="http://schemas.microsoft.com/office/drawing/2016/5/14/chartex" xmlns:mc="http://schemas.openxmlformats.org/markup-compatibility/2006" xmlns:aink="http://schemas.microsoft.com/office/drawing/2016/ink" xmlns:am3d="http://schemas.microsoft.com/office/drawing/2017/model3d" xmlns:o="urn:schemas-microsoft-com:office:office" xmlns:oel="http://schemas.microsoft.com/office/2019/extlst" xmlns:r="http://schemas.openxmlformats.org/officeDocument/2006/relationships" xmlns:m="http://schemas.openxmlformats.org/officeDocument/2006/math" xmlns:v="urn:schemas-microsoft-com:vml" xmlns:wp14="http://schemas.microsoft.com/office/word/2010/wordprocessingDrawing" xmlns:wp="http://schemas.openxmlformats.org/drawingml/2006/wordprocessingDrawing" xmlns:w10="urn:schemas-microsoft-com:office:word" xmlns:w="http://schemas.openxmlformats.org/wordprocessingml/2006/main" xmlns:w14="http://schemas.microsoft.com/office/word/2010/wordml" xmlns:w15="http://schemas.microsoft.com/office/word/2012/wordml" xmlns:w16cex="http://schemas.microsoft.com/office/word/2018/wordml/cex" xmlns:w16cid="http://schemas.microsoft.com/office/word/2016/wordml/cid" xmlns:w16="http://schemas.microsoft.com/office/word/2018/wordml" xmlns:w16du="http://schemas.microsoft.com/office/word/2023/wordml/word16du" xmlns:w16sdtdh="http://schemas.microsoft.com/office/word/2020/wordml/sdtdatahash" xmlns:w16sdtfl="http://schemas.microsoft.com/office/word/2024/wordml/sdtformatlock" xmlns:w16se="http://schemas.microsoft.com/office/word/2015/wordml/symex" xmlns:wpg="http://schemas.microsoft.com/office/word/2010/wordprocessingGroup" xmlns:wpi="http://schemas.microsoft.com/office/word/2010/wordprocessingInk" xmlns:wne="http://schemas.microsoft.com/office/word/2006/wordml" xmlns:wps="http://schemas.microsoft.com/office/word/2010/wordprocessingShape" mc:Ignorable="w14 w15 w16se w16cid w16 w16cex w16sdtdh w16sdtfl w16du wp14">
   <w:footnote w:type="separator" w:id="-1">
@@ -1637,36 +1601,6 @@
     </w:p>
   </w:footnote>
 </w:footnotes>
-</file>
-
-<file path=word/header1.xml><?xml version="1.0" encoding="utf-8"?>
-<w:hdr xmlns:wpc="http://schemas.microsoft.com/office/word/2010/wordprocessingCanvas" xmlns:cx="http://schemas.microsoft.com/office/drawing/2014/chartex" xmlns:cx1="http://schemas.microsoft.com/office/drawing/2015/9/8/chartex" xmlns:cx2="http://schemas.microsoft.com/office/drawing/2015/10/21/chartex" xmlns:cx3="http://schemas.microsoft.com/office/drawing/2016/5/9/chartex" xmlns:cx4="http://schemas.microsoft.com/office/drawing/2016/5/10/chartex" xmlns:cx5="http://schemas.microsoft.com/office/drawing/2016/5/11/chartex" xmlns:cx6="http://schemas.microsoft.com/office/drawing/2016/5/12/chartex" xmlns:cx7="http://schemas.microsoft.com/office/drawing/2016/5/13/chartex" xmlns:cx8="http://schemas.microsoft.com/office/drawing/2016/5/14/chartex" xmlns:mc="http://schemas.openxmlformats.org/markup-compatibility/2006" xmlns:aink="http://schemas.microsoft.com/office/drawing/2016/ink" xmlns:am3d="http://schemas.microsoft.com/office/drawing/2017/model3d" xmlns:o="urn:schemas-microsoft-com:office:office" xmlns:oel="http://schemas.microsoft.com/office/2019/extlst" xmlns:r="http://schemas.openxmlformats.org/officeDocument/2006/relationships" xmlns:m="http://schemas.openxmlformats.org/officeDocument/2006/math" xmlns:v="urn:schemas-microsoft-com:vml" xmlns:wp14="http://schemas.microsoft.com/office/word/2010/wordprocessingDrawing" xmlns:wp="http://schemas.openxmlformats.org/drawingml/2006/wordprocessingDrawing" xmlns:w10="urn:schemas-microsoft-com:office:word" xmlns:w="http://schemas.openxmlformats.org/wordprocessingml/2006/main" xmlns:w14="http://schemas.microsoft.com/office/word/2010/wordml" xmlns:w15="http://schemas.microsoft.com/office/word/2012/wordml" xmlns:w16cex="http://schemas.microsoft.com/office/word/2018/wordml/cex" xmlns:w16cid="http://schemas.microsoft.com/office/word/2016/wordml/cid" xmlns:w16="http://schemas.microsoft.com/office/word/2018/wordml" xmlns:w16du="http://schemas.microsoft.com/office/word/2023/wordml/word16du" xmlns:w16sdtdh="http://schemas.microsoft.com/office/word/2020/wordml/sdtdatahash" xmlns:w16sdtfl="http://schemas.microsoft.com/office/word/2024/wordml/sdtformatlock" xmlns:w16se="http://schemas.microsoft.com/office/word/2015/wordml/symex" xmlns:wpg="http://schemas.microsoft.com/office/word/2010/wordprocessingGroup" xmlns:wpi="http://schemas.microsoft.com/office/word/2010/wordprocessingInk" xmlns:wne="http://schemas.microsoft.com/office/word/2006/wordml" xmlns:wps="http://schemas.microsoft.com/office/word/2010/wordprocessingShape" mc:Ignorable="w14 w15 w16se w16cid w16 w16cex w16sdtdh w16sdtfl w16du wp14">
-  <w:p>
-    <w:pPr>
-      <w:pStyle w:val="Header"/>
-    </w:pPr>
-  </w:p>
-</w:hdr>
-</file>
-
-<file path=word/header2.xml><?xml version="1.0" encoding="utf-8"?>
-<w:hdr xmlns:wpc="http://schemas.microsoft.com/office/word/2010/wordprocessingCanvas" xmlns:cx="http://schemas.microsoft.com/office/drawing/2014/chartex" xmlns:cx1="http://schemas.microsoft.com/office/drawing/2015/9/8/chartex" xmlns:cx2="http://schemas.microsoft.com/office/drawing/2015/10/21/chartex" xmlns:cx3="http://schemas.microsoft.com/office/drawing/2016/5/9/chartex" xmlns:cx4="http://schemas.microsoft.com/office/drawing/2016/5/10/chartex" xmlns:cx5="http://schemas.microsoft.com/office/drawing/2016/5/11/chartex" xmlns:cx6="http://schemas.microsoft.com/office/drawing/2016/5/12/chartex" xmlns:cx7="http://schemas.microsoft.com/office/drawing/2016/5/13/chartex" xmlns:cx8="http://schemas.microsoft.com/office/drawing/2016/5/14/chartex" xmlns:mc="http://schemas.openxmlformats.org/markup-compatibility/2006" xmlns:aink="http://schemas.microsoft.com/office/drawing/2016/ink" xmlns:am3d="http://schemas.microsoft.com/office/drawing/2017/model3d" xmlns:o="urn:schemas-microsoft-com:office:office" xmlns:oel="http://schemas.microsoft.com/office/2019/extlst" xmlns:r="http://schemas.openxmlformats.org/officeDocument/2006/relationships" xmlns:m="http://schemas.openxmlformats.org/officeDocument/2006/math" xmlns:v="urn:schemas-microsoft-com:vml" xmlns:wp14="http://schemas.microsoft.com/office/word/2010/wordprocessingDrawing" xmlns:wp="http://schemas.openxmlformats.org/drawingml/2006/wordprocessingDrawing" xmlns:w10="urn:schemas-microsoft-com:office:word" xmlns:w="http://schemas.openxmlformats.org/wordprocessingml/2006/main" xmlns:w14="http://schemas.microsoft.com/office/word/2010/wordml" xmlns:w15="http://schemas.microsoft.com/office/word/2012/wordml" xmlns:w16cex="http://schemas.microsoft.com/office/word/2018/wordml/cex" xmlns:w16cid="http://schemas.microsoft.com/office/word/2016/wordml/cid" xmlns:w16="http://schemas.microsoft.com/office/word/2018/wordml" xmlns:w16du="http://schemas.microsoft.com/office/word/2023/wordml/word16du" xmlns:w16sdtdh="http://schemas.microsoft.com/office/word/2020/wordml/sdtdatahash" xmlns:w16sdtfl="http://schemas.microsoft.com/office/word/2024/wordml/sdtformatlock" xmlns:w16se="http://schemas.microsoft.com/office/word/2015/wordml/symex" xmlns:wpg="http://schemas.microsoft.com/office/word/2010/wordprocessingGroup" xmlns:wpi="http://schemas.microsoft.com/office/word/2010/wordprocessingInk" xmlns:wne="http://schemas.microsoft.com/office/word/2006/wordml" xmlns:wps="http://schemas.microsoft.com/office/word/2010/wordprocessingShape" mc:Ignorable="w14 w15 w16se w16cid w16 w16cex w16sdtdh w16sdtfl w16du wp14">
-  <w:p>
-    <w:pPr>
-      <w:pStyle w:val="Header"/>
-    </w:pPr>
-  </w:p>
-</w:hdr>
-</file>
-
-<file path=word/header3.xml><?xml version="1.0" encoding="utf-8"?>
-<w:hdr xmlns:wpc="http://schemas.microsoft.com/office/word/2010/wordprocessingCanvas" xmlns:cx="http://schemas.microsoft.com/office/drawing/2014/chartex" xmlns:cx1="http://schemas.microsoft.com/office/drawing/2015/9/8/chartex" xmlns:cx2="http://schemas.microsoft.com/office/drawing/2015/10/21/chartex" xmlns:cx3="http://schemas.microsoft.com/office/drawing/2016/5/9/chartex" xmlns:cx4="http://schemas.microsoft.com/office/drawing/2016/5/10/chartex" xmlns:cx5="http://schemas.microsoft.com/office/drawing/2016/5/11/chartex" xmlns:cx6="http://schemas.microsoft.com/office/drawing/2016/5/12/chartex" xmlns:cx7="http://schemas.microsoft.com/office/drawing/2016/5/13/chartex" xmlns:cx8="http://schemas.microsoft.com/office/drawing/2016/5/14/chartex" xmlns:mc="http://schemas.openxmlformats.org/markup-compatibility/2006" xmlns:aink="http://schemas.microsoft.com/office/drawing/2016/ink" xmlns:am3d="http://schemas.microsoft.com/office/drawing/2017/model3d" xmlns:o="urn:schemas-microsoft-com:office:office" xmlns:oel="http://schemas.microsoft.com/office/2019/extlst" xmlns:r="http://schemas.openxmlformats.org/officeDocument/2006/relationships" xmlns:m="http://schemas.openxmlformats.org/officeDocument/2006/math" xmlns:v="urn:schemas-microsoft-com:vml" xmlns:wp14="http://schemas.microsoft.com/office/word/2010/wordprocessingDrawing" xmlns:wp="http://schemas.openxmlformats.org/drawingml/2006/wordprocessingDrawing" xmlns:w10="urn:schemas-microsoft-com:office:word" xmlns:w="http://schemas.openxmlformats.org/wordprocessingml/2006/main" xmlns:w14="http://schemas.microsoft.com/office/word/2010/wordml" xmlns:w15="http://schemas.microsoft.com/office/word/2012/wordml" xmlns:w16cex="http://schemas.microsoft.com/office/word/2018/wordml/cex" xmlns:w16cid="http://schemas.microsoft.com/office/word/2016/wordml/cid" xmlns:w16="http://schemas.microsoft.com/office/word/2018/wordml" xmlns:w16du="http://schemas.microsoft.com/office/word/2023/wordml/word16du" xmlns:w16sdtdh="http://schemas.microsoft.com/office/word/2020/wordml/sdtdatahash" xmlns:w16sdtfl="http://schemas.microsoft.com/office/word/2024/wordml/sdtformatlock" xmlns:w16se="http://schemas.microsoft.com/office/word/2015/wordml/symex" xmlns:wpg="http://schemas.microsoft.com/office/word/2010/wordprocessingGroup" xmlns:wpi="http://schemas.microsoft.com/office/word/2010/wordprocessingInk" xmlns:wne="http://schemas.microsoft.com/office/word/2006/wordml" xmlns:wps="http://schemas.microsoft.com/office/word/2010/wordprocessingShape" mc:Ignorable="w14 w15 w16se w16cid w16 w16cex w16sdtdh w16sdtfl w16du wp14">
-  <w:p>
-    <w:pPr>
-      <w:pStyle w:val="Header"/>
-    </w:pPr>
-  </w:p>
-</w:hdr>
 </file>
 
 <file path=word/styles.xml><?xml version="1.0" encoding="utf-8"?>
@@ -3040,7 +2974,9 @@
     <w:rsid w:val="00E84E08"/>
     <w:rsid w:val="00EE3028"/>
     <w:rsid w:val="00EF2BBB"/>
+    <w:rsid w:val="00F00773"/>
     <w:rsid w:val="00F667D6"/>
+    <w:rsid w:val="00F71BC2"/>
     <w:rsid w:val="00F82C88"/>
     <w:rsid w:val="00FA5F85"/>
     <w:rsid w:val="00FD0E05"/>
@@ -3967,7 +3903,7 @@
 </we:webextension>
 </file>
 
-<file path=customXml/item1.xml>��< ? x m l   v e r s i o n = " 1 . 0 "   e n c o d i n g = " u t f - 1 6 " ? > < N a v W o r d R e p o r t X m l P a r t   x m l n s = " u r n : m i c r o s o f t - d y n a m i c s - n a v / r e p o r t s / S a l e s p e r s o n _ C o m m i s s i o n / 1 1 5 / " > +<file path=customXml/item1.xml>��< ? x m l   v e r s i o n = " 1 . 0 "   e n c o d i n g = " u t f - 1 6 " ? > < N a v W o r d R e p o r t X m l P a r t   x m l n s = " u r n : m i c r o s o f t - d y n a m i c s - b u s i n e s s c e n t r a l / i n t e r n a l / e x t e n d e d / r e p o r t s / S a l e s p e r s o n _ C o m m i s s i o n / 1 1 5 / " >   
      < B C R e p o r t I n f o r m a t i o n >   
@@ -4115,192 +4051,262 @@
  
      < L a b e l s >   
-         < A b o u t T h e R e p o r t L a b e l > A b o u t T h e R e p o r t L a b e l < / A b o u t T h e R e p o r t L a b e l > - 
-         < A d j u s t e d P r o f i t C o m m i s s i o n L a b e l > A d j u s t e d P r o f i t C o m m i s s i o n L a b e l < / A d j u s t e d P r o f i t C o m m i s s i o n L a b e l > - 
-         < A d j u s t e d P r o f i t L a b e l > A d j u s t e d P r o f i t L a b e l < / A d j u s t e d P r o f i t L a b e l > - 
-         < A l l A m o u n t s A r e I n L C Y L a b e l > A l l A m o u n t s A r e I n L C Y L a b e l < / A l l A m o u n t s A r e I n L C Y L a b e l > - 
-         < C o m m i s s i o n P e r c e n t L a b e l > C o m m i s s i o n P e r c e n t L a b e l < / C o m m i s s i o n P e r c e n t L a b e l > - 
-         < C o m p a n y L a b e l > C o m p a n y L a b e l < / C o m p a n y L a b e l > - 
-         < C u s t o m e r N a m e L a b e l > C u s t o m e r N a m e L a b e l < / C u s t o m e r N a m e L a b e l > - 
-         < C u s t o m e r N o L a b e l > C u s t o m e r N o L a b e l < / C u s t o m e r N o L a b e l > - 
-         < D a t a R e t r i e v e d > D a t a R e t r i e v e d < / D a t a R e t r i e v e d > - 
-         < D o c u m e n t a t i o n L a b e l > D o c u m e n t a t i o n L a b e l < / D o c u m e n t a t i o n L a b e l > - 
-         < D o c u m e n t N o L a b e l > D o c u m e n t N o L a b e l < / D o c u m e n t N o L a b e l > - 
-         < E n v i r o n m e n t L a b e l > E n v i r o n m e n t L a b e l < / E n v i r o n m e n t L a b e l > - 
-         < P e r i o d C a p t i o n > P e r i o d C a p t i o n < / P e r i o d C a p t i o n > - 
-         < P o s t i n g D a t e L a b e l > P o s t i n g D a t e L a b e l < / P o s t i n g D a t e L a b e l > - 
-         < P r o f i t C o m m i s s i o n L a b e l > P r o f i t C o m m i s s i o n L a b e l < / P r o f i t C o m m i s s i o n L a b e l > - 
-         < P r o f i t L a b e l > P r o f i t L a b e l < / P r o f i t L a b e l > - 
-         < R e p o r t N a m e L a b e l > R e p o r t N a m e L a b e l < / R e p o r t N a m e L a b e l > - 
-         < R u n O n L a b e l > R u n O n L a b e l < / R u n O n L a b e l > - 
-         < S a l e s C o m m i s s i o n L a b e l > S a l e s C o m m i s s i o n L a b e l < / S a l e s C o m m i s s i o n L a b e l > - 
-         < S a l e s L a b e l > S a l e s L a b e l < / S a l e s L a b e l > - 
-         < S a l e s p e r s o n _ P u r c h a s e r _ _ N a m e C a p t i o n > S a l e s p e r s o n _ P u r c h a s e r _ _ N a m e C a p t i o n < / S a l e s p e r s o n _ P u r c h a s e r _ _ N a m e C a p t i o n > - 
-         < S a l e s p e r s o n C o m m i s s i o n A n a l y s i s > S a l e s p e r s o n C o m m i s s i o n A n a l y s i s < / S a l e s p e r s o n C o m m i s s i o n A n a l y s i s > - 
-         < S a l e s p e r s o n C o m m i s s i o n L a b e l > S a l e s p e r s o n C o m m i s s i o n L a b e l < / S a l e s p e r s o n C o m m i s s i o n L a b e l > - 
-         < S a l e s p e r s o n C o m m i s s i o n P r i n t > S a l e s p e r s o n C o m m i s s i o n P r i n t < / S a l e s p e r s o n C o m m i s s i o n P r i n t > - 
-         < S a l e s p e r s o n P u r c h a s e r _ C o d e C a p t i o n > S a l e s p e r s o n P u r c h a s e r _ C o d e C a p t i o n < / S a l e s p e r s o n P u r c h a s e r _ C o d e C a p t i o n > - 
-         < T o t a l s C a p t i o n > T o t a l s C a p t i o n < / T o t a l s C a p t i o n > - 
-         < U s e r L a b e l > U s e r L a b e l < / U s e r L a b e l > +         < A b o u t T h e R e p o r t L a b e l   E l e m e n t T y p e = " P a r a m e t e r "   E l e m e n t I d = " 1 6 7 7 9 2 0 0 1 "   D a t a T y p e = " S t r i n g " > A b o u t T h e R e p o r t L a b e l < / A b o u t T h e R e p o r t L a b e l > + 
+         < A d j u s t e d P r o f i t C o m m i s s i o n L a b e l   E l e m e n t T y p e = " P a r a m e t e r "   E l e m e n t I d = " 9 1 5 5 5 7 0 2 0 "   D a t a T y p e = " S t r i n g " > A d j u s t e d P r o f i t C o m m i s s i o n L a b e l < / A d j u s t e d P r o f i t C o m m i s s i o n L a b e l > + 
+         < A d j u s t e d P r o f i t L a b e l   E l e m e n t T y p e = " P a r a m e t e r "   E l e m e n t I d = " 1 6 1 5 2 8 3 0 4 7 "   D a t a T y p e = " S t r i n g " > A d j u s t e d P r o f i t L a b e l < / A d j u s t e d P r o f i t L a b e l > + 
+         < A l l A m o u n t s A r e I n L C Y L a b e l   E l e m e n t T y p e = " P a r a m e t e r "   E l e m e n t I d = " 5 6 3 5 1 4 3 1 8 "   D a t a T y p e = " S t r i n g " > A l l A m o u n t s A r e I n L C Y L a b e l < / A l l A m o u n t s A r e I n L C Y L a b e l > + 
+         < C o m m i s s i o n P e r c e n t L a b e l   E l e m e n t T y p e = " P a r a m e t e r "   E l e m e n t I d = " 8 3 9 2 6 3 7 6 5 "   D a t a T y p e = " S t r i n g " > C o m m i s s i o n P e r c e n t L a b e l < / C o m m i s s i o n P e r c e n t L a b e l > + 
+         < C o m p a n y L a b e l   E l e m e n t T y p e = " P a r a m e t e r "   E l e m e n t I d = " 3 4 6 7 6 0 3 4 8 "   D a t a T y p e = " S t r i n g " > C o m p a n y L a b e l < / C o m p a n y L a b e l > + 
+         < C u s t o m e r N a m e L a b e l   E l e m e n t T y p e = " P a r a m e t e r "   E l e m e n t I d = " 1 1 1 8 7 9 0 8 8 "   D a t a T y p e = " S t r i n g " > C u s t o m e r N a m e L a b e l < / C u s t o m e r N a m e L a b e l > + 
+         < C u s t o m e r N o L a b e l   E l e m e n t T y p e = " P a r a m e t e r "   E l e m e n t I d = " 3 8 7 4 7 8 0 3 4 "   D a t a T y p e = " S t r i n g " > C u s t o m e r N o L a b e l < / C u s t o m e r N o L a b e l > + 
+         < D a t a R e t r i e v e d   E l e m e n t T y p e = " P a r a m e t e r "   E l e m e n t I d = " 2 9 1 9 1 1 8 0 7 "   D a t a T y p e = " S t r i n g " > D a t a R e t r i e v e d < / D a t a R e t r i e v e d > + 
+         < D o c u m e n t a t i o n L a b e l   E l e m e n t T y p e = " P a r a m e t e r "   E l e m e n t I d = " 1 7 3 8 9 2 4 8 1 5 "   D a t a T y p e = " S t r i n g " > D o c u m e n t a t i o n L a b e l < / D o c u m e n t a t i o n L a b e l > + 
+         < D o c u m e n t N o L a b e l   E l e m e n t T y p e = " P a r a m e t e r "   E l e m e n t I d = " 1 1 4 6 4 3 5 8 0 3 "   D a t a T y p e = " S t r i n g " > D o c u m e n t N o L a b e l < / D o c u m e n t N o L a b e l > + 
+         < E n v i r o n m e n t L a b e l   E l e m e n t T y p e = " P a r a m e t e r "   E l e m e n t I d = " 8 1 8 8 1 6 5 9 0 "   D a t a T y p e = " S t r i n g " > E n v i r o n m e n t L a b e l < / E n v i r o n m e n t L a b e l > + 
+         < P e r i o d C a p t i o n   E l e m e n t T y p e = " P a r a m e t e r "   E l e m e n t I d = " 1 4 7 8 2 5 3 4 2 2 "   D a t a T y p e = " S t r i n g " > P e r i o d C a p t i o n < / P e r i o d C a p t i o n > + 
+         < P o s t i n g D a t e L a b e l   E l e m e n t T y p e = " P a r a m e t e r "   E l e m e n t I d = " 1 7 7 5 7 9 4 2 4 9 "   D a t a T y p e = " S t r i n g " > P o s t i n g D a t e L a b e l < / P o s t i n g D a t e L a b e l > + 
+         < P r o f i t C o m m i s s i o n L a b e l   E l e m e n t T y p e = " P a r a m e t e r "   E l e m e n t I d = " 8 3 2 7 0 6 3 9 2 "   D a t a T y p e = " S t r i n g " > P r o f i t C o m m i s s i o n L a b e l < / P r o f i t C o m m i s s i o n L a b e l > + 
+         < P r o f i t L a b e l   E l e m e n t T y p e = " P a r a m e t e r "   E l e m e n t I d = " 2 5 4 6 3 3 6 4 5 "   D a t a T y p e = " S t r i n g " > P r o f i t L a b e l < / P r o f i t L a b e l > + 
+         < R e p o r t N a m e L a b e l   E l e m e n t T y p e = " P a r a m e t e r "   E l e m e n t I d = " 1 0 2 2 2 9 2 9 8 2 "   D a t a T y p e = " S t r i n g " > R e p o r t N a m e L a b e l < / R e p o r t N a m e L a b e l > + 
+         < R u n O n L a b e l   E l e m e n t T y p e = " P a r a m e t e r "   E l e m e n t I d = " 1 1 1 9 0 3 7 5 9 5 "   D a t a T y p e = " S t r i n g " > R u n O n L a b e l < / R u n O n L a b e l > + 
+         < S a l e s C o m m i s s i o n L a b e l   E l e m e n t T y p e = " P a r a m e t e r "   E l e m e n t I d = " 1 0 1 8 2 6 8 7 7 0 "   D a t a T y p e = " S t r i n g " > S a l e s C o m m i s s i o n L a b e l < / S a l e s C o m m i s s i o n L a b e l > + 
+         < S a l e s L a b e l   E l e m e n t T y p e = " P a r a m e t e r "   E l e m e n t I d = " 1 7 9 5 4 4 8 0 0 5 "   D a t a T y p e = " S t r i n g " > S a l e s L a b e l < / S a l e s L a b e l > + 
+         < S a l e s p e r s o n _ P u r c h a s e r _ _ N a m e C a p t i o n   E l e m e n t T y p e = " P a r a m e t e r "   E l e m e n t I d = " 1 1 9 5 8 7 9 8 7 3 "   D a t a T y p e = " S t r i n g " > S a l e s p e r s o n _ P u r c h a s e r _ _ N a m e C a p t i o n < / S a l e s p e r s o n _ P u r c h a s e r _ _ N a m e C a p t i o n > + 
+         < S a l e s p e r s o n C o m m i s s i o n A n a l y s i s   E l e m e n t T y p e = " P a r a m e t e r "   E l e m e n t I d = " 7 1 5 8 7 1 2 4 7 "   D a t a T y p e = " S t r i n g " > S a l e s p e r s o n C o m m i s s i o n A n a l y s i s < / S a l e s p e r s o n C o m m i s s i o n A n a l y s i s > + 
+         < S a l e s p e r s o n C o m m i s s i o n L a b e l   E l e m e n t T y p e = " P a r a m e t e r "   E l e m e n t I d = " 3 0 0 0 9 6 0 5 1 "   D a t a T y p e = " S t r i n g " > S a l e s p e r s o n C o m m i s s i o n L a b e l < / S a l e s p e r s o n C o m m i s s i o n L a b e l > + 
+         < S a l e s p e r s o n C o m m i s s i o n P r i n t   E l e m e n t T y p e = " P a r a m e t e r "   E l e m e n t I d = " 1 3 1 6 0 2 8 6 0 "   D a t a T y p e = " S t r i n g " > S a l e s p e r s o n C o m m i s s i o n P r i n t < / S a l e s p e r s o n C o m m i s s i o n P r i n t > + 
+         < S a l e s p e r s o n P u r c h a s e r _ C o d e C a p t i o n   E l e m e n t T y p e = " P a r a m e t e r "   E l e m e n t I d = " 1 2 2 1 2 1 9 2 4 5 "   D a t a T y p e = " S t r i n g " > S a l e s p e r s o n P u r c h a s e r _ C o d e C a p t i o n < / S a l e s p e r s o n P u r c h a s e r _ C o d e C a p t i o n > + 
+         < T o t a l s C a p t i o n   E l e m e n t T y p e = " P a r a m e t e r "   E l e m e n t I d = " 2 3 5 4 5 9 0 6 "   D a t a T y p e = " S t r i n g " > T o t a l s C a p t i o n < / T o t a l s C a p t i o n > + 
+         < U s e r L a b e l   E l e m e n t T y p e = " P a r a m e t e r "   E l e m e n t I d = " 8 4 8 8 1 6 7 9 4 "   D a t a T y p e = " S t r i n g " > U s e r L a b e l < / U s e r L a b e l >   
      < / L a b e l s >   
-     < S a l e s p e r s o n _ P u r c h a s e r > - 
-         < A d j P r o f i t > A d j P r o f i t < / A d j P r o f i t > - 
-         < A d j P r o f i t C o m m i s s i o n A m t > A d j P r o f i t C o m m i s s i o n A m t < / A d j P r o f i t C o m m i s s i o n A m t > - 
-         < A d j P r o f i t C o m m i s s i o n A m t _ C o n t r o l 4 5 C a p t i o n > A d j P r o f i t C o m m i s s i o n A m t _ C o n t r o l 4 5 C a p t i o n < / A d j P r o f i t C o m m i s s i o n A m t _ C o n t r o l 4 5 C a p t i o n > - 
-         < A d j P r o f i t _ C o n t r o l 3 9 C a p t i o n > A d j P r o f i t _ C o n t r o l 3 9 C a p t i o n < / A d j P r o f i t _ C o n t r o l 3 9 C a p t i o n > - 
-         < A l l _ a m o u n t s _ a r e _ i n _ L C Y C a p t i o n > A l l _ a m o u n t s _ a r e _ i n _ L C Y C a p t i o n < / A l l _ a m o u n t s _ a r e _ i n _ L C Y C a p t i o n > - 
-         < C O M P A N Y N A M E > C O M P A N Y N A M E < / C O M P A N Y N A M E > - 
-         < C u r r R e p o r t _ P A G E N O C a p t i o n > C u r r R e p o r t _ P A G E N O C a p t i o n < / C u r r R e p o r t _ P A G E N O C a p t i o n > - 
-         < C u s t L e d g E n t r y F i l t e r > C u s t L e d g E n t r y F i l t e r < / C u s t L e d g E n t r y F i l t e r > - 
-         < C u s t _ _ L e d g e r _ E n t r y _ _ C u s t o m e r _ N o _ _ C a p t i o n > C u s t _ _ L e d g e r _ E n t r y _ _ C u s t o m e r _ N o _ _ C a p t i o n < / C u s t _ _ L e d g e r _ E n t r y _ _ C u s t o m e r _ N o _ _ C a p t i o n > - 
-         < C u s t _ _ L e d g e r _ E n t r y _ _ D o c u m e n t _ N o _ _ C a p t i o n > C u s t _ _ L e d g e r _ E n t r y _ _ D o c u m e n t _ N o _ _ C a p t i o n < / C u s t _ _ L e d g e r _ E n t r y _ _ D o c u m e n t _ N o _ _ C a p t i o n > - 
-         < C u s t _ _ L e d g e r _ E n t r y _ _ P o s t i n g _ D a t e _ C a p t i o n > C u s t _ _ L e d g e r _ E n t r y _ _ P o s t i n g _ D a t e _ C a p t i o n < / C u s t _ _ L e d g e r _ E n t r y _ _ P o s t i n g _ D a t e _ C a p t i o n > - 
-         < C u s t _ _ L e d g e r _ E n t r y _ _ P r o f i t _ _ L C Y _ _ C a p t i o n > C u s t _ _ L e d g e r _ E n t r y _ _ P r o f i t _ _ L C Y _ _ C a p t i o n < / C u s t _ _ L e d g e r _ E n t r y _ _ P r o f i t _ _ L C Y _ _ C a p t i o n > - 
-         < C u s t _ _ L e d g e r _ E n t r y _ _ S a l e s _ _ L C Y _ _ C a p t i o n > C u s t _ _ L e d g e r _ E n t r y _ _ S a l e s _ _ L C Y _ _ C a p t i o n < / C u s t _ _ L e d g e r _ E n t r y _ _ S a l e s _ _ L C Y _ _ C a p t i o n > - 
-         < C u s t _ _ L e d g e r _ E n t r y _ _ T A B L E C A P T I O N _ _ _ _ _ _ _ _ _ _ C u s t L e d g E n t r y F i l t e r > C u s t _ _ L e d g e r _ E n t r y _ _ T A B L E C A P T I O N _ _ _ _ _ _ _ _ _ _ C u s t L e d g E n t r y F i l t e r < / C u s t _ _ L e d g e r _ E n t r y _ _ T A B L E C A P T I O N _ _ _ _ _ _ _ _ _ _ C u s t L e d g E n t r y F i l t e r > - 
-         < C u s t _ _ L e d g e r _ E n t r y _ _ _ P r o f i t _ _ L C Y _ _ > C u s t _ _ L e d g e r _ E n t r y _ _ _ P r o f i t _ _ L C Y _ _ < / C u s t _ _ L e d g e r _ E n t r y _ _ _ P r o f i t _ _ L C Y _ _ > - 
-         < C u s t _ _ L e d g e r _ E n t r y _ _ _ S a l e s _ _ L C Y _ _ > C u s t _ _ L e d g e r _ E n t r y _ _ _ S a l e s _ _ L C Y _ _ < / C u s t _ _ L e d g e r _ E n t r y _ _ _ S a l e s _ _ L C Y _ _ > - 
-         < P a g e G r o u p N o > P a g e G r o u p N o < / P a g e G r o u p N o > - 
-         < P r o f i t C o m m i s s i o n A m t > P r o f i t C o m m i s s i o n A m t < / P r o f i t C o m m i s s i o n A m t > - 
-         < P r o f i t C o m m i s s i o n A m t _ C o n t r o l 3 3 C a p t i o n > P r o f i t C o m m i s s i o n A m t _ C o n t r o l 3 3 C a p t i o n < / P r o f i t C o m m i s s i o n A m t _ C o n t r o l 3 3 C a p t i o n > - 
-         < S a l e s C o m m i s s i o n A m t > S a l e s C o m m i s s i o n A m t < / S a l e s C o m m i s s i o n A m t > - 
-         < S a l e s C o m m i s s i o n A m t _ C o n t r o l 3 2 C a p t i o n > S a l e s C o m m i s s i o n A m t _ C o n t r o l 3 2 C a p t i o n < / S a l e s C o m m i s s i o n A m t _ C o n t r o l 3 2 C a p t i o n > - 
-         < S a l e s p e r s o n F i l t e r > S a l e s p e r s o n F i l t e r < / S a l e s p e r s o n F i l t e r > - 
-         < S a l e s p e r s o n _ P u r c h a s e r _ C o d e > S a l e s p e r s o n _ P u r c h a s e r _ C o d e < / S a l e s p e r s o n _ P u r c h a s e r _ C o d e > - 
-         < S a l e s p e r s o n _ P u r c h a s e r _ N a m e > S a l e s p e r s o n _ P u r c h a s e r _ N a m e < / S a l e s p e r s o n _ P u r c h a s e r _ N a m e > - 
-         < S a l e s p e r s o n _ P u r c h a s e r _ _ C o m m i s s i o n _ _ _ > S a l e s p e r s o n _ P u r c h a s e r _ _ C o m m i s s i o n _ _ _ < / S a l e s p e r s o n _ P u r c h a s e r _ _ C o m m i s s i o n _ _ _ > - 
-         < S a l e s p e r s o n _ P u r c h a s e r _ _ C o m m i s s i o n _ _ _ C a p t i o n > S a l e s p e r s o n _ P u r c h a s e r _ _ C o m m i s s i o n _ _ _ C a p t i o n < / S a l e s p e r s o n _ P u r c h a s e r _ _ C o m m i s s i o n _ _ _ C a p t i o n > - 
-         < S a l e s p e r s o n _ P u r c h a s e r _ _ T A B L E C A P T I O N _ _ _ _ _ _ _ _ _ _ S a l e s p e r s o n F i l t e r > S a l e s p e r s o n _ P u r c h a s e r _ _ T A B L E C A P T I O N _ _ _ _ _ _ _ _ _ _ S a l e s p e r s o n F i l t e r < / S a l e s p e r s o n _ P u r c h a s e r _ _ T A B L E C A P T I O N _ _ _ _ _ _ _ _ _ _ S a l e s p e r s o n F i l t e r > - 
-         < S a l e s p e r s o n _ _ _ C o m m i s s i o n C a p t i o n > S a l e s p e r s o n _ _ _ C o m m i s s i o n C a p t i o n < / S a l e s p e r s o n _ _ _ C o m m i s s i o n C a p t i o n > - 
-         < S T R S U B S T N O _ T e x t 0 0 0 _ P e r i o d T e x t _ > S T R S U B S T N O _ T e x t 0 0 0 _ P e r i o d T e x t _ < / S T R S U B S T N O _ T e x t 0 0 0 _ P e r i o d T e x t _ > - 
-         < T o t a l C a p t i o n > T o t a l C a p t i o n < / T o t a l C a p t i o n > - 
-         < C u s t _ L e d g e r _ E n t r y > - 
-             < A d j P r o f i t C o m m i s s i o n A m t _ C o n t r o l 4 5 > A d j P r o f i t C o m m i s s i o n A m t _ C o n t r o l 4 5 < / A d j P r o f i t C o m m i s s i o n A m t _ C o n t r o l 4 5 > - 
-             < A d j P r o f i t _ C o n t r o l 3 9 > A d j P r o f i t _ C o n t r o l 3 9 < / A d j P r o f i t _ C o n t r o l 3 9 > - 
-             < C u s t L e d g e r E n t r y _ C u s t o m e r N a m e > C u s t L e d g e r E n t r y _ C u s t o m e r N a m e < / C u s t L e d g e r E n t r y _ C u s t o m e r N a m e > - 
-             < C u s t _ _ L e d g e r _ E n t r y _ _ C u s t o m e r _ N o _ _ > C u s t _ _ L e d g e r _ E n t r y _ _ C u s t o m e r _ N o _ _ < / C u s t _ _ L e d g e r _ E n t r y _ _ C u s t o m e r _ N o _ _ > - 
-             < C u s t _ _ L e d g e r _ E n t r y _ _ D o c u m e n t _ N o _ _ > C u s t _ _ L e d g e r _ E n t r y _ _ D o c u m e n t _ N o _ _ < / C u s t _ _ L e d g e r _ E n t r y _ _ D o c u m e n t _ N o _ _ > - 
-             < C u s t _ _ L e d g e r _ E n t r y _ _ P o s t i n g _ D a t e _ > C u s t _ _ L e d g e r _ E n t r y _ _ P o s t i n g _ D a t e _ < / C u s t _ _ L e d g e r _ E n t r y _ _ P o s t i n g _ D a t e _ > - 
-             < C u s t _ _ L e d g e r _ E n t r y _ _ P r o f i t _ _ L C Y _ _ > C u s t _ _ L e d g e r _ E n t r y _ _ P r o f i t _ _ L C Y _ _ < / C u s t _ _ L e d g e r _ E n t r y _ _ P r o f i t _ _ L C Y _ _ > - 
-             < C u s t _ _ L e d g e r _ E n t r y _ _ S a l e s _ _ L C Y _ _ > C u s t _ _ L e d g e r _ E n t r y _ _ S a l e s _ _ L C Y _ _ < / C u s t _ _ L e d g e r _ E n t r y _ _ S a l e s _ _ L C Y _ _ > - 
-             < P r o f i t C o m m i s s i o n A m t _ C o n t r o l 3 3 > P r o f i t C o m m i s s i o n A m t _ C o n t r o l 3 3 < / P r o f i t C o m m i s s i o n A m t _ C o n t r o l 3 3 > - 
-             < S a l e s C o m m i s s i o n A m t _ C o n t r o l 3 2 > S a l e s C o m m i s s i o n A m t _ C o n t r o l 3 2 < / S a l e s C o m m i s s i o n A m t _ C o n t r o l 3 2 > - 
-             < S a l e s p e r s o n P u r c h a s e r _ C o d e > S a l e s p e r s o n P u r c h a s e r _ C o d e < / S a l e s p e r s o n P u r c h a s e r _ C o d e > - 
-             < S a l e s p e r s o n _ P u r c h a s e r _ _ N a m e > S a l e s p e r s o n _ P u r c h a s e r _ _ N a m e < / S a l e s p e r s o n _ P u r c h a s e r _ _ N a m e > +     < T o o l t i p s > + 
+         < T o o l t i p   c o l u m n = " S a l e s p e r s o n _ P u r c h a s e r _ C o d e "   E l e m e n t I d = " 1 3 8 8 0 3 1 6 5 2 " > + 
+             < T o o l t i p T e x t   l a n g = " e n - U S " > S p e c i f i e s   a   c o d e   f o r   t h e   s a l e s p e r s o n   o r   p u r c h a s e r . < / T o o l t i p T e x t > + 
+         < / T o o l t i p > + 
+         < T o o l t i p   c o l u m n = " S a l e s p e r s o n _ P u r c h a s e r _ N a m e "   E l e m e n t I d = " 1 3 4 8 2 2 8 4 6 2 " > + 
+             < T o o l t i p T e x t   l a n g = " e n - U S " > S p e c i f i e s   t h e   n a m e   o f   t h e   s a l e s p e r s o n   o r   p u r c h a s e r . < / T o o l t i p T e x t > + 
+         < / T o o l t i p > + 
+         < T o o l t i p   c o l u m n = " S a l e s p e r s o n _ P u r c h a s e r _ _ C o m m i s s i o n _ _ _ "   E l e m e n t I d = " 1 5 9 0 6 8 9 0 0 4 " > + 
+             < T o o l t i p T e x t   l a n g = " e n - U S " > S p e c i f i e s   t h e   p e r c e n t a g e   t o   u s e   t o   c a l c u l a t e   t h e   s a l e s p e r s o n ' s   c o m m i s s i o n . < / T o o l t i p T e x t > + 
+         < / T o o l t i p > + 
+         < T o o l t i p   c o l u m n = " C u s t _ _ L e d g e r _ E n t r y _ _ _ S a l e s _ _ L C Y _ _ "   E l e m e n t I d = " 3 4 8 7 9 4 9 4 9 " > + 
+             < T o o l t i p T e x t   l a n g = " e n - U S " > S p e c i f i e s   t h e   t o t a l   s a l e s   a m o u n t   e x c l .   V A T   t o   t h e   c u s t o m e r   i n   L C Y . < / T o o l t i p T e x t > + 
+         < / T o o l t i p > + 
+         < T o o l t i p   c o l u m n = " C u s t _ _ L e d g e r _ E n t r y _ _ D o c u m e n t _ N o _ _ "   E l e m e n t I d = " 8 5 2 6 1 1 1 8 1 " > + 
+             < T o o l t i p T e x t   l a n g = " e n - U S " > S p e c i f i e s   t h e   e n t r y ' s   d o c u m e n t   n u m b e r . < / T o o l t i p T e x t > + 
+         < / T o o l t i p > + 
+         < T o o l t i p   c o l u m n = " C u s t _ _ L e d g e r _ E n t r y _ _ C u s t o m e r _ N o _ _ "   E l e m e n t I d = " 1 0 0 9 0 1 6 8 0 8 " > + 
+             < T o o l t i p T e x t   l a n g = " e n - U S " > S p e c i f i e s   t h e   c u s t o m e r   a c c o u n t   n u m b e r   t h a t   t h e   e n t r y   i s   l i n k e d   t o . < / T o o l t i p T e x t > + 
+         < / T o o l t i p > + 
+         < T o o l t i p   c o l u m n = " C u s t _ _ L e d g e r _ E n t r y _ _ S a l e s _ _ L C Y _ _ "   E l e m e n t I d = " 8 1 9 5 1 7 4 8 " > + 
+             < T o o l t i p T e x t   l a n g = " e n - U S " > S p e c i f i e s   t h e   t o t a l   s a l e s   a m o u n t   e x c l .   V A T   t o   t h e   c u s t o m e r   i n   L C Y . < / T o o l t i p T e x t > + 
+         < / T o o l t i p > + 
+         < T o o l t i p   c o l u m n = " C u s t L e d g e r E n t r y _ C u s t o m e r N a m e "   E l e m e n t I d = " 2 0 9 1 8 9 3 2 7 9 " > + 
+             < T o o l t i p T e x t   l a n g = " e n - U S " > S p e c i f i e s   t h e   c u s t o m e r   n a m e   t h a t   t h e   e n t r y   i s   l i n k e d   t o . < / T o o l t i p T e x t > + 
+         < / T o o l t i p > + 
+         < T o o l t i p   c o l u m n = " S a l e s p e r s o n P u r c h a s e r _ C o d e "   E l e m e n t I d = " 1 2 2 1 2 1 9 2 4 5 " > + 
+             < T o o l t i p T e x t   l a n g = " e n - U S " > S p e c i f i e s   a   c o d e   f o r   t h e   s a l e s p e r s o n   o r   p u r c h a s e r . < / T o o l t i p T e x t > + 
+         < / T o o l t i p > + 
+         < T o o l t i p   c o l u m n = " S a l e s p e r s o n _ P u r c h a s e r _ _ N a m e "   E l e m e n t I d = " 1 1 9 5 8 7 9 8 7 3 " > + 
+             < T o o l t i p T e x t   l a n g = " e n - U S " > S p e c i f i e s   t h e   n a m e   o f   t h e   s a l e s p e r s o n   o r   p u r c h a s e r . < / T o o l t i p T e x t > + 
+         < / T o o l t i p > + 
+         < T o o l t i p   c o l u m n = " S u b t o t a l s _ S a l e s p e r s o n _ C o d e "   E l e m e n t I d = " 1 1 9 8 5 9 4 2 7 2 " > + 
+             < T o o l t i p T e x t   l a n g = " e n - U S " > S p e c i f i e s   a   c o d e   f o r   t h e   s a l e s p e r s o n   o r   p u r c h a s e r . < / T o o l t i p T e x t > + 
+         < / T o o l t i p > + 
+     < / T o o l t i p s > + 
+     < S a l e s p e r s o n _ P u r c h a s e r   E l e m e n t T y p e = " D a t a I t e m "   E l e m e n t I d = " 7 1 5 0 0 7 1 9 8 " > + 
+         < A d j P r o f i t   E l e m e n t T y p e = " C o l u m n "   E l e m e n t I d = " 6 6 6 3 9 3 8 5 2 "   D a t a T y p e = " D e c i m a l "   O b s o l e t e S t a t e = " P e n d i n g " > A d j P r o f i t < / A d j P r o f i t > + 
+         < A d j P r o f i t C o m m i s s i o n A m t   E l e m e n t T y p e = " C o l u m n "   E l e m e n t I d = " 1 5 8 1 4 8 8 5 9 9 "   D a t a T y p e = " D e c i m a l "   O b s o l e t e S t a t e = " P e n d i n g " > A d j P r o f i t C o m m i s s i o n A m t < / A d j P r o f i t C o m m i s s i o n A m t > + 
+         < A d j P r o f i t C o m m i s s i o n A m t _ C o n t r o l 4 5 C a p t i o n   E l e m e n t T y p e = " C o l u m n "   E l e m e n t I d = " 6 2 1 2 7 7 8 5 4 "   D a t a T y p e = " L a b e l "   O b s o l e t e S t a t e = " P e n d i n g " > A d j P r o f i t C o m m i s s i o n A m t _ C o n t r o l 4 5 C a p t i o n < / A d j P r o f i t C o m m i s s i o n A m t _ C o n t r o l 4 5 C a p t i o n > + 
+         < A d j P r o f i t _ C o n t r o l 3 9 C a p t i o n   E l e m e n t T y p e = " C o l u m n "   E l e m e n t I d = " 2 1 3 3 9 8 4 3 2 "   D a t a T y p e = " L a b e l "   O b s o l e t e S t a t e = " P e n d i n g " > A d j P r o f i t _ C o n t r o l 3 9 C a p t i o n < / A d j P r o f i t _ C o n t r o l 3 9 C a p t i o n > + 
+         < A l l _ a m o u n t s _ a r e _ i n _ L C Y C a p t i o n   E l e m e n t T y p e = " C o l u m n "   E l e m e n t I d = " 6 9 7 4 8 4 8 0 2 "   D a t a T y p e = " L a b e l "   O b s o l e t e S t a t e = " P e n d i n g " > A l l _ a m o u n t s _ a r e _ i n _ L C Y C a p t i o n < / A l l _ a m o u n t s _ a r e _ i n _ L C Y C a p t i o n > + 
+         < C O M P A N Y N A M E   E l e m e n t T y p e = " C o l u m n "   E l e m e n t I d = " 1 7 5 3 0 1 5 1 5 5 "   D a t a T y p e = " S t r i n g "   O b s o l e t e S t a t e = " P e n d i n g " > C O M P A N Y N A M E < / C O M P A N Y N A M E > + 
+         < C u r r R e p o r t _ P A G E N O C a p t i o n   E l e m e n t T y p e = " C o l u m n "   E l e m e n t I d = " 1 8 4 6 2 6 2 1 5 8 "   D a t a T y p e = " L a b e l "   O b s o l e t e S t a t e = " P e n d i n g " > C u r r R e p o r t _ P A G E N O C a p t i o n < / C u r r R e p o r t _ P A G E N O C a p t i o n > + 
+         < C u s t L e d g E n t r y F i l t e r   E l e m e n t T y p e = " C o l u m n "   E l e m e n t I d = " 1 1 7 3 5 3 2 6 6 6 "   D a t a T y p e = " T e x t "   O b s o l e t e S t a t e = " P e n d i n g " > C u s t L e d g E n t r y F i l t e r < / C u s t L e d g E n t r y F i l t e r > + 
+         < C u s t _ _ L e d g e r _ E n t r y _ _ C u s t o m e r _ N o _ _ C a p t i o n   E l e m e n t T y p e = " C o l u m n "   E l e m e n t I d = " 1 2 2 3 8 5 6 2 7 8 "   D a t a T y p e = " S t r i n g "   O b s o l e t e S t a t e = " P e n d i n g " > C u s t _ _ L e d g e r _ E n t r y _ _ C u s t o m e r _ N o _ _ C a p t i o n < / C u s t _ _ L e d g e r _ E n t r y _ _ C u s t o m e r _ N o _ _ C a p t i o n > + 
+         < C u s t _ _ L e d g e r _ E n t r y _ _ D o c u m e n t _ N o _ _ C a p t i o n   E l e m e n t T y p e = " C o l u m n "   E l e m e n t I d = " 4 8 8 8 0 6 5 1 7 "   D a t a T y p e = " S t r i n g "   O b s o l e t e S t a t e = " P e n d i n g " > C u s t _ _ L e d g e r _ E n t r y _ _ D o c u m e n t _ N o _ _ C a p t i o n < / C u s t _ _ L e d g e r _ E n t r y _ _ D o c u m e n t _ N o _ _ C a p t i o n > + 
+         < C u s t _ _ L e d g e r _ E n t r y _ _ P o s t i n g _ D a t e _ C a p t i o n   E l e m e n t T y p e = " C o l u m n "   E l e m e n t I d = " 2 0 7 9 4 3 8 7 1 2 "   D a t a T y p e = " L a b e l "   O b s o l e t e S t a t e = " P e n d i n g " > C u s t _ _ L e d g e r _ E n t r y _ _ P o s t i n g _ D a t e _ C a p t i o n < / C u s t _ _ L e d g e r _ E n t r y _ _ P o s t i n g _ D a t e _ C a p t i o n > + 
+         < C u s t _ _ L e d g e r _ E n t r y _ _ P r o f i t _ _ L C Y _ _ C a p t i o n   E l e m e n t T y p e = " C o l u m n "   E l e m e n t I d = " 1 9 9 4 3 8 8 4 7 6 "   D a t a T y p e = " S t r i n g "   O b s o l e t e S t a t e = " P e n d i n g " > C u s t _ _ L e d g e r _ E n t r y _ _ P r o f i t _ _ L C Y _ _ C a p t i o n < / C u s t _ _ L e d g e r _ E n t r y _ _ P r o f i t _ _ L C Y _ _ C a p t i o n > + 
+         < C u s t _ _ L e d g e r _ E n t r y _ _ S a l e s _ _ L C Y _ _ C a p t i o n   E l e m e n t T y p e = " C o l u m n "   E l e m e n t I d = " 1 0 5 6 9 2 6 5 4 6 "   D a t a T y p e = " S t r i n g "   O b s o l e t e S t a t e = " P e n d i n g " > C u s t _ _ L e d g e r _ E n t r y _ _ S a l e s _ _ L C Y _ _ C a p t i o n < / C u s t _ _ L e d g e r _ E n t r y _ _ S a l e s _ _ L C Y _ _ C a p t i o n > + 
+         < C u s t _ _ L e d g e r _ E n t r y _ _ T A B L E C A P T I O N _ _ _ _ _ _ _ _ _ _ C u s t L e d g E n t r y F i l t e r   E l e m e n t T y p e = " C o l u m n "   E l e m e n t I d = " 7 1 0 6 3 3 9 1 7 "   D a t a T y p e = " T e x t " > C u s t _ _ L e d g e r _ E n t r y _ _ T A B L E C A P T I O N _ _ _ _ _ _ _ _ _ _ C u s t L e d g E n t r y F i l t e r < / C u s t _ _ L e d g e r _ E n t r y _ _ T A B L E C A P T I O N _ _ _ _ _ _ _ _ _ _ C u s t L e d g E n t r y F i l t e r > + 
+         < C u s t _ _ L e d g e r _ E n t r y _ _ _ P r o f i t _ _ L C Y _ _   E l e m e n t T y p e = " C o l u m n "   E l e m e n t I d = " 1 6 1 5 1 3 7 4 4 3 "   D a t a T y p e = " D e c i m a l "   O b s o l e t e S t a t e = " P e n d i n g " > C u s t _ _ L e d g e r _ E n t r y _ _ _ P r o f i t _ _ L C Y _ _ < / C u s t _ _ L e d g e r _ E n t r y _ _ _ P r o f i t _ _ L C Y _ _ > + 
+         < C u s t _ _ L e d g e r _ E n t r y _ _ _ S a l e s _ _ L C Y _ _   E l e m e n t T y p e = " C o l u m n "   E l e m e n t I d = " 3 4 8 7 9 4 9 4 9 "   D a t a T y p e = " D e c i m a l "   O b s o l e t e S t a t e = " P e n d i n g " > C u s t _ _ L e d g e r _ E n t r y _ _ _ S a l e s _ _ L C Y _ _ < / C u s t _ _ L e d g e r _ E n t r y _ _ _ S a l e s _ _ L C Y _ _ > + 
+         < P a g e G r o u p N o   E l e m e n t T y p e = " C o l u m n "   E l e m e n t I d = " 6 4 9 1 8 0 1 4 4 "   D a t a T y p e = " I n t e g e r "   O b s o l e t e S t a t e = " P e n d i n g " > P a g e G r o u p N o < / P a g e G r o u p N o > + 
+         < P r o f i t C o m m i s s i o n A m t   E l e m e n t T y p e = " C o l u m n "   E l e m e n t I d = " 4 1 6 2 2 4 2 0 6 "   D a t a T y p e = " D e c i m a l "   O b s o l e t e S t a t e = " P e n d i n g " > P r o f i t C o m m i s s i o n A m t < / P r o f i t C o m m i s s i o n A m t > + 
+         < P r o f i t C o m m i s s i o n A m t _ C o n t r o l 3 3 C a p t i o n   E l e m e n t T y p e = " C o l u m n "   E l e m e n t I d = " 4 6 5 8 1 2 5 3 6 "   D a t a T y p e = " L a b e l "   O b s o l e t e S t a t e = " P e n d i n g " > P r o f i t C o m m i s s i o n A m t _ C o n t r o l 3 3 C a p t i o n < / P r o f i t C o m m i s s i o n A m t _ C o n t r o l 3 3 C a p t i o n > + 
+         < S a l e s C o m m i s s i o n A m t   E l e m e n t T y p e = " C o l u m n "   E l e m e n t I d = " 1 6 5 6 6 7 5 0 1 6 "   D a t a T y p e = " D e c i m a l "   O b s o l e t e S t a t e = " P e n d i n g " > S a l e s C o m m i s s i o n A m t < / S a l e s C o m m i s s i o n A m t > + 
+         < S a l e s C o m m i s s i o n A m t _ C o n t r o l 3 2 C a p t i o n   E l e m e n t T y p e = " C o l u m n "   E l e m e n t I d = " 1 2 7 2 6 4 2 0 6 5 "   D a t a T y p e = " L a b e l "   O b s o l e t e S t a t e = " P e n d i n g " > S a l e s C o m m i s s i o n A m t _ C o n t r o l 3 2 C a p t i o n < / S a l e s C o m m i s s i o n A m t _ C o n t r o l 3 2 C a p t i o n > + 
+         < S a l e s p e r s o n F i l t e r   E l e m e n t T y p e = " C o l u m n "   E l e m e n t I d = " 1 2 4 2 2 8 3 2 5 6 "   D a t a T y p e = " T e x t "   O b s o l e t e S t a t e = " P e n d i n g " > S a l e s p e r s o n F i l t e r < / S a l e s p e r s o n F i l t e r > + 
+         < S a l e s p e r s o n _ P u r c h a s e r _ C o d e   E l e m e n t T y p e = " C o l u m n "   E l e m e n t I d = " 1 3 8 8 0 3 1 6 5 2 "   D a t a T y p e = " C o d e " > S a l e s p e r s o n _ P u r c h a s e r _ C o d e < / S a l e s p e r s o n _ P u r c h a s e r _ C o d e > + 
+         < S a l e s p e r s o n _ P u r c h a s e r _ N a m e   E l e m e n t T y p e = " C o l u m n "   E l e m e n t I d = " 1 3 4 8 2 2 8 4 6 2 "   D a t a T y p e = " T e x t " > S a l e s p e r s o n _ P u r c h a s e r _ N a m e < / S a l e s p e r s o n _ P u r c h a s e r _ N a m e > + 
+         < S a l e s p e r s o n _ P u r c h a s e r _ _ C o m m i s s i o n _ _ _   E l e m e n t T y p e = " C o l u m n "   E l e m e n t I d = " 1 5 9 0 6 8 9 0 0 4 "   D a t a T y p e = " D e c i m a l " > S a l e s p e r s o n _ P u r c h a s e r _ _ C o m m i s s i o n _ _ _ < / S a l e s p e r s o n _ P u r c h a s e r _ _ C o m m i s s i o n _ _ _ > + 
+         < S a l e s p e r s o n _ P u r c h a s e r _ _ C o m m i s s i o n _ _ _ C a p t i o n   E l e m e n t T y p e = " C o l u m n "   E l e m e n t I d = " 4 9 9 4 6 3 1 7 0 "   D a t a T y p e = " S t r i n g "   O b s o l e t e S t a t e = " P e n d i n g " > S a l e s p e r s o n _ P u r c h a s e r _ _ C o m m i s s i o n _ _ _ C a p t i o n < / S a l e s p e r s o n _ P u r c h a s e r _ _ C o m m i s s i o n _ _ _ C a p t i o n > + 
+         < S a l e s p e r s o n _ P u r c h a s e r _ _ T A B L E C A P T I O N _ _ _ _ _ _ _ _ _ _ S a l e s p e r s o n F i l t e r   E l e m e n t T y p e = " C o l u m n "   E l e m e n t I d = " 1 0 1 6 0 4 1 6 9 9 "   D a t a T y p e = " T e x t " > S a l e s p e r s o n _ P u r c h a s e r _ _ T A B L E C A P T I O N _ _ _ _ _ _ _ _ _ _ S a l e s p e r s o n F i l t e r < / S a l e s p e r s o n _ P u r c h a s e r _ _ T A B L E C A P T I O N _ _ _ _ _ _ _ _ _ _ S a l e s p e r s o n F i l t e r > + 
+         < S a l e s p e r s o n _ _ _ C o m m i s s i o n C a p t i o n   E l e m e n t T y p e = " C o l u m n "   E l e m e n t I d = " 1 7 6 9 4 7 1 9 4 8 "   D a t a T y p e = " L a b e l "   O b s o l e t e S t a t e = " P e n d i n g " > S a l e s p e r s o n _ _ _ C o m m i s s i o n C a p t i o n < / S a l e s p e r s o n _ _ _ C o m m i s s i o n C a p t i o n > + 
+         < S T R S U B S T N O _ T e x t 0 0 0 _ P e r i o d T e x t _   E l e m e n t T y p e = " C o l u m n "   E l e m e n t I d = " 7 2 2 9 9 1 7 0 4 "   D a t a T y p e = " S t r i n g " > S T R S U B S T N O _ T e x t 0 0 0 _ P e r i o d T e x t _ < / S T R S U B S T N O _ T e x t 0 0 0 _ P e r i o d T e x t _ > + 
+         < T o t a l C a p t i o n   E l e m e n t T y p e = " C o l u m n "   E l e m e n t I d = " 7 0 7 1 0 2 6 9 5 "   D a t a T y p e = " L a b e l "   O b s o l e t e S t a t e = " P e n d i n g " > T o t a l C a p t i o n < / T o t a l C a p t i o n > + 
+         < C u s t _ L e d g e r _ E n t r y   E l e m e n t T y p e = " D a t a I t e m "   E l e m e n t I d = " 1 6 3 9 1 4 6 4 4 5 " > + 
+             < A d j P r o f i t C o m m i s s i o n A m t _ C o n t r o l 4 5   E l e m e n t T y p e = " C o l u m n "   E l e m e n t I d = " 8 0 5 8 9 6 4 0 0 "   D a t a T y p e = " D e c i m a l " > A d j P r o f i t C o m m i s s i o n A m t _ C o n t r o l 4 5 < / A d j P r o f i t C o m m i s s i o n A m t _ C o n t r o l 4 5 > + 
+             < A d j P r o f i t _ C o n t r o l 3 9   E l e m e n t T y p e = " C o l u m n "   E l e m e n t I d = " 2 0 2 4 1 9 6 5 4 2 "   D a t a T y p e = " D e c i m a l " > A d j P r o f i t _ C o n t r o l 3 9 < / A d j P r o f i t _ C o n t r o l 3 9 > + 
+             < C u s t L e d g e r E n t r y _ C u s t o m e r N a m e   E l e m e n t T y p e = " C o l u m n "   E l e m e n t I d = " 2 0 9 1 8 9 3 2 7 9 "   D a t a T y p e = " T e x t " > C u s t L e d g e r E n t r y _ C u s t o m e r N a m e < / C u s t L e d g e r E n t r y _ C u s t o m e r N a m e > + 
+             < C u s t _ _ L e d g e r _ E n t r y _ _ C u s t o m e r _ N o _ _   E l e m e n t T y p e = " C o l u m n "   E l e m e n t I d = " 1 0 0 9 0 1 6 8 0 8 "   D a t a T y p e = " C o d e " > C u s t _ _ L e d g e r _ E n t r y _ _ C u s t o m e r _ N o _ _ < / C u s t _ _ L e d g e r _ E n t r y _ _ C u s t o m e r _ N o _ _ > + 
+             < C u s t _ _ L e d g e r _ E n t r y _ _ D o c u m e n t _ N o _ _   E l e m e n t T y p e = " C o l u m n "   E l e m e n t I d = " 8 5 2 6 1 1 1 8 1 "   D a t a T y p e = " C o d e " > C u s t _ _ L e d g e r _ E n t r y _ _ D o c u m e n t _ N o _ _ < / C u s t _ _ L e d g e r _ E n t r y _ _ D o c u m e n t _ N o _ _ > + 
+             < C u s t _ _ L e d g e r _ E n t r y _ _ P o s t i n g _ D a t e _   E l e m e n t T y p e = " C o l u m n "   E l e m e n t I d = " 2 1 4 2 6 5 7 1 6 2 "   D a t a T y p e = " S t r i n g " > C u s t _ _ L e d g e r _ E n t r y _ _ P o s t i n g _ D a t e _ < / C u s t _ _ L e d g e r _ E n t r y _ _ P o s t i n g _ D a t e _ > + 
+             < C u s t _ _ L e d g e r _ E n t r y _ _ P r o f i t _ _ L C Y _ _   E l e m e n t T y p e = " C o l u m n "   E l e m e n t I d = " 5 1 9 3 4 1 8 2 6 "   D a t a T y p e = " D e c i m a l " > C u s t _ _ L e d g e r _ E n t r y _ _ P r o f i t _ _ L C Y _ _ < / C u s t _ _ L e d g e r _ E n t r y _ _ P r o f i t _ _ L C Y _ _ > + 
+             < C u s t _ _ L e d g e r _ E n t r y _ _ S a l e s _ _ L C Y _ _   E l e m e n t T y p e = " C o l u m n "   E l e m e n t I d = " 8 1 9 5 1 7 4 8 "   D a t a T y p e = " D e c i m a l " > C u s t _ _ L e d g e r _ E n t r y _ _ S a l e s _ _ L C Y _ _ < / C u s t _ _ L e d g e r _ E n t r y _ _ S a l e s _ _ L C Y _ _ > + 
+             < P r o f i t C o m m i s s i o n A m t _ C o n t r o l 3 3   E l e m e n t T y p e = " C o l u m n "   E l e m e n t I d = " 3 1 2 1 8 6 8 2 6 "   D a t a T y p e = " D e c i m a l " > P r o f i t C o m m i s s i o n A m t _ C o n t r o l 3 3 < / P r o f i t C o m m i s s i o n A m t _ C o n t r o l 3 3 > + 
+             < S a l e s C o m m i s s i o n A m t _ C o n t r o l 3 2   E l e m e n t T y p e = " C o l u m n "   E l e m e n t I d = " 1 4 6 2 3 9 0 1 5 3 "   D a t a T y p e = " D e c i m a l " > S a l e s C o m m i s s i o n A m t _ C o n t r o l 3 2 < / S a l e s C o m m i s s i o n A m t _ C o n t r o l 3 2 > + 
+             < S a l e s p e r s o n P u r c h a s e r _ C o d e   E l e m e n t T y p e = " C o l u m n "   E l e m e n t I d = " 1 2 2 1 2 1 9 2 4 5 "   D a t a T y p e = " C o d e " > S a l e s p e r s o n P u r c h a s e r _ C o d e < / S a l e s p e r s o n P u r c h a s e r _ C o d e > + 
+             < S a l e s p e r s o n _ P u r c h a s e r _ _ N a m e   E l e m e n t T y p e = " C o l u m n "   E l e m e n t I d = " 1 1 9 5 8 7 9 8 7 3 "   D a t a T y p e = " T e x t " > S a l e s p e r s o n _ P u r c h a s e r _ _ N a m e < / S a l e s p e r s o n _ P u r c h a s e r _ _ N a m e >   
          < / C u s t _ L e d g e r _ E n t r y >   
-         < S u b t o t a l s > - 
-             < S u b t o t a l s _ A d j P r o f i t > S u b t o t a l s _ A d j P r o f i t < / S u b t o t a l s _ A d j P r o f i t > - 
-             < S u b t o t a l s _ A d j P r o f i t C o m m i s s i o n > S u b t o t a l s _ A d j P r o f i t C o m m i s s i o n < / S u b t o t a l s _ A d j P r o f i t C o m m i s s i o n > - 
-             < S u b t o t a l s _ P r o f i t > S u b t o t a l s _ P r o f i t < / S u b t o t a l s _ P r o f i t > - 
-             < S u b t o t a l s _ P r o f i t C o m m i s s i o n > S u b t o t a l s _ P r o f i t C o m m i s s i o n < / S u b t o t a l s _ P r o f i t C o m m i s s i o n > - 
-             < S u b t o t a l s _ S a l e s > S u b t o t a l s _ S a l e s < / S u b t o t a l s _ S a l e s > - 
-             < S u b t o t a l s _ S a l e s C o m m i s s i o n > S u b t o t a l s _ S a l e s C o m m i s s i o n < / S u b t o t a l s _ S a l e s C o m m i s s i o n > - 
-             < S u b t o t a l s _ S a l e s p e r s o n _ C o d e > S u b t o t a l s _ S a l e s p e r s o n _ C o d e < / S u b t o t a l s _ S a l e s p e r s o n _ C o d e > +         < S u b t o t a l s   E l e m e n t T y p e = " D a t a I t e m "   E l e m e n t I d = " 8 3 8 6 9 3 5 6 0 " > + 
+             < S u b t o t a l s _ A d j P r o f i t   E l e m e n t T y p e = " C o l u m n "   E l e m e n t I d = " 5 6 1 3 6 6 8 2 2 "   D a t a T y p e = " D e c i m a l " > S u b t o t a l s _ A d j P r o f i t < / S u b t o t a l s _ A d j P r o f i t > + 
+             < S u b t o t a l s _ A d j P r o f i t C o m m i s s i o n   E l e m e n t T y p e = " C o l u m n "   E l e m e n t I d = " 1 4 1 8 9 7 1 8 3 5 "   D a t a T y p e = " D e c i m a l " > S u b t o t a l s _ A d j P r o f i t C o m m i s s i o n < / S u b t o t a l s _ A d j P r o f i t C o m m i s s i o n > + 
+             < S u b t o t a l s _ P r o f i t   E l e m e n t T y p e = " C o l u m n "   E l e m e n t I d = " 2 4 1 5 0 0 6 9 7 "   D a t a T y p e = " D e c i m a l " > S u b t o t a l s _ P r o f i t < / S u b t o t a l s _ P r o f i t > + 
+             < S u b t o t a l s _ P r o f i t C o m m i s s i o n   E l e m e n t T y p e = " C o l u m n "   E l e m e n t I d = " 1 4 9 6 3 3 2 1 7 2 "   D a t a T y p e = " D e c i m a l " > S u b t o t a l s _ P r o f i t C o m m i s s i o n < / S u b t o t a l s _ P r o f i t C o m m i s s i o n > + 
+             < S u b t o t a l s _ S a l e s   E l e m e n t T y p e = " C o l u m n "   E l e m e n t I d = " 1 9 7 8 7 7 5 0 3 "   D a t a T y p e = " D e c i m a l " > S u b t o t a l s _ S a l e s < / S u b t o t a l s _ S a l e s > + 
+             < S u b t o t a l s _ S a l e s C o m m i s s i o n   E l e m e n t T y p e = " C o l u m n "   E l e m e n t I d = " 1 4 7 6 0 7 2 5 9 0 "   D a t a T y p e = " D e c i m a l " > S u b t o t a l s _ S a l e s C o m m i s s i o n < / S u b t o t a l s _ S a l e s C o m m i s s i o n > + 
+             < S u b t o t a l s _ S a l e s p e r s o n _ C o d e   E l e m e n t T y p e = " C o l u m n "   E l e m e n t I d = " 1 1 9 8 5 9 4 2 7 2 "   D a t a T y p e = " C o d e " > S u b t o t a l s _ S a l e s p e r s o n _ C o d e < / S u b t o t a l s _ S a l e s p e r s o n _ C o d e >   
          < / S u b t o t a l s >   
      < / S a l e s p e r s o n _ P u r c h a s e r >   
-     < T o t a l s > - 
-         < T o t a l s _ A d j P r o f i t > T o t a l s _ A d j P r o f i t < / T o t a l s _ A d j P r o f i t > - 
-         < T o t a l s _ A d j P r o f i t C o m m i s s i o n > T o t a l s _ A d j P r o f i t C o m m i s s i o n < / T o t a l s _ A d j P r o f i t C o m m i s s i o n > - 
-         < T o t a l s _ P r o f i t > T o t a l s _ P r o f i t < / T o t a l s _ P r o f i t > - 
-         < T o t a l s _ P r o f i t C o m m i s s i o n > T o t a l s _ P r o f i t C o m m i s s i o n < / T o t a l s _ P r o f i t C o m m i s s i o n > - 
-         < T o t a l s _ S a l e s > T o t a l s _ S a l e s < / T o t a l s _ S a l e s > - 
-         < T o t a l s _ S a l e s C o m m i s s i o n > T o t a l s _ S a l e s C o m m i s s i o n < / T o t a l s _ S a l e s C o m m i s s i o n > +     < T o t a l s   E l e m e n t T y p e = " D a t a I t e m "   E l e m e n t I d = " 1 8 2 3 9 5 0 0 4 4 " > + 
+         < T o t a l s _ A d j P r o f i t   E l e m e n t T y p e = " C o l u m n "   E l e m e n t I d = " 1 9 0 9 5 0 1 3 6 2 "   D a t a T y p e = " D e c i m a l " > T o t a l s _ A d j P r o f i t < / T o t a l s _ A d j P r o f i t > + 
+         < T o t a l s _ A d j P r o f i t C o m m i s s i o n   E l e m e n t T y p e = " C o l u m n "   E l e m e n t I d = " 9 4 6 1 0 3 7 5 9 "   D a t a T y p e = " D e c i m a l " > T o t a l s _ A d j P r o f i t C o m m i s s i o n < / T o t a l s _ A d j P r o f i t C o m m i s s i o n > + 
+         < T o t a l s _ P r o f i t   E l e m e n t T y p e = " C o l u m n "   E l e m e n t I d = " 6 4 6 2 9 5 2 1 9 "   D a t a T y p e = " D e c i m a l " > T o t a l s _ P r o f i t < / T o t a l s _ P r o f i t > + 
+         < T o t a l s _ P r o f i t C o m m i s s i o n   E l e m e n t T y p e = " C o l u m n "   E l e m e n t I d = " 3 6 7 7 9 1 3 9 2 "   D a t a T y p e = " D e c i m a l " > T o t a l s _ P r o f i t C o m m i s s i o n < / T o t a l s _ P r o f i t C o m m i s s i o n > + 
+         < T o t a l s _ S a l e s   E l e m e n t T y p e = " C o l u m n "   E l e m e n t I d = " 1 3 9 9 9 8 5 1 0 9 "   D a t a T y p e = " D e c i m a l " > T o t a l s _ S a l e s < / T o t a l s _ S a l e s > + 
+         < T o t a l s _ S a l e s C o m m i s s i o n   E l e m e n t T y p e = " C o l u m n "   E l e m e n t I d = " 4 6 4 8 2 3 3 9 8 "   D a t a T y p e = " D e c i m a l " > T o t a l s _ S a l e s C o m m i s s i o n < / T o t a l s _ S a l e s C o m m i s s i o n >   
      < / T o t a l s >   
  < / N a v W o r d R e p o r t X m l P a r t > 
 </file>
 
-<file path=customXml/item2.xml>��< ? x m l   v e r s i o n = " 1 . 0 "   e n c o d i n g = " u t f - 1 6 " ? > < N a v W o r d R e p o r t X m l P a r t   x m l n s = " u r n : m i c r o s o f t - d y n a m i c s - b u s i n e s s c e n t r a l / i n t e r n a l / e x t e n d e d / r e p o r t s / S a l e s p e r s o n _ C o m m i s s i o n / 1 1 5 / " > +<file path=customXml/item2.xml>��< ? x m l   v e r s i o n = " 1 . 0 "   e n c o d i n g = " u t f - 1 6 " ? > < N a v W o r d R e p o r t X m l P a r t   x m l n s = " u r n : m i c r o s o f t - d y n a m i c s - n a v / r e p o r t s / S a l e s p e r s o n _ C o m m i s s i o n / 1 1 5 / " >   
      < B C R e p o r t I n f o r m a t i o n >   
@@ -4448,255 +4454,185 @@
  
      < L a b e l s >   
-         < A b o u t T h e R e p o r t L a b e l   E l e m e n t T y p e = " P a r a m e t e r "   E l e m e n t I d = " 1 6 7 7 9 2 0 0 1 "   D a t a T y p e = " S t r i n g " > A b o u t T h e R e p o r t L a b e l < / A b o u t T h e R e p o r t L a b e l > - 
-         < A d j u s t e d P r o f i t C o m m i s s i o n L a b e l   E l e m e n t T y p e = " P a r a m e t e r "   E l e m e n t I d = " 9 1 5 5 5 7 0 2 0 "   D a t a T y p e = " S t r i n g " > A d j u s t e d P r o f i t C o m m i s s i o n L a b e l < / A d j u s t e d P r o f i t C o m m i s s i o n L a b e l > - 
-         < A d j u s t e d P r o f i t L a b e l   E l e m e n t T y p e = " P a r a m e t e r "   E l e m e n t I d = " 1 6 1 5 2 8 3 0 4 7 "   D a t a T y p e = " S t r i n g " > A d j u s t e d P r o f i t L a b e l < / A d j u s t e d P r o f i t L a b e l > - 
-         < A l l A m o u n t s A r e I n L C Y L a b e l   E l e m e n t T y p e = " P a r a m e t e r "   E l e m e n t I d = " 5 6 3 5 1 4 3 1 8 "   D a t a T y p e = " S t r i n g " > A l l A m o u n t s A r e I n L C Y L a b e l < / A l l A m o u n t s A r e I n L C Y L a b e l > - 
-         < C o m m i s s i o n P e r c e n t L a b e l   E l e m e n t T y p e = " P a r a m e t e r "   E l e m e n t I d = " 8 3 9 2 6 3 7 6 5 "   D a t a T y p e = " S t r i n g " > C o m m i s s i o n P e r c e n t L a b e l < / C o m m i s s i o n P e r c e n t L a b e l > - 
-         < C o m p a n y L a b e l   E l e m e n t T y p e = " P a r a m e t e r "   E l e m e n t I d = " 3 4 6 7 6 0 3 4 8 "   D a t a T y p e = " S t r i n g " > C o m p a n y L a b e l < / C o m p a n y L a b e l > - 
-         < C u s t o m e r N a m e L a b e l   E l e m e n t T y p e = " P a r a m e t e r "   E l e m e n t I d = " 1 1 1 8 7 9 0 8 8 "   D a t a T y p e = " S t r i n g " > C u s t o m e r N a m e L a b e l < / C u s t o m e r N a m e L a b e l > - 
-         < C u s t o m e r N o L a b e l   E l e m e n t T y p e = " P a r a m e t e r "   E l e m e n t I d = " 3 8 7 4 7 8 0 3 4 "   D a t a T y p e = " S t r i n g " > C u s t o m e r N o L a b e l < / C u s t o m e r N o L a b e l > - 
-         < D a t a R e t r i e v e d   E l e m e n t T y p e = " P a r a m e t e r "   E l e m e n t I d = " 2 9 1 9 1 1 8 0 7 "   D a t a T y p e = " S t r i n g " > D a t a R e t r i e v e d < / D a t a R e t r i e v e d > - 
-         < D o c u m e n t a t i o n L a b e l   E l e m e n t T y p e = " P a r a m e t e r "   E l e m e n t I d = " 1 7 3 8 9 2 4 8 1 5 "   D a t a T y p e = " S t r i n g " > D o c u m e n t a t i o n L a b e l < / D o c u m e n t a t i o n L a b e l > - 
-         < D o c u m e n t N o L a b e l   E l e m e n t T y p e = " P a r a m e t e r "   E l e m e n t I d = " 1 1 4 6 4 3 5 8 0 3 "   D a t a T y p e = " S t r i n g " > D o c u m e n t N o L a b e l < / D o c u m e n t N o L a b e l > - 
-         < E n v i r o n m e n t L a b e l   E l e m e n t T y p e = " P a r a m e t e r "   E l e m e n t I d = " 8 1 8 8 1 6 5 9 0 "   D a t a T y p e = " S t r i n g " > E n v i r o n m e n t L a b e l < / E n v i r o n m e n t L a b e l > - 
-         < P e r i o d C a p t i o n   E l e m e n t T y p e = " P a r a m e t e r "   E l e m e n t I d = " 1 4 7 8 2 5 3 4 2 2 "   D a t a T y p e = " S t r i n g " > P e r i o d C a p t i o n < / P e r i o d C a p t i o n > - 
-         < P o s t i n g D a t e L a b e l   E l e m e n t T y p e = " P a r a m e t e r "   E l e m e n t I d = " 1 7 7 5 7 9 4 2 4 9 "   D a t a T y p e = " S t r i n g " > P o s t i n g D a t e L a b e l < / P o s t i n g D a t e L a b e l > - 
-         < P r o f i t C o m m i s s i o n L a b e l   E l e m e n t T y p e = " P a r a m e t e r "   E l e m e n t I d = " 8 3 2 7 0 6 3 9 2 "   D a t a T y p e = " S t r i n g " > P r o f i t C o m m i s s i o n L a b e l < / P r o f i t C o m m i s s i o n L a b e l > - 
-         < P r o f i t L a b e l   E l e m e n t T y p e = " P a r a m e t e r "   E l e m e n t I d = " 2 5 4 6 3 3 6 4 5 "   D a t a T y p e = " S t r i n g " > P r o f i t L a b e l < / P r o f i t L a b e l > - 
-         < R e p o r t N a m e L a b e l   E l e m e n t T y p e = " P a r a m e t e r "   E l e m e n t I d = " 1 0 2 2 2 9 2 9 8 2 "   D a t a T y p e = " S t r i n g " > R e p o r t N a m e L a b e l < / R e p o r t N a m e L a b e l > - 
-         < R u n O n L a b e l   E l e m e n t T y p e = " P a r a m e t e r "   E l e m e n t I d = " 1 1 1 9 0 3 7 5 9 5 "   D a t a T y p e = " S t r i n g " > R u n O n L a b e l < / R u n O n L a b e l > - 
-         < S a l e s C o m m i s s i o n L a b e l   E l e m e n t T y p e = " P a r a m e t e r "   E l e m e n t I d = " 1 0 1 8 2 6 8 7 7 0 "   D a t a T y p e = " S t r i n g " > S a l e s C o m m i s s i o n L a b e l < / S a l e s C o m m i s s i o n L a b e l > - 
-         < S a l e s L a b e l   E l e m e n t T y p e = " P a r a m e t e r "   E l e m e n t I d = " 1 7 9 5 4 4 8 0 0 5 "   D a t a T y p e = " S t r i n g " > S a l e s L a b e l < / S a l e s L a b e l > - 
-         < S a l e s p e r s o n _ P u r c h a s e r _ _ N a m e C a p t i o n   E l e m e n t T y p e = " P a r a m e t e r "   E l e m e n t I d = " 1 1 9 5 8 7 9 8 7 3 "   D a t a T y p e = " S t r i n g " > S a l e s p e r s o n _ P u r c h a s e r _ _ N a m e C a p t i o n < / S a l e s p e r s o n _ P u r c h a s e r _ _ N a m e C a p t i o n > - 
-         < S a l e s p e r s o n C o m m i s s i o n A n a l y s i s   E l e m e n t T y p e = " P a r a m e t e r "   E l e m e n t I d = " 7 1 5 8 7 1 2 4 7 "   D a t a T y p e = " S t r i n g " > S a l e s p e r s o n C o m m i s s i o n A n a l y s i s < / S a l e s p e r s o n C o m m i s s i o n A n a l y s i s > - 
-         < S a l e s p e r s o n C o m m i s s i o n L a b e l   E l e m e n t T y p e = " P a r a m e t e r "   E l e m e n t I d = " 3 0 0 0 9 6 0 5 1 "   D a t a T y p e = " S t r i n g " > S a l e s p e r s o n C o m m i s s i o n L a b e l < / S a l e s p e r s o n C o m m i s s i o n L a b e l > - 
-         < S a l e s p e r s o n C o m m i s s i o n P r i n t   E l e m e n t T y p e = " P a r a m e t e r "   E l e m e n t I d = " 1 3 1 6 0 2 8 6 0 "   D a t a T y p e = " S t r i n g " > S a l e s p e r s o n C o m m i s s i o n P r i n t < / S a l e s p e r s o n C o m m i s s i o n P r i n t > - 
-         < S a l e s p e r s o n P u r c h a s e r _ C o d e C a p t i o n   E l e m e n t T y p e = " P a r a m e t e r "   E l e m e n t I d = " 1 2 2 1 2 1 9 2 4 5 "   D a t a T y p e = " S t r i n g " > S a l e s p e r s o n P u r c h a s e r _ C o d e C a p t i o n < / S a l e s p e r s o n P u r c h a s e r _ C o d e C a p t i o n > - 
-         < T o t a l s C a p t i o n   E l e m e n t T y p e = " P a r a m e t e r "   E l e m e n t I d = " 2 3 5 4 5 9 0 6 "   D a t a T y p e = " S t r i n g " > T o t a l s C a p t i o n < / T o t a l s C a p t i o n > - 
-         < U s e r L a b e l   E l e m e n t T y p e = " P a r a m e t e r "   E l e m e n t I d = " 8 4 8 8 1 6 7 9 4 "   D a t a T y p e = " S t r i n g " > U s e r L a b e l < / U s e r L a b e l > +         < A b o u t T h e R e p o r t L a b e l > A b o u t T h e R e p o r t L a b e l < / A b o u t T h e R e p o r t L a b e l > + 
+         < A d j u s t e d P r o f i t C o m m i s s i o n L a b e l > A d j u s t e d P r o f i t C o m m i s s i o n L a b e l < / A d j u s t e d P r o f i t C o m m i s s i o n L a b e l > + 
+         < A d j u s t e d P r o f i t L a b e l > A d j u s t e d P r o f i t L a b e l < / A d j u s t e d P r o f i t L a b e l > + 
+         < A l l A m o u n t s A r e I n L C Y L a b e l > A l l A m o u n t s A r e I n L C Y L a b e l < / A l l A m o u n t s A r e I n L C Y L a b e l > + 
+         < C o m m i s s i o n P e r c e n t L a b e l > C o m m i s s i o n P e r c e n t L a b e l < / C o m m i s s i o n P e r c e n t L a b e l > + 
+         < C o m p a n y L a b e l > C o m p a n y L a b e l < / C o m p a n y L a b e l > + 
+         < C u s t o m e r N a m e L a b e l > C u s t o m e r N a m e L a b e l < / C u s t o m e r N a m e L a b e l > + 
+         < C u s t o m e r N o L a b e l > C u s t o m e r N o L a b e l < / C u s t o m e r N o L a b e l > + 
+         < D a t a R e t r i e v e d > D a t a R e t r i e v e d < / D a t a R e t r i e v e d > + 
+         < D o c u m e n t a t i o n L a b e l > D o c u m e n t a t i o n L a b e l < / D o c u m e n t a t i o n L a b e l > + 
+         < D o c u m e n t N o L a b e l > D o c u m e n t N o L a b e l < / D o c u m e n t N o L a b e l > + 
+         < E n v i r o n m e n t L a b e l > E n v i r o n m e n t L a b e l < / E n v i r o n m e n t L a b e l > + 
+         < P e r i o d C a p t i o n > P e r i o d C a p t i o n < / P e r i o d C a p t i o n > + 
+         < P o s t i n g D a t e L a b e l > P o s t i n g D a t e L a b e l < / P o s t i n g D a t e L a b e l > + 
+         < P r o f i t C o m m i s s i o n L a b e l > P r o f i t C o m m i s s i o n L a b e l < / P r o f i t C o m m i s s i o n L a b e l > + 
+         < P r o f i t L a b e l > P r o f i t L a b e l < / P r o f i t L a b e l > + 
+         < R e p o r t N a m e L a b e l > R e p o r t N a m e L a b e l < / R e p o r t N a m e L a b e l > + 
+         < R u n O n L a b e l > R u n O n L a b e l < / R u n O n L a b e l > + 
+         < S a l e s C o m m i s s i o n L a b e l > S a l e s C o m m i s s i o n L a b e l < / S a l e s C o m m i s s i o n L a b e l > + 
+         < S a l e s L a b e l > S a l e s L a b e l < / S a l e s L a b e l > + 
+         < S a l e s p e r s o n _ P u r c h a s e r _ _ N a m e C a p t i o n > S a l e s p e r s o n _ P u r c h a s e r _ _ N a m e C a p t i o n < / S a l e s p e r s o n _ P u r c h a s e r _ _ N a m e C a p t i o n > + 
+         < S a l e s p e r s o n C o m m i s s i o n A n a l y s i s > S a l e s p e r s o n C o m m i s s i o n A n a l y s i s < / S a l e s p e r s o n C o m m i s s i o n A n a l y s i s > + 
+         < S a l e s p e r s o n C o m m i s s i o n L a b e l > S a l e s p e r s o n C o m m i s s i o n L a b e l < / S a l e s p e r s o n C o m m i s s i o n L a b e l > + 
+         < S a l e s p e r s o n C o m m i s s i o n P r i n t > S a l e s p e r s o n C o m m i s s i o n P r i n t < / S a l e s p e r s o n C o m m i s s i o n P r i n t > + 
+         < S a l e s p e r s o n P u r c h a s e r _ C o d e C a p t i o n > S a l e s p e r s o n P u r c h a s e r _ C o d e C a p t i o n < / S a l e s p e r s o n P u r c h a s e r _ C o d e C a p t i o n > + 
+         < T o t a l s C a p t i o n > T o t a l s C a p t i o n < / T o t a l s C a p t i o n > + 
+         < U s e r L a b e l > U s e r L a b e l < / U s e r L a b e l >   
      < / L a b e l s >   
-     < T o o l t i p s > - 
-         < T o o l t i p   c o l u m n = " S a l e s p e r s o n _ P u r c h a s e r _ C o d e "   E l e m e n t I d = " 1 3 8 8 0 3 1 6 5 2 " > - 
-             < T o o l t i p T e x t   l a n g = " e n - U S " > S p e c i f i e s   a   c o d e   f o r   t h e   s a l e s p e r s o n   o r   p u r c h a s e r . < / T o o l t i p T e x t > - 
-         < / T o o l t i p > - 
-         < T o o l t i p   c o l u m n = " S a l e s p e r s o n _ P u r c h a s e r _ N a m e "   E l e m e n t I d = " 1 3 4 8 2 2 8 4 6 2 " > - 
-             < T o o l t i p T e x t   l a n g = " e n - U S " > S p e c i f i e s   t h e   n a m e   o f   t h e   s a l e s p e r s o n   o r   p u r c h a s e r . < / T o o l t i p T e x t > - 
-         < / T o o l t i p > - 
-         < T o o l t i p   c o l u m n = " S a l e s p e r s o n _ P u r c h a s e r _ _ C o m m i s s i o n _ _ _ "   E l e m e n t I d = " 1 5 9 0 6 8 9 0 0 4 " > - 
-             < T o o l t i p T e x t   l a n g = " e n - U S " > S p e c i f i e s   t h e   p e r c e n t a g e   t o   u s e   t o   c a l c u l a t e   t h e   s a l e s p e r s o n ' s   c o m m i s s i o n . < / T o o l t i p T e x t > - 
-         < / T o o l t i p > - 
-         < T o o l t i p   c o l u m n = " C u s t _ _ L e d g e r _ E n t r y _ _ _ S a l e s _ _ L C Y _ _ "   E l e m e n t I d = " 3 4 8 7 9 4 9 4 9 " > - 
-             < T o o l t i p T e x t   l a n g = " e n - U S " > S p e c i f i e s   t h e   t o t a l   s a l e s   a m o u n t   e x c l .   V A T   t o   t h e   c u s t o m e r   i n   L C Y . < / T o o l t i p T e x t > - 
-         < / T o o l t i p > - 
-         < T o o l t i p   c o l u m n = " C u s t _ _ L e d g e r _ E n t r y _ _ D o c u m e n t _ N o _ _ "   E l e m e n t I d = " 8 5 2 6 1 1 1 8 1 " > - 
-             < T o o l t i p T e x t   l a n g = " e n - U S " > S p e c i f i e s   t h e   e n t r y ' s   d o c u m e n t   n u m b e r . < / T o o l t i p T e x t > - 
-         < / T o o l t i p > - 
-         < T o o l t i p   c o l u m n = " C u s t _ _ L e d g e r _ E n t r y _ _ C u s t o m e r _ N o _ _ "   E l e m e n t I d = " 1 0 0 9 0 1 6 8 0 8 " > - 
-             < T o o l t i p T e x t   l a n g = " e n - U S " > S p e c i f i e s   t h e   c u s t o m e r   a c c o u n t   n u m b e r   t h a t   t h e   e n t r y   i s   l i n k e d   t o . < / T o o l t i p T e x t > - 
-         < / T o o l t i p > - 
-         < T o o l t i p   c o l u m n = " C u s t _ _ L e d g e r _ E n t r y _ _ S a l e s _ _ L C Y _ _ "   E l e m e n t I d = " 8 1 9 5 1 7 4 8 " > - 
-             < T o o l t i p T e x t   l a n g = " e n - U S " > S p e c i f i e s   t h e   t o t a l   s a l e s   a m o u n t   e x c l .   V A T   t o   t h e   c u s t o m e r   i n   L C Y . < / T o o l t i p T e x t > - 
-         < / T o o l t i p > - 
-         < T o o l t i p   c o l u m n = " C u s t L e d g e r E n t r y _ C u s t o m e r N a m e "   E l e m e n t I d = " 2 0 9 1 8 9 3 2 7 9 " > - 
-             < T o o l t i p T e x t   l a n g = " e n - U S " > S p e c i f i e s   t h e   c u s t o m e r   n a m e   t h a t   t h e   e n t r y   i s   l i n k e d   t o . < / T o o l t i p T e x t > - 
-         < / T o o l t i p > - 
-         < T o o l t i p   c o l u m n = " S a l e s p e r s o n P u r c h a s e r _ C o d e "   E l e m e n t I d = " 1 2 2 1 2 1 9 2 4 5 " > - 
-             < T o o l t i p T e x t   l a n g = " e n - U S " > S p e c i f i e s   a   c o d e   f o r   t h e   s a l e s p e r s o n   o r   p u r c h a s e r . < / T o o l t i p T e x t > - 
-         < / T o o l t i p > - 
-         < T o o l t i p   c o l u m n = " S a l e s p e r s o n _ P u r c h a s e r _ _ N a m e "   E l e m e n t I d = " 1 1 9 5 8 7 9 8 7 3 " > - 
-             < T o o l t i p T e x t   l a n g = " e n - U S " > S p e c i f i e s   t h e   n a m e   o f   t h e   s a l e s p e r s o n   o r   p u r c h a s e r . < / T o o l t i p T e x t > - 
-         < / T o o l t i p > - 
-         < T o o l t i p   c o l u m n = " S u b t o t a l s _ S a l e s p e r s o n _ C o d e "   E l e m e n t I d = " 1 1 9 8 5 9 4 2 7 2 " > - 
-             < T o o l t i p T e x t   l a n g = " e n - U S " > S p e c i f i e s   a   c o d e   f o r   t h e   s a l e s p e r s o n   o r   p u r c h a s e r . < / T o o l t i p T e x t > - 
-         < / T o o l t i p > - 
-     < / T o o l t i p s > - 
-     < S a l e s p e r s o n _ P u r c h a s e r   E l e m e n t T y p e = " D a t a I t e m "   E l e m e n t I d = " 7 1 5 0 0 7 1 9 8 " > - 
-         < A d j P r o f i t   E l e m e n t T y p e = " C o l u m n "   E l e m e n t I d = " 6 6 6 3 9 3 8 5 2 "   D a t a T y p e = " D e c i m a l "   O b s o l e t e S t a t e = " P e n d i n g " > A d j P r o f i t < / A d j P r o f i t > - 
-         < A d j P r o f i t C o m m i s s i o n A m t   E l e m e n t T y p e = " C o l u m n "   E l e m e n t I d = " 1 5 8 1 4 8 8 5 9 9 "   D a t a T y p e = " D e c i m a l "   O b s o l e t e S t a t e = " P e n d i n g " > A d j P r o f i t C o m m i s s i o n A m t < / A d j P r o f i t C o m m i s s i o n A m t > - 
-         < A d j P r o f i t C o m m i s s i o n A m t _ C o n t r o l 4 5 C a p t i o n   E l e m e n t T y p e = " C o l u m n "   E l e m e n t I d = " 6 2 1 2 7 7 8 5 4 "   D a t a T y p e = " L a b e l "   O b s o l e t e S t a t e = " P e n d i n g " > A d j P r o f i t C o m m i s s i o n A m t _ C o n t r o l 4 5 C a p t i o n < / A d j P r o f i t C o m m i s s i o n A m t _ C o n t r o l 4 5 C a p t i o n > - 
-         < A d j P r o f i t _ C o n t r o l 3 9 C a p t i o n   E l e m e n t T y p e = " C o l u m n "   E l e m e n t I d = " 2 1 3 3 9 8 4 3 2 "   D a t a T y p e = " L a b e l "   O b s o l e t e S t a t e = " P e n d i n g " > A d j P r o f i t _ C o n t r o l 3 9 C a p t i o n < / A d j P r o f i t _ C o n t r o l 3 9 C a p t i o n > - 
-         < A l l _ a m o u n t s _ a r e _ i n _ L C Y C a p t i o n   E l e m e n t T y p e = " C o l u m n "   E l e m e n t I d = " 6 9 7 4 8 4 8 0 2 "   D a t a T y p e = " L a b e l "   O b s o l e t e S t a t e = " P e n d i n g " > A l l _ a m o u n t s _ a r e _ i n _ L C Y C a p t i o n < / A l l _ a m o u n t s _ a r e _ i n _ L C Y C a p t i o n > - 
-         < C O M P A N Y N A M E   E l e m e n t T y p e = " C o l u m n "   E l e m e n t I d = " 1 7 5 3 0 1 5 1 5 5 "   D a t a T y p e = " S t r i n g "   O b s o l e t e S t a t e = " P e n d i n g " > C O M P A N Y N A M E < / C O M P A N Y N A M E > - 
-         < C u r r R e p o r t _ P A G E N O C a p t i o n   E l e m e n t T y p e = " C o l u m n "   E l e m e n t I d = " 1 8 4 6 2 6 2 1 5 8 "   D a t a T y p e = " L a b e l "   O b s o l e t e S t a t e = " P e n d i n g " > C u r r R e p o r t _ P A G E N O C a p t i o n < / C u r r R e p o r t _ P A G E N O C a p t i o n > - 
-         < C u s t L e d g E n t r y F i l t e r   E l e m e n t T y p e = " C o l u m n "   E l e m e n t I d = " 1 1 7 3 5 3 2 6 6 6 "   D a t a T y p e = " T e x t "   O b s o l e t e S t a t e = " P e n d i n g " > C u s t L e d g E n t r y F i l t e r < / C u s t L e d g E n t r y F i l t e r > - 
-         < C u s t _ _ L e d g e r _ E n t r y _ _ C u s t o m e r _ N o _ _ C a p t i o n   E l e m e n t T y p e = " C o l u m n "   E l e m e n t I d = " 1 2 2 3 8 5 6 2 7 8 "   D a t a T y p e = " S t r i n g "   O b s o l e t e S t a t e = " P e n d i n g " > C u s t _ _ L e d g e r _ E n t r y _ _ C u s t o m e r _ N o _ _ C a p t i o n < / C u s t _ _ L e d g e r _ E n t r y _ _ C u s t o m e r _ N o _ _ C a p t i o n > - 
-         < C u s t _ _ L e d g e r _ E n t r y _ _ D o c u m e n t _ N o _ _ C a p t i o n   E l e m e n t T y p e = " C o l u m n "   E l e m e n t I d = " 4 8 8 8 0 6 5 1 7 "   D a t a T y p e = " S t r i n g "   O b s o l e t e S t a t e = " P e n d i n g " > C u s t _ _ L e d g e r _ E n t r y _ _ D o c u m e n t _ N o _ _ C a p t i o n < / C u s t _ _ L e d g e r _ E n t r y _ _ D o c u m e n t _ N o _ _ C a p t i o n > - 
-         < C u s t _ _ L e d g e r _ E n t r y _ _ P o s t i n g _ D a t e _ C a p t i o n   E l e m e n t T y p e = " C o l u m n "   E l e m e n t I d = " 2 0 7 9 4 3 8 7 1 2 "   D a t a T y p e = " L a b e l "   O b s o l e t e S t a t e = " P e n d i n g " > C u s t _ _ L e d g e r _ E n t r y _ _ P o s t i n g _ D a t e _ C a p t i o n < / C u s t _ _ L e d g e r _ E n t r y _ _ P o s t i n g _ D a t e _ C a p t i o n > - 
-         < C u s t _ _ L e d g e r _ E n t r y _ _ P r o f i t _ _ L C Y _ _ C a p t i o n   E l e m e n t T y p e = " C o l u m n "   E l e m e n t I d = " 1 9 9 4 3 8 8 4 7 6 "   D a t a T y p e = " S t r i n g "   O b s o l e t e S t a t e = " P e n d i n g " > C u s t _ _ L e d g e r _ E n t r y _ _ P r o f i t _ _ L C Y _ _ C a p t i o n < / C u s t _ _ L e d g e r _ E n t r y _ _ P r o f i t _ _ L C Y _ _ C a p t i o n > - 
-         < C u s t _ _ L e d g e r _ E n t r y _ _ S a l e s _ _ L C Y _ _ C a p t i o n   E l e m e n t T y p e = " C o l u m n "   E l e m e n t I d = " 1 0 5 6 9 2 6 5 4 6 "   D a t a T y p e = " S t r i n g "   O b s o l e t e S t a t e = " P e n d i n g " > C u s t _ _ L e d g e r _ E n t r y _ _ S a l e s _ _ L C Y _ _ C a p t i o n < / C u s t _ _ L e d g e r _ E n t r y _ _ S a l e s _ _ L C Y _ _ C a p t i o n > - 
-         < C u s t _ _ L e d g e r _ E n t r y _ _ T A B L E C A P T I O N _ _ _ _ _ _ _ _ _ _ C u s t L e d g E n t r y F i l t e r   E l e m e n t T y p e = " C o l u m n "   E l e m e n t I d = " 7 1 0 6 3 3 9 1 7 "   D a t a T y p e = " T e x t " > C u s t _ _ L e d g e r _ E n t r y _ _ T A B L E C A P T I O N _ _ _ _ _ _ _ _ _ _ C u s t L e d g E n t r y F i l t e r < / C u s t _ _ L e d g e r _ E n t r y _ _ T A B L E C A P T I O N _ _ _ _ _ _ _ _ _ _ C u s t L e d g E n t r y F i l t e r > - 
-         < C u s t _ _ L e d g e r _ E n t r y _ _ _ P r o f i t _ _ L C Y _ _   E l e m e n t T y p e = " C o l u m n "   E l e m e n t I d = " 1 6 1 5 1 3 7 4 4 3 "   D a t a T y p e = " D e c i m a l "   O b s o l e t e S t a t e = " P e n d i n g " > C u s t _ _ L e d g e r _ E n t r y _ _ _ P r o f i t _ _ L C Y _ _ < / C u s t _ _ L e d g e r _ E n t r y _ _ _ P r o f i t _ _ L C Y _ _ > - 
-         < C u s t _ _ L e d g e r _ E n t r y _ _ _ S a l e s _ _ L C Y _ _   E l e m e n t T y p e = " C o l u m n "   E l e m e n t I d = " 3 4 8 7 9 4 9 4 9 "   D a t a T y p e = " D e c i m a l "   O b s o l e t e S t a t e = " P e n d i n g " > C u s t _ _ L e d g e r _ E n t r y _ _ _ S a l e s _ _ L C Y _ _ < / C u s t _ _ L e d g e r _ E n t r y _ _ _ S a l e s _ _ L C Y _ _ > - 
-         < P a g e G r o u p N o   E l e m e n t T y p e = " C o l u m n "   E l e m e n t I d = " 6 4 9 1 8 0 1 4 4 "   D a t a T y p e = " I n t e g e r "   O b s o l e t e S t a t e = " P e n d i n g " > P a g e G r o u p N o < / P a g e G r o u p N o > - 
-         < P r o f i t C o m m i s s i o n A m t   E l e m e n t T y p e = " C o l u m n "   E l e m e n t I d = " 4 1 6 2 2 4 2 0 6 "   D a t a T y p e = " D e c i m a l "   O b s o l e t e S t a t e = " P e n d i n g " > P r o f i t C o m m i s s i o n A m t < / P r o f i t C o m m i s s i o n A m t > - 
-         < P r o f i t C o m m i s s i o n A m t _ C o n t r o l 3 3 C a p t i o n   E l e m e n t T y p e = " C o l u m n "   E l e m e n t I d = " 4 6 5 8 1 2 5 3 6 "   D a t a T y p e = " L a b e l "   O b s o l e t e S t a t e = " P e n d i n g " > P r o f i t C o m m i s s i o n A m t _ C o n t r o l 3 3 C a p t i o n < / P r o f i t C o m m i s s i o n A m t _ C o n t r o l 3 3 C a p t i o n > - 
-         < S a l e s C o m m i s s i o n A m t   E l e m e n t T y p e = " C o l u m n "   E l e m e n t I d = " 1 6 5 6 6 7 5 0 1 6 "   D a t a T y p e = " D e c i m a l "   O b s o l e t e S t a t e = " P e n d i n g " > S a l e s C o m m i s s i o n A m t < / S a l e s C o m m i s s i o n A m t > - 
-         < S a l e s C o m m i s s i o n A m t _ C o n t r o l 3 2 C a p t i o n   E l e m e n t T y p e = " C o l u m n "   E l e m e n t I d = " 1 2 7 2 6 4 2 0 6 5 "   D a t a T y p e = " L a b e l "   O b s o l e t e S t a t e = " P e n d i n g " > S a l e s C o m m i s s i o n A m t _ C o n t r o l 3 2 C a p t i o n < / S a l e s C o m m i s s i o n A m t _ C o n t r o l 3 2 C a p t i o n > - 
-         < S a l e s p e r s o n F i l t e r   E l e m e n t T y p e = " C o l u m n "   E l e m e n t I d = " 1 2 4 2 2 8 3 2 5 6 "   D a t a T y p e = " T e x t "   O b s o l e t e S t a t e = " P e n d i n g " > S a l e s p e r s o n F i l t e r < / S a l e s p e r s o n F i l t e r > - 
-         < S a l e s p e r s o n _ P u r c h a s e r _ C o d e   E l e m e n t T y p e = " C o l u m n "   E l e m e n t I d = " 1 3 8 8 0 3 1 6 5 2 "   D a t a T y p e = " C o d e " > S a l e s p e r s o n _ P u r c h a s e r _ C o d e < / S a l e s p e r s o n _ P u r c h a s e r _ C o d e > - 
-         < S a l e s p e r s o n _ P u r c h a s e r _ N a m e   E l e m e n t T y p e = " C o l u m n "   E l e m e n t I d = " 1 3 4 8 2 2 8 4 6 2 "   D a t a T y p e = " T e x t " > S a l e s p e r s o n _ P u r c h a s e r _ N a m e < / S a l e s p e r s o n _ P u r c h a s e r _ N a m e > - 
-         < S a l e s p e r s o n _ P u r c h a s e r _ _ C o m m i s s i o n _ _ _   E l e m e n t T y p e = " C o l u m n "   E l e m e n t I d = " 1 5 9 0 6 8 9 0 0 4 "   D a t a T y p e = " D e c i m a l " > S a l e s p e r s o n _ P u r c h a s e r _ _ C o m m i s s i o n _ _ _ < / S a l e s p e r s o n _ P u r c h a s e r _ _ C o m m i s s i o n _ _ _ > - 
-         < S a l e s p e r s o n _ P u r c h a s e r _ _ C o m m i s s i o n _ _ _ C a p t i o n   E l e m e n t T y p e = " C o l u m n "   E l e m e n t I d = " 4 9 9 4 6 3 1 7 0 "   D a t a T y p e = " S t r i n g "   O b s o l e t e S t a t e = " P e n d i n g " > S a l e s p e r s o n _ P u r c h a s e r _ _ C o m m i s s i o n _ _ _ C a p t i o n < / S a l e s p e r s o n _ P u r c h a s e r _ _ C o m m i s s i o n _ _ _ C a p t i o n > - 
-         < S a l e s p e r s o n _ P u r c h a s e r _ _ T A B L E C A P T I O N _ _ _ _ _ _ _ _ _ _ S a l e s p e r s o n F i l t e r   E l e m e n t T y p e = " C o l u m n "   E l e m e n t I d = " 1 0 1 6 0 4 1 6 9 9 "   D a t a T y p e = " T e x t " > S a l e s p e r s o n _ P u r c h a s e r _ _ T A B L E C A P T I O N _ _ _ _ _ _ _ _ _ _ S a l e s p e r s o n F i l t e r < / S a l e s p e r s o n _ P u r c h a s e r _ _ T A B L E C A P T I O N _ _ _ _ _ _ _ _ _ _ S a l e s p e r s o n F i l t e r > - 
-         < S a l e s p e r s o n _ _ _ C o m m i s s i o n C a p t i o n   E l e m e n t T y p e = " C o l u m n "   E l e m e n t I d = " 1 7 6 9 4 7 1 9 4 8 "   D a t a T y p e = " L a b e l "   O b s o l e t e S t a t e = " P e n d i n g " > S a l e s p e r s o n _ _ _ C o m m i s s i o n C a p t i o n < / S a l e s p e r s o n _ _ _ C o m m i s s i o n C a p t i o n > - 
-         < S T R S U B S T N O _ T e x t 0 0 0 _ P e r i o d T e x t _   E l e m e n t T y p e = " C o l u m n "   E l e m e n t I d = " 7 2 2 9 9 1 7 0 4 "   D a t a T y p e = " S t r i n g " > S T R S U B S T N O _ T e x t 0 0 0 _ P e r i o d T e x t _ < / S T R S U B S T N O _ T e x t 0 0 0 _ P e r i o d T e x t _ > - 
-         < T o t a l C a p t i o n   E l e m e n t T y p e = " C o l u m n "   E l e m e n t I d = " 7 0 7 1 0 2 6 9 5 "   D a t a T y p e = " L a b e l "   O b s o l e t e S t a t e = " P e n d i n g " > T o t a l C a p t i o n < / T o t a l C a p t i o n > - 
-         < C u s t _ L e d g e r _ E n t r y   E l e m e n t T y p e = " D a t a I t e m "   E l e m e n t I d = " 1 6 3 9 1 4 6 4 4 5 " > - 
-             < A d j P r o f i t C o m m i s s i o n A m t _ C o n t r o l 4 5   E l e m e n t T y p e = " C o l u m n "   E l e m e n t I d = " 8 0 5 8 9 6 4 0 0 "   D a t a T y p e = " D e c i m a l " > A d j P r o f i t C o m m i s s i o n A m t _ C o n t r o l 4 5 < / A d j P r o f i t C o m m i s s i o n A m t _ C o n t r o l 4 5 > - 
-             < A d j P r o f i t _ C o n t r o l 3 9   E l e m e n t T y p e = " C o l u m n "   E l e m e n t I d = " 2 0 2 4 1 9 6 5 4 2 "   D a t a T y p e = " D e c i m a l " > A d j P r o f i t _ C o n t r o l 3 9 < / A d j P r o f i t _ C o n t r o l 3 9 > - 
-             < C u s t L e d g e r E n t r y _ C u s t o m e r N a m e   E l e m e n t T y p e = " C o l u m n "   E l e m e n t I d = " 2 0 9 1 8 9 3 2 7 9 "   D a t a T y p e = " T e x t " > C u s t L e d g e r E n t r y _ C u s t o m e r N a m e < / C u s t L e d g e r E n t r y _ C u s t o m e r N a m e > - 
-             < C u s t _ _ L e d g e r _ E n t r y _ _ C u s t o m e r _ N o _ _   E l e m e n t T y p e = " C o l u m n "   E l e m e n t I d = " 1 0 0 9 0 1 6 8 0 8 "   D a t a T y p e = " C o d e " > C u s t _ _ L e d g e r _ E n t r y _ _ C u s t o m e r _ N o _ _ < / C u s t _ _ L e d g e r _ E n t r y _ _ C u s t o m e r _ N o _ _ > - 
-             < C u s t _ _ L e d g e r _ E n t r y _ _ D o c u m e n t _ N o _ _   E l e m e n t T y p e = " C o l u m n "   E l e m e n t I d = " 8 5 2 6 1 1 1 8 1 "   D a t a T y p e = " C o d e " > C u s t _ _ L e d g e r _ E n t r y _ _ D o c u m e n t _ N o _ _ < / C u s t _ _ L e d g e r _ E n t r y _ _ D o c u m e n t _ N o _ _ > - 
-             < C u s t _ _ L e d g e r _ E n t r y _ _ P o s t i n g _ D a t e _   E l e m e n t T y p e = " C o l u m n "   E l e m e n t I d = " 2 1 4 2 6 5 7 1 6 2 "   D a t a T y p e = " S t r i n g " > C u s t _ _ L e d g e r _ E n t r y _ _ P o s t i n g _ D a t e _ < / C u s t _ _ L e d g e r _ E n t r y _ _ P o s t i n g _ D a t e _ > - 
-             < C u s t _ _ L e d g e r _ E n t r y _ _ P r o f i t _ _ L C Y _ _   E l e m e n t T y p e = " C o l u m n "   E l e m e n t I d = " 5 1 9 3 4 1 8 2 6 "   D a t a T y p e = " D e c i m a l " > C u s t _ _ L e d g e r _ E n t r y _ _ P r o f i t _ _ L C Y _ _ < / C u s t _ _ L e d g e r _ E n t r y _ _ P r o f i t _ _ L C Y _ _ > - 
-             < C u s t _ _ L e d g e r _ E n t r y _ _ S a l e s _ _ L C Y _ _   E l e m e n t T y p e = " C o l u m n "   E l e m e n t I d = " 8 1 9 5 1 7 4 8 "   D a t a T y p e = " D e c i m a l " > C u s t _ _ L e d g e r _ E n t r y _ _ S a l e s _ _ L C Y _ _ < / C u s t _ _ L e d g e r _ E n t r y _ _ S a l e s _ _ L C Y _ _ > - 
-             < P r o f i t C o m m i s s i o n A m t _ C o n t r o l 3 3   E l e m e n t T y p e = " C o l u m n "   E l e m e n t I d = " 3 1 2 1 8 6 8 2 6 "   D a t a T y p e = " D e c i m a l " > P r o f i t C o m m i s s i o n A m t _ C o n t r o l 3 3 < / P r o f i t C o m m i s s i o n A m t _ C o n t r o l 3 3 > - 
-             < S a l e s C o m m i s s i o n A m t _ C o n t r o l 3 2   E l e m e n t T y p e = " C o l u m n "   E l e m e n t I d = " 1 4 6 2 3 9 0 1 5 3 "   D a t a T y p e = " D e c i m a l " > S a l e s C o m m i s s i o n A m t _ C o n t r o l 3 2 < / S a l e s C o m m i s s i o n A m t _ C o n t r o l 3 2 > - 
-             < S a l e s p e r s o n P u r c h a s e r _ C o d e   E l e m e n t T y p e = " C o l u m n "   E l e m e n t I d = " 1 2 2 1 2 1 9 2 4 5 "   D a t a T y p e = " C o d e " > S a l e s p e r s o n P u r c h a s e r _ C o d e < / S a l e s p e r s o n P u r c h a s e r _ C o d e > - 
-             < S a l e s p e r s o n _ P u r c h a s e r _ _ N a m e   E l e m e n t T y p e = " C o l u m n "   E l e m e n t I d = " 1 1 9 5 8 7 9 8 7 3 "   D a t a T y p e = " T e x t " > S a l e s p e r s o n _ P u r c h a s e r _ _ N a m e < / S a l e s p e r s o n _ P u r c h a s e r _ _ N a m e > +     < S a l e s p e r s o n _ P u r c h a s e r > + 
+         < A d j P r o f i t > A d j P r o f i t < / A d j P r o f i t > + 
+         < A d j P r o f i t C o m m i s s i o n A m t > A d j P r o f i t C o m m i s s i o n A m t < / A d j P r o f i t C o m m i s s i o n A m t > + 
+         < A d j P r o f i t C o m m i s s i o n A m t _ C o n t r o l 4 5 C a p t i o n > A d j P r o f i t C o m m i s s i o n A m t _ C o n t r o l 4 5 C a p t i o n < / A d j P r o f i t C o m m i s s i o n A m t _ C o n t r o l 4 5 C a p t i o n > + 
+         < A d j P r o f i t _ C o n t r o l 3 9 C a p t i o n > A d j P r o f i t _ C o n t r o l 3 9 C a p t i o n < / A d j P r o f i t _ C o n t r o l 3 9 C a p t i o n > + 
+         < A l l _ a m o u n t s _ a r e _ i n _ L C Y C a p t i o n > A l l _ a m o u n t s _ a r e _ i n _ L C Y C a p t i o n < / A l l _ a m o u n t s _ a r e _ i n _ L C Y C a p t i o n > + 
+         < C O M P A N Y N A M E > C O M P A N Y N A M E < / C O M P A N Y N A M E > + 
+         < C u r r R e p o r t _ P A G E N O C a p t i o n > C u r r R e p o r t _ P A G E N O C a p t i o n < / C u r r R e p o r t _ P A G E N O C a p t i o n > + 
+         < C u s t L e d g E n t r y F i l t e r > C u s t L e d g E n t r y F i l t e r < / C u s t L e d g E n t r y F i l t e r > + 
+         < C u s t _ _ L e d g e r _ E n t r y _ _ C u s t o m e r _ N o _ _ C a p t i o n > C u s t _ _ L e d g e r _ E n t r y _ _ C u s t o m e r _ N o _ _ C a p t i o n < / C u s t _ _ L e d g e r _ E n t r y _ _ C u s t o m e r _ N o _ _ C a p t i o n > + 
+         < C u s t _ _ L e d g e r _ E n t r y _ _ D o c u m e n t _ N o _ _ C a p t i o n > C u s t _ _ L e d g e r _ E n t r y _ _ D o c u m e n t _ N o _ _ C a p t i o n < / C u s t _ _ L e d g e r _ E n t r y _ _ D o c u m e n t _ N o _ _ C a p t i o n > + 
+         < C u s t _ _ L e d g e r _ E n t r y _ _ P o s t i n g _ D a t e _ C a p t i o n > C u s t _ _ L e d g e r _ E n t r y _ _ P o s t i n g _ D a t e _ C a p t i o n < / C u s t _ _ L e d g e r _ E n t r y _ _ P o s t i n g _ D a t e _ C a p t i o n > + 
+         < C u s t _ _ L e d g e r _ E n t r y _ _ P r o f i t _ _ L C Y _ _ C a p t i o n > C u s t _ _ L e d g e r _ E n t r y _ _ P r o f i t _ _ L C Y _ _ C a p t i o n < / C u s t _ _ L e d g e r _ E n t r y _ _ P r o f i t _ _ L C Y _ _ C a p t i o n > + 
+         < C u s t _ _ L e d g e r _ E n t r y _ _ S a l e s _ _ L C Y _ _ C a p t i o n > C u s t _ _ L e d g e r _ E n t r y _ _ S a l e s _ _ L C Y _ _ C a p t i o n < / C u s t _ _ L e d g e r _ E n t r y _ _ S a l e s _ _ L C Y _ _ C a p t i o n > + 
+         < C u s t _ _ L e d g e r _ E n t r y _ _ T A B L E C A P T I O N _ _ _ _ _ _ _ _ _ _ C u s t L e d g E n t r y F i l t e r > C u s t _ _ L e d g e r _ E n t r y _ _ T A B L E C A P T I O N _ _ _ _ _ _ _ _ _ _ C u s t L e d g E n t r y F i l t e r < / C u s t _ _ L e d g e r _ E n t r y _ _ T A B L E C A P T I O N _ _ _ _ _ _ _ _ _ _ C u s t L e d g E n t r y F i l t e r > + 
+         < C u s t _ _ L e d g e r _ E n t r y _ _ _ P r o f i t _ _ L C Y _ _ > C u s t _ _ L e d g e r _ E n t r y _ _ _ P r o f i t _ _ L C Y _ _ < / C u s t _ _ L e d g e r _ E n t r y _ _ _ P r o f i t _ _ L C Y _ _ > + 
+         < C u s t _ _ L e d g e r _ E n t r y _ _ _ S a l e s _ _ L C Y _ _ > C u s t _ _ L e d g e r _ E n t r y _ _ _ S a l e s _ _ L C Y _ _ < / C u s t _ _ L e d g e r _ E n t r y _ _ _ S a l e s _ _ L C Y _ _ > + 
+         < P a g e G r o u p N o > P a g e G r o u p N o < / P a g e G r o u p N o > + 
+         < P r o f i t C o m m i s s i o n A m t > P r o f i t C o m m i s s i o n A m t < / P r o f i t C o m m i s s i o n A m t > + 
+         < P r o f i t C o m m i s s i o n A m t _ C o n t r o l 3 3 C a p t i o n > P r o f i t C o m m i s s i o n A m t _ C o n t r o l 3 3 C a p t i o n < / P r o f i t C o m m i s s i o n A m t _ C o n t r o l 3 3 C a p t i o n > + 
+         < S a l e s C o m m i s s i o n A m t > S a l e s C o m m i s s i o n A m t < / S a l e s C o m m i s s i o n A m t > + 
+         < S a l e s C o m m i s s i o n A m t _ C o n t r o l 3 2 C a p t i o n > S a l e s C o m m i s s i o n A m t _ C o n t r o l 3 2 C a p t i o n < / S a l e s C o m m i s s i o n A m t _ C o n t r o l 3 2 C a p t i o n > + 
+         < S a l e s p e r s o n F i l t e r > S a l e s p e r s o n F i l t e r < / S a l e s p e r s o n F i l t e r > + 
+         < S a l e s p e r s o n _ P u r c h a s e r _ C o d e > S a l e s p e r s o n _ P u r c h a s e r _ C o d e < / S a l e s p e r s o n _ P u r c h a s e r _ C o d e > + 
+         < S a l e s p e r s o n _ P u r c h a s e r _ N a m e > S a l e s p e r s o n _ P u r c h a s e r _ N a m e < / S a l e s p e r s o n _ P u r c h a s e r _ N a m e > + 
+         < S a l e s p e r s o n _ P u r c h a s e r _ _ C o m m i s s i o n _ _ _ > S a l e s p e r s o n _ P u r c h a s e r _ _ C o m m i s s i o n _ _ _ < / S a l e s p e r s o n _ P u r c h a s e r _ _ C o m m i s s i o n _ _ _ > + 
+         < S a l e s p e r s o n _ P u r c h a s e r _ _ C o m m i s s i o n _ _ _ C a p t i o n > S a l e s p e r s o n _ P u r c h a s e r _ _ C o m m i s s i o n _ _ _ C a p t i o n < / S a l e s p e r s o n _ P u r c h a s e r _ _ C o m m i s s i o n _ _ _ C a p t i o n > + 
+         < S a l e s p e r s o n _ P u r c h a s e r _ _ T A B L E C A P T I O N _ _ _ _ _ _ _ _ _ _ S a l e s p e r s o n F i l t e r > S a l e s p e r s o n _ P u r c h a s e r _ _ T A B L E C A P T I O N _ _ _ _ _ _ _ _ _ _ S a l e s p e r s o n F i l t e r < / S a l e s p e r s o n _ P u r c h a s e r _ _ T A B L E C A P T I O N _ _ _ _ _ _ _ _ _ _ S a l e s p e r s o n F i l t e r > + 
+         < S a l e s p e r s o n _ _ _ C o m m i s s i o n C a p t i o n > S a l e s p e r s o n _ _ _ C o m m i s s i o n C a p t i o n < / S a l e s p e r s o n _ _ _ C o m m i s s i o n C a p t i o n > + 
+         < S T R S U B S T N O _ T e x t 0 0 0 _ P e r i o d T e x t _ > S T R S U B S T N O _ T e x t 0 0 0 _ P e r i o d T e x t _ < / S T R S U B S T N O _ T e x t 0 0 0 _ P e r i o d T e x t _ > + 
+         < T o t a l C a p t i o n > T o t a l C a p t i o n < / T o t a l C a p t i o n > + 
+         < C u s t _ L e d g e r _ E n t r y > + 
+             < A d j P r o f i t C o m m i s s i o n A m t _ C o n t r o l 4 5 > A d j P r o f i t C o m m i s s i o n A m t _ C o n t r o l 4 5 < / A d j P r o f i t C o m m i s s i o n A m t _ C o n t r o l 4 5 > + 
+             < A d j P r o f i t _ C o n t r o l 3 9 > A d j P r o f i t _ C o n t r o l 3 9 < / A d j P r o f i t _ C o n t r o l 3 9 > + 
+             < C u s t L e d g e r E n t r y _ C u s t o m e r N a m e > C u s t L e d g e r E n t r y _ C u s t o m e r N a m e < / C u s t L e d g e r E n t r y _ C u s t o m e r N a m e > + 
+             < C u s t _ _ L e d g e r _ E n t r y _ _ C u s t o m e r _ N o _ _ > C u s t _ _ L e d g e r _ E n t r y _ _ C u s t o m e r _ N o _ _ < / C u s t _ _ L e d g e r _ E n t r y _ _ C u s t o m e r _ N o _ _ > + 
+             < C u s t _ _ L e d g e r _ E n t r y _ _ D o c u m e n t _ N o _ _ > C u s t _ _ L e d g e r _ E n t r y _ _ D o c u m e n t _ N o _ _ < / C u s t _ _ L e d g e r _ E n t r y _ _ D o c u m e n t _ N o _ _ > + 
+             < C u s t _ _ L e d g e r _ E n t r y _ _ P o s t i n g _ D a t e _ > C u s t _ _ L e d g e r _ E n t r y _ _ P o s t i n g _ D a t e _ < / C u s t _ _ L e d g e r _ E n t r y _ _ P o s t i n g _ D a t e _ > + 
+             < C u s t _ _ L e d g e r _ E n t r y _ _ P r o f i t _ _ L C Y _ _ > C u s t _ _ L e d g e r _ E n t r y _ _ P r o f i t _ _ L C Y _ _ < / C u s t _ _ L e d g e r _ E n t r y _ _ P r o f i t _ _ L C Y _ _ > + 
+             < C u s t _ _ L e d g e r _ E n t r y _ _ S a l e s _ _ L C Y _ _ > C u s t _ _ L e d g e r _ E n t r y _ _ S a l e s _ _ L C Y _ _ < / C u s t _ _ L e d g e r _ E n t r y _ _ S a l e s _ _ L C Y _ _ > + 
+             < P r o f i t C o m m i s s i o n A m t _ C o n t r o l 3 3 > P r o f i t C o m m i s s i o n A m t _ C o n t r o l 3 3 < / P r o f i t C o m m i s s i o n A m t _ C o n t r o l 3 3 > + 
+             < S a l e s C o m m i s s i o n A m t _ C o n t r o l 3 2 > S a l e s C o m m i s s i o n A m t _ C o n t r o l 3 2 < / S a l e s C o m m i s s i o n A m t _ C o n t r o l 3 2 > + 
+             < S a l e s p e r s o n P u r c h a s e r _ C o d e > S a l e s p e r s o n P u r c h a s e r _ C o d e < / S a l e s p e r s o n P u r c h a s e r _ C o d e > + 
+             < S a l e s p e r s o n _ P u r c h a s e r _ _ N a m e > S a l e s p e r s o n _ P u r c h a s e r _ _ N a m e < / S a l e s p e r s o n _ P u r c h a s e r _ _ N a m e >   
          < / C u s t _ L e d g e r _ E n t r y >   
-         < S u b t o t a l s   E l e m e n t T y p e = " D a t a I t e m "   E l e m e n t I d = " 8 3 8 6 9 3 5 6 0 " > - 
-             < S u b t o t a l s _ A d j P r o f i t   E l e m e n t T y p e = " C o l u m n "   E l e m e n t I d = " 5 6 1 3 6 6 8 2 2 "   D a t a T y p e = " D e c i m a l " > S u b t o t a l s _ A d j P r o f i t < / S u b t o t a l s _ A d j P r o f i t > - 
-             < S u b t o t a l s _ A d j P r o f i t C o m m i s s i o n   E l e m e n t T y p e = " C o l u m n "   E l e m e n t I d = " 1 4 1 8 9 7 1 8 3 5 "   D a t a T y p e = " D e c i m a l " > S u b t o t a l s _ A d j P r o f i t C o m m i s s i o n < / S u b t o t a l s _ A d j P r o f i t C o m m i s s i o n > - 
-             < S u b t o t a l s _ P r o f i t   E l e m e n t T y p e = " C o l u m n "   E l e m e n t I d = " 2 4 1 5 0 0 6 9 7 "   D a t a T y p e = " D e c i m a l " > S u b t o t a l s _ P r o f i t < / S u b t o t a l s _ P r o f i t > - 
-             < S u b t o t a l s _ P r o f i t C o m m i s s i o n   E l e m e n t T y p e = " C o l u m n "   E l e m e n t I d = " 1 4 9 6 3 3 2 1 7 2 "   D a t a T y p e = " D e c i m a l " > S u b t o t a l s _ P r o f i t C o m m i s s i o n < / S u b t o t a l s _ P r o f i t C o m m i s s i o n > - 
-             < S u b t o t a l s _ S a l e s   E l e m e n t T y p e = " C o l u m n "   E l e m e n t I d = " 1 9 7 8 7 7 5 0 3 "   D a t a T y p e = " D e c i m a l " > S u b t o t a l s _ S a l e s < / S u b t o t a l s _ S a l e s > - 
-             < S u b t o t a l s _ S a l e s C o m m i s s i o n   E l e m e n t T y p e = " C o l u m n "   E l e m e n t I d = " 1 4 7 6 0 7 2 5 9 0 "   D a t a T y p e = " D e c i m a l " > S u b t o t a l s _ S a l e s C o m m i s s i o n < / S u b t o t a l s _ S a l e s C o m m i s s i o n > - 
-             < S u b t o t a l s _ S a l e s p e r s o n _ C o d e   E l e m e n t T y p e = " C o l u m n "   E l e m e n t I d = " 1 1 9 8 5 9 4 2 7 2 "   D a t a T y p e = " C o d e " > S u b t o t a l s _ S a l e s p e r s o n _ C o d e < / S u b t o t a l s _ S a l e s p e r s o n _ C o d e > +         < S u b t o t a l s > + 
+             < S u b t o t a l s _ A d j P r o f i t > S u b t o t a l s _ A d j P r o f i t < / S u b t o t a l s _ A d j P r o f i t > + 
+             < S u b t o t a l s _ A d j P r o f i t C o m m i s s i o n > S u b t o t a l s _ A d j P r o f i t C o m m i s s i o n < / S u b t o t a l s _ A d j P r o f i t C o m m i s s i o n > + 
+             < S u b t o t a l s _ P r o f i t > S u b t o t a l s _ P r o f i t < / S u b t o t a l s _ P r o f i t > + 
+             < S u b t o t a l s _ P r o f i t C o m m i s s i o n > S u b t o t a l s _ P r o f i t C o m m i s s i o n < / S u b t o t a l s _ P r o f i t C o m m i s s i o n > + 
+             < S u b t o t a l s _ S a l e s > S u b t o t a l s _ S a l e s < / S u b t o t a l s _ S a l e s > + 
+             < S u b t o t a l s _ S a l e s C o m m i s s i o n > S u b t o t a l s _ S a l e s C o m m i s s i o n < / S u b t o t a l s _ S a l e s C o m m i s s i o n > + 
+             < S u b t o t a l s _ S a l e s p e r s o n _ C o d e > S u b t o t a l s _ S a l e s p e r s o n _ C o d e < / S u b t o t a l s _ S a l e s p e r s o n _ C o d e >   
          < / S u b t o t a l s >   
      < / S a l e s p e r s o n _ P u r c h a s e r >   
-     < T o t a l s   E l e m e n t T y p e = " D a t a I t e m "   E l e m e n t I d = " 1 8 2 3 9 5 0 0 4 4 " > - 
-         < T o t a l s _ A d j P r o f i t   E l e m e n t T y p e = " C o l u m n "   E l e m e n t I d = " 1 9 0 9 5 0 1 3 6 2 "   D a t a T y p e = " D e c i m a l " > T o t a l s _ A d j P r o f i t < / T o t a l s _ A d j P r o f i t > - 
-         < T o t a l s _ A d j P r o f i t C o m m i s s i o n   E l e m e n t T y p e = " C o l u m n "   E l e m e n t I d = " 9 4 6 1 0 3 7 5 9 "   D a t a T y p e = " D e c i m a l " > T o t a l s _ A d j P r o f i t C o m m i s s i o n < / T o t a l s _ A d j P r o f i t C o m m i s s i o n > - 
-         < T o t a l s _ P r o f i t   E l e m e n t T y p e = " C o l u m n "   E l e m e n t I d = " 6 4 6 2 9 5 2 1 9 "   D a t a T y p e = " D e c i m a l " > T o t a l s _ P r o f i t < / T o t a l s _ P r o f i t > - 
-         < T o t a l s _ P r o f i t C o m m i s s i o n   E l e m e n t T y p e = " C o l u m n "   E l e m e n t I d = " 3 6 7 7 9 1 3 9 2 "   D a t a T y p e = " D e c i m a l " > T o t a l s _ P r o f i t C o m m i s s i o n < / T o t a l s _ P r o f i t C o m m i s s i o n > - 
-         < T o t a l s _ S a l e s   E l e m e n t T y p e = " C o l u m n "   E l e m e n t I d = " 1 3 9 9 9 8 5 1 0 9 "   D a t a T y p e = " D e c i m a l " > T o t a l s _ S a l e s < / T o t a l s _ S a l e s > - 
-         < T o t a l s _ S a l e s C o m m i s s i o n   E l e m e n t T y p e = " C o l u m n "   E l e m e n t I d = " 4 6 4 8 2 3 3 9 8 "   D a t a T y p e = " D e c i m a l " > T o t a l s _ S a l e s C o m m i s s i o n < / T o t a l s _ S a l e s C o m m i s s i o n > +     < T o t a l s > + 
+         < T o t a l s _ A d j P r o f i t > T o t a l s _ A d j P r o f i t < / T o t a l s _ A d j P r o f i t > + 
+         < T o t a l s _ A d j P r o f i t C o m m i s s i o n > T o t a l s _ A d j P r o f i t C o m m i s s i o n < / T o t a l s _ A d j P r o f i t C o m m i s s i o n > + 
+         < T o t a l s _ P r o f i t > T o t a l s _ P r o f i t < / T o t a l s _ P r o f i t > + 
+         < T o t a l s _ P r o f i t C o m m i s s i o n > T o t a l s _ P r o f i t C o m m i s s i o n < / T o t a l s _ P r o f i t C o m m i s s i o n > + 
+         < T o t a l s _ S a l e s > T o t a l s _ S a l e s < / T o t a l s _ S a l e s > + 
+         < T o t a l s _ S a l e s C o m m i s s i o n > T o t a l s _ S a l e s C o m m i s s i o n < / T o t a l s _ S a l e s C o m m i s s i o n >   
      < / T o t a l s >   
@@ -4704,17 +4640,17 @@
 </file>
 
 <file path=customXml/itemProps1.xml><?xml version="1.0" encoding="utf-8"?>
-<ds:datastoreItem xmlns:ds="http://schemas.openxmlformats.org/officeDocument/2006/customXml" ds:itemID="{79D6D75F-D29A-40D3-A819-B215617F17D6}">
+<ds:datastoreItem xmlns:ds="http://schemas.openxmlformats.org/officeDocument/2006/customXml" ds:itemID="{A0CC7945-5283-4905-A71D-472246249B67}">
   <ds:schemaRefs>
-    <ds:schemaRef ds:uri="urn:microsoft-dynamics-nav/reports/Salesperson_Commission/115/"/>
+    <ds:schemaRef ds:uri="urn:microsoft-dynamics-businesscentral/internal/extended/reports/Salesperson_Commission/115/"/>
   </ds:schemaRefs>
 </ds:datastoreItem>
 </file>
 
 <file path=customXml/itemProps2.xml><?xml version="1.0" encoding="utf-8"?>
-<ds:datastoreItem xmlns:ds="http://schemas.openxmlformats.org/officeDocument/2006/customXml" ds:itemID="{A0CC7945-5283-4905-A71D-472246249B67}">
+<ds:datastoreItem xmlns:ds="http://schemas.openxmlformats.org/officeDocument/2006/customXml" ds:itemID="{79D6D75F-D29A-40D3-A819-B215617F17D6}">
   <ds:schemaRefs>
-    <ds:schemaRef ds:uri="urn:microsoft-dynamics-businesscentral/internal/extended/reports/Salesperson_Commission/115/"/>
+    <ds:schemaRef ds:uri="urn:microsoft-dynamics-nav/reports/Salesperson_Commission/115/"/>
   </ds:schemaRefs>
 </ds:datastoreItem>
 </file>

</xml_diff>

<commit_message>
[29.0] Strip header/footer parts from the two body-only Word layouts
Matches main's 8cdf718ca9. SalespersonCommissionBody.docx and
SalespersonSalesStatisticsBody.docx were registered with
Subtype = Body but still carried full document sections
(header1-3.xml/footer1-3.xml, their relationships, content-type
overrides, and sectPr references). Those parts were visually empty —
no text content changed — but the empty section references could
override or suppress the header/footer supplied by the composed
report layout. Now matches CustomerOrderSummaryBody.docx's clean
body-only structure.
</commit_message>
<xml_diff>
--- a/src/Layers/W1/BaseApp/Sales/Reports/SalespersonCommissionBody.docx
+++ b/src/Layers/W1/BaseApp/Sales/Reports/SalespersonCommissionBody.docx
@@ -1544,12 +1544,6 @@
     </w:tbl>
     <w:p/>
     <w:sectPr>
-      <w:headerReference w:type="even" r:id="rId8"/>
-      <w:headerReference w:type="default" r:id="rId9"/>
-      <w:footerReference w:type="even" r:id="rId10"/>
-      <w:footerReference w:type="default" r:id="rId11"/>
-      <w:headerReference w:type="first" r:id="rId12"/>
-      <w:footerReference w:type="first" r:id="rId13"/>
       <w:pgSz w:w="16838" w:h="11906" w:orient="landscape"/>
       <w:pgMar w:top="720" w:right="720" w:bottom="720" w:left="720" w:header="425" w:footer="708" w:gutter="0"/>
       <w:cols w:space="708"/>
@@ -1584,36 +1578,6 @@
 </w:endnotes>
 </file>
 
-<file path=word/footer1.xml><?xml version="1.0" encoding="utf-8"?>
-<w:ftr xmlns:wpc="http://schemas.microsoft.com/office/word/2010/wordprocessingCanvas" xmlns:cx="http://schemas.microsoft.com/office/drawing/2014/chartex" xmlns:cx1="http://schemas.microsoft.com/office/drawing/2015/9/8/chartex" xmlns:cx2="http://schemas.microsoft.com/office/drawing/2015/10/21/chartex" xmlns:cx3="http://schemas.microsoft.com/office/drawing/2016/5/9/chartex" xmlns:cx4="http://schemas.microsoft.com/office/drawing/2016/5/10/chartex" xmlns:cx5="http://schemas.microsoft.com/office/drawing/2016/5/11/chartex" xmlns:cx6="http://schemas.microsoft.com/office/drawing/2016/5/12/chartex" xmlns:cx7="http://schemas.microsoft.com/office/drawing/2016/5/13/chartex" xmlns:cx8="http://schemas.microsoft.com/office/drawing/2016/5/14/chartex" xmlns:mc="http://schemas.openxmlformats.org/markup-compatibility/2006" xmlns:aink="http://schemas.microsoft.com/office/drawing/2016/ink" xmlns:am3d="http://schemas.microsoft.com/office/drawing/2017/model3d" xmlns:o="urn:schemas-microsoft-com:office:office" xmlns:oel="http://schemas.microsoft.com/office/2019/extlst" xmlns:r="http://schemas.openxmlformats.org/officeDocument/2006/relationships" xmlns:m="http://schemas.openxmlformats.org/officeDocument/2006/math" xmlns:v="urn:schemas-microsoft-com:vml" xmlns:wp14="http://schemas.microsoft.com/office/word/2010/wordprocessingDrawing" xmlns:wp="http://schemas.openxmlformats.org/drawingml/2006/wordprocessingDrawing" xmlns:w10="urn:schemas-microsoft-com:office:word" xmlns:w="http://schemas.openxmlformats.org/wordprocessingml/2006/main" xmlns:w14="http://schemas.microsoft.com/office/word/2010/wordml" xmlns:w15="http://schemas.microsoft.com/office/word/2012/wordml" xmlns:w16cex="http://schemas.microsoft.com/office/word/2018/wordml/cex" xmlns:w16cid="http://schemas.microsoft.com/office/word/2016/wordml/cid" xmlns:w16="http://schemas.microsoft.com/office/word/2018/wordml" xmlns:w16du="http://schemas.microsoft.com/office/word/2023/wordml/word16du" xmlns:w16sdtdh="http://schemas.microsoft.com/office/word/2020/wordml/sdtdatahash" xmlns:w16sdtfl="http://schemas.microsoft.com/office/word/2024/wordml/sdtformatlock" xmlns:w16se="http://schemas.microsoft.com/office/word/2015/wordml/symex" xmlns:wpg="http://schemas.microsoft.com/office/word/2010/wordprocessingGroup" xmlns:wpi="http://schemas.microsoft.com/office/word/2010/wordprocessingInk" xmlns:wne="http://schemas.microsoft.com/office/word/2006/wordml" xmlns:wps="http://schemas.microsoft.com/office/word/2010/wordprocessingShape" mc:Ignorable="w14 w15 w16se w16cid w16 w16cex w16sdtdh w16sdtfl w16du wp14">
-  <w:p>
-    <w:pPr>
-      <w:pStyle w:val="Footer"/>
-    </w:pPr>
-  </w:p>
-</w:ftr>
-</file>
-
-<file path=word/footer2.xml><?xml version="1.0" encoding="utf-8"?>
-<w:ftr xmlns:wpc="http://schemas.microsoft.com/office/word/2010/wordprocessingCanvas" xmlns:cx="http://schemas.microsoft.com/office/drawing/2014/chartex" xmlns:cx1="http://schemas.microsoft.com/office/drawing/2015/9/8/chartex" xmlns:cx2="http://schemas.microsoft.com/office/drawing/2015/10/21/chartex" xmlns:cx3="http://schemas.microsoft.com/office/drawing/2016/5/9/chartex" xmlns:cx4="http://schemas.microsoft.com/office/drawing/2016/5/10/chartex" xmlns:cx5="http://schemas.microsoft.com/office/drawing/2016/5/11/chartex" xmlns:cx6="http://schemas.microsoft.com/office/drawing/2016/5/12/chartex" xmlns:cx7="http://schemas.microsoft.com/office/drawing/2016/5/13/chartex" xmlns:cx8="http://schemas.microsoft.com/office/drawing/2016/5/14/chartex" xmlns:mc="http://schemas.openxmlformats.org/markup-compatibility/2006" xmlns:aink="http://schemas.microsoft.com/office/drawing/2016/ink" xmlns:am3d="http://schemas.microsoft.com/office/drawing/2017/model3d" xmlns:o="urn:schemas-microsoft-com:office:office" xmlns:oel="http://schemas.microsoft.com/office/2019/extlst" xmlns:r="http://schemas.openxmlformats.org/officeDocument/2006/relationships" xmlns:m="http://schemas.openxmlformats.org/officeDocument/2006/math" xmlns:v="urn:schemas-microsoft-com:vml" xmlns:wp14="http://schemas.microsoft.com/office/word/2010/wordprocessingDrawing" xmlns:wp="http://schemas.openxmlformats.org/drawingml/2006/wordprocessingDrawing" xmlns:w10="urn:schemas-microsoft-com:office:word" xmlns:w="http://schemas.openxmlformats.org/wordprocessingml/2006/main" xmlns:w14="http://schemas.microsoft.com/office/word/2010/wordml" xmlns:w15="http://schemas.microsoft.com/office/word/2012/wordml" xmlns:w16cex="http://schemas.microsoft.com/office/word/2018/wordml/cex" xmlns:w16cid="http://schemas.microsoft.com/office/word/2016/wordml/cid" xmlns:w16="http://schemas.microsoft.com/office/word/2018/wordml" xmlns:w16du="http://schemas.microsoft.com/office/word/2023/wordml/word16du" xmlns:w16sdtdh="http://schemas.microsoft.com/office/word/2020/wordml/sdtdatahash" xmlns:w16sdtfl="http://schemas.microsoft.com/office/word/2024/wordml/sdtformatlock" xmlns:w16se="http://schemas.microsoft.com/office/word/2015/wordml/symex" xmlns:wpg="http://schemas.microsoft.com/office/word/2010/wordprocessingGroup" xmlns:wpi="http://schemas.microsoft.com/office/word/2010/wordprocessingInk" xmlns:wne="http://schemas.microsoft.com/office/word/2006/wordml" xmlns:wps="http://schemas.microsoft.com/office/word/2010/wordprocessingShape" mc:Ignorable="w14 w15 w16se w16cid w16 w16cex w16sdtdh w16sdtfl w16du wp14">
-  <w:p>
-    <w:pPr>
-      <w:pStyle w:val="Footer"/>
-    </w:pPr>
-  </w:p>
-</w:ftr>
-</file>
-
-<file path=word/footer3.xml><?xml version="1.0" encoding="utf-8"?>
-<w:ftr xmlns:wpc="http://schemas.microsoft.com/office/word/2010/wordprocessingCanvas" xmlns:cx="http://schemas.microsoft.com/office/drawing/2014/chartex" xmlns:cx1="http://schemas.microsoft.com/office/drawing/2015/9/8/chartex" xmlns:cx2="http://schemas.microsoft.com/office/drawing/2015/10/21/chartex" xmlns:cx3="http://schemas.microsoft.com/office/drawing/2016/5/9/chartex" xmlns:cx4="http://schemas.microsoft.com/office/drawing/2016/5/10/chartex" xmlns:cx5="http://schemas.microsoft.com/office/drawing/2016/5/11/chartex" xmlns:cx6="http://schemas.microsoft.com/office/drawing/2016/5/12/chartex" xmlns:cx7="http://schemas.microsoft.com/office/drawing/2016/5/13/chartex" xmlns:cx8="http://schemas.microsoft.com/office/drawing/2016/5/14/chartex" xmlns:mc="http://schemas.openxmlformats.org/markup-compatibility/2006" xmlns:aink="http://schemas.microsoft.com/office/drawing/2016/ink" xmlns:am3d="http://schemas.microsoft.com/office/drawing/2017/model3d" xmlns:o="urn:schemas-microsoft-com:office:office" xmlns:oel="http://schemas.microsoft.com/office/2019/extlst" xmlns:r="http://schemas.openxmlformats.org/officeDocument/2006/relationships" xmlns:m="http://schemas.openxmlformats.org/officeDocument/2006/math" xmlns:v="urn:schemas-microsoft-com:vml" xmlns:wp14="http://schemas.microsoft.com/office/word/2010/wordprocessingDrawing" xmlns:wp="http://schemas.openxmlformats.org/drawingml/2006/wordprocessingDrawing" xmlns:w10="urn:schemas-microsoft-com:office:word" xmlns:w="http://schemas.openxmlformats.org/wordprocessingml/2006/main" xmlns:w14="http://schemas.microsoft.com/office/word/2010/wordml" xmlns:w15="http://schemas.microsoft.com/office/word/2012/wordml" xmlns:w16cex="http://schemas.microsoft.com/office/word/2018/wordml/cex" xmlns:w16cid="http://schemas.microsoft.com/office/word/2016/wordml/cid" xmlns:w16="http://schemas.microsoft.com/office/word/2018/wordml" xmlns:w16du="http://schemas.microsoft.com/office/word/2023/wordml/word16du" xmlns:w16sdtdh="http://schemas.microsoft.com/office/word/2020/wordml/sdtdatahash" xmlns:w16sdtfl="http://schemas.microsoft.com/office/word/2024/wordml/sdtformatlock" xmlns:w16se="http://schemas.microsoft.com/office/word/2015/wordml/symex" xmlns:wpg="http://schemas.microsoft.com/office/word/2010/wordprocessingGroup" xmlns:wpi="http://schemas.microsoft.com/office/word/2010/wordprocessingInk" xmlns:wne="http://schemas.microsoft.com/office/word/2006/wordml" xmlns:wps="http://schemas.microsoft.com/office/word/2010/wordprocessingShape" mc:Ignorable="w14 w15 w16se w16cid w16 w16cex w16sdtdh w16sdtfl w16du wp14">
-  <w:p>
-    <w:pPr>
-      <w:pStyle w:val="Footer"/>
-    </w:pPr>
-  </w:p>
-</w:ftr>
-</file>
-
 <file path=word/footnotes.xml><?xml version="1.0" encoding="utf-8"?>
 <w:footnotes xmlns:wpc="http://schemas.microsoft.com/office/word/2010/wordprocessingCanvas" xmlns:cx="http://schemas.microsoft.com/office/drawing/2014/chartex" xmlns:cx1="http://schemas.microsoft.com/office/drawing/2015/9/8/chartex" xmlns:cx2="http://schemas.microsoft.com/office/drawing/2015/10/21/chartex" xmlns:cx3="http://schemas.microsoft.com/office/drawing/2016/5/9/chartex" xmlns:cx4="http://schemas.microsoft.com/office/drawing/2016/5/10/chartex" xmlns:cx5="http://schemas.microsoft.com/office/drawing/2016/5/11/chartex" xmlns:cx6="http://schemas.microsoft.com/office/drawing/2016/5/12/chartex" xmlns:cx7="http://schemas.microsoft.com/office/drawing/2016/5/13/chartex" xmlns:cx8="http://schemas.microsoft.com/office/drawing/2016/5/14/chartex" xmlns:mc="http://schemas.openxmlformats.org/markup-compatibility/2006" xmlns:aink="http://schemas.microsoft.com/office/drawing/2016/ink" xmlns:am3d="http://schemas.microsoft.com/office/drawing/2017/model3d" xmlns:o="urn:schemas-microsoft-com:office:office" xmlns:oel="http://schemas.microsoft.com/office/2019/extlst" xmlns:r="http://schemas.openxmlformats.org/officeDocument/2006/relationships" xmlns:m="http://schemas.openxmlformats.org/officeDocument/2006/math" xmlns:v="urn:schemas-microsoft-com:vml" xmlns:wp14="http://schemas.microsoft.com/office/word/2010/wordprocessingDrawing" xmlns:wp="http://schemas.openxmlformats.org/drawingml/2006/wordprocessingDrawing" xmlns:w10="urn:schemas-microsoft-com:office:word" xmlns:w="http://schemas.openxmlformats.org/wordprocessingml/2006/main" xmlns:w14="http://schemas.microsoft.com/office/word/2010/wordml" xmlns:w15="http://schemas.microsoft.com/office/word/2012/wordml" xmlns:w16cex="http://schemas.microsoft.com/office/word/2018/wordml/cex" xmlns:w16cid="http://schemas.microsoft.com/office/word/2016/wordml/cid" xmlns:w16="http://schemas.microsoft.com/office/word/2018/wordml" xmlns:w16du="http://schemas.microsoft.com/office/word/2023/wordml/word16du" xmlns:w16sdtdh="http://schemas.microsoft.com/office/word/2020/wordml/sdtdatahash" xmlns:w16sdtfl="http://schemas.microsoft.com/office/word/2024/wordml/sdtformatlock" xmlns:w16se="http://schemas.microsoft.com/office/word/2015/wordml/symex" xmlns:wpg="http://schemas.microsoft.com/office/word/2010/wordprocessingGroup" xmlns:wpi="http://schemas.microsoft.com/office/word/2010/wordprocessingInk" xmlns:wne="http://schemas.microsoft.com/office/word/2006/wordml" xmlns:wps="http://schemas.microsoft.com/office/word/2010/wordprocessingShape" mc:Ignorable="w14 w15 w16se w16cid w16 w16cex w16sdtdh w16sdtfl w16du wp14">
   <w:footnote w:type="separator" w:id="-1">
@@ -1637,36 +1601,6 @@
     </w:p>
   </w:footnote>
 </w:footnotes>
-</file>
-
-<file path=word/header1.xml><?xml version="1.0" encoding="utf-8"?>
-<w:hdr xmlns:wpc="http://schemas.microsoft.com/office/word/2010/wordprocessingCanvas" xmlns:cx="http://schemas.microsoft.com/office/drawing/2014/chartex" xmlns:cx1="http://schemas.microsoft.com/office/drawing/2015/9/8/chartex" xmlns:cx2="http://schemas.microsoft.com/office/drawing/2015/10/21/chartex" xmlns:cx3="http://schemas.microsoft.com/office/drawing/2016/5/9/chartex" xmlns:cx4="http://schemas.microsoft.com/office/drawing/2016/5/10/chartex" xmlns:cx5="http://schemas.microsoft.com/office/drawing/2016/5/11/chartex" xmlns:cx6="http://schemas.microsoft.com/office/drawing/2016/5/12/chartex" xmlns:cx7="http://schemas.microsoft.com/office/drawing/2016/5/13/chartex" xmlns:cx8="http://schemas.microsoft.com/office/drawing/2016/5/14/chartex" xmlns:mc="http://schemas.openxmlformats.org/markup-compatibility/2006" xmlns:aink="http://schemas.microsoft.com/office/drawing/2016/ink" xmlns:am3d="http://schemas.microsoft.com/office/drawing/2017/model3d" xmlns:o="urn:schemas-microsoft-com:office:office" xmlns:oel="http://schemas.microsoft.com/office/2019/extlst" xmlns:r="http://schemas.openxmlformats.org/officeDocument/2006/relationships" xmlns:m="http://schemas.openxmlformats.org/officeDocument/2006/math" xmlns:v="urn:schemas-microsoft-com:vml" xmlns:wp14="http://schemas.microsoft.com/office/word/2010/wordprocessingDrawing" xmlns:wp="http://schemas.openxmlformats.org/drawingml/2006/wordprocessingDrawing" xmlns:w10="urn:schemas-microsoft-com:office:word" xmlns:w="http://schemas.openxmlformats.org/wordprocessingml/2006/main" xmlns:w14="http://schemas.microsoft.com/office/word/2010/wordml" xmlns:w15="http://schemas.microsoft.com/office/word/2012/wordml" xmlns:w16cex="http://schemas.microsoft.com/office/word/2018/wordml/cex" xmlns:w16cid="http://schemas.microsoft.com/office/word/2016/wordml/cid" xmlns:w16="http://schemas.microsoft.com/office/word/2018/wordml" xmlns:w16du="http://schemas.microsoft.com/office/word/2023/wordml/word16du" xmlns:w16sdtdh="http://schemas.microsoft.com/office/word/2020/wordml/sdtdatahash" xmlns:w16sdtfl="http://schemas.microsoft.com/office/word/2024/wordml/sdtformatlock" xmlns:w16se="http://schemas.microsoft.com/office/word/2015/wordml/symex" xmlns:wpg="http://schemas.microsoft.com/office/word/2010/wordprocessingGroup" xmlns:wpi="http://schemas.microsoft.com/office/word/2010/wordprocessingInk" xmlns:wne="http://schemas.microsoft.com/office/word/2006/wordml" xmlns:wps="http://schemas.microsoft.com/office/word/2010/wordprocessingShape" mc:Ignorable="w14 w15 w16se w16cid w16 w16cex w16sdtdh w16sdtfl w16du wp14">
-  <w:p>
-    <w:pPr>
-      <w:pStyle w:val="Header"/>
-    </w:pPr>
-  </w:p>
-</w:hdr>
-</file>
-
-<file path=word/header2.xml><?xml version="1.0" encoding="utf-8"?>
-<w:hdr xmlns:wpc="http://schemas.microsoft.com/office/word/2010/wordprocessingCanvas" xmlns:cx="http://schemas.microsoft.com/office/drawing/2014/chartex" xmlns:cx1="http://schemas.microsoft.com/office/drawing/2015/9/8/chartex" xmlns:cx2="http://schemas.microsoft.com/office/drawing/2015/10/21/chartex" xmlns:cx3="http://schemas.microsoft.com/office/drawing/2016/5/9/chartex" xmlns:cx4="http://schemas.microsoft.com/office/drawing/2016/5/10/chartex" xmlns:cx5="http://schemas.microsoft.com/office/drawing/2016/5/11/chartex" xmlns:cx6="http://schemas.microsoft.com/office/drawing/2016/5/12/chartex" xmlns:cx7="http://schemas.microsoft.com/office/drawing/2016/5/13/chartex" xmlns:cx8="http://schemas.microsoft.com/office/drawing/2016/5/14/chartex" xmlns:mc="http://schemas.openxmlformats.org/markup-compatibility/2006" xmlns:aink="http://schemas.microsoft.com/office/drawing/2016/ink" xmlns:am3d="http://schemas.microsoft.com/office/drawing/2017/model3d" xmlns:o="urn:schemas-microsoft-com:office:office" xmlns:oel="http://schemas.microsoft.com/office/2019/extlst" xmlns:r="http://schemas.openxmlformats.org/officeDocument/2006/relationships" xmlns:m="http://schemas.openxmlformats.org/officeDocument/2006/math" xmlns:v="urn:schemas-microsoft-com:vml" xmlns:wp14="http://schemas.microsoft.com/office/word/2010/wordprocessingDrawing" xmlns:wp="http://schemas.openxmlformats.org/drawingml/2006/wordprocessingDrawing" xmlns:w10="urn:schemas-microsoft-com:office:word" xmlns:w="http://schemas.openxmlformats.org/wordprocessingml/2006/main" xmlns:w14="http://schemas.microsoft.com/office/word/2010/wordml" xmlns:w15="http://schemas.microsoft.com/office/word/2012/wordml" xmlns:w16cex="http://schemas.microsoft.com/office/word/2018/wordml/cex" xmlns:w16cid="http://schemas.microsoft.com/office/word/2016/wordml/cid" xmlns:w16="http://schemas.microsoft.com/office/word/2018/wordml" xmlns:w16du="http://schemas.microsoft.com/office/word/2023/wordml/word16du" xmlns:w16sdtdh="http://schemas.microsoft.com/office/word/2020/wordml/sdtdatahash" xmlns:w16sdtfl="http://schemas.microsoft.com/office/word/2024/wordml/sdtformatlock" xmlns:w16se="http://schemas.microsoft.com/office/word/2015/wordml/symex" xmlns:wpg="http://schemas.microsoft.com/office/word/2010/wordprocessingGroup" xmlns:wpi="http://schemas.microsoft.com/office/word/2010/wordprocessingInk" xmlns:wne="http://schemas.microsoft.com/office/word/2006/wordml" xmlns:wps="http://schemas.microsoft.com/office/word/2010/wordprocessingShape" mc:Ignorable="w14 w15 w16se w16cid w16 w16cex w16sdtdh w16sdtfl w16du wp14">
-  <w:p>
-    <w:pPr>
-      <w:pStyle w:val="Header"/>
-    </w:pPr>
-  </w:p>
-</w:hdr>
-</file>
-
-<file path=word/header3.xml><?xml version="1.0" encoding="utf-8"?>
-<w:hdr xmlns:wpc="http://schemas.microsoft.com/office/word/2010/wordprocessingCanvas" xmlns:cx="http://schemas.microsoft.com/office/drawing/2014/chartex" xmlns:cx1="http://schemas.microsoft.com/office/drawing/2015/9/8/chartex" xmlns:cx2="http://schemas.microsoft.com/office/drawing/2015/10/21/chartex" xmlns:cx3="http://schemas.microsoft.com/office/drawing/2016/5/9/chartex" xmlns:cx4="http://schemas.microsoft.com/office/drawing/2016/5/10/chartex" xmlns:cx5="http://schemas.microsoft.com/office/drawing/2016/5/11/chartex" xmlns:cx6="http://schemas.microsoft.com/office/drawing/2016/5/12/chartex" xmlns:cx7="http://schemas.microsoft.com/office/drawing/2016/5/13/chartex" xmlns:cx8="http://schemas.microsoft.com/office/drawing/2016/5/14/chartex" xmlns:mc="http://schemas.openxmlformats.org/markup-compatibility/2006" xmlns:aink="http://schemas.microsoft.com/office/drawing/2016/ink" xmlns:am3d="http://schemas.microsoft.com/office/drawing/2017/model3d" xmlns:o="urn:schemas-microsoft-com:office:office" xmlns:oel="http://schemas.microsoft.com/office/2019/extlst" xmlns:r="http://schemas.openxmlformats.org/officeDocument/2006/relationships" xmlns:m="http://schemas.openxmlformats.org/officeDocument/2006/math" xmlns:v="urn:schemas-microsoft-com:vml" xmlns:wp14="http://schemas.microsoft.com/office/word/2010/wordprocessingDrawing" xmlns:wp="http://schemas.openxmlformats.org/drawingml/2006/wordprocessingDrawing" xmlns:w10="urn:schemas-microsoft-com:office:word" xmlns:w="http://schemas.openxmlformats.org/wordprocessingml/2006/main" xmlns:w14="http://schemas.microsoft.com/office/word/2010/wordml" xmlns:w15="http://schemas.microsoft.com/office/word/2012/wordml" xmlns:w16cex="http://schemas.microsoft.com/office/word/2018/wordml/cex" xmlns:w16cid="http://schemas.microsoft.com/office/word/2016/wordml/cid" xmlns:w16="http://schemas.microsoft.com/office/word/2018/wordml" xmlns:w16du="http://schemas.microsoft.com/office/word/2023/wordml/word16du" xmlns:w16sdtdh="http://schemas.microsoft.com/office/word/2020/wordml/sdtdatahash" xmlns:w16sdtfl="http://schemas.microsoft.com/office/word/2024/wordml/sdtformatlock" xmlns:w16se="http://schemas.microsoft.com/office/word/2015/wordml/symex" xmlns:wpg="http://schemas.microsoft.com/office/word/2010/wordprocessingGroup" xmlns:wpi="http://schemas.microsoft.com/office/word/2010/wordprocessingInk" xmlns:wne="http://schemas.microsoft.com/office/word/2006/wordml" xmlns:wps="http://schemas.microsoft.com/office/word/2010/wordprocessingShape" mc:Ignorable="w14 w15 w16se w16cid w16 w16cex w16sdtdh w16sdtfl w16du wp14">
-  <w:p>
-    <w:pPr>
-      <w:pStyle w:val="Header"/>
-    </w:pPr>
-  </w:p>
-</w:hdr>
 </file>
 
 <file path=word/styles.xml><?xml version="1.0" encoding="utf-8"?>

</xml_diff>

<commit_message>
[29.x] Strip header/footer parts from the two body-only Word layouts
Matches main's 8cdf718ca9. SalespersonCommissionBody.docx and
SalespersonSalesStatisticsBody.docx were registered with
Subtype = Body but still carried full document sections
(header1-3.xml/footer1-3.xml, their relationships, content-type
overrides, and sectPr references). Those parts were visually empty —
no text content changed — but the empty section references could
override or suppress the header/footer supplied by the composed
report layout. Now matches CustomerOrderSummaryBody.docx's clean
body-only structure.
</commit_message>
<xml_diff>
--- a/src/Layers/W1/BaseApp/Sales/Reports/SalespersonCommissionBody.docx
+++ b/src/Layers/W1/BaseApp/Sales/Reports/SalespersonCommissionBody.docx
@@ -1544,12 +1544,6 @@
     </w:tbl>
     <w:p/>
     <w:sectPr>
-      <w:headerReference w:type="even" r:id="rId8"/>
-      <w:headerReference w:type="default" r:id="rId9"/>
-      <w:footerReference w:type="even" r:id="rId10"/>
-      <w:footerReference w:type="default" r:id="rId11"/>
-      <w:headerReference w:type="first" r:id="rId12"/>
-      <w:footerReference w:type="first" r:id="rId13"/>
       <w:pgSz w:w="16838" w:h="11906" w:orient="landscape"/>
       <w:pgMar w:top="720" w:right="720" w:bottom="720" w:left="720" w:header="425" w:footer="708" w:gutter="0"/>
       <w:cols w:space="708"/>
@@ -1584,36 +1578,6 @@
 </w:endnotes>
 </file>
 
-<file path=word/footer1.xml><?xml version="1.0" encoding="utf-8"?>
-<w:ftr xmlns:wpc="http://schemas.microsoft.com/office/word/2010/wordprocessingCanvas" xmlns:cx="http://schemas.microsoft.com/office/drawing/2014/chartex" xmlns:cx1="http://schemas.microsoft.com/office/drawing/2015/9/8/chartex" xmlns:cx2="http://schemas.microsoft.com/office/drawing/2015/10/21/chartex" xmlns:cx3="http://schemas.microsoft.com/office/drawing/2016/5/9/chartex" xmlns:cx4="http://schemas.microsoft.com/office/drawing/2016/5/10/chartex" xmlns:cx5="http://schemas.microsoft.com/office/drawing/2016/5/11/chartex" xmlns:cx6="http://schemas.microsoft.com/office/drawing/2016/5/12/chartex" xmlns:cx7="http://schemas.microsoft.com/office/drawing/2016/5/13/chartex" xmlns:cx8="http://schemas.microsoft.com/office/drawing/2016/5/14/chartex" xmlns:mc="http://schemas.openxmlformats.org/markup-compatibility/2006" xmlns:aink="http://schemas.microsoft.com/office/drawing/2016/ink" xmlns:am3d="http://schemas.microsoft.com/office/drawing/2017/model3d" xmlns:o="urn:schemas-microsoft-com:office:office" xmlns:oel="http://schemas.microsoft.com/office/2019/extlst" xmlns:r="http://schemas.openxmlformats.org/officeDocument/2006/relationships" xmlns:m="http://schemas.openxmlformats.org/officeDocument/2006/math" xmlns:v="urn:schemas-microsoft-com:vml" xmlns:wp14="http://schemas.microsoft.com/office/word/2010/wordprocessingDrawing" xmlns:wp="http://schemas.openxmlformats.org/drawingml/2006/wordprocessingDrawing" xmlns:w10="urn:schemas-microsoft-com:office:word" xmlns:w="http://schemas.openxmlformats.org/wordprocessingml/2006/main" xmlns:w14="http://schemas.microsoft.com/office/word/2010/wordml" xmlns:w15="http://schemas.microsoft.com/office/word/2012/wordml" xmlns:w16cex="http://schemas.microsoft.com/office/word/2018/wordml/cex" xmlns:w16cid="http://schemas.microsoft.com/office/word/2016/wordml/cid" xmlns:w16="http://schemas.microsoft.com/office/word/2018/wordml" xmlns:w16du="http://schemas.microsoft.com/office/word/2023/wordml/word16du" xmlns:w16sdtdh="http://schemas.microsoft.com/office/word/2020/wordml/sdtdatahash" xmlns:w16sdtfl="http://schemas.microsoft.com/office/word/2024/wordml/sdtformatlock" xmlns:w16se="http://schemas.microsoft.com/office/word/2015/wordml/symex" xmlns:wpg="http://schemas.microsoft.com/office/word/2010/wordprocessingGroup" xmlns:wpi="http://schemas.microsoft.com/office/word/2010/wordprocessingInk" xmlns:wne="http://schemas.microsoft.com/office/word/2006/wordml" xmlns:wps="http://schemas.microsoft.com/office/word/2010/wordprocessingShape" mc:Ignorable="w14 w15 w16se w16cid w16 w16cex w16sdtdh w16sdtfl w16du wp14">
-  <w:p>
-    <w:pPr>
-      <w:pStyle w:val="Footer"/>
-    </w:pPr>
-  </w:p>
-</w:ftr>
-</file>
-
-<file path=word/footer2.xml><?xml version="1.0" encoding="utf-8"?>
-<w:ftr xmlns:wpc="http://schemas.microsoft.com/office/word/2010/wordprocessingCanvas" xmlns:cx="http://schemas.microsoft.com/office/drawing/2014/chartex" xmlns:cx1="http://schemas.microsoft.com/office/drawing/2015/9/8/chartex" xmlns:cx2="http://schemas.microsoft.com/office/drawing/2015/10/21/chartex" xmlns:cx3="http://schemas.microsoft.com/office/drawing/2016/5/9/chartex" xmlns:cx4="http://schemas.microsoft.com/office/drawing/2016/5/10/chartex" xmlns:cx5="http://schemas.microsoft.com/office/drawing/2016/5/11/chartex" xmlns:cx6="http://schemas.microsoft.com/office/drawing/2016/5/12/chartex" xmlns:cx7="http://schemas.microsoft.com/office/drawing/2016/5/13/chartex" xmlns:cx8="http://schemas.microsoft.com/office/drawing/2016/5/14/chartex" xmlns:mc="http://schemas.openxmlformats.org/markup-compatibility/2006" xmlns:aink="http://schemas.microsoft.com/office/drawing/2016/ink" xmlns:am3d="http://schemas.microsoft.com/office/drawing/2017/model3d" xmlns:o="urn:schemas-microsoft-com:office:office" xmlns:oel="http://schemas.microsoft.com/office/2019/extlst" xmlns:r="http://schemas.openxmlformats.org/officeDocument/2006/relationships" xmlns:m="http://schemas.openxmlformats.org/officeDocument/2006/math" xmlns:v="urn:schemas-microsoft-com:vml" xmlns:wp14="http://schemas.microsoft.com/office/word/2010/wordprocessingDrawing" xmlns:wp="http://schemas.openxmlformats.org/drawingml/2006/wordprocessingDrawing" xmlns:w10="urn:schemas-microsoft-com:office:word" xmlns:w="http://schemas.openxmlformats.org/wordprocessingml/2006/main" xmlns:w14="http://schemas.microsoft.com/office/word/2010/wordml" xmlns:w15="http://schemas.microsoft.com/office/word/2012/wordml" xmlns:w16cex="http://schemas.microsoft.com/office/word/2018/wordml/cex" xmlns:w16cid="http://schemas.microsoft.com/office/word/2016/wordml/cid" xmlns:w16="http://schemas.microsoft.com/office/word/2018/wordml" xmlns:w16du="http://schemas.microsoft.com/office/word/2023/wordml/word16du" xmlns:w16sdtdh="http://schemas.microsoft.com/office/word/2020/wordml/sdtdatahash" xmlns:w16sdtfl="http://schemas.microsoft.com/office/word/2024/wordml/sdtformatlock" xmlns:w16se="http://schemas.microsoft.com/office/word/2015/wordml/symex" xmlns:wpg="http://schemas.microsoft.com/office/word/2010/wordprocessingGroup" xmlns:wpi="http://schemas.microsoft.com/office/word/2010/wordprocessingInk" xmlns:wne="http://schemas.microsoft.com/office/word/2006/wordml" xmlns:wps="http://schemas.microsoft.com/office/word/2010/wordprocessingShape" mc:Ignorable="w14 w15 w16se w16cid w16 w16cex w16sdtdh w16sdtfl w16du wp14">
-  <w:p>
-    <w:pPr>
-      <w:pStyle w:val="Footer"/>
-    </w:pPr>
-  </w:p>
-</w:ftr>
-</file>
-
-<file path=word/footer3.xml><?xml version="1.0" encoding="utf-8"?>
-<w:ftr xmlns:wpc="http://schemas.microsoft.com/office/word/2010/wordprocessingCanvas" xmlns:cx="http://schemas.microsoft.com/office/drawing/2014/chartex" xmlns:cx1="http://schemas.microsoft.com/office/drawing/2015/9/8/chartex" xmlns:cx2="http://schemas.microsoft.com/office/drawing/2015/10/21/chartex" xmlns:cx3="http://schemas.microsoft.com/office/drawing/2016/5/9/chartex" xmlns:cx4="http://schemas.microsoft.com/office/drawing/2016/5/10/chartex" xmlns:cx5="http://schemas.microsoft.com/office/drawing/2016/5/11/chartex" xmlns:cx6="http://schemas.microsoft.com/office/drawing/2016/5/12/chartex" xmlns:cx7="http://schemas.microsoft.com/office/drawing/2016/5/13/chartex" xmlns:cx8="http://schemas.microsoft.com/office/drawing/2016/5/14/chartex" xmlns:mc="http://schemas.openxmlformats.org/markup-compatibility/2006" xmlns:aink="http://schemas.microsoft.com/office/drawing/2016/ink" xmlns:am3d="http://schemas.microsoft.com/office/drawing/2017/model3d" xmlns:o="urn:schemas-microsoft-com:office:office" xmlns:oel="http://schemas.microsoft.com/office/2019/extlst" xmlns:r="http://schemas.openxmlformats.org/officeDocument/2006/relationships" xmlns:m="http://schemas.openxmlformats.org/officeDocument/2006/math" xmlns:v="urn:schemas-microsoft-com:vml" xmlns:wp14="http://schemas.microsoft.com/office/word/2010/wordprocessingDrawing" xmlns:wp="http://schemas.openxmlformats.org/drawingml/2006/wordprocessingDrawing" xmlns:w10="urn:schemas-microsoft-com:office:word" xmlns:w="http://schemas.openxmlformats.org/wordprocessingml/2006/main" xmlns:w14="http://schemas.microsoft.com/office/word/2010/wordml" xmlns:w15="http://schemas.microsoft.com/office/word/2012/wordml" xmlns:w16cex="http://schemas.microsoft.com/office/word/2018/wordml/cex" xmlns:w16cid="http://schemas.microsoft.com/office/word/2016/wordml/cid" xmlns:w16="http://schemas.microsoft.com/office/word/2018/wordml" xmlns:w16du="http://schemas.microsoft.com/office/word/2023/wordml/word16du" xmlns:w16sdtdh="http://schemas.microsoft.com/office/word/2020/wordml/sdtdatahash" xmlns:w16sdtfl="http://schemas.microsoft.com/office/word/2024/wordml/sdtformatlock" xmlns:w16se="http://schemas.microsoft.com/office/word/2015/wordml/symex" xmlns:wpg="http://schemas.microsoft.com/office/word/2010/wordprocessingGroup" xmlns:wpi="http://schemas.microsoft.com/office/word/2010/wordprocessingInk" xmlns:wne="http://schemas.microsoft.com/office/word/2006/wordml" xmlns:wps="http://schemas.microsoft.com/office/word/2010/wordprocessingShape" mc:Ignorable="w14 w15 w16se w16cid w16 w16cex w16sdtdh w16sdtfl w16du wp14">
-  <w:p>
-    <w:pPr>
-      <w:pStyle w:val="Footer"/>
-    </w:pPr>
-  </w:p>
-</w:ftr>
-</file>
-
 <file path=word/footnotes.xml><?xml version="1.0" encoding="utf-8"?>
 <w:footnotes xmlns:wpc="http://schemas.microsoft.com/office/word/2010/wordprocessingCanvas" xmlns:cx="http://schemas.microsoft.com/office/drawing/2014/chartex" xmlns:cx1="http://schemas.microsoft.com/office/drawing/2015/9/8/chartex" xmlns:cx2="http://schemas.microsoft.com/office/drawing/2015/10/21/chartex" xmlns:cx3="http://schemas.microsoft.com/office/drawing/2016/5/9/chartex" xmlns:cx4="http://schemas.microsoft.com/office/drawing/2016/5/10/chartex" xmlns:cx5="http://schemas.microsoft.com/office/drawing/2016/5/11/chartex" xmlns:cx6="http://schemas.microsoft.com/office/drawing/2016/5/12/chartex" xmlns:cx7="http://schemas.microsoft.com/office/drawing/2016/5/13/chartex" xmlns:cx8="http://schemas.microsoft.com/office/drawing/2016/5/14/chartex" xmlns:mc="http://schemas.openxmlformats.org/markup-compatibility/2006" xmlns:aink="http://schemas.microsoft.com/office/drawing/2016/ink" xmlns:am3d="http://schemas.microsoft.com/office/drawing/2017/model3d" xmlns:o="urn:schemas-microsoft-com:office:office" xmlns:oel="http://schemas.microsoft.com/office/2019/extlst" xmlns:r="http://schemas.openxmlformats.org/officeDocument/2006/relationships" xmlns:m="http://schemas.openxmlformats.org/officeDocument/2006/math" xmlns:v="urn:schemas-microsoft-com:vml" xmlns:wp14="http://schemas.microsoft.com/office/word/2010/wordprocessingDrawing" xmlns:wp="http://schemas.openxmlformats.org/drawingml/2006/wordprocessingDrawing" xmlns:w10="urn:schemas-microsoft-com:office:word" xmlns:w="http://schemas.openxmlformats.org/wordprocessingml/2006/main" xmlns:w14="http://schemas.microsoft.com/office/word/2010/wordml" xmlns:w15="http://schemas.microsoft.com/office/word/2012/wordml" xmlns:w16cex="http://schemas.microsoft.com/office/word/2018/wordml/cex" xmlns:w16cid="http://schemas.microsoft.com/office/word/2016/wordml/cid" xmlns:w16="http://schemas.microsoft.com/office/word/2018/wordml" xmlns:w16du="http://schemas.microsoft.com/office/word/2023/wordml/word16du" xmlns:w16sdtdh="http://schemas.microsoft.com/office/word/2020/wordml/sdtdatahash" xmlns:w16sdtfl="http://schemas.microsoft.com/office/word/2024/wordml/sdtformatlock" xmlns:w16se="http://schemas.microsoft.com/office/word/2015/wordml/symex" xmlns:wpg="http://schemas.microsoft.com/office/word/2010/wordprocessingGroup" xmlns:wpi="http://schemas.microsoft.com/office/word/2010/wordprocessingInk" xmlns:wne="http://schemas.microsoft.com/office/word/2006/wordml" xmlns:wps="http://schemas.microsoft.com/office/word/2010/wordprocessingShape" mc:Ignorable="w14 w15 w16se w16cid w16 w16cex w16sdtdh w16sdtfl w16du wp14">
   <w:footnote w:type="separator" w:id="-1">
@@ -1637,36 +1601,6 @@
     </w:p>
   </w:footnote>
 </w:footnotes>
-</file>
-
-<file path=word/header1.xml><?xml version="1.0" encoding="utf-8"?>
-<w:hdr xmlns:wpc="http://schemas.microsoft.com/office/word/2010/wordprocessingCanvas" xmlns:cx="http://schemas.microsoft.com/office/drawing/2014/chartex" xmlns:cx1="http://schemas.microsoft.com/office/drawing/2015/9/8/chartex" xmlns:cx2="http://schemas.microsoft.com/office/drawing/2015/10/21/chartex" xmlns:cx3="http://schemas.microsoft.com/office/drawing/2016/5/9/chartex" xmlns:cx4="http://schemas.microsoft.com/office/drawing/2016/5/10/chartex" xmlns:cx5="http://schemas.microsoft.com/office/drawing/2016/5/11/chartex" xmlns:cx6="http://schemas.microsoft.com/office/drawing/2016/5/12/chartex" xmlns:cx7="http://schemas.microsoft.com/office/drawing/2016/5/13/chartex" xmlns:cx8="http://schemas.microsoft.com/office/drawing/2016/5/14/chartex" xmlns:mc="http://schemas.openxmlformats.org/markup-compatibility/2006" xmlns:aink="http://schemas.microsoft.com/office/drawing/2016/ink" xmlns:am3d="http://schemas.microsoft.com/office/drawing/2017/model3d" xmlns:o="urn:schemas-microsoft-com:office:office" xmlns:oel="http://schemas.microsoft.com/office/2019/extlst" xmlns:r="http://schemas.openxmlformats.org/officeDocument/2006/relationships" xmlns:m="http://schemas.openxmlformats.org/officeDocument/2006/math" xmlns:v="urn:schemas-microsoft-com:vml" xmlns:wp14="http://schemas.microsoft.com/office/word/2010/wordprocessingDrawing" xmlns:wp="http://schemas.openxmlformats.org/drawingml/2006/wordprocessingDrawing" xmlns:w10="urn:schemas-microsoft-com:office:word" xmlns:w="http://schemas.openxmlformats.org/wordprocessingml/2006/main" xmlns:w14="http://schemas.microsoft.com/office/word/2010/wordml" xmlns:w15="http://schemas.microsoft.com/office/word/2012/wordml" xmlns:w16cex="http://schemas.microsoft.com/office/word/2018/wordml/cex" xmlns:w16cid="http://schemas.microsoft.com/office/word/2016/wordml/cid" xmlns:w16="http://schemas.microsoft.com/office/word/2018/wordml" xmlns:w16du="http://schemas.microsoft.com/office/word/2023/wordml/word16du" xmlns:w16sdtdh="http://schemas.microsoft.com/office/word/2020/wordml/sdtdatahash" xmlns:w16sdtfl="http://schemas.microsoft.com/office/word/2024/wordml/sdtformatlock" xmlns:w16se="http://schemas.microsoft.com/office/word/2015/wordml/symex" xmlns:wpg="http://schemas.microsoft.com/office/word/2010/wordprocessingGroup" xmlns:wpi="http://schemas.microsoft.com/office/word/2010/wordprocessingInk" xmlns:wne="http://schemas.microsoft.com/office/word/2006/wordml" xmlns:wps="http://schemas.microsoft.com/office/word/2010/wordprocessingShape" mc:Ignorable="w14 w15 w16se w16cid w16 w16cex w16sdtdh w16sdtfl w16du wp14">
-  <w:p>
-    <w:pPr>
-      <w:pStyle w:val="Header"/>
-    </w:pPr>
-  </w:p>
-</w:hdr>
-</file>
-
-<file path=word/header2.xml><?xml version="1.0" encoding="utf-8"?>
-<w:hdr xmlns:wpc="http://schemas.microsoft.com/office/word/2010/wordprocessingCanvas" xmlns:cx="http://schemas.microsoft.com/office/drawing/2014/chartex" xmlns:cx1="http://schemas.microsoft.com/office/drawing/2015/9/8/chartex" xmlns:cx2="http://schemas.microsoft.com/office/drawing/2015/10/21/chartex" xmlns:cx3="http://schemas.microsoft.com/office/drawing/2016/5/9/chartex" xmlns:cx4="http://schemas.microsoft.com/office/drawing/2016/5/10/chartex" xmlns:cx5="http://schemas.microsoft.com/office/drawing/2016/5/11/chartex" xmlns:cx6="http://schemas.microsoft.com/office/drawing/2016/5/12/chartex" xmlns:cx7="http://schemas.microsoft.com/office/drawing/2016/5/13/chartex" xmlns:cx8="http://schemas.microsoft.com/office/drawing/2016/5/14/chartex" xmlns:mc="http://schemas.openxmlformats.org/markup-compatibility/2006" xmlns:aink="http://schemas.microsoft.com/office/drawing/2016/ink" xmlns:am3d="http://schemas.microsoft.com/office/drawing/2017/model3d" xmlns:o="urn:schemas-microsoft-com:office:office" xmlns:oel="http://schemas.microsoft.com/office/2019/extlst" xmlns:r="http://schemas.openxmlformats.org/officeDocument/2006/relationships" xmlns:m="http://schemas.openxmlformats.org/officeDocument/2006/math" xmlns:v="urn:schemas-microsoft-com:vml" xmlns:wp14="http://schemas.microsoft.com/office/word/2010/wordprocessingDrawing" xmlns:wp="http://schemas.openxmlformats.org/drawingml/2006/wordprocessingDrawing" xmlns:w10="urn:schemas-microsoft-com:office:word" xmlns:w="http://schemas.openxmlformats.org/wordprocessingml/2006/main" xmlns:w14="http://schemas.microsoft.com/office/word/2010/wordml" xmlns:w15="http://schemas.microsoft.com/office/word/2012/wordml" xmlns:w16cex="http://schemas.microsoft.com/office/word/2018/wordml/cex" xmlns:w16cid="http://schemas.microsoft.com/office/word/2016/wordml/cid" xmlns:w16="http://schemas.microsoft.com/office/word/2018/wordml" xmlns:w16du="http://schemas.microsoft.com/office/word/2023/wordml/word16du" xmlns:w16sdtdh="http://schemas.microsoft.com/office/word/2020/wordml/sdtdatahash" xmlns:w16sdtfl="http://schemas.microsoft.com/office/word/2024/wordml/sdtformatlock" xmlns:w16se="http://schemas.microsoft.com/office/word/2015/wordml/symex" xmlns:wpg="http://schemas.microsoft.com/office/word/2010/wordprocessingGroup" xmlns:wpi="http://schemas.microsoft.com/office/word/2010/wordprocessingInk" xmlns:wne="http://schemas.microsoft.com/office/word/2006/wordml" xmlns:wps="http://schemas.microsoft.com/office/word/2010/wordprocessingShape" mc:Ignorable="w14 w15 w16se w16cid w16 w16cex w16sdtdh w16sdtfl w16du wp14">
-  <w:p>
-    <w:pPr>
-      <w:pStyle w:val="Header"/>
-    </w:pPr>
-  </w:p>
-</w:hdr>
-</file>
-
-<file path=word/header3.xml><?xml version="1.0" encoding="utf-8"?>
-<w:hdr xmlns:wpc="http://schemas.microsoft.com/office/word/2010/wordprocessingCanvas" xmlns:cx="http://schemas.microsoft.com/office/drawing/2014/chartex" xmlns:cx1="http://schemas.microsoft.com/office/drawing/2015/9/8/chartex" xmlns:cx2="http://schemas.microsoft.com/office/drawing/2015/10/21/chartex" xmlns:cx3="http://schemas.microsoft.com/office/drawing/2016/5/9/chartex" xmlns:cx4="http://schemas.microsoft.com/office/drawing/2016/5/10/chartex" xmlns:cx5="http://schemas.microsoft.com/office/drawing/2016/5/11/chartex" xmlns:cx6="http://schemas.microsoft.com/office/drawing/2016/5/12/chartex" xmlns:cx7="http://schemas.microsoft.com/office/drawing/2016/5/13/chartex" xmlns:cx8="http://schemas.microsoft.com/office/drawing/2016/5/14/chartex" xmlns:mc="http://schemas.openxmlformats.org/markup-compatibility/2006" xmlns:aink="http://schemas.microsoft.com/office/drawing/2016/ink" xmlns:am3d="http://schemas.microsoft.com/office/drawing/2017/model3d" xmlns:o="urn:schemas-microsoft-com:office:office" xmlns:oel="http://schemas.microsoft.com/office/2019/extlst" xmlns:r="http://schemas.openxmlformats.org/officeDocument/2006/relationships" xmlns:m="http://schemas.openxmlformats.org/officeDocument/2006/math" xmlns:v="urn:schemas-microsoft-com:vml" xmlns:wp14="http://schemas.microsoft.com/office/word/2010/wordprocessingDrawing" xmlns:wp="http://schemas.openxmlformats.org/drawingml/2006/wordprocessingDrawing" xmlns:w10="urn:schemas-microsoft-com:office:word" xmlns:w="http://schemas.openxmlformats.org/wordprocessingml/2006/main" xmlns:w14="http://schemas.microsoft.com/office/word/2010/wordml" xmlns:w15="http://schemas.microsoft.com/office/word/2012/wordml" xmlns:w16cex="http://schemas.microsoft.com/office/word/2018/wordml/cex" xmlns:w16cid="http://schemas.microsoft.com/office/word/2016/wordml/cid" xmlns:w16="http://schemas.microsoft.com/office/word/2018/wordml" xmlns:w16du="http://schemas.microsoft.com/office/word/2023/wordml/word16du" xmlns:w16sdtdh="http://schemas.microsoft.com/office/word/2020/wordml/sdtdatahash" xmlns:w16sdtfl="http://schemas.microsoft.com/office/word/2024/wordml/sdtformatlock" xmlns:w16se="http://schemas.microsoft.com/office/word/2015/wordml/symex" xmlns:wpg="http://schemas.microsoft.com/office/word/2010/wordprocessingGroup" xmlns:wpi="http://schemas.microsoft.com/office/word/2010/wordprocessingInk" xmlns:wne="http://schemas.microsoft.com/office/word/2006/wordml" xmlns:wps="http://schemas.microsoft.com/office/word/2010/wordprocessingShape" mc:Ignorable="w14 w15 w16se w16cid w16 w16cex w16sdtdh w16sdtfl w16du wp14">
-  <w:p>
-    <w:pPr>
-      <w:pStyle w:val="Header"/>
-    </w:pPr>
-  </w:p>
-</w:hdr>
 </file>
 
 <file path=word/styles.xml><?xml version="1.0" encoding="utf-8"?>

</xml_diff>